<commit_message>
Sync Also-by pages to Quantum, Actually and fix scattered wording errors
The canonical list retired Quanta, Actually (three volumes) after the merge into Quantum, Actually (two volumes). Also-by pages, builders, and cross-references still named the old titles. This updates those lists and the German further-books page, and corrects a doubled word in Life, Actually, two awkward Math, Actually sentences, an article error in the Volume 3 illustration prompts, a doubled "in" in Lolly Book 2 and EE Book 3, and QED lesson subjects that all said Lesson 1.

Co-authored-by: lotmus <lotmus@users.noreply.github.com>
</commit_message>
<xml_diff>
--- a/EE - SERIES/Circuits_Components_and_Control_Book2.docx
+++ b/EE - SERIES/Circuits_Components_and_Control_Book2.docx
@@ -22673,7 +22673,7 @@
         <w:rPr>
           <w:b/>
         </w:rPr>
-        <w:t xml:space="preserve">Quanta, Actually</w:t>
+        <w:t xml:space="preserve">Quantum, Actually</w:t>
       </w:r>
     </w:p>
     <w:p>
@@ -22683,7 +22683,7 @@
         <w:jc w:val="left"/>
       </w:pPr>
       <w:r>
-        <w:t xml:space="preserve">Quanta, Actually, Volume 1: The Quantum World</w:t>
+        <w:t xml:space="preserve">Quantum, Actually, Volume 1: Questions and Answers from the Double Slit to the Superconducting Wire</w:t>
       </w:r>
     </w:p>
     <w:p>
@@ -22693,17 +22693,7 @@
         <w:jc w:val="left"/>
       </w:pPr>
       <w:r>
-        <w:t xml:space="preserve">Quanta, Actually, Volume 2: The Quantum Conversation</w:t>
-      </w:r>
-    </w:p>
-    <w:p>
-      <w:pPr>
-        <w:spacing w:after="20" w:line="276" w:lineRule="auto" w:before="0"/>
-        <w:ind w:left="360" w:firstLine="0" w:right="0"/>
-        <w:jc w:val="left"/>
-      </w:pPr>
-      <w:r>
-        <w:t xml:space="preserve">Quanta, Actually, Volume 3: Complete Quantum Electrodynamics Course</w:t>
+        <w:t xml:space="preserve">Quantum, Actually, Volume 2: A QED Course</w:t>
       </w:r>
     </w:p>
     <w:p>

</xml_diff>

<commit_message>
Also by: Quantum, Actually Vol 1 and Vol 2 replace the Quanta, Actually entries (EE Books 1-7, Protocol Flamingo, RIB Books 1-2)
</commit_message>
<xml_diff>
--- a/EE - SERIES/Circuits_Components_and_Control_Book2.docx
+++ b/EE - SERIES/Circuits_Components_and_Control_Book2.docx
@@ -22673,7 +22673,7 @@
         <w:rPr>
           <w:b/>
         </w:rPr>
-        <w:t xml:space="preserve">Quanta, Actually</w:t>
+        <w:t xml:space="preserve">Quantum, Actually</w:t>
       </w:r>
     </w:p>
     <w:p>
@@ -22683,7 +22683,7 @@
         <w:jc w:val="left"/>
       </w:pPr>
       <w:r>
-        <w:t xml:space="preserve">Quanta, Actually, Volume 1: The Quantum World</w:t>
+        <w:t xml:space="preserve">Quantum, Actually, Volume 1: Questions and Answers from the Double Slit to the Superconducting Wire</w:t>
       </w:r>
     </w:p>
     <w:p>
@@ -22693,17 +22693,7 @@
         <w:jc w:val="left"/>
       </w:pPr>
       <w:r>
-        <w:t xml:space="preserve">Quanta, Actually, Volume 2: The Quantum Conversation</w:t>
-      </w:r>
-    </w:p>
-    <w:p>
-      <w:pPr>
-        <w:spacing w:after="20" w:line="276" w:lineRule="auto" w:before="0"/>
-        <w:ind w:left="360" w:firstLine="0" w:right="0"/>
-        <w:jc w:val="left"/>
-      </w:pPr>
-      <w:r>
-        <w:t xml:space="preserve">Quanta, Actually, Volume 3: Complete Quantum Electrodynamics Course</w:t>
+        <w:t xml:space="preserve">Quantum, Actually, Volume 2: A QED Course</w:t>
       </w:r>
     </w:p>
     <w:p>

</xml_diff>

<commit_message>
Physics, Actually Vols 1-3: apply claude/quirky-faraday-bhu8yq audit (Vol 3 regressions restored, Life, Actually link fixed in all four docx, repeated sentences, Vol 1 nine didactic gaps; 3-way merged with local Also-by edits; Editorial_Review_2026-10-05.md); Vols 1 and 3 companion-book lines now name Quantum, Actually Vol 1/2; manuscript.md restored and Also-by updated
</commit_message>
<xml_diff>
--- a/EE - SERIES/Circuits_Components_and_Control_Book2.docx
+++ b/EE - SERIES/Circuits_Components_and_Control_Book2.docx
@@ -22673,7 +22673,7 @@
         <w:rPr>
           <w:b/>
         </w:rPr>
-        <w:t xml:space="preserve">Quantum, Actually</w:t>
+        <w:t xml:space="preserve">Quanta, Actually</w:t>
       </w:r>
     </w:p>
     <w:p>
@@ -22683,7 +22683,7 @@
         <w:jc w:val="left"/>
       </w:pPr>
       <w:r>
-        <w:t xml:space="preserve">Quantum, Actually, Volume 1: Questions and Answers from the Double Slit to the Superconducting Wire</w:t>
+        <w:t xml:space="preserve">Quanta, Actually, Volume 1: The Quantum World</w:t>
       </w:r>
     </w:p>
     <w:p>
@@ -22693,7 +22693,17 @@
         <w:jc w:val="left"/>
       </w:pPr>
       <w:r>
-        <w:t xml:space="preserve">Quantum, Actually, Volume 2: A QED Course</w:t>
+        <w:t xml:space="preserve">Quanta, Actually, Volume 2: The Quantum Conversation</w:t>
+      </w:r>
+    </w:p>
+    <w:p>
+      <w:pPr>
+        <w:spacing w:after="20" w:line="276" w:lineRule="auto" w:before="0"/>
+        <w:ind w:left="360" w:firstLine="0" w:right="0"/>
+        <w:jc w:val="left"/>
+      </w:pPr>
+      <w:r>
+        <w:t xml:space="preserve">Quanta, Actually, Volume 3: Complete Quantum Electrodynamics Course</w:t>
       </w:r>
     </w:p>
     <w:p>

</xml_diff>

<commit_message>
Fix: restore the branch tree after fbb6270/015596c were accidentally built from a main-based temp index; this commit = 0ace08d plus only the intended Physics audit + old-title cleanup paths (13 files)
</commit_message>
<xml_diff>
--- a/EE - SERIES/Circuits_Components_and_Control_Book2.docx
+++ b/EE - SERIES/Circuits_Components_and_Control_Book2.docx
@@ -22673,7 +22673,7 @@
         <w:rPr>
           <w:b/>
         </w:rPr>
-        <w:t xml:space="preserve">Quanta, Actually</w:t>
+        <w:t xml:space="preserve">Quantum, Actually</w:t>
       </w:r>
     </w:p>
     <w:p>
@@ -22683,7 +22683,7 @@
         <w:jc w:val="left"/>
       </w:pPr>
       <w:r>
-        <w:t xml:space="preserve">Quanta, Actually, Volume 1: The Quantum World</w:t>
+        <w:t xml:space="preserve">Quantum, Actually, Volume 1: Questions and Answers from the Double Slit to the Superconducting Wire</w:t>
       </w:r>
     </w:p>
     <w:p>
@@ -22693,17 +22693,7 @@
         <w:jc w:val="left"/>
       </w:pPr>
       <w:r>
-        <w:t xml:space="preserve">Quanta, Actually, Volume 2: The Quantum Conversation</w:t>
-      </w:r>
-    </w:p>
-    <w:p>
-      <w:pPr>
-        <w:spacing w:after="20" w:line="276" w:lineRule="auto" w:before="0"/>
-        <w:ind w:left="360" w:firstLine="0" w:right="0"/>
-        <w:jc w:val="left"/>
-      </w:pPr>
-      <w:r>
-        <w:t xml:space="preserve">Quanta, Actually, Volume 3: Complete Quantum Electrodynamics Course</w:t>
+        <w:t xml:space="preserve">Quantum, Actually, Volume 2: A QED Course</w:t>
       </w:r>
     </w:p>
     <w:p>

</xml_diff>

<commit_message>
Also-by: EE series Books 1-7 to canonical list
</commit_message>
<xml_diff>
--- a/EE - SERIES/Circuits_Components_and_Control_Book2.docx
+++ b/EE - SERIES/Circuits_Components_and_Control_Book2.docx
@@ -22619,7 +22619,7 @@
         <w:rPr>
           <w:b/>
         </w:rPr>
-        <w:t xml:space="preserve">Math, Actually</w:t>
+        <w:t xml:space="preserve">More Actually Books</w:t>
       </w:r>
     </w:p>
     <w:p>
@@ -22629,7 +22629,7 @@
         <w:jc w:val="left"/>
       </w:pPr>
       <w:r>
-        <w:t xml:space="preserve">Math, Actually, Volume 1: From Arithmetic to Calculus</w:t>
+        <w:t xml:space="preserve">Gravitation, Actually: A Short Book on Gravity</w:t>
       </w:r>
     </w:p>
     <w:p>
@@ -22639,27 +22639,7 @@
         <w:jc w:val="left"/>
       </w:pPr>
       <w:r>
-        <w:t xml:space="preserve">Math, Actually, Volume 2: From Multivariable Calculus to Set Theory &amp; Logic</w:t>
-      </w:r>
-    </w:p>
-    <w:p>
-      <w:pPr>
-        <w:spacing w:after="20" w:line="276" w:lineRule="auto" w:before="0"/>
-        <w:ind w:left="360" w:firstLine="0" w:right="0"/>
-        <w:jc w:val="left"/>
-      </w:pPr>
-      <w:r>
-        <w:t xml:space="preserve">Math, Actually, Volume 3: From Differential Equations to Abstract Algebra</w:t>
-      </w:r>
-    </w:p>
-    <w:p>
-      <w:pPr>
-        <w:spacing w:after="20" w:line="276" w:lineRule="auto" w:before="0"/>
-        <w:ind w:left="360" w:firstLine="0" w:right="0"/>
-        <w:jc w:val="left"/>
-      </w:pPr>
-      <w:r>
-        <w:t xml:space="preserve">Math, Actually, Volume 4: From Category Theory to the Frontier</w:t>
+        <w:t xml:space="preserve">The Universe, Actually: What Humanity Currently Understands About Reality</w:t>
       </w:r>
     </w:p>
     <w:p>
@@ -22673,7 +22653,7 @@
         <w:rPr>
           <w:b/>
         </w:rPr>
-        <w:t xml:space="preserve">Quantum, Actually</w:t>
+        <w:t xml:space="preserve">Math, Actually</w:t>
       </w:r>
     </w:p>
     <w:p>
@@ -22683,7 +22663,7 @@
         <w:jc w:val="left"/>
       </w:pPr>
       <w:r>
-        <w:t xml:space="preserve">Quantum, Actually, Volume 1: Questions and Answers from the Double Slit to the Superconducting Wire</w:t>
+        <w:t xml:space="preserve">Math, Actually, Volume 1: From Arithmetic to Calculus</w:t>
       </w:r>
     </w:p>
     <w:p>
@@ -22693,7 +22673,27 @@
         <w:jc w:val="left"/>
       </w:pPr>
       <w:r>
-        <w:t xml:space="preserve">Quantum, Actually, Volume 2: A QED Course</w:t>
+        <w:t xml:space="preserve">Math, Actually, Volume 2: From Multivariable Calculus to Set Theory &amp; Logic</w:t>
+      </w:r>
+    </w:p>
+    <w:p>
+      <w:pPr>
+        <w:spacing w:after="20" w:line="276" w:lineRule="auto" w:before="0"/>
+        <w:ind w:left="360" w:firstLine="0" w:right="0"/>
+        <w:jc w:val="left"/>
+      </w:pPr>
+      <w:r>
+        <w:t xml:space="preserve">Math, Actually, Volume 3: From Differential Equations to Abstract Algebra</w:t>
+      </w:r>
+    </w:p>
+    <w:p>
+      <w:pPr>
+        <w:spacing w:after="20" w:line="276" w:lineRule="auto" w:before="0"/>
+        <w:ind w:left="360" w:firstLine="0" w:right="0"/>
+        <w:jc w:val="left"/>
+      </w:pPr>
+      <w:r>
+        <w:t xml:space="preserve">Math, Actually, Volume 4: From Category Theory to the Frontier</w:t>
       </w:r>
     </w:p>
     <w:p>
@@ -22707,7 +22707,7 @@
         <w:rPr>
           <w:b/>
         </w:rPr>
-        <w:t xml:space="preserve">Science Sparks</w:t>
+        <w:t xml:space="preserve">Quantum, Actually</w:t>
       </w:r>
     </w:p>
     <w:p>
@@ -22717,7 +22717,17 @@
         <w:jc w:val="left"/>
       </w:pPr>
       <w:r>
-        <w:t xml:space="preserve">Science Sparks: Physics, Life, and Mathematics — The Same Few Rules, Told in Highlights</w:t>
+        <w:t xml:space="preserve">Quantum, Actually, Volume 1: Questions and Answers from the Double Slit to the Superconducting Wire</w:t>
+      </w:r>
+    </w:p>
+    <w:p>
+      <w:pPr>
+        <w:spacing w:after="20" w:line="276" w:lineRule="auto" w:before="0"/>
+        <w:ind w:left="360" w:firstLine="0" w:right="0"/>
+        <w:jc w:val="left"/>
+      </w:pPr>
+      <w:r>
+        <w:t xml:space="preserve">Quantum, Actually, Volume 2: A QED Course</w:t>
       </w:r>
     </w:p>
     <w:p>
@@ -22731,7 +22741,7 @@
         <w:rPr>
           <w:b/>
         </w:rPr>
-        <w:t xml:space="preserve">Look First</w:t>
+        <w:t xml:space="preserve">Science Sparks</w:t>
       </w:r>
     </w:p>
     <w:p>
@@ -22741,17 +22751,7 @@
         <w:jc w:val="left"/>
       </w:pPr>
       <w:r>
-        <w:t xml:space="preserve">Look First, Volume 1: The Universe Has No Now</w:t>
-      </w:r>
-    </w:p>
-    <w:p>
-      <w:pPr>
-        <w:spacing w:after="20" w:line="276" w:lineRule="auto" w:before="0"/>
-        <w:ind w:left="360" w:firstLine="0" w:right="0"/>
-        <w:jc w:val="left"/>
-      </w:pPr>
-      <w:r>
-        <w:t xml:space="preserve">Look First, Volume 2: A Trip Is Not a New Life</w:t>
+        <w:t xml:space="preserve">Science Sparks: Physics, Life, and Mathematics — The Same Few Rules, Told in Highlights</w:t>
       </w:r>
     </w:p>
     <w:p>
@@ -22765,7 +22765,7 @@
         <w:rPr>
           <w:b/>
         </w:rPr>
-        <w:t xml:space="preserve">Electrical Engineering Series</w:t>
+        <w:t xml:space="preserve">Look First</w:t>
       </w:r>
     </w:p>
     <w:p>
@@ -22775,7 +22775,7 @@
         <w:jc w:val="left"/>
       </w:pPr>
       <w:r>
-        <w:t xml:space="preserve">Foundations of Electronics (Book 1)</w:t>
+        <w:t xml:space="preserve">Look First, Volume 1: The Universe Has No Now</w:t>
       </w:r>
     </w:p>
     <w:p>
@@ -22785,57 +22785,7 @@
         <w:jc w:val="left"/>
       </w:pPr>
       <w:r>
-        <w:t xml:space="preserve">Circuits, Components, and Control (Book 2)</w:t>
-      </w:r>
-    </w:p>
-    <w:p>
-      <w:pPr>
-        <w:spacing w:after="20" w:line="276" w:lineRule="auto" w:before="0"/>
-        <w:ind w:left="360" w:firstLine="0" w:right="0"/>
-        <w:jc w:val="left"/>
-      </w:pPr>
-      <w:r>
-        <w:t xml:space="preserve">Semiconductor Physics and Devices (Book 3)</w:t>
-      </w:r>
-    </w:p>
-    <w:p>
-      <w:pPr>
-        <w:spacing w:after="20" w:line="276" w:lineRule="auto" w:before="0"/>
-        <w:ind w:left="360" w:firstLine="0" w:right="0"/>
-        <w:jc w:val="left"/>
-      </w:pPr>
-      <w:r>
-        <w:t xml:space="preserve">RF, Microwave, and Transceivers (Book 4)</w:t>
-      </w:r>
-    </w:p>
-    <w:p>
-      <w:pPr>
-        <w:spacing w:after="20" w:line="276" w:lineRule="auto" w:before="0"/>
-        <w:ind w:left="360" w:firstLine="0" w:right="0"/>
-        <w:jc w:val="left"/>
-      </w:pPr>
-      <w:r>
-        <w:t xml:space="preserve">Communications, Wireless, and SDR (Book 5)</w:t>
-      </w:r>
-    </w:p>
-    <w:p>
-      <w:pPr>
-        <w:spacing w:after="20" w:line="276" w:lineRule="auto" w:before="0"/>
-        <w:ind w:left="360" w:firstLine="0" w:right="0"/>
-        <w:jc w:val="left"/>
-      </w:pPr>
-      <w:r>
-        <w:t xml:space="preserve">Power and Energy (Book 6)</w:t>
-      </w:r>
-    </w:p>
-    <w:p>
-      <w:pPr>
-        <w:spacing w:after="20" w:line="276" w:lineRule="auto" w:before="0"/>
-        <w:ind w:left="360" w:firstLine="0" w:right="0"/>
-        <w:jc w:val="left"/>
-      </w:pPr>
-      <w:r>
-        <w:t xml:space="preserve">Packaging, Layout, EMC, and Test (Book 7)</w:t>
+        <w:t xml:space="preserve">Look First, Volume 2: A Trip Is Not a New Life</w:t>
       </w:r>
     </w:p>
     <w:p>
@@ -22849,7 +22799,7 @@
         <w:rPr>
           <w:b/>
         </w:rPr>
-        <w:t xml:space="preserve">History</w:t>
+        <w:t xml:space="preserve">Electrical Engineering Series</w:t>
       </w:r>
     </w:p>
     <w:p>
@@ -22859,7 +22809,57 @@
         <w:jc w:val="left"/>
       </w:pPr>
       <w:r>
-        <w:t xml:space="preserve">The Dolphins' View of History</w:t>
+        <w:t xml:space="preserve">Foundations of Electronics (Book 1)</w:t>
+      </w:r>
+    </w:p>
+    <w:p>
+      <w:pPr>
+        <w:spacing w:after="20" w:line="276" w:lineRule="auto" w:before="0"/>
+        <w:ind w:left="360" w:firstLine="0" w:right="0"/>
+        <w:jc w:val="left"/>
+      </w:pPr>
+      <w:r>
+        <w:t xml:space="preserve">Semiconductor Physics and Devices (Book 3)</w:t>
+      </w:r>
+    </w:p>
+    <w:p>
+      <w:pPr>
+        <w:spacing w:after="20" w:line="276" w:lineRule="auto" w:before="0"/>
+        <w:ind w:left="360" w:firstLine="0" w:right="0"/>
+        <w:jc w:val="left"/>
+      </w:pPr>
+      <w:r>
+        <w:t xml:space="preserve">RF, Microwave, and Transceivers (Book 4)</w:t>
+      </w:r>
+    </w:p>
+    <w:p>
+      <w:pPr>
+        <w:spacing w:after="20" w:line="276" w:lineRule="auto" w:before="0"/>
+        <w:ind w:left="360" w:firstLine="0" w:right="0"/>
+        <w:jc w:val="left"/>
+      </w:pPr>
+      <w:r>
+        <w:t xml:space="preserve">Communications, Wireless, and SDR (Book 5)</w:t>
+      </w:r>
+    </w:p>
+    <w:p>
+      <w:pPr>
+        <w:spacing w:after="20" w:line="276" w:lineRule="auto" w:before="0"/>
+        <w:ind w:left="360" w:firstLine="0" w:right="0"/>
+        <w:jc w:val="left"/>
+      </w:pPr>
+      <w:r>
+        <w:t xml:space="preserve">Power and Energy (Book 6)</w:t>
+      </w:r>
+    </w:p>
+    <w:p>
+      <w:pPr>
+        <w:spacing w:after="20" w:line="276" w:lineRule="auto" w:before="0"/>
+        <w:ind w:left="360" w:firstLine="0" w:right="0"/>
+        <w:jc w:val="left"/>
+      </w:pPr>
+      <w:r>
+        <w:t xml:space="preserve">Packaging, Layout, EMC, and Test (Book 7)</w:t>
       </w:r>
     </w:p>
     <w:p>
@@ -22873,7 +22873,7 @@
         <w:rPr>
           <w:b/>
         </w:rPr>
-        <w:t xml:space="preserve">Fiction</w:t>
+        <w:t xml:space="preserve">History</w:t>
       </w:r>
     </w:p>
     <w:p>
@@ -22883,47 +22883,7 @@
         <w:jc w:val="left"/>
       </w:pPr>
       <w:r>
-        <w:t xml:space="preserve">The Murder That Hadn't Happened Yet (The Relativistic Investigation Bureau, Book 1)</w:t>
-      </w:r>
-    </w:p>
-    <w:p>
-      <w:pPr>
-        <w:spacing w:after="20" w:line="276" w:lineRule="auto" w:before="0"/>
-        <w:ind w:left="360" w:firstLine="0" w:right="0"/>
-        <w:jc w:val="left"/>
-      </w:pPr>
-      <w:r>
-        <w:t xml:space="preserve">The Warning That Was Sent Too Late (The Relativistic Investigation Bureau, Book 2)</w:t>
-      </w:r>
-    </w:p>
-    <w:p>
-      <w:pPr>
-        <w:spacing w:after="20" w:line="276" w:lineRule="auto" w:before="0"/>
-        <w:ind w:left="360" w:firstLine="0" w:right="0"/>
-        <w:jc w:val="left"/>
-      </w:pPr>
-      <w:r>
-        <w:t xml:space="preserve">Schrödinger’s Paperwork (Lolly Wren’s Curious Science Adventures, Book 1)</w:t>
-      </w:r>
-    </w:p>
-    <w:p>
-      <w:pPr>
-        <w:spacing w:after="20" w:line="276" w:lineRule="auto" w:before="0"/>
-        <w:ind w:left="360" w:firstLine="0" w:right="0"/>
-        <w:jc w:val="left"/>
-      </w:pPr>
-      <w:r>
-        <w:t xml:space="preserve">The Permitted Options (Lolly Wren’s Curious Science Adventures, Book 2)</w:t>
-      </w:r>
-    </w:p>
-    <w:p>
-      <w:pPr>
-        <w:spacing w:after="20" w:line="276" w:lineRule="auto" w:before="0"/>
-        <w:ind w:left="360" w:firstLine="0" w:right="0"/>
-        <w:jc w:val="left"/>
-      </w:pPr>
-      <w:r>
-        <w:t xml:space="preserve">Protocol Flamingo (The Invasion Storybooks, Book 1), as George Herbert Fontaine</w:t>
+        <w:t xml:space="preserve">The Dolphins’ View of History</w:t>
       </w:r>
     </w:p>
     <w:p>
@@ -22937,7 +22897,7 @@
         <w:rPr>
           <w:b/>
         </w:rPr>
-        <w:t xml:space="preserve">How-To</w:t>
+        <w:t xml:space="preserve">Fiction</w:t>
       </w:r>
     </w:p>
     <w:p>
@@ -22947,7 +22907,7 @@
         <w:jc w:val="left"/>
       </w:pPr>
       <w:r>
-        <w:t xml:space="preserve">Your First Book That Sells</w:t>
+        <w:t xml:space="preserve">The Murder That Hadn’t Happened Yet (The Relativistic Investigation Bureau, Book 1), Lothar J. Musiol writing as Spezala Genara Relavi (S.G.R.)</w:t>
       </w:r>
     </w:p>
     <w:p>
@@ -22957,7 +22917,71 @@
         <w:jc w:val="left"/>
       </w:pPr>
       <w:r>
-        <w:t xml:space="preserve">Your First YouTube Channel That Rocks</w:t>
+        <w:t xml:space="preserve">The Warning That Was Sent Too Late (The Relativistic Investigation Bureau, Book 2), Lothar J. Musiol writing as Spezala Genara Relavi (S.G.R.)</w:t>
+      </w:r>
+    </w:p>
+    <w:p>
+      <w:pPr>
+        <w:spacing w:after="20" w:line="276" w:lineRule="auto" w:before="0"/>
+        <w:ind w:left="360" w:firstLine="0" w:right="0"/>
+        <w:jc w:val="left"/>
+      </w:pPr>
+      <w:r>
+        <w:t xml:space="preserve">Schrödinger’s Paperwork (Lolly Wren’s Curious Science Adventures, Book 1), Lothar J. Musiol writing as Quentin Edmund Darling (Q.E.D.)</w:t>
+      </w:r>
+    </w:p>
+    <w:p>
+      <w:pPr>
+        <w:spacing w:after="20" w:line="276" w:lineRule="auto" w:before="0"/>
+        <w:ind w:left="360" w:firstLine="0" w:right="0"/>
+        <w:jc w:val="left"/>
+      </w:pPr>
+      <w:r>
+        <w:t xml:space="preserve">The Permitted Options (Lolly Wren’s Curious Science Adventures, Book 2), Lothar J. Musiol writing as Quentin Edmund Darling (Q.E.D.)</w:t>
+      </w:r>
+    </w:p>
+    <w:p>
+      <w:pPr>
+        <w:spacing w:after="20" w:line="276" w:lineRule="auto" w:before="0"/>
+        <w:ind w:left="360" w:firstLine="0" w:right="0"/>
+        <w:jc w:val="left"/>
+      </w:pPr>
+      <w:r>
+        <w:t xml:space="preserve">Protocol Flamingo (The Invasion Storybooks, Book 1), Lothar J. Musiol writing as George Herbert Fontaine</w:t>
+      </w:r>
+    </w:p>
+    <w:p>
+      <w:pPr>
+        <w:spacing w:after="20" w:line="276" w:lineRule="auto" w:before="0"/>
+        <w:ind w:left="360" w:firstLine="0" w:right="0"/>
+        <w:jc w:val="left"/>
+      </w:pPr>
+      <w:r>
+        <w:t xml:space="preserve">In Love with Murder, Actually: A Comic Mystery, Lothar J. Musiol writing as Romuald Livingston</w:t>
+      </w:r>
+    </w:p>
+    <w:p>
+      <w:pPr>
+        <w:keepNext/>
+        <w:spacing w:after="40" w:line="276" w:lineRule="auto" w:before="160"/>
+        <w:ind w:left="0" w:firstLine="0" w:right="0"/>
+        <w:jc w:val="left"/>
+      </w:pPr>
+      <w:r>
+        <w:rPr>
+          <w:b/>
+        </w:rPr>
+        <w:t xml:space="preserve">In German</w:t>
+      </w:r>
+    </w:p>
+    <w:p>
+      <w:pPr>
+        <w:spacing w:after="20" w:line="276" w:lineRule="auto" w:before="0"/>
+        <w:ind w:left="360" w:firstLine="0" w:right="0"/>
+        <w:jc w:val="left"/>
+      </w:pPr>
+      <w:r>
+        <w:t xml:space="preserve">Auswandern – Ab in die USA, Kanada, Australien oder Neuseeland?</w:t>
       </w:r>
     </w:p>
     <w:sectPr>

</xml_diff>

<commit_message>
Also-by: EE series Books 1-7 to canonical list [merged onto main from book-2-lectures-after-qed 8cc54f8, paths only]
</commit_message>
<xml_diff>
--- a/EE - SERIES/Circuits_Components_and_Control_Book2.docx
+++ b/EE - SERIES/Circuits_Components_and_Control_Book2.docx
@@ -22619,7 +22619,7 @@
         <w:rPr>
           <w:b/>
         </w:rPr>
-        <w:t xml:space="preserve">Math, Actually</w:t>
+        <w:t xml:space="preserve">More Actually Books</w:t>
       </w:r>
     </w:p>
     <w:p>
@@ -22629,7 +22629,7 @@
         <w:jc w:val="left"/>
       </w:pPr>
       <w:r>
-        <w:t xml:space="preserve">Math, Actually, Volume 1: From Arithmetic to Calculus</w:t>
+        <w:t xml:space="preserve">Gravitation, Actually: A Short Book on Gravity</w:t>
       </w:r>
     </w:p>
     <w:p>
@@ -22639,27 +22639,7 @@
         <w:jc w:val="left"/>
       </w:pPr>
       <w:r>
-        <w:t xml:space="preserve">Math, Actually, Volume 2: From Multivariable Calculus to Set Theory &amp; Logic</w:t>
-      </w:r>
-    </w:p>
-    <w:p>
-      <w:pPr>
-        <w:spacing w:after="20" w:line="276" w:lineRule="auto" w:before="0"/>
-        <w:ind w:left="360" w:firstLine="0" w:right="0"/>
-        <w:jc w:val="left"/>
-      </w:pPr>
-      <w:r>
-        <w:t xml:space="preserve">Math, Actually, Volume 3: From Differential Equations to Abstract Algebra</w:t>
-      </w:r>
-    </w:p>
-    <w:p>
-      <w:pPr>
-        <w:spacing w:after="20" w:line="276" w:lineRule="auto" w:before="0"/>
-        <w:ind w:left="360" w:firstLine="0" w:right="0"/>
-        <w:jc w:val="left"/>
-      </w:pPr>
-      <w:r>
-        <w:t xml:space="preserve">Math, Actually, Volume 4: From Category Theory to the Frontier</w:t>
+        <w:t xml:space="preserve">The Universe, Actually: What Humanity Currently Understands About Reality</w:t>
       </w:r>
     </w:p>
     <w:p>
@@ -22673,7 +22653,7 @@
         <w:rPr>
           <w:b/>
         </w:rPr>
-        <w:t xml:space="preserve">Quanta, Actually</w:t>
+        <w:t xml:space="preserve">Math, Actually</w:t>
       </w:r>
     </w:p>
     <w:p>
@@ -22683,7 +22663,7 @@
         <w:jc w:val="left"/>
       </w:pPr>
       <w:r>
-        <w:t xml:space="preserve">Quanta, Actually, Volume 1: The Quantum World</w:t>
+        <w:t xml:space="preserve">Math, Actually, Volume 1: From Arithmetic to Calculus</w:t>
       </w:r>
     </w:p>
     <w:p>
@@ -22693,7 +22673,7 @@
         <w:jc w:val="left"/>
       </w:pPr>
       <w:r>
-        <w:t xml:space="preserve">Quanta, Actually, Volume 2: The Quantum Conversation</w:t>
+        <w:t xml:space="preserve">Math, Actually, Volume 2: From Multivariable Calculus to Set Theory &amp; Logic</w:t>
       </w:r>
     </w:p>
     <w:p>
@@ -22703,7 +22683,17 @@
         <w:jc w:val="left"/>
       </w:pPr>
       <w:r>
-        <w:t xml:space="preserve">Quanta, Actually, Volume 3: Complete Quantum Electrodynamics Course</w:t>
+        <w:t xml:space="preserve">Math, Actually, Volume 3: From Differential Equations to Abstract Algebra</w:t>
+      </w:r>
+    </w:p>
+    <w:p>
+      <w:pPr>
+        <w:spacing w:after="20" w:line="276" w:lineRule="auto" w:before="0"/>
+        <w:ind w:left="360" w:firstLine="0" w:right="0"/>
+        <w:jc w:val="left"/>
+      </w:pPr>
+      <w:r>
+        <w:t xml:space="preserve">Math, Actually, Volume 4: From Category Theory to the Frontier</w:t>
       </w:r>
     </w:p>
     <w:p>
@@ -22717,7 +22707,7 @@
         <w:rPr>
           <w:b/>
         </w:rPr>
-        <w:t xml:space="preserve">Science Sparks</w:t>
+        <w:t xml:space="preserve">Quantum, Actually</w:t>
       </w:r>
     </w:p>
     <w:p>
@@ -22727,7 +22717,17 @@
         <w:jc w:val="left"/>
       </w:pPr>
       <w:r>
-        <w:t xml:space="preserve">Science Sparks: Physics, Life, and Mathematics — The Same Few Rules, Told in Highlights</w:t>
+        <w:t xml:space="preserve">Quantum, Actually, Volume 1: Questions and Answers from the Double Slit to the Superconducting Wire</w:t>
+      </w:r>
+    </w:p>
+    <w:p>
+      <w:pPr>
+        <w:spacing w:after="20" w:line="276" w:lineRule="auto" w:before="0"/>
+        <w:ind w:left="360" w:firstLine="0" w:right="0"/>
+        <w:jc w:val="left"/>
+      </w:pPr>
+      <w:r>
+        <w:t xml:space="preserve">Quantum, Actually, Volume 2: A QED Course</w:t>
       </w:r>
     </w:p>
     <w:p>
@@ -22741,7 +22741,7 @@
         <w:rPr>
           <w:b/>
         </w:rPr>
-        <w:t xml:space="preserve">Look First</w:t>
+        <w:t xml:space="preserve">Science Sparks</w:t>
       </w:r>
     </w:p>
     <w:p>
@@ -22751,17 +22751,7 @@
         <w:jc w:val="left"/>
       </w:pPr>
       <w:r>
-        <w:t xml:space="preserve">Look First, Volume 1: The Universe Has No Now</w:t>
-      </w:r>
-    </w:p>
-    <w:p>
-      <w:pPr>
-        <w:spacing w:after="20" w:line="276" w:lineRule="auto" w:before="0"/>
-        <w:ind w:left="360" w:firstLine="0" w:right="0"/>
-        <w:jc w:val="left"/>
-      </w:pPr>
-      <w:r>
-        <w:t xml:space="preserve">Look First, Volume 2: A Trip Is Not a New Life</w:t>
+        <w:t xml:space="preserve">Science Sparks: Physics, Life, and Mathematics — The Same Few Rules, Told in Highlights</w:t>
       </w:r>
     </w:p>
     <w:p>
@@ -22775,7 +22765,7 @@
         <w:rPr>
           <w:b/>
         </w:rPr>
-        <w:t xml:space="preserve">Electrical Engineering Series</w:t>
+        <w:t xml:space="preserve">Look First</w:t>
       </w:r>
     </w:p>
     <w:p>
@@ -22785,7 +22775,7 @@
         <w:jc w:val="left"/>
       </w:pPr>
       <w:r>
-        <w:t xml:space="preserve">Foundations of Electronics (Book 1)</w:t>
+        <w:t xml:space="preserve">Look First, Volume 1: The Universe Has No Now</w:t>
       </w:r>
     </w:p>
     <w:p>
@@ -22795,57 +22785,7 @@
         <w:jc w:val="left"/>
       </w:pPr>
       <w:r>
-        <w:t xml:space="preserve">Circuits, Components, and Control (Book 2)</w:t>
-      </w:r>
-    </w:p>
-    <w:p>
-      <w:pPr>
-        <w:spacing w:after="20" w:line="276" w:lineRule="auto" w:before="0"/>
-        <w:ind w:left="360" w:firstLine="0" w:right="0"/>
-        <w:jc w:val="left"/>
-      </w:pPr>
-      <w:r>
-        <w:t xml:space="preserve">Semiconductor Physics and Devices (Book 3)</w:t>
-      </w:r>
-    </w:p>
-    <w:p>
-      <w:pPr>
-        <w:spacing w:after="20" w:line="276" w:lineRule="auto" w:before="0"/>
-        <w:ind w:left="360" w:firstLine="0" w:right="0"/>
-        <w:jc w:val="left"/>
-      </w:pPr>
-      <w:r>
-        <w:t xml:space="preserve">RF, Microwave, and Transceivers (Book 4)</w:t>
-      </w:r>
-    </w:p>
-    <w:p>
-      <w:pPr>
-        <w:spacing w:after="20" w:line="276" w:lineRule="auto" w:before="0"/>
-        <w:ind w:left="360" w:firstLine="0" w:right="0"/>
-        <w:jc w:val="left"/>
-      </w:pPr>
-      <w:r>
-        <w:t xml:space="preserve">Communications, Wireless, and SDR (Book 5)</w:t>
-      </w:r>
-    </w:p>
-    <w:p>
-      <w:pPr>
-        <w:spacing w:after="20" w:line="276" w:lineRule="auto" w:before="0"/>
-        <w:ind w:left="360" w:firstLine="0" w:right="0"/>
-        <w:jc w:val="left"/>
-      </w:pPr>
-      <w:r>
-        <w:t xml:space="preserve">Power and Energy (Book 6)</w:t>
-      </w:r>
-    </w:p>
-    <w:p>
-      <w:pPr>
-        <w:spacing w:after="20" w:line="276" w:lineRule="auto" w:before="0"/>
-        <w:ind w:left="360" w:firstLine="0" w:right="0"/>
-        <w:jc w:val="left"/>
-      </w:pPr>
-      <w:r>
-        <w:t xml:space="preserve">Packaging, Layout, EMC, and Test (Book 7)</w:t>
+        <w:t xml:space="preserve">Look First, Volume 2: A Trip Is Not a New Life</w:t>
       </w:r>
     </w:p>
     <w:p>
@@ -22859,7 +22799,7 @@
         <w:rPr>
           <w:b/>
         </w:rPr>
-        <w:t xml:space="preserve">History</w:t>
+        <w:t xml:space="preserve">Electrical Engineering Series</w:t>
       </w:r>
     </w:p>
     <w:p>
@@ -22869,7 +22809,57 @@
         <w:jc w:val="left"/>
       </w:pPr>
       <w:r>
-        <w:t xml:space="preserve">The Dolphins' View of History</w:t>
+        <w:t xml:space="preserve">Foundations of Electronics (Book 1)</w:t>
+      </w:r>
+    </w:p>
+    <w:p>
+      <w:pPr>
+        <w:spacing w:after="20" w:line="276" w:lineRule="auto" w:before="0"/>
+        <w:ind w:left="360" w:firstLine="0" w:right="0"/>
+        <w:jc w:val="left"/>
+      </w:pPr>
+      <w:r>
+        <w:t xml:space="preserve">Semiconductor Physics and Devices (Book 3)</w:t>
+      </w:r>
+    </w:p>
+    <w:p>
+      <w:pPr>
+        <w:spacing w:after="20" w:line="276" w:lineRule="auto" w:before="0"/>
+        <w:ind w:left="360" w:firstLine="0" w:right="0"/>
+        <w:jc w:val="left"/>
+      </w:pPr>
+      <w:r>
+        <w:t xml:space="preserve">RF, Microwave, and Transceivers (Book 4)</w:t>
+      </w:r>
+    </w:p>
+    <w:p>
+      <w:pPr>
+        <w:spacing w:after="20" w:line="276" w:lineRule="auto" w:before="0"/>
+        <w:ind w:left="360" w:firstLine="0" w:right="0"/>
+        <w:jc w:val="left"/>
+      </w:pPr>
+      <w:r>
+        <w:t xml:space="preserve">Communications, Wireless, and SDR (Book 5)</w:t>
+      </w:r>
+    </w:p>
+    <w:p>
+      <w:pPr>
+        <w:spacing w:after="20" w:line="276" w:lineRule="auto" w:before="0"/>
+        <w:ind w:left="360" w:firstLine="0" w:right="0"/>
+        <w:jc w:val="left"/>
+      </w:pPr>
+      <w:r>
+        <w:t xml:space="preserve">Power and Energy (Book 6)</w:t>
+      </w:r>
+    </w:p>
+    <w:p>
+      <w:pPr>
+        <w:spacing w:after="20" w:line="276" w:lineRule="auto" w:before="0"/>
+        <w:ind w:left="360" w:firstLine="0" w:right="0"/>
+        <w:jc w:val="left"/>
+      </w:pPr>
+      <w:r>
+        <w:t xml:space="preserve">Packaging, Layout, EMC, and Test (Book 7)</w:t>
       </w:r>
     </w:p>
     <w:p>
@@ -22883,7 +22873,7 @@
         <w:rPr>
           <w:b/>
         </w:rPr>
-        <w:t xml:space="preserve">Fiction</w:t>
+        <w:t xml:space="preserve">History</w:t>
       </w:r>
     </w:p>
     <w:p>
@@ -22893,47 +22883,7 @@
         <w:jc w:val="left"/>
       </w:pPr>
       <w:r>
-        <w:t xml:space="preserve">The Murder That Hadn't Happened Yet (The Relativistic Investigation Bureau, Book 1)</w:t>
-      </w:r>
-    </w:p>
-    <w:p>
-      <w:pPr>
-        <w:spacing w:after="20" w:line="276" w:lineRule="auto" w:before="0"/>
-        <w:ind w:left="360" w:firstLine="0" w:right="0"/>
-        <w:jc w:val="left"/>
-      </w:pPr>
-      <w:r>
-        <w:t xml:space="preserve">The Warning That Was Sent Too Late (The Relativistic Investigation Bureau, Book 2)</w:t>
-      </w:r>
-    </w:p>
-    <w:p>
-      <w:pPr>
-        <w:spacing w:after="20" w:line="276" w:lineRule="auto" w:before="0"/>
-        <w:ind w:left="360" w:firstLine="0" w:right="0"/>
-        <w:jc w:val="left"/>
-      </w:pPr>
-      <w:r>
-        <w:t xml:space="preserve">Schrödinger’s Paperwork (Lolly Wren’s Curious Science Adventures, Book 1)</w:t>
-      </w:r>
-    </w:p>
-    <w:p>
-      <w:pPr>
-        <w:spacing w:after="20" w:line="276" w:lineRule="auto" w:before="0"/>
-        <w:ind w:left="360" w:firstLine="0" w:right="0"/>
-        <w:jc w:val="left"/>
-      </w:pPr>
-      <w:r>
-        <w:t xml:space="preserve">The Permitted Options (Lolly Wren’s Curious Science Adventures, Book 2)</w:t>
-      </w:r>
-    </w:p>
-    <w:p>
-      <w:pPr>
-        <w:spacing w:after="20" w:line="276" w:lineRule="auto" w:before="0"/>
-        <w:ind w:left="360" w:firstLine="0" w:right="0"/>
-        <w:jc w:val="left"/>
-      </w:pPr>
-      <w:r>
-        <w:t xml:space="preserve">Protocol Flamingo (The Invasion Storybooks, Book 1), as George Herbert Fontaine</w:t>
+        <w:t xml:space="preserve">The Dolphins’ View of History</w:t>
       </w:r>
     </w:p>
     <w:p>
@@ -22947,7 +22897,7 @@
         <w:rPr>
           <w:b/>
         </w:rPr>
-        <w:t xml:space="preserve">How-To</w:t>
+        <w:t xml:space="preserve">Fiction</w:t>
       </w:r>
     </w:p>
     <w:p>
@@ -22957,7 +22907,7 @@
         <w:jc w:val="left"/>
       </w:pPr>
       <w:r>
-        <w:t xml:space="preserve">Your First Book That Sells</w:t>
+        <w:t xml:space="preserve">The Murder That Hadn’t Happened Yet (The Relativistic Investigation Bureau, Book 1), Lothar J. Musiol writing as Spezala Genara Relavi (S.G.R.)</w:t>
       </w:r>
     </w:p>
     <w:p>
@@ -22967,7 +22917,71 @@
         <w:jc w:val="left"/>
       </w:pPr>
       <w:r>
-        <w:t xml:space="preserve">Your First YouTube Channel That Rocks</w:t>
+        <w:t xml:space="preserve">The Warning That Was Sent Too Late (The Relativistic Investigation Bureau, Book 2), Lothar J. Musiol writing as Spezala Genara Relavi (S.G.R.)</w:t>
+      </w:r>
+    </w:p>
+    <w:p>
+      <w:pPr>
+        <w:spacing w:after="20" w:line="276" w:lineRule="auto" w:before="0"/>
+        <w:ind w:left="360" w:firstLine="0" w:right="0"/>
+        <w:jc w:val="left"/>
+      </w:pPr>
+      <w:r>
+        <w:t xml:space="preserve">Schrödinger’s Paperwork (Lolly Wren’s Curious Science Adventures, Book 1), Lothar J. Musiol writing as Quentin Edmund Darling (Q.E.D.)</w:t>
+      </w:r>
+    </w:p>
+    <w:p>
+      <w:pPr>
+        <w:spacing w:after="20" w:line="276" w:lineRule="auto" w:before="0"/>
+        <w:ind w:left="360" w:firstLine="0" w:right="0"/>
+        <w:jc w:val="left"/>
+      </w:pPr>
+      <w:r>
+        <w:t xml:space="preserve">The Permitted Options (Lolly Wren’s Curious Science Adventures, Book 2), Lothar J. Musiol writing as Quentin Edmund Darling (Q.E.D.)</w:t>
+      </w:r>
+    </w:p>
+    <w:p>
+      <w:pPr>
+        <w:spacing w:after="20" w:line="276" w:lineRule="auto" w:before="0"/>
+        <w:ind w:left="360" w:firstLine="0" w:right="0"/>
+        <w:jc w:val="left"/>
+      </w:pPr>
+      <w:r>
+        <w:t xml:space="preserve">Protocol Flamingo (The Invasion Storybooks, Book 1), Lothar J. Musiol writing as George Herbert Fontaine</w:t>
+      </w:r>
+    </w:p>
+    <w:p>
+      <w:pPr>
+        <w:spacing w:after="20" w:line="276" w:lineRule="auto" w:before="0"/>
+        <w:ind w:left="360" w:firstLine="0" w:right="0"/>
+        <w:jc w:val="left"/>
+      </w:pPr>
+      <w:r>
+        <w:t xml:space="preserve">In Love with Murder, Actually: A Comic Mystery, Lothar J. Musiol writing as Romuald Livingston</w:t>
+      </w:r>
+    </w:p>
+    <w:p>
+      <w:pPr>
+        <w:keepNext/>
+        <w:spacing w:after="40" w:line="276" w:lineRule="auto" w:before="160"/>
+        <w:ind w:left="0" w:firstLine="0" w:right="0"/>
+        <w:jc w:val="left"/>
+      </w:pPr>
+      <w:r>
+        <w:rPr>
+          <w:b/>
+        </w:rPr>
+        <w:t xml:space="preserve">In German</w:t>
+      </w:r>
+    </w:p>
+    <w:p>
+      <w:pPr>
+        <w:spacing w:after="20" w:line="276" w:lineRule="auto" w:before="0"/>
+        <w:ind w:left="360" w:firstLine="0" w:right="0"/>
+        <w:jc w:val="left"/>
+      </w:pPr>
+      <w:r>
+        <w:t xml:space="preserve">Auswandern – Ab in die USA, Kanada, Australien oder Neuseeland?</w:t>
       </w:r>
     </w:p>
     <w:sectPr>

</xml_diff>

<commit_message>
About the Author (B): EE series Books 1-7
</commit_message>
<xml_diff>
--- a/EE - SERIES/Circuits_Components_and_Control_Book2.docx
+++ b/EE - SERIES/Circuits_Components_and_Control_Book2.docx
@@ -22551,6 +22551,32 @@
         <w:spacing w:before="480" w:after="240"/>
       </w:pPr>
       <w:r>
+        <w:t xml:space="preserve">About the Author</w:t>
+      </w:r>
+    </w:p>
+    <w:p>
+      <w:pPr>
+        <w:spacing w:after="200" w:line="276" w:lineRule="auto"/>
+      </w:pPr>
+      <w:r>
+        <w:t xml:space="preserve">Lothar J. Musiol is a graduate of Munich University of Applied Sciences who spent more than forty years in the semiconductor industry, first at Germany's largest company in the field, then at a string of American start-ups. He studied physics alongside all of it, seriously enough to know exactly how much he is simplifying. Dual citizenship, put to its most sensible use, lets him split his time between San Clemente, California, and Passau, Bavaria, where Austria begins at the garden fence. The household includes one married daughter, one grumpy Teacup Pomeranian named Gucci, and eleven chickens, listed in order of seniority rather than volume.</w:t>
+      </w:r>
+    </w:p>
+    <w:p>
+      <w:pPr>
+        <w:spacing w:after="200" w:line="276" w:lineRule="auto"/>
+      </w:pPr>
+      <w:r>
+        <w:t xml:space="preserve">He writes to make complex ideas clearer and more engaging than most treatments manage, without ever pretending they are simpler than they actually are.</w:t>
+      </w:r>
+    </w:p>
+    <w:p>
+      <w:pPr>
+        <w:pStyle w:val="Heading1"/>
+        <w:pageBreakBefore/>
+        <w:spacing w:before="480" w:after="240"/>
+      </w:pPr>
+      <w:r>
         <w:t xml:space="preserve">Also by Lothar J. Musiol</w:t>
       </w:r>
     </w:p>

</xml_diff>

<commit_message>
About the Author (B): EE series Books 1-7 [merged onto main from book-2-lectures-after-qed e24d1bf, paths only]
</commit_message>
<xml_diff>
--- a/EE - SERIES/Circuits_Components_and_Control_Book2.docx
+++ b/EE - SERIES/Circuits_Components_and_Control_Book2.docx
@@ -22551,6 +22551,32 @@
         <w:spacing w:before="480" w:after="240"/>
       </w:pPr>
       <w:r>
+        <w:t xml:space="preserve">About the Author</w:t>
+      </w:r>
+    </w:p>
+    <w:p>
+      <w:pPr>
+        <w:spacing w:after="200" w:line="276" w:lineRule="auto"/>
+      </w:pPr>
+      <w:r>
+        <w:t xml:space="preserve">Lothar J. Musiol is a graduate of Munich University of Applied Sciences who spent more than forty years in the semiconductor industry, first at Germany's largest company in the field, then at a string of American start-ups. He studied physics alongside all of it, seriously enough to know exactly how much he is simplifying. Dual citizenship, put to its most sensible use, lets him split his time between San Clemente, California, and Passau, Bavaria, where Austria begins at the garden fence. The household includes one married daughter, one grumpy Teacup Pomeranian named Gucci, and eleven chickens, listed in order of seniority rather than volume.</w:t>
+      </w:r>
+    </w:p>
+    <w:p>
+      <w:pPr>
+        <w:spacing w:after="200" w:line="276" w:lineRule="auto"/>
+      </w:pPr>
+      <w:r>
+        <w:t xml:space="preserve">He writes to make complex ideas clearer and more engaging than most treatments manage, without ever pretending they are simpler than they actually are.</w:t>
+      </w:r>
+    </w:p>
+    <w:p>
+      <w:pPr>
+        <w:pStyle w:val="Heading1"/>
+        <w:pageBreakBefore/>
+        <w:spacing w:before="480" w:after="240"/>
+      </w:pPr>
+      <w:r>
         <w:t xml:space="preserve">Also by Lothar J. Musiol</w:t>
       </w:r>
     </w:p>

</xml_diff>

<commit_message>
TOC complete and linked + review invitation: EE Series Books 1-7
</commit_message>
<xml_diff>
--- a/EE - SERIES/Circuits_Components_and_Control_Book2.docx
+++ b/EE - SERIES/Circuits_Components_and_Control_Book2.docx
@@ -58,6 +58,8 @@
         <w:pageBreakBefore/>
         <w:spacing w:before="480" w:after="240"/>
       </w:pPr>
+      <w:bookmarkStart w:id="101" w:name="_TocAll0001"/>
+      <w:bookmarkEnd w:id="101"/>
       <w:r>
         <w:lastRenderedPageBreak/>
         <w:t>Preface — How to Use This Book</w:t>
@@ -87,6 +89,8 @@
         <w:pStyle w:val="Heading1"/>
         <w:spacing w:before="480" w:after="240"/>
       </w:pPr>
+      <w:bookmarkStart w:id="102" w:name="_TocAll0002"/>
+      <w:bookmarkEnd w:id="102"/>
       <w:r>
         <w:t>How This Book Is Organized</w:t>
       </w:r>
@@ -141,6 +145,8 @@
         <w:pStyle w:val="Heading1"/>
         <w:spacing w:before="480" w:after="240"/>
       </w:pPr>
+      <w:bookmarkStart w:id="103" w:name="_TocAll0003"/>
+      <w:bookmarkEnd w:id="103"/>
       <w:r>
         <w:t>About This Series</w:t>
       </w:r>
@@ -443,321 +449,421 @@
       <w:pPr>
         <w:spacing w:after="200" w:line="276" w:lineRule="auto"/>
       </w:pPr>
-      <w:r>
-        <w:t>Preface — How to Use This Book</w:t>
-      </w:r>
-    </w:p>
-    <w:p>
-      <w:pPr>
-        <w:spacing w:after="200" w:line="276" w:lineRule="auto"/>
-      </w:pPr>
-      <w:r>
-        <w:t>How This Book Is Organized</w:t>
-      </w:r>
-    </w:p>
-    <w:p>
-      <w:pPr>
-        <w:spacing w:after="200" w:line="276" w:lineRule="auto"/>
-      </w:pPr>
-      <w:r>
-        <w:t>About This Series</w:t>
-      </w:r>
-    </w:p>
-    <w:p>
-      <w:pPr>
-        <w:spacing w:after="200" w:line="276" w:lineRule="auto"/>
-      </w:pPr>
-      <w:r>
-        <w:t>Chapter 1 — Analog Electronics</w:t>
-      </w:r>
-    </w:p>
-    <w:p>
-      <w:pPr>
-        <w:spacing w:after="200" w:line="276" w:lineRule="auto"/>
-      </w:pPr>
-      <w:r>
-        <w:t>Chapter 2 — Digital Electronics</w:t>
-      </w:r>
-    </w:p>
-    <w:p>
-      <w:pPr>
-        <w:spacing w:after="200" w:line="276" w:lineRule="auto"/>
-      </w:pPr>
-      <w:r>
-        <w:t>Chapter 3 — Logic and Boolean Algebra</w:t>
-      </w:r>
-    </w:p>
-    <w:p>
-      <w:pPr>
-        <w:spacing w:after="200" w:line="276" w:lineRule="auto"/>
-      </w:pPr>
-      <w:r>
-        <w:t>Chapter 4 — Combinational and Sequential Circuits</w:t>
-      </w:r>
-    </w:p>
-    <w:p>
-      <w:pPr>
-        <w:spacing w:after="200" w:line="276" w:lineRule="auto"/>
-      </w:pPr>
-      <w:r>
-        <w:t>Chapter 5 — Operational Amplifiers</w:t>
-      </w:r>
-    </w:p>
-    <w:p>
-      <w:pPr>
-        <w:spacing w:after="200" w:line="276" w:lineRule="auto"/>
-      </w:pPr>
-      <w:r>
-        <w:t>Chapter 6 — Passive and Active Filters</w:t>
-      </w:r>
-    </w:p>
-    <w:p>
-      <w:pPr>
-        <w:spacing w:after="200" w:line="276" w:lineRule="auto"/>
-      </w:pPr>
-      <w:r>
-        <w:t>Chapter 7 — Resistors</w:t>
-      </w:r>
-    </w:p>
-    <w:p>
-      <w:pPr>
-        <w:spacing w:after="200" w:line="276" w:lineRule="auto"/>
-      </w:pPr>
-      <w:r>
-        <w:t>Chapter 8 — Capacitors</w:t>
-      </w:r>
-    </w:p>
-    <w:p>
-      <w:pPr>
-        <w:spacing w:after="200" w:line="276" w:lineRule="auto"/>
-      </w:pPr>
-      <w:r>
-        <w:t>Chapter 9 — Inductors</w:t>
-      </w:r>
-    </w:p>
-    <w:p>
-      <w:pPr>
-        <w:spacing w:after="200" w:line="276" w:lineRule="auto"/>
-      </w:pPr>
-      <w:r>
-        <w:t xml:space="preserve">Chapter 10 — The Loop Under the Model</w:t>
-      </w:r>
-    </w:p>
-    <w:p>
-      <w:pPr>
-        <w:spacing w:after="200" w:line="276" w:lineRule="auto"/>
-      </w:pPr>
-      <w:r>
-        <w:t xml:space="preserve">Chapter 11 — Negative Feedback</w:t>
-      </w:r>
-    </w:p>
-    <w:p>
-      <w:pPr>
-        <w:spacing w:after="200" w:line="276" w:lineRule="auto"/>
-      </w:pPr>
-      <w:r>
-        <w:t xml:space="preserve">Chapter 12 — Followers, Buffers, and Loading</w:t>
-      </w:r>
-    </w:p>
-    <w:p>
-      <w:pPr>
-        <w:spacing w:after="200" w:line="276" w:lineRule="auto"/>
-      </w:pPr>
-      <w:r>
-        <w:t xml:space="preserve">Chapter 13 — Noise Gain, Bandwidth, and Slew Rate</w:t>
-      </w:r>
-    </w:p>
-    <w:p>
-      <w:pPr>
-        <w:spacing w:after="200" w:line="276" w:lineRule="auto"/>
-      </w:pPr>
-      <w:r>
-        <w:t xml:space="preserve">Chapter 14 — Noise in Op-Amp Circuits</w:t>
-      </w:r>
-    </w:p>
-    <w:p>
-      <w:pPr>
-        <w:spacing w:after="200" w:line="276" w:lineRule="auto"/>
-      </w:pPr>
-      <w:r>
-        <w:t xml:space="preserve">Chapter 15 — DC Errors: Offset, Bias Current, and Drift</w:t>
-      </w:r>
-    </w:p>
-    <w:p>
-      <w:pPr>
-        <w:spacing w:after="200" w:line="276" w:lineRule="auto"/>
-      </w:pPr>
-      <w:r>
-        <w:t xml:space="preserve">Chapter 16 — Comparators, Hysteresis, and Open-Collector Outputs</w:t>
-      </w:r>
-    </w:p>
-    <w:p>
-      <w:pPr>
-        <w:spacing w:after="200" w:line="276" w:lineRule="auto"/>
-      </w:pPr>
-      <w:r>
-        <w:t xml:space="preserve">Chapter 17 — Feedback Control: Plant, Sensor, and Controller</w:t>
-      </w:r>
-    </w:p>
-    <w:p>
-      <w:pPr>
-        <w:spacing w:after="200" w:line="276" w:lineRule="auto"/>
-      </w:pPr>
-      <w:r>
-        <w:t xml:space="preserve">Chapter 18 — PID, Lead, and Lag: Shaping the Loop</w:t>
-      </w:r>
-    </w:p>
-    <w:p>
-      <w:pPr>
-        <w:spacing w:after="200" w:line="276" w:lineRule="auto"/>
-      </w:pPr>
-      <w:r>
-        <w:t xml:space="preserve">Chapter 19 — Digital Control: Sample, Hold, and Delay</w:t>
-      </w:r>
-    </w:p>
-    <w:p>
-      <w:pPr>
-        <w:spacing w:after="200" w:line="276" w:lineRule="auto"/>
-      </w:pPr>
-      <w:r>
-        <w:t xml:space="preserve">Chapter 20 — The Inductor as a Part: Reading the Datasheet</w:t>
-      </w:r>
-    </w:p>
-    <w:p>
-      <w:pPr>
-        <w:spacing w:after="200" w:line="276" w:lineRule="auto"/>
-      </w:pPr>
-      <w:r>
-        <w:t xml:space="preserve">Chapter 21 — Active Filter Design: Sallen-Key and Multiple Feedback</w:t>
-      </w:r>
-    </w:p>
-    <w:p>
-      <w:pPr>
-        <w:spacing w:after="200" w:line="276" w:lineRule="auto"/>
-      </w:pPr>
-      <w:r>
-        <w:t xml:space="preserve">Chapter 22 — Resistors in Practice: Heat, Drift, and Pulses</w:t>
-      </w:r>
-    </w:p>
-    <w:p>
-      <w:pPr>
-        <w:spacing w:after="200" w:line="276" w:lineRule="auto"/>
-      </w:pPr>
-      <w:r>
-        <w:t xml:space="preserve">Chapter 23 — Capacitors in Practice: Decoupling and Real Impedance</w:t>
-      </w:r>
-    </w:p>
-    <w:p>
-      <w:pPr>
-        <w:spacing w:after="200" w:line="276" w:lineRule="auto"/>
-      </w:pPr>
-      <w:r>
-        <w:t xml:space="preserve">Chapter 24 — The Instrumentation Amplifier</w:t>
-      </w:r>
-    </w:p>
-    <w:p>
-      <w:pPr>
-        <w:spacing w:after="200" w:line="276" w:lineRule="auto"/>
-      </w:pPr>
-      <w:r>
-        <w:t xml:space="preserve">Chapter 25 — State Feedback and Observers</w:t>
-      </w:r>
-    </w:p>
-    <w:p>
-      <w:pPr>
-        <w:spacing w:after="200" w:line="276" w:lineRule="auto"/>
-      </w:pPr>
-      <w:r>
-        <w:t xml:space="preserve">Chapter 26 — The Sample-and-Hold Circuit</w:t>
-      </w:r>
-    </w:p>
-    <w:p>
-      <w:pPr>
-        <w:spacing w:after="200" w:line="276" w:lineRule="auto"/>
-      </w:pPr>
-      <w:r>
-        <w:t xml:space="preserve">Chapter 27 — The Voltage Reference and the Bandgap</w:t>
-      </w:r>
-    </w:p>
-    <w:p>
-      <w:pPr>
-        <w:spacing w:after="200" w:line="276" w:lineRule="auto"/>
-      </w:pPr>
-      <w:r>
-        <w:t xml:space="preserve">Chapter 28 — The H-Bridge and Motor as a Plant</w:t>
-      </w:r>
-    </w:p>
-    <w:p>
-      <w:pPr>
-        <w:spacing w:after="200" w:line="276" w:lineRule="auto"/>
-      </w:pPr>
-      <w:r>
-        <w:t xml:space="preserve">Chapter 29 — The Root Locus</w:t>
-      </w:r>
-    </w:p>
-    <w:p>
-      <w:pPr>
-        <w:spacing w:after="200" w:line="276" w:lineRule="auto"/>
-      </w:pPr>
-      <w:r>
-        <w:t xml:space="preserve">Chapter 30 — Stability Margins, Nyquist, and the Sensitivity Peak</w:t>
-      </w:r>
-    </w:p>
-    <w:p>
-      <w:pPr>
-        <w:spacing w:after="200" w:line="276" w:lineRule="auto"/>
-      </w:pPr>
-      <w:r>
-        <w:t xml:space="preserve">Chapter 31 — Oscillators: Feedback That Is Meant to Ring</w:t>
-      </w:r>
-    </w:p>
-    <w:p>
-      <w:pPr>
-        <w:spacing w:after="200" w:line="276" w:lineRule="auto"/>
-      </w:pPr>
-      <w:r>
-        <w:t xml:space="preserve">Chapter 32 — Timing: Setup, Hold, and Metastability</w:t>
-      </w:r>
-    </w:p>
-    <w:p>
-      <w:pPr>
-        <w:spacing w:after="200" w:line="276" w:lineRule="auto"/>
-      </w:pPr>
-      <w:r>
-        <w:t>Appendix A — Formula Reference</w:t>
-      </w:r>
-    </w:p>
-    <w:p>
-      <w:pPr>
-        <w:spacing w:after="200" w:line="276" w:lineRule="auto"/>
-      </w:pPr>
-      <w:r>
-        <w:t>Appendix B — Practice Problem Solutions</w:t>
-      </w:r>
-    </w:p>
-    <w:p>
-      <w:pPr>
-        <w:spacing w:after="200" w:line="276" w:lineRule="auto"/>
-      </w:pPr>
-      <w:r>
-        <w:t>Appendix C — Glossary</w:t>
-      </w:r>
-    </w:p>
-    <w:p>
-      <w:pPr>
-        <w:spacing w:after="200" w:line="276" w:lineRule="auto"/>
-      </w:pPr>
-      <w:r>
-        <w:t>Appendix D — Chapter Summaries</w:t>
-      </w:r>
-    </w:p>
-    <w:p>
-      <w:pPr>
-        <w:spacing w:after="200" w:line="276" w:lineRule="auto"/>
-      </w:pPr>
-      <w:r>
-        <w:t>Appendix E — Further Reading</w:t>
-      </w:r>
+      <w:hyperlink w:anchor="_TocAll0001" w:history="1">
+        <w:r>
+          <w:t>Preface — How to Use This Book</w:t>
+        </w:r>
+      </w:hyperlink>
+    </w:p>
+    <w:p>
+      <w:pPr>
+        <w:spacing w:after="200" w:line="276" w:lineRule="auto"/>
+      </w:pPr>
+      <w:hyperlink w:anchor="_TocAll0002" w:history="1">
+        <w:r>
+          <w:t>How This Book Is Organized</w:t>
+        </w:r>
+      </w:hyperlink>
+    </w:p>
+    <w:p>
+      <w:pPr>
+        <w:spacing w:after="200" w:line="276" w:lineRule="auto"/>
+      </w:pPr>
+      <w:hyperlink w:anchor="_TocAll0003" w:history="1">
+        <w:r>
+          <w:t>About This Series</w:t>
+        </w:r>
+      </w:hyperlink>
+    </w:p>
+    <w:p>
+      <w:pPr>
+        <w:spacing w:after="200" w:line="276" w:lineRule="auto"/>
+      </w:pPr>
+      <w:hyperlink w:anchor="_TocAll0004" w:history="1">
+        <w:r>
+          <w:t>Chapter 1 — Analog Electronics</w:t>
+        </w:r>
+      </w:hyperlink>
+    </w:p>
+    <w:p>
+      <w:pPr>
+        <w:spacing w:after="200" w:line="276" w:lineRule="auto"/>
+      </w:pPr>
+      <w:hyperlink w:anchor="_TocAll0005" w:history="1">
+        <w:r>
+          <w:t>Chapter 2 — Digital Electronics</w:t>
+        </w:r>
+      </w:hyperlink>
+    </w:p>
+    <w:p>
+      <w:pPr>
+        <w:spacing w:after="200" w:line="276" w:lineRule="auto"/>
+      </w:pPr>
+      <w:hyperlink w:anchor="_TocAll0006" w:history="1">
+        <w:r>
+          <w:t>Chapter 3 — Logic and Boolean Algebra</w:t>
+        </w:r>
+      </w:hyperlink>
+    </w:p>
+    <w:p>
+      <w:pPr>
+        <w:spacing w:after="200" w:line="276" w:lineRule="auto"/>
+      </w:pPr>
+      <w:hyperlink w:anchor="_TocAll0007" w:history="1">
+        <w:r>
+          <w:t>Chapter 4 — Combinational and Sequential Circuits</w:t>
+        </w:r>
+      </w:hyperlink>
+    </w:p>
+    <w:p>
+      <w:pPr>
+        <w:spacing w:after="200" w:line="276" w:lineRule="auto"/>
+      </w:pPr>
+      <w:hyperlink w:anchor="_TocAll0008" w:history="1">
+        <w:r>
+          <w:t>Chapter 5 — Operational Amplifiers</w:t>
+        </w:r>
+      </w:hyperlink>
+    </w:p>
+    <w:p>
+      <w:pPr>
+        <w:spacing w:after="200" w:line="276" w:lineRule="auto"/>
+      </w:pPr>
+      <w:hyperlink w:anchor="_TocAll0009" w:history="1">
+        <w:r>
+          <w:t>Chapter 6 — Passive and Active Filters</w:t>
+        </w:r>
+      </w:hyperlink>
+    </w:p>
+    <w:p>
+      <w:pPr>
+        <w:spacing w:after="200" w:line="276" w:lineRule="auto"/>
+      </w:pPr>
+      <w:hyperlink w:anchor="_TocAll0010" w:history="1">
+        <w:r>
+          <w:t>Chapter 7 — Resistors</w:t>
+        </w:r>
+      </w:hyperlink>
+    </w:p>
+    <w:p>
+      <w:pPr>
+        <w:spacing w:after="200" w:line="276" w:lineRule="auto"/>
+      </w:pPr>
+      <w:hyperlink w:anchor="_TocAll0011" w:history="1">
+        <w:r>
+          <w:t>Chapter 8 — Capacitors</w:t>
+        </w:r>
+      </w:hyperlink>
+    </w:p>
+    <w:p>
+      <w:pPr>
+        <w:spacing w:after="200" w:line="276" w:lineRule="auto"/>
+      </w:pPr>
+      <w:hyperlink w:anchor="_TocAll0012" w:history="1">
+        <w:r>
+          <w:t>Chapter 9 — Inductors</w:t>
+        </w:r>
+      </w:hyperlink>
+    </w:p>
+    <w:p>
+      <w:pPr>
+        <w:spacing w:after="200" w:line="276" w:lineRule="auto"/>
+      </w:pPr>
+      <w:hyperlink w:anchor="_TocAll0013" w:history="1">
+        <w:r>
+          <w:t xml:space="preserve">Chapter 10 — The Loop Under the Model</w:t>
+        </w:r>
+      </w:hyperlink>
+    </w:p>
+    <w:p>
+      <w:pPr>
+        <w:spacing w:after="200" w:line="276" w:lineRule="auto"/>
+      </w:pPr>
+      <w:hyperlink w:anchor="_TocAll0014" w:history="1">
+        <w:r>
+          <w:t xml:space="preserve">Chapter 11 — Negative Feedback</w:t>
+        </w:r>
+      </w:hyperlink>
+    </w:p>
+    <w:p>
+      <w:pPr>
+        <w:spacing w:after="200" w:line="276" w:lineRule="auto"/>
+      </w:pPr>
+      <w:hyperlink w:anchor="_TocAll0015" w:history="1">
+        <w:r>
+          <w:t xml:space="preserve">Chapter 12 — Followers, Buffers, and Loading</w:t>
+        </w:r>
+      </w:hyperlink>
+    </w:p>
+    <w:p>
+      <w:pPr>
+        <w:spacing w:after="200" w:line="276" w:lineRule="auto"/>
+      </w:pPr>
+      <w:hyperlink w:anchor="_TocAll0016" w:history="1">
+        <w:r>
+          <w:t xml:space="preserve">Chapter 13 — Noise Gain, Bandwidth, and Slew Rate</w:t>
+        </w:r>
+      </w:hyperlink>
+    </w:p>
+    <w:p>
+      <w:pPr>
+        <w:spacing w:after="200" w:line="276" w:lineRule="auto"/>
+      </w:pPr>
+      <w:hyperlink w:anchor="_TocAll0017" w:history="1">
+        <w:r>
+          <w:t xml:space="preserve">Chapter 14 — Noise in Op-Amp Circuits</w:t>
+        </w:r>
+      </w:hyperlink>
+    </w:p>
+    <w:p>
+      <w:pPr>
+        <w:spacing w:after="200" w:line="276" w:lineRule="auto"/>
+      </w:pPr>
+      <w:hyperlink w:anchor="_TocAll0018" w:history="1">
+        <w:r>
+          <w:t xml:space="preserve">Chapter 15 — DC Errors: Offset, Bias Current, and Drift</w:t>
+        </w:r>
+      </w:hyperlink>
+    </w:p>
+    <w:p>
+      <w:pPr>
+        <w:spacing w:after="200" w:line="276" w:lineRule="auto"/>
+      </w:pPr>
+      <w:hyperlink w:anchor="_TocAll0019" w:history="1">
+        <w:r>
+          <w:t xml:space="preserve">Chapter 16 — Comparators, Hysteresis, and Open-Collector Outputs</w:t>
+        </w:r>
+      </w:hyperlink>
+    </w:p>
+    <w:p>
+      <w:pPr>
+        <w:spacing w:after="200" w:line="276" w:lineRule="auto"/>
+      </w:pPr>
+      <w:hyperlink w:anchor="_TocAll0020" w:history="1">
+        <w:r>
+          <w:t xml:space="preserve">Chapter 17 — Feedback Control: Plant, Sensor, and Controller</w:t>
+        </w:r>
+      </w:hyperlink>
+    </w:p>
+    <w:p>
+      <w:pPr>
+        <w:spacing w:after="200" w:line="276" w:lineRule="auto"/>
+      </w:pPr>
+      <w:hyperlink w:anchor="_TocAll0021" w:history="1">
+        <w:r>
+          <w:t xml:space="preserve">Chapter 18 — PID, Lead, and Lag: Shaping the Loop</w:t>
+        </w:r>
+      </w:hyperlink>
+    </w:p>
+    <w:p>
+      <w:pPr>
+        <w:spacing w:after="200" w:line="276" w:lineRule="auto"/>
+      </w:pPr>
+      <w:hyperlink w:anchor="_TocAll0022" w:history="1">
+        <w:r>
+          <w:t xml:space="preserve">Chapter 19 — Digital Control: Sample, Hold, and Delay</w:t>
+        </w:r>
+      </w:hyperlink>
+    </w:p>
+    <w:p>
+      <w:pPr>
+        <w:spacing w:after="200" w:line="276" w:lineRule="auto"/>
+      </w:pPr>
+      <w:hyperlink w:anchor="_TocAll0023" w:history="1">
+        <w:r>
+          <w:t xml:space="preserve">Chapter 20 — The Inductor as a Part: Reading the Datasheet</w:t>
+        </w:r>
+      </w:hyperlink>
+    </w:p>
+    <w:p>
+      <w:pPr>
+        <w:spacing w:after="200" w:line="276" w:lineRule="auto"/>
+      </w:pPr>
+      <w:hyperlink w:anchor="_TocAll0024" w:history="1">
+        <w:r>
+          <w:t xml:space="preserve">Chapter 21 — Active Filter Design: Sallen-Key and Multiple Feedback</w:t>
+        </w:r>
+      </w:hyperlink>
+    </w:p>
+    <w:p>
+      <w:pPr>
+        <w:spacing w:after="200" w:line="276" w:lineRule="auto"/>
+      </w:pPr>
+      <w:hyperlink w:anchor="_TocAll0025" w:history="1">
+        <w:r>
+          <w:t xml:space="preserve">Chapter 22 — Resistors in Practice: Heat, Drift, and Pulses</w:t>
+        </w:r>
+      </w:hyperlink>
+    </w:p>
+    <w:p>
+      <w:pPr>
+        <w:spacing w:after="200" w:line="276" w:lineRule="auto"/>
+      </w:pPr>
+      <w:hyperlink w:anchor="_TocAll0026" w:history="1">
+        <w:r>
+          <w:t xml:space="preserve">Chapter 23 — Capacitors in Practice: Decoupling and Real Impedance</w:t>
+        </w:r>
+      </w:hyperlink>
+    </w:p>
+    <w:p>
+      <w:pPr>
+        <w:spacing w:after="200" w:line="276" w:lineRule="auto"/>
+      </w:pPr>
+      <w:hyperlink w:anchor="_TocAll0027" w:history="1">
+        <w:r>
+          <w:t xml:space="preserve">Chapter 24 — The Instrumentation Amplifier</w:t>
+        </w:r>
+      </w:hyperlink>
+    </w:p>
+    <w:p>
+      <w:pPr>
+        <w:spacing w:after="200" w:line="276" w:lineRule="auto"/>
+      </w:pPr>
+      <w:hyperlink w:anchor="_TocAll0028" w:history="1">
+        <w:r>
+          <w:t xml:space="preserve">Chapter 25 — State Feedback and Observers</w:t>
+        </w:r>
+      </w:hyperlink>
+    </w:p>
+    <w:p>
+      <w:pPr>
+        <w:spacing w:after="200" w:line="276" w:lineRule="auto"/>
+      </w:pPr>
+      <w:hyperlink w:anchor="_TocAll0029" w:history="1">
+        <w:r>
+          <w:t xml:space="preserve">Chapter 26 — The Sample-and-Hold Circuit</w:t>
+        </w:r>
+      </w:hyperlink>
+    </w:p>
+    <w:p>
+      <w:pPr>
+        <w:spacing w:after="200" w:line="276" w:lineRule="auto"/>
+      </w:pPr>
+      <w:hyperlink w:anchor="_TocAll0030" w:history="1">
+        <w:r>
+          <w:t xml:space="preserve">Chapter 27 — The Voltage Reference and the Bandgap</w:t>
+        </w:r>
+      </w:hyperlink>
+    </w:p>
+    <w:p>
+      <w:pPr>
+        <w:spacing w:after="200" w:line="276" w:lineRule="auto"/>
+      </w:pPr>
+      <w:hyperlink w:anchor="_TocAll0031" w:history="1">
+        <w:r>
+          <w:t xml:space="preserve">Chapter 28 — The H-Bridge and Motor as a Plant</w:t>
+        </w:r>
+      </w:hyperlink>
+    </w:p>
+    <w:p>
+      <w:pPr>
+        <w:spacing w:after="200" w:line="276" w:lineRule="auto"/>
+      </w:pPr>
+      <w:hyperlink w:anchor="_TocAll0032" w:history="1">
+        <w:r>
+          <w:t xml:space="preserve">Chapter 29 — The Root Locus</w:t>
+        </w:r>
+      </w:hyperlink>
+    </w:p>
+    <w:p>
+      <w:pPr>
+        <w:spacing w:after="200" w:line="276" w:lineRule="auto"/>
+      </w:pPr>
+      <w:hyperlink w:anchor="_TocAll0033" w:history="1">
+        <w:r>
+          <w:t xml:space="preserve">Chapter 30 — Stability Margins, Nyquist, and the Sensitivity Peak</w:t>
+        </w:r>
+      </w:hyperlink>
+    </w:p>
+    <w:p>
+      <w:pPr>
+        <w:spacing w:after="200" w:line="276" w:lineRule="auto"/>
+      </w:pPr>
+      <w:hyperlink w:anchor="_TocAll0034" w:history="1">
+        <w:r>
+          <w:t xml:space="preserve">Chapter 31 — Oscillators: Feedback That Is Meant to Ring</w:t>
+        </w:r>
+      </w:hyperlink>
+    </w:p>
+    <w:p>
+      <w:pPr>
+        <w:spacing w:after="200" w:line="276" w:lineRule="auto"/>
+      </w:pPr>
+      <w:hyperlink w:anchor="_TocAll0035" w:history="1">
+        <w:r>
+          <w:t xml:space="preserve">Chapter 32 — Timing: Setup, Hold, and Metastability</w:t>
+        </w:r>
+      </w:hyperlink>
+    </w:p>
+    <w:p>
+      <w:pPr>
+        <w:spacing w:after="200" w:line="276" w:lineRule="auto"/>
+      </w:pPr>
+      <w:hyperlink w:anchor="_TocAll0036" w:history="1">
+        <w:r>
+          <w:t>Appendix A — Formula Reference</w:t>
+        </w:r>
+      </w:hyperlink>
+    </w:p>
+    <w:p>
+      <w:pPr>
+        <w:spacing w:after="200" w:line="276" w:lineRule="auto"/>
+      </w:pPr>
+      <w:hyperlink w:anchor="_TocAll0037" w:history="1">
+        <w:r>
+          <w:t>Appendix B — Practice Problem Solutions</w:t>
+        </w:r>
+      </w:hyperlink>
+    </w:p>
+    <w:p>
+      <w:pPr>
+        <w:spacing w:after="200" w:line="276" w:lineRule="auto"/>
+      </w:pPr>
+      <w:hyperlink w:anchor="_TocAll0038" w:history="1">
+        <w:r>
+          <w:t>Appendix C — Glossary</w:t>
+        </w:r>
+      </w:hyperlink>
+    </w:p>
+    <w:p>
+      <w:pPr>
+        <w:spacing w:after="200" w:line="276" w:lineRule="auto"/>
+      </w:pPr>
+      <w:hyperlink w:anchor="_TocAll0039" w:history="1">
+        <w:r>
+          <w:t>Appendix D — Chapter Summaries</w:t>
+        </w:r>
+      </w:hyperlink>
+    </w:p>
+    <w:p>
+      <w:pPr>
+        <w:spacing w:after="200" w:line="276" w:lineRule="auto"/>
+      </w:pPr>
+      <w:hyperlink w:anchor="_TocAll0040" w:history="1">
+        <w:r>
+          <w:t>Appendix E — Further Reading</w:t>
+        </w:r>
+      </w:hyperlink>
+    </w:p>
+    <w:p>
+      <w:pPr>
+        <w:spacing w:after="200" w:line="276" w:lineRule="auto"/>
+      </w:pPr>
+      <w:hyperlink w:anchor="_TocAll0041" w:history="1">
+        <w:r>
+          <w:t xml:space="preserve">About the Author</w:t>
+        </w:r>
+      </w:hyperlink>
+    </w:p>
+    <w:p>
+      <w:pPr>
+        <w:spacing w:after="200" w:line="276" w:lineRule="auto"/>
+      </w:pPr>
+      <w:hyperlink w:anchor="_TocAll0042" w:history="1">
+        <w:r>
+          <w:t xml:space="preserve">Also by Lothar J. Musiol</w:t>
+        </w:r>
+      </w:hyperlink>
     </w:p>
     <w:p>
       <w:pPr>
@@ -765,6 +871,8 @@
         <w:pageBreakBefore/>
         <w:spacing w:before="480" w:after="240"/>
       </w:pPr>
+      <w:bookmarkStart w:id="104" w:name="_TocAll0004"/>
+      <w:bookmarkEnd w:id="104"/>
       <w:r>
         <w:lastRenderedPageBreak/>
         <w:t>Chapter 1 — Analog Electronics</w:t>
@@ -1150,6 +1258,8 @@
         <w:pageBreakBefore/>
         <w:spacing w:before="480" w:after="240"/>
       </w:pPr>
+      <w:bookmarkStart w:id="105" w:name="_TocAll0005"/>
+      <w:bookmarkEnd w:id="105"/>
       <w:r>
         <w:lastRenderedPageBreak/>
         <w:t>Chapter 2 — Digital Electronics</w:t>
@@ -1525,6 +1635,8 @@
         <w:pageBreakBefore/>
         <w:spacing w:before="480" w:after="240"/>
       </w:pPr>
+      <w:bookmarkStart w:id="106" w:name="_TocAll0006"/>
+      <w:bookmarkEnd w:id="106"/>
       <w:r>
         <w:lastRenderedPageBreak/>
         <w:t>Chapter 3 — Logic and Boolean Algebra</w:t>
@@ -1893,6 +2005,8 @@
         <w:pageBreakBefore/>
         <w:spacing w:before="480" w:after="240"/>
       </w:pPr>
+      <w:bookmarkStart w:id="107" w:name="_TocAll0007"/>
+      <w:bookmarkEnd w:id="107"/>
       <w:r>
         <w:lastRenderedPageBreak/>
         <w:t>Chapter 4 — Combinational and Sequential Circuits</w:t>
@@ -2347,6 +2461,8 @@
         <w:pageBreakBefore/>
         <w:spacing w:before="480" w:after="240"/>
       </w:pPr>
+      <w:bookmarkStart w:id="108" w:name="_TocAll0008"/>
+      <w:bookmarkEnd w:id="108"/>
       <w:r>
         <w:lastRenderedPageBreak/>
         <w:t>Chapter 5 — Operational Amplifiers</w:t>
@@ -3011,6 +3127,8 @@
         <w:pageBreakBefore/>
         <w:spacing w:before="480" w:after="240"/>
       </w:pPr>
+      <w:bookmarkStart w:id="109" w:name="_TocAll0009"/>
+      <w:bookmarkEnd w:id="109"/>
       <w:r>
         <w:lastRenderedPageBreak/>
         <w:t>Chapter 6 — Passive and Active Filters</w:t>
@@ -3523,6 +3641,8 @@
         <w:pageBreakBefore/>
         <w:spacing w:before="480" w:after="240"/>
       </w:pPr>
+      <w:bookmarkStart w:id="110" w:name="_TocAll0010"/>
+      <w:bookmarkEnd w:id="110"/>
       <w:r>
         <w:lastRenderedPageBreak/>
         <w:t>Chapter 7 — Resistors</w:t>
@@ -3886,6 +4006,8 @@
         <w:pageBreakBefore/>
         <w:spacing w:before="480" w:after="240"/>
       </w:pPr>
+      <w:bookmarkStart w:id="111" w:name="_TocAll0011"/>
+      <w:bookmarkEnd w:id="111"/>
       <w:r>
         <w:lastRenderedPageBreak/>
         <w:t>Chapter 8 — Capacitors</w:t>
@@ -4242,6 +4364,8 @@
         <w:pageBreakBefore/>
         <w:spacing w:before="480" w:after="240"/>
       </w:pPr>
+      <w:bookmarkStart w:id="112" w:name="_TocAll0012"/>
+      <w:bookmarkEnd w:id="112"/>
       <w:r>
         <w:lastRenderedPageBreak/>
         <w:t>Chapter 9 — Inductors</w:t>
@@ -4611,6 +4735,8 @@
       <w:pPr>
         <w:pStyle w:val="Heading1"/>
       </w:pPr>
+      <w:bookmarkStart w:id="113" w:name="_TocAll0013"/>
+      <w:bookmarkEnd w:id="113"/>
       <w:r>
         <w:rPr>
           <w:rFonts w:ascii="Amazon Ember" w:hAnsi="Amazon Ember" w:cs="Amazon Ember"/>
@@ -4725,6 +4851,8 @@
         <w:pageBreakBefore/>
         <w:spacing w:before="480" w:after="240"/>
       </w:pPr>
+      <w:bookmarkStart w:id="114" w:name="_TocAll0014"/>
+      <w:bookmarkEnd w:id="114"/>
       <w:r>
         <w:t xml:space="preserve">Chapter 11 — Negative Feedback</w:t>
       </w:r>
@@ -5276,6 +5404,8 @@
         <w:pageBreakBefore/>
         <w:spacing w:before="480" w:after="240"/>
       </w:pPr>
+      <w:bookmarkStart w:id="115" w:name="_TocAll0015"/>
+      <w:bookmarkEnd w:id="115"/>
       <w:r>
         <w:t xml:space="preserve">Chapter 12 — Followers, Buffers, and Loading</w:t>
       </w:r>
@@ -5806,6 +5936,8 @@
         <w:pageBreakBefore/>
         <w:spacing w:before="480" w:after="240"/>
       </w:pPr>
+      <w:bookmarkStart w:id="116" w:name="_TocAll0016"/>
+      <w:bookmarkEnd w:id="116"/>
       <w:r>
         <w:t xml:space="preserve">Chapter 13 — Noise Gain, Bandwidth, and Slew Rate</w:t>
       </w:r>
@@ -6317,6 +6449,8 @@
         <w:pageBreakBefore/>
         <w:spacing w:before="480" w:after="240"/>
       </w:pPr>
+      <w:bookmarkStart w:id="117" w:name="_TocAll0017"/>
+      <w:bookmarkEnd w:id="117"/>
       <w:r>
         <w:t xml:space="preserve">Chapter 14 — Noise in Op-Amp Circuits</w:t>
       </w:r>
@@ -6777,6 +6911,8 @@
         <w:pageBreakBefore/>
         <w:spacing w:before="480" w:after="240"/>
       </w:pPr>
+      <w:bookmarkStart w:id="118" w:name="_TocAll0018"/>
+      <w:bookmarkEnd w:id="118"/>
       <w:r>
         <w:t xml:space="preserve">Chapter 15 — DC Errors: Offset, Bias Current, and Drift</w:t>
       </w:r>
@@ -7310,6 +7446,8 @@
         <w:pageBreakBefore/>
         <w:spacing w:before="480" w:after="240"/>
       </w:pPr>
+      <w:bookmarkStart w:id="119" w:name="_TocAll0019"/>
+      <w:bookmarkEnd w:id="119"/>
       <w:r>
         <w:t xml:space="preserve">Chapter 16 — Comparators, Hysteresis, and Open-Collector Outputs</w:t>
       </w:r>
@@ -7769,6 +7907,8 @@
         <w:pageBreakBefore/>
         <w:spacing w:before="480" w:after="240"/>
       </w:pPr>
+      <w:bookmarkStart w:id="120" w:name="_TocAll0020"/>
+      <w:bookmarkEnd w:id="120"/>
       <w:r>
         <w:t xml:space="preserve">Chapter 17 — Feedback Control: Plant, Sensor, and Controller</w:t>
       </w:r>
@@ -8203,6 +8343,8 @@
         <w:pageBreakBefore/>
         <w:spacing w:before="480" w:after="240"/>
       </w:pPr>
+      <w:bookmarkStart w:id="121" w:name="_TocAll0021"/>
+      <w:bookmarkEnd w:id="121"/>
       <w:r>
         <w:t xml:space="preserve">Chapter 18 — PID, Lead, and Lag: Shaping the Loop</w:t>
       </w:r>
@@ -8733,6 +8875,8 @@
         <w:pageBreakBefore/>
         <w:spacing w:before="480" w:after="240"/>
       </w:pPr>
+      <w:bookmarkStart w:id="122" w:name="_TocAll0022"/>
+      <w:bookmarkEnd w:id="122"/>
       <w:r>
         <w:t xml:space="preserve">Chapter 19 — Digital Control: Sample, Hold, and Delay</w:t>
       </w:r>
@@ -9168,6 +9312,8 @@
         <w:pageBreakBefore/>
         <w:spacing w:before="480" w:after="240"/>
       </w:pPr>
+      <w:bookmarkStart w:id="123" w:name="_TocAll0023"/>
+      <w:bookmarkEnd w:id="123"/>
       <w:r>
         <w:t xml:space="preserve">Chapter 20 — The Inductor as a Part: Reading the Datasheet</w:t>
       </w:r>
@@ -9621,6 +9767,8 @@
         <w:pageBreakBefore/>
         <w:spacing w:before="480" w:after="240"/>
       </w:pPr>
+      <w:bookmarkStart w:id="124" w:name="_TocAll0024"/>
+      <w:bookmarkEnd w:id="124"/>
       <w:r>
         <w:t xml:space="preserve">Chapter 21 — Active Filter Design: Sallen-Key and Multiple Feedback</w:t>
       </w:r>
@@ -10081,6 +10229,8 @@
         <w:pageBreakBefore/>
         <w:spacing w:before="480" w:after="240"/>
       </w:pPr>
+      <w:bookmarkStart w:id="125" w:name="_TocAll0025"/>
+      <w:bookmarkEnd w:id="125"/>
       <w:r>
         <w:t xml:space="preserve">Chapter 22 — Resistors in Practice: Heat, Drift, and Pulses</w:t>
       </w:r>
@@ -10613,6 +10763,8 @@
         <w:pageBreakBefore/>
         <w:spacing w:before="480" w:after="240"/>
       </w:pPr>
+      <w:bookmarkStart w:id="126" w:name="_TocAll0026"/>
+      <w:bookmarkEnd w:id="126"/>
       <w:r>
         <w:t xml:space="preserve">Chapter 23 — Capacitors in Practice: Decoupling and Real Impedance</w:t>
       </w:r>
@@ -11171,6 +11323,8 @@
         <w:pageBreakBefore/>
         <w:spacing w:before="480" w:after="240"/>
       </w:pPr>
+      <w:bookmarkStart w:id="127" w:name="_TocAll0027"/>
+      <w:bookmarkEnd w:id="127"/>
       <w:r>
         <w:t xml:space="preserve">Chapter 24 — The Instrumentation Amplifier</w:t>
       </w:r>
@@ -11795,6 +11949,8 @@
         <w:pageBreakBefore/>
         <w:spacing w:before="480" w:after="240"/>
       </w:pPr>
+      <w:bookmarkStart w:id="128" w:name="_TocAll0028"/>
+      <w:bookmarkEnd w:id="128"/>
       <w:r>
         <w:t xml:space="preserve">Chapter 25 — State Feedback and Observers</w:t>
       </w:r>
@@ -12343,6 +12499,8 @@
         <w:pageBreakBefore/>
         <w:spacing w:before="480" w:after="240"/>
       </w:pPr>
+      <w:bookmarkStart w:id="129" w:name="_TocAll0029"/>
+      <w:bookmarkEnd w:id="129"/>
       <w:r>
         <w:t xml:space="preserve">Chapter 26 — The Sample-and-Hold Circuit</w:t>
       </w:r>
@@ -12928,6 +13086,8 @@
         <w:pageBreakBefore/>
         <w:spacing w:before="480" w:after="240"/>
       </w:pPr>
+      <w:bookmarkStart w:id="130" w:name="_TocAll0030"/>
+      <w:bookmarkEnd w:id="130"/>
       <w:r>
         <w:t xml:space="preserve">Chapter 27 — The Voltage Reference and the Bandgap</w:t>
       </w:r>
@@ -13549,6 +13709,8 @@
         <w:pageBreakBefore/>
         <w:spacing w:before="480" w:after="240"/>
       </w:pPr>
+      <w:bookmarkStart w:id="131" w:name="_TocAll0031"/>
+      <w:bookmarkEnd w:id="131"/>
       <w:r>
         <w:t xml:space="preserve">Chapter 28 — The H-Bridge and Motor as a Plant</w:t>
       </w:r>
@@ -14080,6 +14242,8 @@
         <w:pageBreakBefore/>
         <w:spacing w:before="480" w:after="240"/>
       </w:pPr>
+      <w:bookmarkStart w:id="132" w:name="_TocAll0032"/>
+      <w:bookmarkEnd w:id="132"/>
       <w:r>
         <w:t xml:space="preserve">Chapter 29 — The Root Locus</w:t>
       </w:r>
@@ -14509,6 +14673,8 @@
         <w:pageBreakBefore/>
         <w:spacing w:before="480" w:after="240"/>
       </w:pPr>
+      <w:bookmarkStart w:id="133" w:name="_TocAll0033"/>
+      <w:bookmarkEnd w:id="133"/>
       <w:r>
         <w:t xml:space="preserve">Chapter 30 — Stability Margins, Nyquist, and the Sensitivity Peak</w:t>
       </w:r>
@@ -14911,6 +15077,8 @@
         <w:pageBreakBefore/>
         <w:spacing w:before="480" w:after="240"/>
       </w:pPr>
+      <w:bookmarkStart w:id="134" w:name="_TocAll0034"/>
+      <w:bookmarkEnd w:id="134"/>
       <w:r>
         <w:t xml:space="preserve">Chapter 31 — Oscillators: Feedback That Is Meant to Ring</w:t>
       </w:r>
@@ -15383,6 +15551,8 @@
         <w:pageBreakBefore/>
         <w:spacing w:before="480" w:after="240"/>
       </w:pPr>
+      <w:bookmarkStart w:id="135" w:name="_TocAll0035"/>
+      <w:bookmarkEnd w:id="135"/>
       <w:r>
         <w:t xml:space="preserve">Chapter 32 — Timing: Setup, Hold, and Metastability</w:t>
       </w:r>
@@ -15776,6 +15946,8 @@
         <w:pageBreakBefore/>
         <w:spacing w:before="480" w:after="240"/>
       </w:pPr>
+      <w:bookmarkStart w:id="136" w:name="_TocAll0036"/>
+      <w:bookmarkEnd w:id="136"/>
       <w:r>
         <w:lastRenderedPageBreak/>
         <w:t>Appendix A — Formula Reference</w:t>
@@ -17723,6 +17895,8 @@
         <w:pageBreakBefore/>
         <w:spacing w:before="480" w:after="240"/>
       </w:pPr>
+      <w:bookmarkStart w:id="137" w:name="_TocAll0037"/>
+      <w:bookmarkEnd w:id="137"/>
       <w:r>
         <w:lastRenderedPageBreak/>
         <w:t>Appendix B — Practice Problem Solutions</w:t>
@@ -20014,6 +20188,8 @@
         <w:pageBreakBefore/>
         <w:spacing w:before="480" w:after="240"/>
       </w:pPr>
+      <w:bookmarkStart w:id="138" w:name="_TocAll0038"/>
+      <w:bookmarkEnd w:id="138"/>
       <w:r>
         <w:lastRenderedPageBreak/>
         <w:t>Appendix C — Glossary</w:t>
@@ -21720,6 +21896,8 @@
         <w:pageBreakBefore/>
         <w:spacing w:before="480" w:after="240"/>
       </w:pPr>
+      <w:bookmarkStart w:id="139" w:name="_TocAll0039"/>
+      <w:bookmarkEnd w:id="139"/>
       <w:r>
         <w:lastRenderedPageBreak/>
         <w:t>Appendix D — Chapter Summaries</w:t>
@@ -22276,6 +22454,8 @@
         <w:pageBreakBefore/>
         <w:spacing w:before="480" w:after="240"/>
       </w:pPr>
+      <w:bookmarkStart w:id="140" w:name="_TocAll0040"/>
+      <w:bookmarkEnd w:id="140"/>
       <w:r>
         <w:lastRenderedPageBreak/>
         <w:t>Appendix E — Further Reading</w:t>
@@ -22542,6 +22722,19 @@
       </w:r>
       <w:r>
         <w:t xml:space="preserve">a widely used paper on synchronizers, Gray-coded FIFO pointers, and handshakes (Chapter 32).</w:t>
+      </w:r>
+    </w:p>
+    <w:p>
+      <w:pPr>
+        <w:pageBreakBefore/>
+        <w:spacing w:after="200" w:line="276" w:lineRule="auto"/>
+      </w:pPr>
+      <w:r>
+        <w:rPr>
+          <w:i/>
+          <w:iCs/>
+        </w:rPr>
+        <w:t xml:space="preserve">If this book gave you something, a laugh, an idea, or a better question, I'd love to hear about it. A short review on Amazon, even a sentence or two, helps other curious readers find it, and I read every one.</w:t>
       </w:r>
     </w:p>
     <w:p>
@@ -22550,6 +22743,8 @@
         <w:pageBreakBefore/>
         <w:spacing w:before="480" w:after="240"/>
       </w:pPr>
+      <w:bookmarkStart w:id="141" w:name="_TocAll0041"/>
+      <w:bookmarkEnd w:id="141"/>
       <w:r>
         <w:t xml:space="preserve">About the Author</w:t>
       </w:r>
@@ -22576,6 +22771,8 @@
         <w:pageBreakBefore/>
         <w:spacing w:before="480" w:after="240"/>
       </w:pPr>
+      <w:bookmarkStart w:id="142" w:name="_TocAll0042"/>
+      <w:bookmarkEnd w:id="142"/>
       <w:r>
         <w:t xml:space="preserve">Also by Lothar J. Musiol</w:t>
       </w:r>

</xml_diff>

<commit_message>
TOC complete and linked + review invitation: EE Series Books 1-7 [merged onto main from book-2-lectures-after-qed 78622d9, paths only]
</commit_message>
<xml_diff>
--- a/EE - SERIES/Circuits_Components_and_Control_Book2.docx
+++ b/EE - SERIES/Circuits_Components_and_Control_Book2.docx
@@ -58,6 +58,8 @@
         <w:pageBreakBefore/>
         <w:spacing w:before="480" w:after="240"/>
       </w:pPr>
+      <w:bookmarkStart w:id="101" w:name="_TocAll0001"/>
+      <w:bookmarkEnd w:id="101"/>
       <w:r>
         <w:lastRenderedPageBreak/>
         <w:t>Preface — How to Use This Book</w:t>
@@ -87,6 +89,8 @@
         <w:pStyle w:val="Heading1"/>
         <w:spacing w:before="480" w:after="240"/>
       </w:pPr>
+      <w:bookmarkStart w:id="102" w:name="_TocAll0002"/>
+      <w:bookmarkEnd w:id="102"/>
       <w:r>
         <w:t>How This Book Is Organized</w:t>
       </w:r>
@@ -141,6 +145,8 @@
         <w:pStyle w:val="Heading1"/>
         <w:spacing w:before="480" w:after="240"/>
       </w:pPr>
+      <w:bookmarkStart w:id="103" w:name="_TocAll0003"/>
+      <w:bookmarkEnd w:id="103"/>
       <w:r>
         <w:t>About This Series</w:t>
       </w:r>
@@ -443,321 +449,421 @@
       <w:pPr>
         <w:spacing w:after="200" w:line="276" w:lineRule="auto"/>
       </w:pPr>
-      <w:r>
-        <w:t>Preface — How to Use This Book</w:t>
-      </w:r>
-    </w:p>
-    <w:p>
-      <w:pPr>
-        <w:spacing w:after="200" w:line="276" w:lineRule="auto"/>
-      </w:pPr>
-      <w:r>
-        <w:t>How This Book Is Organized</w:t>
-      </w:r>
-    </w:p>
-    <w:p>
-      <w:pPr>
-        <w:spacing w:after="200" w:line="276" w:lineRule="auto"/>
-      </w:pPr>
-      <w:r>
-        <w:t>About This Series</w:t>
-      </w:r>
-    </w:p>
-    <w:p>
-      <w:pPr>
-        <w:spacing w:after="200" w:line="276" w:lineRule="auto"/>
-      </w:pPr>
-      <w:r>
-        <w:t>Chapter 1 — Analog Electronics</w:t>
-      </w:r>
-    </w:p>
-    <w:p>
-      <w:pPr>
-        <w:spacing w:after="200" w:line="276" w:lineRule="auto"/>
-      </w:pPr>
-      <w:r>
-        <w:t>Chapter 2 — Digital Electronics</w:t>
-      </w:r>
-    </w:p>
-    <w:p>
-      <w:pPr>
-        <w:spacing w:after="200" w:line="276" w:lineRule="auto"/>
-      </w:pPr>
-      <w:r>
-        <w:t>Chapter 3 — Logic and Boolean Algebra</w:t>
-      </w:r>
-    </w:p>
-    <w:p>
-      <w:pPr>
-        <w:spacing w:after="200" w:line="276" w:lineRule="auto"/>
-      </w:pPr>
-      <w:r>
-        <w:t>Chapter 4 — Combinational and Sequential Circuits</w:t>
-      </w:r>
-    </w:p>
-    <w:p>
-      <w:pPr>
-        <w:spacing w:after="200" w:line="276" w:lineRule="auto"/>
-      </w:pPr>
-      <w:r>
-        <w:t>Chapter 5 — Operational Amplifiers</w:t>
-      </w:r>
-    </w:p>
-    <w:p>
-      <w:pPr>
-        <w:spacing w:after="200" w:line="276" w:lineRule="auto"/>
-      </w:pPr>
-      <w:r>
-        <w:t>Chapter 6 — Passive and Active Filters</w:t>
-      </w:r>
-    </w:p>
-    <w:p>
-      <w:pPr>
-        <w:spacing w:after="200" w:line="276" w:lineRule="auto"/>
-      </w:pPr>
-      <w:r>
-        <w:t>Chapter 7 — Resistors</w:t>
-      </w:r>
-    </w:p>
-    <w:p>
-      <w:pPr>
-        <w:spacing w:after="200" w:line="276" w:lineRule="auto"/>
-      </w:pPr>
-      <w:r>
-        <w:t>Chapter 8 — Capacitors</w:t>
-      </w:r>
-    </w:p>
-    <w:p>
-      <w:pPr>
-        <w:spacing w:after="200" w:line="276" w:lineRule="auto"/>
-      </w:pPr>
-      <w:r>
-        <w:t>Chapter 9 — Inductors</w:t>
-      </w:r>
-    </w:p>
-    <w:p>
-      <w:pPr>
-        <w:spacing w:after="200" w:line="276" w:lineRule="auto"/>
-      </w:pPr>
-      <w:r>
-        <w:t xml:space="preserve">Chapter 10 — The Loop Under the Model</w:t>
-      </w:r>
-    </w:p>
-    <w:p>
-      <w:pPr>
-        <w:spacing w:after="200" w:line="276" w:lineRule="auto"/>
-      </w:pPr>
-      <w:r>
-        <w:t xml:space="preserve">Chapter 11 — Negative Feedback</w:t>
-      </w:r>
-    </w:p>
-    <w:p>
-      <w:pPr>
-        <w:spacing w:after="200" w:line="276" w:lineRule="auto"/>
-      </w:pPr>
-      <w:r>
-        <w:t xml:space="preserve">Chapter 12 — Followers, Buffers, and Loading</w:t>
-      </w:r>
-    </w:p>
-    <w:p>
-      <w:pPr>
-        <w:spacing w:after="200" w:line="276" w:lineRule="auto"/>
-      </w:pPr>
-      <w:r>
-        <w:t xml:space="preserve">Chapter 13 — Noise Gain, Bandwidth, and Slew Rate</w:t>
-      </w:r>
-    </w:p>
-    <w:p>
-      <w:pPr>
-        <w:spacing w:after="200" w:line="276" w:lineRule="auto"/>
-      </w:pPr>
-      <w:r>
-        <w:t xml:space="preserve">Chapter 14 — Noise in Op-Amp Circuits</w:t>
-      </w:r>
-    </w:p>
-    <w:p>
-      <w:pPr>
-        <w:spacing w:after="200" w:line="276" w:lineRule="auto"/>
-      </w:pPr>
-      <w:r>
-        <w:t xml:space="preserve">Chapter 15 — DC Errors: Offset, Bias Current, and Drift</w:t>
-      </w:r>
-    </w:p>
-    <w:p>
-      <w:pPr>
-        <w:spacing w:after="200" w:line="276" w:lineRule="auto"/>
-      </w:pPr>
-      <w:r>
-        <w:t xml:space="preserve">Chapter 16 — Comparators, Hysteresis, and Open-Collector Outputs</w:t>
-      </w:r>
-    </w:p>
-    <w:p>
-      <w:pPr>
-        <w:spacing w:after="200" w:line="276" w:lineRule="auto"/>
-      </w:pPr>
-      <w:r>
-        <w:t xml:space="preserve">Chapter 17 — Feedback Control: Plant, Sensor, and Controller</w:t>
-      </w:r>
-    </w:p>
-    <w:p>
-      <w:pPr>
-        <w:spacing w:after="200" w:line="276" w:lineRule="auto"/>
-      </w:pPr>
-      <w:r>
-        <w:t xml:space="preserve">Chapter 18 — PID, Lead, and Lag: Shaping the Loop</w:t>
-      </w:r>
-    </w:p>
-    <w:p>
-      <w:pPr>
-        <w:spacing w:after="200" w:line="276" w:lineRule="auto"/>
-      </w:pPr>
-      <w:r>
-        <w:t xml:space="preserve">Chapter 19 — Digital Control: Sample, Hold, and Delay</w:t>
-      </w:r>
-    </w:p>
-    <w:p>
-      <w:pPr>
-        <w:spacing w:after="200" w:line="276" w:lineRule="auto"/>
-      </w:pPr>
-      <w:r>
-        <w:t xml:space="preserve">Chapter 20 — The Inductor as a Part: Reading the Datasheet</w:t>
-      </w:r>
-    </w:p>
-    <w:p>
-      <w:pPr>
-        <w:spacing w:after="200" w:line="276" w:lineRule="auto"/>
-      </w:pPr>
-      <w:r>
-        <w:t xml:space="preserve">Chapter 21 — Active Filter Design: Sallen-Key and Multiple Feedback</w:t>
-      </w:r>
-    </w:p>
-    <w:p>
-      <w:pPr>
-        <w:spacing w:after="200" w:line="276" w:lineRule="auto"/>
-      </w:pPr>
-      <w:r>
-        <w:t xml:space="preserve">Chapter 22 — Resistors in Practice: Heat, Drift, and Pulses</w:t>
-      </w:r>
-    </w:p>
-    <w:p>
-      <w:pPr>
-        <w:spacing w:after="200" w:line="276" w:lineRule="auto"/>
-      </w:pPr>
-      <w:r>
-        <w:t xml:space="preserve">Chapter 23 — Capacitors in Practice: Decoupling and Real Impedance</w:t>
-      </w:r>
-    </w:p>
-    <w:p>
-      <w:pPr>
-        <w:spacing w:after="200" w:line="276" w:lineRule="auto"/>
-      </w:pPr>
-      <w:r>
-        <w:t xml:space="preserve">Chapter 24 — The Instrumentation Amplifier</w:t>
-      </w:r>
-    </w:p>
-    <w:p>
-      <w:pPr>
-        <w:spacing w:after="200" w:line="276" w:lineRule="auto"/>
-      </w:pPr>
-      <w:r>
-        <w:t xml:space="preserve">Chapter 25 — State Feedback and Observers</w:t>
-      </w:r>
-    </w:p>
-    <w:p>
-      <w:pPr>
-        <w:spacing w:after="200" w:line="276" w:lineRule="auto"/>
-      </w:pPr>
-      <w:r>
-        <w:t xml:space="preserve">Chapter 26 — The Sample-and-Hold Circuit</w:t>
-      </w:r>
-    </w:p>
-    <w:p>
-      <w:pPr>
-        <w:spacing w:after="200" w:line="276" w:lineRule="auto"/>
-      </w:pPr>
-      <w:r>
-        <w:t xml:space="preserve">Chapter 27 — The Voltage Reference and the Bandgap</w:t>
-      </w:r>
-    </w:p>
-    <w:p>
-      <w:pPr>
-        <w:spacing w:after="200" w:line="276" w:lineRule="auto"/>
-      </w:pPr>
-      <w:r>
-        <w:t xml:space="preserve">Chapter 28 — The H-Bridge and Motor as a Plant</w:t>
-      </w:r>
-    </w:p>
-    <w:p>
-      <w:pPr>
-        <w:spacing w:after="200" w:line="276" w:lineRule="auto"/>
-      </w:pPr>
-      <w:r>
-        <w:t xml:space="preserve">Chapter 29 — The Root Locus</w:t>
-      </w:r>
-    </w:p>
-    <w:p>
-      <w:pPr>
-        <w:spacing w:after="200" w:line="276" w:lineRule="auto"/>
-      </w:pPr>
-      <w:r>
-        <w:t xml:space="preserve">Chapter 30 — Stability Margins, Nyquist, and the Sensitivity Peak</w:t>
-      </w:r>
-    </w:p>
-    <w:p>
-      <w:pPr>
-        <w:spacing w:after="200" w:line="276" w:lineRule="auto"/>
-      </w:pPr>
-      <w:r>
-        <w:t xml:space="preserve">Chapter 31 — Oscillators: Feedback That Is Meant to Ring</w:t>
-      </w:r>
-    </w:p>
-    <w:p>
-      <w:pPr>
-        <w:spacing w:after="200" w:line="276" w:lineRule="auto"/>
-      </w:pPr>
-      <w:r>
-        <w:t xml:space="preserve">Chapter 32 — Timing: Setup, Hold, and Metastability</w:t>
-      </w:r>
-    </w:p>
-    <w:p>
-      <w:pPr>
-        <w:spacing w:after="200" w:line="276" w:lineRule="auto"/>
-      </w:pPr>
-      <w:r>
-        <w:t>Appendix A — Formula Reference</w:t>
-      </w:r>
-    </w:p>
-    <w:p>
-      <w:pPr>
-        <w:spacing w:after="200" w:line="276" w:lineRule="auto"/>
-      </w:pPr>
-      <w:r>
-        <w:t>Appendix B — Practice Problem Solutions</w:t>
-      </w:r>
-    </w:p>
-    <w:p>
-      <w:pPr>
-        <w:spacing w:after="200" w:line="276" w:lineRule="auto"/>
-      </w:pPr>
-      <w:r>
-        <w:t>Appendix C — Glossary</w:t>
-      </w:r>
-    </w:p>
-    <w:p>
-      <w:pPr>
-        <w:spacing w:after="200" w:line="276" w:lineRule="auto"/>
-      </w:pPr>
-      <w:r>
-        <w:t>Appendix D — Chapter Summaries</w:t>
-      </w:r>
-    </w:p>
-    <w:p>
-      <w:pPr>
-        <w:spacing w:after="200" w:line="276" w:lineRule="auto"/>
-      </w:pPr>
-      <w:r>
-        <w:t>Appendix E — Further Reading</w:t>
-      </w:r>
+      <w:hyperlink w:anchor="_TocAll0001" w:history="1">
+        <w:r>
+          <w:t>Preface — How to Use This Book</w:t>
+        </w:r>
+      </w:hyperlink>
+    </w:p>
+    <w:p>
+      <w:pPr>
+        <w:spacing w:after="200" w:line="276" w:lineRule="auto"/>
+      </w:pPr>
+      <w:hyperlink w:anchor="_TocAll0002" w:history="1">
+        <w:r>
+          <w:t>How This Book Is Organized</w:t>
+        </w:r>
+      </w:hyperlink>
+    </w:p>
+    <w:p>
+      <w:pPr>
+        <w:spacing w:after="200" w:line="276" w:lineRule="auto"/>
+      </w:pPr>
+      <w:hyperlink w:anchor="_TocAll0003" w:history="1">
+        <w:r>
+          <w:t>About This Series</w:t>
+        </w:r>
+      </w:hyperlink>
+    </w:p>
+    <w:p>
+      <w:pPr>
+        <w:spacing w:after="200" w:line="276" w:lineRule="auto"/>
+      </w:pPr>
+      <w:hyperlink w:anchor="_TocAll0004" w:history="1">
+        <w:r>
+          <w:t>Chapter 1 — Analog Electronics</w:t>
+        </w:r>
+      </w:hyperlink>
+    </w:p>
+    <w:p>
+      <w:pPr>
+        <w:spacing w:after="200" w:line="276" w:lineRule="auto"/>
+      </w:pPr>
+      <w:hyperlink w:anchor="_TocAll0005" w:history="1">
+        <w:r>
+          <w:t>Chapter 2 — Digital Electronics</w:t>
+        </w:r>
+      </w:hyperlink>
+    </w:p>
+    <w:p>
+      <w:pPr>
+        <w:spacing w:after="200" w:line="276" w:lineRule="auto"/>
+      </w:pPr>
+      <w:hyperlink w:anchor="_TocAll0006" w:history="1">
+        <w:r>
+          <w:t>Chapter 3 — Logic and Boolean Algebra</w:t>
+        </w:r>
+      </w:hyperlink>
+    </w:p>
+    <w:p>
+      <w:pPr>
+        <w:spacing w:after="200" w:line="276" w:lineRule="auto"/>
+      </w:pPr>
+      <w:hyperlink w:anchor="_TocAll0007" w:history="1">
+        <w:r>
+          <w:t>Chapter 4 — Combinational and Sequential Circuits</w:t>
+        </w:r>
+      </w:hyperlink>
+    </w:p>
+    <w:p>
+      <w:pPr>
+        <w:spacing w:after="200" w:line="276" w:lineRule="auto"/>
+      </w:pPr>
+      <w:hyperlink w:anchor="_TocAll0008" w:history="1">
+        <w:r>
+          <w:t>Chapter 5 — Operational Amplifiers</w:t>
+        </w:r>
+      </w:hyperlink>
+    </w:p>
+    <w:p>
+      <w:pPr>
+        <w:spacing w:after="200" w:line="276" w:lineRule="auto"/>
+      </w:pPr>
+      <w:hyperlink w:anchor="_TocAll0009" w:history="1">
+        <w:r>
+          <w:t>Chapter 6 — Passive and Active Filters</w:t>
+        </w:r>
+      </w:hyperlink>
+    </w:p>
+    <w:p>
+      <w:pPr>
+        <w:spacing w:after="200" w:line="276" w:lineRule="auto"/>
+      </w:pPr>
+      <w:hyperlink w:anchor="_TocAll0010" w:history="1">
+        <w:r>
+          <w:t>Chapter 7 — Resistors</w:t>
+        </w:r>
+      </w:hyperlink>
+    </w:p>
+    <w:p>
+      <w:pPr>
+        <w:spacing w:after="200" w:line="276" w:lineRule="auto"/>
+      </w:pPr>
+      <w:hyperlink w:anchor="_TocAll0011" w:history="1">
+        <w:r>
+          <w:t>Chapter 8 — Capacitors</w:t>
+        </w:r>
+      </w:hyperlink>
+    </w:p>
+    <w:p>
+      <w:pPr>
+        <w:spacing w:after="200" w:line="276" w:lineRule="auto"/>
+      </w:pPr>
+      <w:hyperlink w:anchor="_TocAll0012" w:history="1">
+        <w:r>
+          <w:t>Chapter 9 — Inductors</w:t>
+        </w:r>
+      </w:hyperlink>
+    </w:p>
+    <w:p>
+      <w:pPr>
+        <w:spacing w:after="200" w:line="276" w:lineRule="auto"/>
+      </w:pPr>
+      <w:hyperlink w:anchor="_TocAll0013" w:history="1">
+        <w:r>
+          <w:t xml:space="preserve">Chapter 10 — The Loop Under the Model</w:t>
+        </w:r>
+      </w:hyperlink>
+    </w:p>
+    <w:p>
+      <w:pPr>
+        <w:spacing w:after="200" w:line="276" w:lineRule="auto"/>
+      </w:pPr>
+      <w:hyperlink w:anchor="_TocAll0014" w:history="1">
+        <w:r>
+          <w:t xml:space="preserve">Chapter 11 — Negative Feedback</w:t>
+        </w:r>
+      </w:hyperlink>
+    </w:p>
+    <w:p>
+      <w:pPr>
+        <w:spacing w:after="200" w:line="276" w:lineRule="auto"/>
+      </w:pPr>
+      <w:hyperlink w:anchor="_TocAll0015" w:history="1">
+        <w:r>
+          <w:t xml:space="preserve">Chapter 12 — Followers, Buffers, and Loading</w:t>
+        </w:r>
+      </w:hyperlink>
+    </w:p>
+    <w:p>
+      <w:pPr>
+        <w:spacing w:after="200" w:line="276" w:lineRule="auto"/>
+      </w:pPr>
+      <w:hyperlink w:anchor="_TocAll0016" w:history="1">
+        <w:r>
+          <w:t xml:space="preserve">Chapter 13 — Noise Gain, Bandwidth, and Slew Rate</w:t>
+        </w:r>
+      </w:hyperlink>
+    </w:p>
+    <w:p>
+      <w:pPr>
+        <w:spacing w:after="200" w:line="276" w:lineRule="auto"/>
+      </w:pPr>
+      <w:hyperlink w:anchor="_TocAll0017" w:history="1">
+        <w:r>
+          <w:t xml:space="preserve">Chapter 14 — Noise in Op-Amp Circuits</w:t>
+        </w:r>
+      </w:hyperlink>
+    </w:p>
+    <w:p>
+      <w:pPr>
+        <w:spacing w:after="200" w:line="276" w:lineRule="auto"/>
+      </w:pPr>
+      <w:hyperlink w:anchor="_TocAll0018" w:history="1">
+        <w:r>
+          <w:t xml:space="preserve">Chapter 15 — DC Errors: Offset, Bias Current, and Drift</w:t>
+        </w:r>
+      </w:hyperlink>
+    </w:p>
+    <w:p>
+      <w:pPr>
+        <w:spacing w:after="200" w:line="276" w:lineRule="auto"/>
+      </w:pPr>
+      <w:hyperlink w:anchor="_TocAll0019" w:history="1">
+        <w:r>
+          <w:t xml:space="preserve">Chapter 16 — Comparators, Hysteresis, and Open-Collector Outputs</w:t>
+        </w:r>
+      </w:hyperlink>
+    </w:p>
+    <w:p>
+      <w:pPr>
+        <w:spacing w:after="200" w:line="276" w:lineRule="auto"/>
+      </w:pPr>
+      <w:hyperlink w:anchor="_TocAll0020" w:history="1">
+        <w:r>
+          <w:t xml:space="preserve">Chapter 17 — Feedback Control: Plant, Sensor, and Controller</w:t>
+        </w:r>
+      </w:hyperlink>
+    </w:p>
+    <w:p>
+      <w:pPr>
+        <w:spacing w:after="200" w:line="276" w:lineRule="auto"/>
+      </w:pPr>
+      <w:hyperlink w:anchor="_TocAll0021" w:history="1">
+        <w:r>
+          <w:t xml:space="preserve">Chapter 18 — PID, Lead, and Lag: Shaping the Loop</w:t>
+        </w:r>
+      </w:hyperlink>
+    </w:p>
+    <w:p>
+      <w:pPr>
+        <w:spacing w:after="200" w:line="276" w:lineRule="auto"/>
+      </w:pPr>
+      <w:hyperlink w:anchor="_TocAll0022" w:history="1">
+        <w:r>
+          <w:t xml:space="preserve">Chapter 19 — Digital Control: Sample, Hold, and Delay</w:t>
+        </w:r>
+      </w:hyperlink>
+    </w:p>
+    <w:p>
+      <w:pPr>
+        <w:spacing w:after="200" w:line="276" w:lineRule="auto"/>
+      </w:pPr>
+      <w:hyperlink w:anchor="_TocAll0023" w:history="1">
+        <w:r>
+          <w:t xml:space="preserve">Chapter 20 — The Inductor as a Part: Reading the Datasheet</w:t>
+        </w:r>
+      </w:hyperlink>
+    </w:p>
+    <w:p>
+      <w:pPr>
+        <w:spacing w:after="200" w:line="276" w:lineRule="auto"/>
+      </w:pPr>
+      <w:hyperlink w:anchor="_TocAll0024" w:history="1">
+        <w:r>
+          <w:t xml:space="preserve">Chapter 21 — Active Filter Design: Sallen-Key and Multiple Feedback</w:t>
+        </w:r>
+      </w:hyperlink>
+    </w:p>
+    <w:p>
+      <w:pPr>
+        <w:spacing w:after="200" w:line="276" w:lineRule="auto"/>
+      </w:pPr>
+      <w:hyperlink w:anchor="_TocAll0025" w:history="1">
+        <w:r>
+          <w:t xml:space="preserve">Chapter 22 — Resistors in Practice: Heat, Drift, and Pulses</w:t>
+        </w:r>
+      </w:hyperlink>
+    </w:p>
+    <w:p>
+      <w:pPr>
+        <w:spacing w:after="200" w:line="276" w:lineRule="auto"/>
+      </w:pPr>
+      <w:hyperlink w:anchor="_TocAll0026" w:history="1">
+        <w:r>
+          <w:t xml:space="preserve">Chapter 23 — Capacitors in Practice: Decoupling and Real Impedance</w:t>
+        </w:r>
+      </w:hyperlink>
+    </w:p>
+    <w:p>
+      <w:pPr>
+        <w:spacing w:after="200" w:line="276" w:lineRule="auto"/>
+      </w:pPr>
+      <w:hyperlink w:anchor="_TocAll0027" w:history="1">
+        <w:r>
+          <w:t xml:space="preserve">Chapter 24 — The Instrumentation Amplifier</w:t>
+        </w:r>
+      </w:hyperlink>
+    </w:p>
+    <w:p>
+      <w:pPr>
+        <w:spacing w:after="200" w:line="276" w:lineRule="auto"/>
+      </w:pPr>
+      <w:hyperlink w:anchor="_TocAll0028" w:history="1">
+        <w:r>
+          <w:t xml:space="preserve">Chapter 25 — State Feedback and Observers</w:t>
+        </w:r>
+      </w:hyperlink>
+    </w:p>
+    <w:p>
+      <w:pPr>
+        <w:spacing w:after="200" w:line="276" w:lineRule="auto"/>
+      </w:pPr>
+      <w:hyperlink w:anchor="_TocAll0029" w:history="1">
+        <w:r>
+          <w:t xml:space="preserve">Chapter 26 — The Sample-and-Hold Circuit</w:t>
+        </w:r>
+      </w:hyperlink>
+    </w:p>
+    <w:p>
+      <w:pPr>
+        <w:spacing w:after="200" w:line="276" w:lineRule="auto"/>
+      </w:pPr>
+      <w:hyperlink w:anchor="_TocAll0030" w:history="1">
+        <w:r>
+          <w:t xml:space="preserve">Chapter 27 — The Voltage Reference and the Bandgap</w:t>
+        </w:r>
+      </w:hyperlink>
+    </w:p>
+    <w:p>
+      <w:pPr>
+        <w:spacing w:after="200" w:line="276" w:lineRule="auto"/>
+      </w:pPr>
+      <w:hyperlink w:anchor="_TocAll0031" w:history="1">
+        <w:r>
+          <w:t xml:space="preserve">Chapter 28 — The H-Bridge and Motor as a Plant</w:t>
+        </w:r>
+      </w:hyperlink>
+    </w:p>
+    <w:p>
+      <w:pPr>
+        <w:spacing w:after="200" w:line="276" w:lineRule="auto"/>
+      </w:pPr>
+      <w:hyperlink w:anchor="_TocAll0032" w:history="1">
+        <w:r>
+          <w:t xml:space="preserve">Chapter 29 — The Root Locus</w:t>
+        </w:r>
+      </w:hyperlink>
+    </w:p>
+    <w:p>
+      <w:pPr>
+        <w:spacing w:after="200" w:line="276" w:lineRule="auto"/>
+      </w:pPr>
+      <w:hyperlink w:anchor="_TocAll0033" w:history="1">
+        <w:r>
+          <w:t xml:space="preserve">Chapter 30 — Stability Margins, Nyquist, and the Sensitivity Peak</w:t>
+        </w:r>
+      </w:hyperlink>
+    </w:p>
+    <w:p>
+      <w:pPr>
+        <w:spacing w:after="200" w:line="276" w:lineRule="auto"/>
+      </w:pPr>
+      <w:hyperlink w:anchor="_TocAll0034" w:history="1">
+        <w:r>
+          <w:t xml:space="preserve">Chapter 31 — Oscillators: Feedback That Is Meant to Ring</w:t>
+        </w:r>
+      </w:hyperlink>
+    </w:p>
+    <w:p>
+      <w:pPr>
+        <w:spacing w:after="200" w:line="276" w:lineRule="auto"/>
+      </w:pPr>
+      <w:hyperlink w:anchor="_TocAll0035" w:history="1">
+        <w:r>
+          <w:t xml:space="preserve">Chapter 32 — Timing: Setup, Hold, and Metastability</w:t>
+        </w:r>
+      </w:hyperlink>
+    </w:p>
+    <w:p>
+      <w:pPr>
+        <w:spacing w:after="200" w:line="276" w:lineRule="auto"/>
+      </w:pPr>
+      <w:hyperlink w:anchor="_TocAll0036" w:history="1">
+        <w:r>
+          <w:t>Appendix A — Formula Reference</w:t>
+        </w:r>
+      </w:hyperlink>
+    </w:p>
+    <w:p>
+      <w:pPr>
+        <w:spacing w:after="200" w:line="276" w:lineRule="auto"/>
+      </w:pPr>
+      <w:hyperlink w:anchor="_TocAll0037" w:history="1">
+        <w:r>
+          <w:t>Appendix B — Practice Problem Solutions</w:t>
+        </w:r>
+      </w:hyperlink>
+    </w:p>
+    <w:p>
+      <w:pPr>
+        <w:spacing w:after="200" w:line="276" w:lineRule="auto"/>
+      </w:pPr>
+      <w:hyperlink w:anchor="_TocAll0038" w:history="1">
+        <w:r>
+          <w:t>Appendix C — Glossary</w:t>
+        </w:r>
+      </w:hyperlink>
+    </w:p>
+    <w:p>
+      <w:pPr>
+        <w:spacing w:after="200" w:line="276" w:lineRule="auto"/>
+      </w:pPr>
+      <w:hyperlink w:anchor="_TocAll0039" w:history="1">
+        <w:r>
+          <w:t>Appendix D — Chapter Summaries</w:t>
+        </w:r>
+      </w:hyperlink>
+    </w:p>
+    <w:p>
+      <w:pPr>
+        <w:spacing w:after="200" w:line="276" w:lineRule="auto"/>
+      </w:pPr>
+      <w:hyperlink w:anchor="_TocAll0040" w:history="1">
+        <w:r>
+          <w:t>Appendix E — Further Reading</w:t>
+        </w:r>
+      </w:hyperlink>
+    </w:p>
+    <w:p>
+      <w:pPr>
+        <w:spacing w:after="200" w:line="276" w:lineRule="auto"/>
+      </w:pPr>
+      <w:hyperlink w:anchor="_TocAll0041" w:history="1">
+        <w:r>
+          <w:t xml:space="preserve">About the Author</w:t>
+        </w:r>
+      </w:hyperlink>
+    </w:p>
+    <w:p>
+      <w:pPr>
+        <w:spacing w:after="200" w:line="276" w:lineRule="auto"/>
+      </w:pPr>
+      <w:hyperlink w:anchor="_TocAll0042" w:history="1">
+        <w:r>
+          <w:t xml:space="preserve">Also by Lothar J. Musiol</w:t>
+        </w:r>
+      </w:hyperlink>
     </w:p>
     <w:p>
       <w:pPr>
@@ -765,6 +871,8 @@
         <w:pageBreakBefore/>
         <w:spacing w:before="480" w:after="240"/>
       </w:pPr>
+      <w:bookmarkStart w:id="104" w:name="_TocAll0004"/>
+      <w:bookmarkEnd w:id="104"/>
       <w:r>
         <w:lastRenderedPageBreak/>
         <w:t>Chapter 1 — Analog Electronics</w:t>
@@ -1150,6 +1258,8 @@
         <w:pageBreakBefore/>
         <w:spacing w:before="480" w:after="240"/>
       </w:pPr>
+      <w:bookmarkStart w:id="105" w:name="_TocAll0005"/>
+      <w:bookmarkEnd w:id="105"/>
       <w:r>
         <w:lastRenderedPageBreak/>
         <w:t>Chapter 2 — Digital Electronics</w:t>
@@ -1525,6 +1635,8 @@
         <w:pageBreakBefore/>
         <w:spacing w:before="480" w:after="240"/>
       </w:pPr>
+      <w:bookmarkStart w:id="106" w:name="_TocAll0006"/>
+      <w:bookmarkEnd w:id="106"/>
       <w:r>
         <w:lastRenderedPageBreak/>
         <w:t>Chapter 3 — Logic and Boolean Algebra</w:t>
@@ -1893,6 +2005,8 @@
         <w:pageBreakBefore/>
         <w:spacing w:before="480" w:after="240"/>
       </w:pPr>
+      <w:bookmarkStart w:id="107" w:name="_TocAll0007"/>
+      <w:bookmarkEnd w:id="107"/>
       <w:r>
         <w:lastRenderedPageBreak/>
         <w:t>Chapter 4 — Combinational and Sequential Circuits</w:t>
@@ -2347,6 +2461,8 @@
         <w:pageBreakBefore/>
         <w:spacing w:before="480" w:after="240"/>
       </w:pPr>
+      <w:bookmarkStart w:id="108" w:name="_TocAll0008"/>
+      <w:bookmarkEnd w:id="108"/>
       <w:r>
         <w:lastRenderedPageBreak/>
         <w:t>Chapter 5 — Operational Amplifiers</w:t>
@@ -3011,6 +3127,8 @@
         <w:pageBreakBefore/>
         <w:spacing w:before="480" w:after="240"/>
       </w:pPr>
+      <w:bookmarkStart w:id="109" w:name="_TocAll0009"/>
+      <w:bookmarkEnd w:id="109"/>
       <w:r>
         <w:lastRenderedPageBreak/>
         <w:t>Chapter 6 — Passive and Active Filters</w:t>
@@ -3523,6 +3641,8 @@
         <w:pageBreakBefore/>
         <w:spacing w:before="480" w:after="240"/>
       </w:pPr>
+      <w:bookmarkStart w:id="110" w:name="_TocAll0010"/>
+      <w:bookmarkEnd w:id="110"/>
       <w:r>
         <w:lastRenderedPageBreak/>
         <w:t>Chapter 7 — Resistors</w:t>
@@ -3886,6 +4006,8 @@
         <w:pageBreakBefore/>
         <w:spacing w:before="480" w:after="240"/>
       </w:pPr>
+      <w:bookmarkStart w:id="111" w:name="_TocAll0011"/>
+      <w:bookmarkEnd w:id="111"/>
       <w:r>
         <w:lastRenderedPageBreak/>
         <w:t>Chapter 8 — Capacitors</w:t>
@@ -4242,6 +4364,8 @@
         <w:pageBreakBefore/>
         <w:spacing w:before="480" w:after="240"/>
       </w:pPr>
+      <w:bookmarkStart w:id="112" w:name="_TocAll0012"/>
+      <w:bookmarkEnd w:id="112"/>
       <w:r>
         <w:lastRenderedPageBreak/>
         <w:t>Chapter 9 — Inductors</w:t>
@@ -4611,6 +4735,8 @@
       <w:pPr>
         <w:pStyle w:val="Heading1"/>
       </w:pPr>
+      <w:bookmarkStart w:id="113" w:name="_TocAll0013"/>
+      <w:bookmarkEnd w:id="113"/>
       <w:r>
         <w:rPr>
           <w:rFonts w:ascii="Amazon Ember" w:hAnsi="Amazon Ember" w:cs="Amazon Ember"/>
@@ -4725,6 +4851,8 @@
         <w:pageBreakBefore/>
         <w:spacing w:before="480" w:after="240"/>
       </w:pPr>
+      <w:bookmarkStart w:id="114" w:name="_TocAll0014"/>
+      <w:bookmarkEnd w:id="114"/>
       <w:r>
         <w:t xml:space="preserve">Chapter 11 — Negative Feedback</w:t>
       </w:r>
@@ -5276,6 +5404,8 @@
         <w:pageBreakBefore/>
         <w:spacing w:before="480" w:after="240"/>
       </w:pPr>
+      <w:bookmarkStart w:id="115" w:name="_TocAll0015"/>
+      <w:bookmarkEnd w:id="115"/>
       <w:r>
         <w:t xml:space="preserve">Chapter 12 — Followers, Buffers, and Loading</w:t>
       </w:r>
@@ -5806,6 +5936,8 @@
         <w:pageBreakBefore/>
         <w:spacing w:before="480" w:after="240"/>
       </w:pPr>
+      <w:bookmarkStart w:id="116" w:name="_TocAll0016"/>
+      <w:bookmarkEnd w:id="116"/>
       <w:r>
         <w:t xml:space="preserve">Chapter 13 — Noise Gain, Bandwidth, and Slew Rate</w:t>
       </w:r>
@@ -6317,6 +6449,8 @@
         <w:pageBreakBefore/>
         <w:spacing w:before="480" w:after="240"/>
       </w:pPr>
+      <w:bookmarkStart w:id="117" w:name="_TocAll0017"/>
+      <w:bookmarkEnd w:id="117"/>
       <w:r>
         <w:t xml:space="preserve">Chapter 14 — Noise in Op-Amp Circuits</w:t>
       </w:r>
@@ -6777,6 +6911,8 @@
         <w:pageBreakBefore/>
         <w:spacing w:before="480" w:after="240"/>
       </w:pPr>
+      <w:bookmarkStart w:id="118" w:name="_TocAll0018"/>
+      <w:bookmarkEnd w:id="118"/>
       <w:r>
         <w:t xml:space="preserve">Chapter 15 — DC Errors: Offset, Bias Current, and Drift</w:t>
       </w:r>
@@ -7310,6 +7446,8 @@
         <w:pageBreakBefore/>
         <w:spacing w:before="480" w:after="240"/>
       </w:pPr>
+      <w:bookmarkStart w:id="119" w:name="_TocAll0019"/>
+      <w:bookmarkEnd w:id="119"/>
       <w:r>
         <w:t xml:space="preserve">Chapter 16 — Comparators, Hysteresis, and Open-Collector Outputs</w:t>
       </w:r>
@@ -7769,6 +7907,8 @@
         <w:pageBreakBefore/>
         <w:spacing w:before="480" w:after="240"/>
       </w:pPr>
+      <w:bookmarkStart w:id="120" w:name="_TocAll0020"/>
+      <w:bookmarkEnd w:id="120"/>
       <w:r>
         <w:t xml:space="preserve">Chapter 17 — Feedback Control: Plant, Sensor, and Controller</w:t>
       </w:r>
@@ -8203,6 +8343,8 @@
         <w:pageBreakBefore/>
         <w:spacing w:before="480" w:after="240"/>
       </w:pPr>
+      <w:bookmarkStart w:id="121" w:name="_TocAll0021"/>
+      <w:bookmarkEnd w:id="121"/>
       <w:r>
         <w:t xml:space="preserve">Chapter 18 — PID, Lead, and Lag: Shaping the Loop</w:t>
       </w:r>
@@ -8733,6 +8875,8 @@
         <w:pageBreakBefore/>
         <w:spacing w:before="480" w:after="240"/>
       </w:pPr>
+      <w:bookmarkStart w:id="122" w:name="_TocAll0022"/>
+      <w:bookmarkEnd w:id="122"/>
       <w:r>
         <w:t xml:space="preserve">Chapter 19 — Digital Control: Sample, Hold, and Delay</w:t>
       </w:r>
@@ -9168,6 +9312,8 @@
         <w:pageBreakBefore/>
         <w:spacing w:before="480" w:after="240"/>
       </w:pPr>
+      <w:bookmarkStart w:id="123" w:name="_TocAll0023"/>
+      <w:bookmarkEnd w:id="123"/>
       <w:r>
         <w:t xml:space="preserve">Chapter 20 — The Inductor as a Part: Reading the Datasheet</w:t>
       </w:r>
@@ -9621,6 +9767,8 @@
         <w:pageBreakBefore/>
         <w:spacing w:before="480" w:after="240"/>
       </w:pPr>
+      <w:bookmarkStart w:id="124" w:name="_TocAll0024"/>
+      <w:bookmarkEnd w:id="124"/>
       <w:r>
         <w:t xml:space="preserve">Chapter 21 — Active Filter Design: Sallen-Key and Multiple Feedback</w:t>
       </w:r>
@@ -10081,6 +10229,8 @@
         <w:pageBreakBefore/>
         <w:spacing w:before="480" w:after="240"/>
       </w:pPr>
+      <w:bookmarkStart w:id="125" w:name="_TocAll0025"/>
+      <w:bookmarkEnd w:id="125"/>
       <w:r>
         <w:t xml:space="preserve">Chapter 22 — Resistors in Practice: Heat, Drift, and Pulses</w:t>
       </w:r>
@@ -10613,6 +10763,8 @@
         <w:pageBreakBefore/>
         <w:spacing w:before="480" w:after="240"/>
       </w:pPr>
+      <w:bookmarkStart w:id="126" w:name="_TocAll0026"/>
+      <w:bookmarkEnd w:id="126"/>
       <w:r>
         <w:t xml:space="preserve">Chapter 23 — Capacitors in Practice: Decoupling and Real Impedance</w:t>
       </w:r>
@@ -11171,6 +11323,8 @@
         <w:pageBreakBefore/>
         <w:spacing w:before="480" w:after="240"/>
       </w:pPr>
+      <w:bookmarkStart w:id="127" w:name="_TocAll0027"/>
+      <w:bookmarkEnd w:id="127"/>
       <w:r>
         <w:t xml:space="preserve">Chapter 24 — The Instrumentation Amplifier</w:t>
       </w:r>
@@ -11795,6 +11949,8 @@
         <w:pageBreakBefore/>
         <w:spacing w:before="480" w:after="240"/>
       </w:pPr>
+      <w:bookmarkStart w:id="128" w:name="_TocAll0028"/>
+      <w:bookmarkEnd w:id="128"/>
       <w:r>
         <w:t xml:space="preserve">Chapter 25 — State Feedback and Observers</w:t>
       </w:r>
@@ -12343,6 +12499,8 @@
         <w:pageBreakBefore/>
         <w:spacing w:before="480" w:after="240"/>
       </w:pPr>
+      <w:bookmarkStart w:id="129" w:name="_TocAll0029"/>
+      <w:bookmarkEnd w:id="129"/>
       <w:r>
         <w:t xml:space="preserve">Chapter 26 — The Sample-and-Hold Circuit</w:t>
       </w:r>
@@ -12928,6 +13086,8 @@
         <w:pageBreakBefore/>
         <w:spacing w:before="480" w:after="240"/>
       </w:pPr>
+      <w:bookmarkStart w:id="130" w:name="_TocAll0030"/>
+      <w:bookmarkEnd w:id="130"/>
       <w:r>
         <w:t xml:space="preserve">Chapter 27 — The Voltage Reference and the Bandgap</w:t>
       </w:r>
@@ -13549,6 +13709,8 @@
         <w:pageBreakBefore/>
         <w:spacing w:before="480" w:after="240"/>
       </w:pPr>
+      <w:bookmarkStart w:id="131" w:name="_TocAll0031"/>
+      <w:bookmarkEnd w:id="131"/>
       <w:r>
         <w:t xml:space="preserve">Chapter 28 — The H-Bridge and Motor as a Plant</w:t>
       </w:r>
@@ -14080,6 +14242,8 @@
         <w:pageBreakBefore/>
         <w:spacing w:before="480" w:after="240"/>
       </w:pPr>
+      <w:bookmarkStart w:id="132" w:name="_TocAll0032"/>
+      <w:bookmarkEnd w:id="132"/>
       <w:r>
         <w:t xml:space="preserve">Chapter 29 — The Root Locus</w:t>
       </w:r>
@@ -14509,6 +14673,8 @@
         <w:pageBreakBefore/>
         <w:spacing w:before="480" w:after="240"/>
       </w:pPr>
+      <w:bookmarkStart w:id="133" w:name="_TocAll0033"/>
+      <w:bookmarkEnd w:id="133"/>
       <w:r>
         <w:t xml:space="preserve">Chapter 30 — Stability Margins, Nyquist, and the Sensitivity Peak</w:t>
       </w:r>
@@ -14911,6 +15077,8 @@
         <w:pageBreakBefore/>
         <w:spacing w:before="480" w:after="240"/>
       </w:pPr>
+      <w:bookmarkStart w:id="134" w:name="_TocAll0034"/>
+      <w:bookmarkEnd w:id="134"/>
       <w:r>
         <w:t xml:space="preserve">Chapter 31 — Oscillators: Feedback That Is Meant to Ring</w:t>
       </w:r>
@@ -15383,6 +15551,8 @@
         <w:pageBreakBefore/>
         <w:spacing w:before="480" w:after="240"/>
       </w:pPr>
+      <w:bookmarkStart w:id="135" w:name="_TocAll0035"/>
+      <w:bookmarkEnd w:id="135"/>
       <w:r>
         <w:t xml:space="preserve">Chapter 32 — Timing: Setup, Hold, and Metastability</w:t>
       </w:r>
@@ -15776,6 +15946,8 @@
         <w:pageBreakBefore/>
         <w:spacing w:before="480" w:after="240"/>
       </w:pPr>
+      <w:bookmarkStart w:id="136" w:name="_TocAll0036"/>
+      <w:bookmarkEnd w:id="136"/>
       <w:r>
         <w:lastRenderedPageBreak/>
         <w:t>Appendix A — Formula Reference</w:t>
@@ -17723,6 +17895,8 @@
         <w:pageBreakBefore/>
         <w:spacing w:before="480" w:after="240"/>
       </w:pPr>
+      <w:bookmarkStart w:id="137" w:name="_TocAll0037"/>
+      <w:bookmarkEnd w:id="137"/>
       <w:r>
         <w:lastRenderedPageBreak/>
         <w:t>Appendix B — Practice Problem Solutions</w:t>
@@ -20014,6 +20188,8 @@
         <w:pageBreakBefore/>
         <w:spacing w:before="480" w:after="240"/>
       </w:pPr>
+      <w:bookmarkStart w:id="138" w:name="_TocAll0038"/>
+      <w:bookmarkEnd w:id="138"/>
       <w:r>
         <w:lastRenderedPageBreak/>
         <w:t>Appendix C — Glossary</w:t>
@@ -21720,6 +21896,8 @@
         <w:pageBreakBefore/>
         <w:spacing w:before="480" w:after="240"/>
       </w:pPr>
+      <w:bookmarkStart w:id="139" w:name="_TocAll0039"/>
+      <w:bookmarkEnd w:id="139"/>
       <w:r>
         <w:lastRenderedPageBreak/>
         <w:t>Appendix D — Chapter Summaries</w:t>
@@ -22276,6 +22454,8 @@
         <w:pageBreakBefore/>
         <w:spacing w:before="480" w:after="240"/>
       </w:pPr>
+      <w:bookmarkStart w:id="140" w:name="_TocAll0040"/>
+      <w:bookmarkEnd w:id="140"/>
       <w:r>
         <w:lastRenderedPageBreak/>
         <w:t>Appendix E — Further Reading</w:t>
@@ -22542,6 +22722,19 @@
       </w:r>
       <w:r>
         <w:t xml:space="preserve">a widely used paper on synchronizers, Gray-coded FIFO pointers, and handshakes (Chapter 32).</w:t>
+      </w:r>
+    </w:p>
+    <w:p>
+      <w:pPr>
+        <w:pageBreakBefore/>
+        <w:spacing w:after="200" w:line="276" w:lineRule="auto"/>
+      </w:pPr>
+      <w:r>
+        <w:rPr>
+          <w:i/>
+          <w:iCs/>
+        </w:rPr>
+        <w:t xml:space="preserve">If this book gave you something, a laugh, an idea, or a better question, I'd love to hear about it. A short review on Amazon, even a sentence or two, helps other curious readers find it, and I read every one.</w:t>
       </w:r>
     </w:p>
     <w:p>
@@ -22550,6 +22743,8 @@
         <w:pageBreakBefore/>
         <w:spacing w:before="480" w:after="240"/>
       </w:pPr>
+      <w:bookmarkStart w:id="141" w:name="_TocAll0041"/>
+      <w:bookmarkEnd w:id="141"/>
       <w:r>
         <w:t xml:space="preserve">About the Author</w:t>
       </w:r>
@@ -22576,6 +22771,8 @@
         <w:pageBreakBefore/>
         <w:spacing w:before="480" w:after="240"/>
       </w:pPr>
+      <w:bookmarkStart w:id="142" w:name="_TocAll0042"/>
+      <w:bookmarkEnd w:id="142"/>
       <w:r>
         <w:t xml:space="preserve">Also by Lothar J. Musiol</w:t>
       </w:r>

</xml_diff>

<commit_message>
No Word tables, part 1: tools/kindle_tables.py (tables to headed text, or an inline PNG with alt text when columns are needed; floating pictures inline), hooked into kindle_postbuild.py via tables: true (also fixes unused-image detection for ns-prefixed masters); EE Book 1 (17 as text), EE Book 2 (2 as text), Life (1 text, 1 image), Schrodinger's Paperwork (1 text)
</commit_message>
<xml_diff>
--- a/EE - SERIES/Circuits_Components_and_Control_Book2.docx
+++ b/EE - SERIES/Circuits_Components_and_Control_Book2.docx
@@ -159,254 +159,162 @@
         <w:t>This book is the second of seven, covering circuits, components, and the classical control loop that later sits under a robot model. Each book assumes only the books before it in the list below — never the ones after.</w:t>
       </w:r>
     </w:p>
-    <w:tbl>
-      <w:tblPr>
-        <w:tblW w:w="5000" w:type="pct"/>
-        <w:tblBorders>
-          <w:top w:val="single" w:sz="4" w:space="0" w:color="auto"/>
-          <w:left w:val="single" w:sz="4" w:space="0" w:color="auto"/>
-          <w:bottom w:val="single" w:sz="4" w:space="0" w:color="auto"/>
-          <w:right w:val="single" w:sz="4" w:space="0" w:color="auto"/>
-          <w:insideH w:val="single" w:sz="4" w:space="0" w:color="auto"/>
-          <w:insideV w:val="single" w:sz="4" w:space="0" w:color="auto"/>
-        </w:tblBorders>
-        <w:tblCellMar>
-          <w:left w:w="10" w:type="dxa"/>
-          <w:right w:w="10" w:type="dxa"/>
-        </w:tblCellMar>
-        <w:tblLook w:val="04A0" w:firstRow="1" w:lastRow="0" w:firstColumn="1" w:lastColumn="0" w:noHBand="0" w:noVBand="1"/>
-      </w:tblPr>
-      <w:tblGrid>
-        <w:gridCol w:w="3195"/>
-        <w:gridCol w:w="6155"/>
-      </w:tblGrid>
-      <w:tr>
-        <w:tblPrEx>
-          <w:tblCellMar>
-            <w:top w:w="0" w:type="dxa"/>
-            <w:bottom w:w="0" w:type="dxa"/>
-          </w:tblCellMar>
-        </w:tblPrEx>
-        <w:tc>
-          <w:tcPr>
-            <w:tcW w:w="0" w:type="auto"/>
-            <w:shd w:val="clear" w:color="auto" w:fill="DDE6F0"/>
-          </w:tcPr>
-          <w:p>
-            <w:r>
-              <w:t>Book</w:t>
-            </w:r>
-          </w:p>
-        </w:tc>
-        <w:tc>
-          <w:tcPr>
-            <w:tcW w:w="0" w:type="auto"/>
-            <w:shd w:val="clear" w:color="auto" w:fill="DDE6F0"/>
-          </w:tcPr>
-          <w:p>
-            <w:r>
-              <w:t>Covers</w:t>
-            </w:r>
-          </w:p>
-        </w:tc>
-      </w:tr>
-      <w:tr>
-        <w:tblPrEx>
-          <w:tblCellMar>
-            <w:top w:w="0" w:type="dxa"/>
-            <w:bottom w:w="0" w:type="dxa"/>
-          </w:tblCellMar>
-        </w:tblPrEx>
-        <w:tc>
-          <w:tcPr>
-            <w:tcW w:w="0" w:type="auto"/>
-          </w:tcPr>
-          <w:p>
-            <w:r>
-              <w:t>1. Foundations</w:t>
-            </w:r>
-          </w:p>
-        </w:tc>
-        <w:tc>
-          <w:tcPr>
-            <w:tcW w:w="0" w:type="auto"/>
-          </w:tcPr>
-          <w:p>
-            <w:r>
-              <w:t>Physics, mathematics, and circuit theory</w:t>
-            </w:r>
-          </w:p>
-        </w:tc>
-      </w:tr>
-      <w:tr>
-        <w:tblPrEx>
-          <w:tblCellMar>
-            <w:top w:w="0" w:type="dxa"/>
-            <w:bottom w:w="0" w:type="dxa"/>
-          </w:tblCellMar>
-        </w:tblPrEx>
-        <w:tc>
-          <w:tcPr>
-            <w:tcW w:w="0" w:type="auto"/>
-          </w:tcPr>
-          <w:p>
-            <w:r>
-              <w:t>2. Circuits, Components, and Control (this book)</w:t>
-            </w:r>
-          </w:p>
-        </w:tc>
-        <w:tc>
-          <w:tcPr>
-            <w:tcW w:w="0" w:type="auto"/>
-          </w:tcPr>
-          <w:p>
-            <w:r>
-              <w:t>Analog and digital, op-amps, passives, the classical loop</w:t>
-            </w:r>
-          </w:p>
-        </w:tc>
-      </w:tr>
-      <w:tr>
-        <w:tblPrEx>
-          <w:tblCellMar>
-            <w:top w:w="0" w:type="dxa"/>
-            <w:bottom w:w="0" w:type="dxa"/>
-          </w:tblCellMar>
-        </w:tblPrEx>
-        <w:tc>
-          <w:tcPr>
-            <w:tcW w:w="0" w:type="auto"/>
-          </w:tcPr>
-          <w:p>
-            <w:r>
-              <w:t>3. Semiconductor Physics and Devices</w:t>
-            </w:r>
-          </w:p>
-        </w:tc>
-        <w:tc>
-          <w:tcPr>
-            <w:tcW w:w="0" w:type="auto"/>
-          </w:tcPr>
-          <w:p>
-            <w:r>
-              <w:t>Diodes, BJTs, MOSFETs, FinFET, compound semiconductors</w:t>
-            </w:r>
-          </w:p>
-        </w:tc>
-      </w:tr>
-      <w:tr>
-        <w:tblPrEx>
-          <w:tblCellMar>
-            <w:top w:w="0" w:type="dxa"/>
-            <w:bottom w:w="0" w:type="dxa"/>
-          </w:tblCellMar>
-        </w:tblPrEx>
-        <w:tc>
-          <w:tcPr>
-            <w:tcW w:w="0" w:type="auto"/>
-          </w:tcPr>
-          <w:p>
-            <w:r>
-              <w:t>4. RF, Microwave, and Transceivers</w:t>
-            </w:r>
-          </w:p>
-        </w:tc>
-        <w:tc>
-          <w:tcPr>
-            <w:tcW w:w="0" w:type="auto"/>
-          </w:tcPr>
-          <w:p>
-            <w:r>
-              <w:t>Lines, matching, antennas, PAs, receivers, PLLs, radar</w:t>
-            </w:r>
-          </w:p>
-        </w:tc>
-      </w:tr>
-      <w:tr>
-        <w:tblPrEx>
-          <w:tblCellMar>
-            <w:top w:w="0" w:type="dxa"/>
-            <w:bottom w:w="0" w:type="dxa"/>
-          </w:tblCellMar>
-        </w:tblPrEx>
-        <w:tc>
-          <w:tcPr>
-            <w:tcW w:w="0" w:type="auto"/>
-          </w:tcPr>
-          <w:p>
-            <w:r>
-              <w:t>5. Communications, Wireless, and SDR</w:t>
-            </w:r>
-          </w:p>
-        </w:tc>
-        <w:tc>
-          <w:tcPr>
-            <w:tcW w:w="0" w:type="auto"/>
-          </w:tcPr>
-          <w:p>
-            <w:r>
-              <w:t>Modulation, band plans, DSP and software radio</w:t>
-            </w:r>
-          </w:p>
-        </w:tc>
-      </w:tr>
-      <w:tr>
-        <w:tblPrEx>
-          <w:tblCellMar>
-            <w:top w:w="0" w:type="dxa"/>
-            <w:bottom w:w="0" w:type="dxa"/>
-          </w:tblCellMar>
-        </w:tblPrEx>
-        <w:tc>
-          <w:tcPr>
-            <w:tcW w:w="0" w:type="auto"/>
-          </w:tcPr>
-          <w:p>
-            <w:r>
-              <w:t>6. Power and Energy</w:t>
-            </w:r>
-          </w:p>
-        </w:tc>
-        <w:tc>
-          <w:tcPr>
-            <w:tcW w:w="0" w:type="auto"/>
-          </w:tcPr>
-          <w:p>
-            <w:r>
-              <w:t>Regulators, magnetics, the grid, the rack</w:t>
-            </w:r>
-          </w:p>
-        </w:tc>
-      </w:tr>
-      <w:tr>
-        <w:tblPrEx>
-          <w:tblCellMar>
-            <w:top w:w="0" w:type="dxa"/>
-            <w:bottom w:w="0" w:type="dxa"/>
-          </w:tblCellMar>
-        </w:tblPrEx>
-        <w:tc>
-          <w:tcPr>
-            <w:tcW w:w="0" w:type="auto"/>
-          </w:tcPr>
-          <w:p>
-            <w:r>
-              <w:t>7. Packaging, Layout, EMC, and Test</w:t>
-            </w:r>
-          </w:p>
-        </w:tc>
-        <w:tc>
-          <w:tcPr>
-            <w:tcW w:w="0" w:type="auto"/>
-          </w:tcPr>
-          <w:p>
-            <w:r>
-              <w:t>Boards, packages, cooling, emissions, the accredited lab, robots</w:t>
-            </w:r>
-          </w:p>
-        </w:tc>
-      </w:tr>
-    </w:tbl>
+    <w:p>
+      <w:pPr>
+        <w:spacing w:before="0" w:after="100"/>
+      </w:pPr>
+      <w:r>
+        <w:rPr>
+          <w:b/>
+        </w:rPr>
+        <w:t>Book</w:t>
+      </w:r>
+      <w:r>
+        <w:rPr>
+          <w:b/>
+        </w:rPr>
+        <w:t xml:space="preserve"> — </w:t>
+      </w:r>
+      <w:r>
+        <w:rPr>
+          <w:b/>
+        </w:rPr>
+        <w:t>Covers</w:t>
+      </w:r>
+    </w:p>
+    <w:p>
+      <w:pPr>
+        <w:spacing w:before="0" w:after="100"/>
+      </w:pPr>
+      <w:r>
+        <w:rPr>
+          <w:b/>
+        </w:rPr>
+        <w:t>1. Foundations</w:t>
+      </w:r>
+      <w:r>
+        <w:rPr/>
+        <w:t xml:space="preserve"> — </w:t>
+      </w:r>
+      <w:r>
+        <w:rPr/>
+        <w:t>Physics, mathematics, and circuit theory</w:t>
+      </w:r>
+    </w:p>
+    <w:p>
+      <w:pPr>
+        <w:spacing w:before="0" w:after="100"/>
+      </w:pPr>
+      <w:r>
+        <w:rPr>
+          <w:b/>
+        </w:rPr>
+        <w:t>2. Circuits, Components, and Control (this book)</w:t>
+      </w:r>
+      <w:r>
+        <w:rPr/>
+        <w:t xml:space="preserve"> — </w:t>
+      </w:r>
+      <w:r>
+        <w:rPr/>
+        <w:t>Analog and digital, op-amps, passives, the classical loop</w:t>
+      </w:r>
+    </w:p>
+    <w:p>
+      <w:pPr>
+        <w:spacing w:before="0" w:after="100"/>
+      </w:pPr>
+      <w:r>
+        <w:rPr>
+          <w:b/>
+        </w:rPr>
+        <w:t>3. Semiconductor Physics and Devices</w:t>
+      </w:r>
+      <w:r>
+        <w:rPr/>
+        <w:t xml:space="preserve"> — </w:t>
+      </w:r>
+      <w:r>
+        <w:rPr/>
+        <w:t>Diodes, BJTs, MOSFETs, FinFET, compound semiconductors</w:t>
+      </w:r>
+    </w:p>
+    <w:p>
+      <w:pPr>
+        <w:spacing w:before="0" w:after="100"/>
+      </w:pPr>
+      <w:r>
+        <w:rPr>
+          <w:b/>
+        </w:rPr>
+        <w:t>4. RF, Microwave, and Transceivers</w:t>
+      </w:r>
+      <w:r>
+        <w:rPr/>
+        <w:t xml:space="preserve"> — </w:t>
+      </w:r>
+      <w:r>
+        <w:rPr/>
+        <w:t>Lines, matching, antennas, PAs, receivers, PLLs, radar</w:t>
+      </w:r>
+    </w:p>
+    <w:p>
+      <w:pPr>
+        <w:spacing w:before="0" w:after="100"/>
+      </w:pPr>
+      <w:r>
+        <w:rPr>
+          <w:b/>
+        </w:rPr>
+        <w:t>5. Communications, Wireless, and SDR</w:t>
+      </w:r>
+      <w:r>
+        <w:rPr/>
+        <w:t xml:space="preserve"> — </w:t>
+      </w:r>
+      <w:r>
+        <w:rPr/>
+        <w:t>Modulation, band plans, DSP and software radio</w:t>
+      </w:r>
+    </w:p>
+    <w:p>
+      <w:pPr>
+        <w:spacing w:before="0" w:after="100"/>
+      </w:pPr>
+      <w:r>
+        <w:rPr>
+          <w:b/>
+        </w:rPr>
+        <w:t>6. Power and Energy</w:t>
+      </w:r>
+      <w:r>
+        <w:rPr/>
+        <w:t xml:space="preserve"> — </w:t>
+      </w:r>
+      <w:r>
+        <w:rPr/>
+        <w:t>Regulators, magnetics, the grid, the rack</w:t>
+      </w:r>
+    </w:p>
+    <w:p>
+      <w:pPr>
+        <w:spacing w:before="0" w:after="100"/>
+      </w:pPr>
+      <w:r>
+        <w:rPr>
+          <w:b/>
+        </w:rPr>
+        <w:t>7. Packaging, Layout, EMC, and Test</w:t>
+      </w:r>
+      <w:r>
+        <w:rPr/>
+        <w:t xml:space="preserve"> — </w:t>
+      </w:r>
+      <w:r>
+        <w:rPr/>
+        <w:t>Boards, packages, cooling, emissions, the accredited lab, robots</w:t>
+      </w:r>
+    </w:p>
     <w:p>
       <w:pPr>
         <w:shd w:val="clear" w:color="auto" w:fill="EFEFEF"/>
@@ -15953,1942 +15861,1304 @@
         <w:t>Appendix A — Formula Reference</w:t>
       </w:r>
     </w:p>
-    <w:tbl>
-      <w:tblPr>
-        <w:tblW w:w="5000" w:type="pct"/>
-        <w:tblBorders>
-          <w:top w:val="single" w:sz="4" w:space="0" w:color="auto"/>
-          <w:left w:val="single" w:sz="4" w:space="0" w:color="auto"/>
-          <w:bottom w:val="single" w:sz="4" w:space="0" w:color="auto"/>
-          <w:right w:val="single" w:sz="4" w:space="0" w:color="auto"/>
-          <w:insideH w:val="single" w:sz="4" w:space="0" w:color="auto"/>
-          <w:insideV w:val="single" w:sz="4" w:space="0" w:color="auto"/>
-        </w:tblBorders>
-        <w:tblCellMar>
-          <w:left w:w="10" w:type="dxa"/>
-          <w:right w:w="10" w:type="dxa"/>
-        </w:tblCellMar>
-        <w:tblLook w:val="04A0" w:firstRow="1" w:lastRow="0" w:firstColumn="1" w:lastColumn="0" w:noHBand="0" w:noVBand="1"/>
-      </w:tblPr>
-      <w:tblGrid>
-        <w:gridCol w:w="3344"/>
-        <w:gridCol w:w="6006"/>
-      </w:tblGrid>
-      <w:tr>
-        <w:tblPrEx>
-          <w:tblCellMar>
-            <w:top w:w="0" w:type="dxa"/>
-            <w:bottom w:w="0" w:type="dxa"/>
-          </w:tblCellMar>
-        </w:tblPrEx>
-        <w:tc>
-          <w:tcPr>
-            <w:tcW w:w="0" w:type="auto"/>
-            <w:shd w:val="clear" w:color="auto" w:fill="DDE6F0"/>
-          </w:tcPr>
-          <w:p>
-            <w:r>
-              <w:rPr>
-                <w:b/>
-                <w:bCs/>
-              </w:rPr>
-              <w:t>Concept</w:t>
-            </w:r>
-          </w:p>
-        </w:tc>
-        <w:tc>
-          <w:tcPr>
-            <w:tcW w:w="0" w:type="auto"/>
-            <w:shd w:val="clear" w:color="auto" w:fill="DDE6F0"/>
-          </w:tcPr>
-          <w:p>
-            <w:r>
-              <w:rPr>
-                <w:b/>
-                <w:bCs/>
-              </w:rPr>
-              <w:t>Formula</w:t>
-            </w:r>
-          </w:p>
-        </w:tc>
-      </w:tr>
-      <w:tr>
-        <w:tblPrEx>
-          <w:tblCellMar>
-            <w:top w:w="0" w:type="dxa"/>
-            <w:bottom w:w="0" w:type="dxa"/>
-          </w:tblCellMar>
-        </w:tblPrEx>
-        <w:tc>
-          <w:tcPr>
-            <w:tcW w:w="0" w:type="auto"/>
-          </w:tcPr>
-          <w:p>
-            <w:r>
-              <w:t>Noise margins</w:t>
-            </w:r>
-          </w:p>
-        </w:tc>
-        <w:tc>
-          <w:tcPr>
-            <w:tcW w:w="0" w:type="auto"/>
-          </w:tcPr>
-          <w:p>
-            <w:r>
-              <w:t>NMʜ = Vₒₕ(min) − Vᵢₕ(min)      NMʟ = Vᵢʟ(max) − Vₒʟ(max)</w:t>
-            </w:r>
-          </w:p>
-        </w:tc>
-      </w:tr>
-      <w:tr>
-        <w:tblPrEx>
-          <w:tblCellMar>
-            <w:top w:w="0" w:type="dxa"/>
-            <w:bottom w:w="0" w:type="dxa"/>
-          </w:tblCellMar>
-        </w:tblPrEx>
-        <w:tc>
-          <w:tcPr>
-            <w:tcW w:w="0" w:type="auto"/>
-          </w:tcPr>
-          <w:p>
-            <w:r>
-              <w:t>Inverting amplifier</w:t>
-            </w:r>
-          </w:p>
-        </w:tc>
-        <w:tc>
-          <w:tcPr>
-            <w:tcW w:w="0" w:type="auto"/>
-          </w:tcPr>
-          <w:p>
-            <w:r>
-              <w:t>Vₒᵤₜ = −(R_f / Rᵢₙ) · Vᵢₙ</w:t>
-            </w:r>
-          </w:p>
-        </w:tc>
-      </w:tr>
-      <w:tr>
-        <w:tblPrEx>
-          <w:tblCellMar>
-            <w:top w:w="0" w:type="dxa"/>
-            <w:bottom w:w="0" w:type="dxa"/>
-          </w:tblCellMar>
-        </w:tblPrEx>
-        <w:tc>
-          <w:tcPr>
-            <w:tcW w:w="0" w:type="auto"/>
-          </w:tcPr>
-          <w:p>
-            <w:r>
-              <w:t>Non-inverting amplifier</w:t>
-            </w:r>
-          </w:p>
-        </w:tc>
-        <w:tc>
-          <w:tcPr>
-            <w:tcW w:w="0" w:type="auto"/>
-          </w:tcPr>
-          <w:p>
-            <w:r>
-              <w:t>Vₒᵤₜ = (1 + R_f / Rᵢₙ) · Vᵢₙ</w:t>
-            </w:r>
-          </w:p>
-        </w:tc>
-      </w:tr>
-      <w:tr>
-        <w:tblPrEx>
-          <w:tblCellMar>
-            <w:top w:w="0" w:type="dxa"/>
-            <w:bottom w:w="0" w:type="dxa"/>
-          </w:tblCellMar>
-        </w:tblPrEx>
-        <w:tc>
-          <w:tcPr>
-            <w:tcW w:w="0" w:type="auto"/>
-          </w:tcPr>
-          <w:p>
-            <w:r>
-              <w:t>RC filter corner frequency</w:t>
-            </w:r>
-          </w:p>
-        </w:tc>
-        <w:tc>
-          <w:tcPr>
-            <w:tcW w:w="0" w:type="auto"/>
-          </w:tcPr>
-          <w:p>
-            <w:r>
-              <w:t>fᴄ = 1 / (2πRC)</w:t>
-            </w:r>
-          </w:p>
-        </w:tc>
-      </w:tr>
-      <w:tr>
-        <w:tblPrEx>
-          <w:tblCellMar>
-            <w:top w:w="0" w:type="dxa"/>
-            <w:bottom w:w="0" w:type="dxa"/>
-          </w:tblCellMar>
-        </w:tblPrEx>
-        <w:tc>
-          <w:tcPr>
-            <w:tcW w:w="0" w:type="auto"/>
-          </w:tcPr>
-          <w:p>
-            <w:r>
-              <w:t>Capacitor self-resonant frequency</w:t>
-            </w:r>
-          </w:p>
-        </w:tc>
-        <w:tc>
-          <w:tcPr>
-            <w:tcW w:w="0" w:type="auto"/>
-          </w:tcPr>
-          <w:p>
-            <w:r>
-              <w:t>SRF = 1 / (2π√(L_ESL · C))</w:t>
-            </w:r>
-          </w:p>
-        </w:tc>
-      </w:tr>
-      <w:tr>
-        <w:tblPrEx>
-          <w:tblCellMar>
-            <w:top w:w="0" w:type="dxa"/>
-            <w:bottom w:w="0" w:type="dxa"/>
-          </w:tblCellMar>
-        </w:tblPrEx>
-        <w:tc>
-          <w:tcPr>
-            <w:tcW w:w="0" w:type="auto"/>
-          </w:tcPr>
-          <w:p>
-            <w:r>
-              <w:t>Inductor quality factor</w:t>
-            </w:r>
-          </w:p>
-        </w:tc>
-        <w:tc>
-          <w:tcPr>
-            <w:tcW w:w="0" w:type="auto"/>
-          </w:tcPr>
-          <w:p>
-            <w:r>
-              <w:t>Q = ωL / R</w:t>
-            </w:r>
-          </w:p>
-        </w:tc>
-      </w:tr>
-      <w:tr>
-        <w:tblPrEx>
-          <w:tblCellMar>
-            <w:top w:w="0" w:type="dxa"/>
-            <w:bottom w:w="0" w:type="dxa"/>
-          </w:tblCellMar>
-        </w:tblPrEx>
-        <w:tc>
-          <w:tcPr>
-            <w:tcW w:w="0" w:type="auto"/>
-          </w:tcPr>
-          <w:p>
-            <w:r>
-              <w:t>Inductor self-resonant frequency</w:t>
-            </w:r>
-          </w:p>
-        </w:tc>
-        <w:tc>
-          <w:tcPr>
-            <w:tcW w:w="0" w:type="auto"/>
-          </w:tcPr>
-          <w:p>
-            <w:r>
-              <w:t>SRF = 1 / (2π√(L · C_wind))</w:t>
-            </w:r>
-          </w:p>
-        </w:tc>
-      </w:tr>
-      <w:tr>
-        <w:tblPrEx>
-          <w:tblCellMar>
-            <w:top w:w="0" w:type="dxa"/>
-            <w:bottom w:w="0" w:type="dxa"/>
-          </w:tblCellMar>
-        </w:tblPrEx>
-        <w:tc>
-          <w:tcPr>
-            <w:tcW w:w="0" w:type="auto"/>
-          </w:tcPr>
-          <w:p>
-            <w:r>
-              <w:t>Feedback closed-loop gain</w:t>
-            </w:r>
-          </w:p>
-        </w:tc>
-        <w:tc>
-          <w:tcPr>
-            <w:tcW w:w="0" w:type="auto"/>
-          </w:tcPr>
-          <w:p>
-            <w:r>
-              <w:t>G = A / (1 + Aβ) ≈ 1/β</w:t>
-            </w:r>
-          </w:p>
-        </w:tc>
-      </w:tr>
-      <w:tr>
-        <w:tblPrEx>
-          <w:tblCellMar>
-            <w:top w:w="0" w:type="dxa"/>
-            <w:bottom w:w="0" w:type="dxa"/>
-          </w:tblCellMar>
-        </w:tblPrEx>
-        <w:tc>
-          <w:tcPr>
-            <w:tcW w:w="0" w:type="auto"/>
-          </w:tcPr>
-          <w:p>
-            <w:r>
-              <w:t>Gain sensitivity</w:t>
-            </w:r>
-          </w:p>
-        </w:tc>
-        <w:tc>
-          <w:tcPr>
-            <w:tcW w:w="0" w:type="auto"/>
-          </w:tcPr>
-          <w:p>
-            <w:r>
-              <w:t>ΔG/G ≈ (ΔA/A) / (1 + T)</w:t>
-            </w:r>
-          </w:p>
-        </w:tc>
-      </w:tr>
-      <w:tr>
-        <w:tblPrEx>
-          <w:tblCellMar>
-            <w:top w:w="0" w:type="dxa"/>
-            <w:bottom w:w="0" w:type="dxa"/>
-          </w:tblCellMar>
-        </w:tblPrEx>
-        <w:tc>
-          <w:tcPr>
-            <w:tcW w:w="0" w:type="auto"/>
-          </w:tcPr>
-          <w:p>
-            <w:r>
-              <w:t>Capacitive-load pole</w:t>
-            </w:r>
-          </w:p>
-        </w:tc>
-        <w:tc>
-          <w:tcPr>
-            <w:tcW w:w="0" w:type="auto"/>
-          </w:tcPr>
-          <w:p>
-            <w:r>
-              <w:t>f₂ = 1 / (2π r_o C_L)</w:t>
-            </w:r>
-          </w:p>
-        </w:tc>
-      </w:tr>
-      <w:tr>
-        <w:tblPrEx>
-          <w:tblCellMar>
-            <w:top w:w="0" w:type="dxa"/>
-            <w:bottom w:w="0" w:type="dxa"/>
-          </w:tblCellMar>
-        </w:tblPrEx>
-        <w:tc>
-          <w:tcPr>
-            <w:tcW w:w="0" w:type="auto"/>
-          </w:tcPr>
-          <w:p>
-            <w:r>
-              <w:t>Closed-loop bandwidth</w:t>
-            </w:r>
-          </w:p>
-        </w:tc>
-        <w:tc>
-          <w:tcPr>
-            <w:tcW w:w="0" w:type="auto"/>
-          </w:tcPr>
-          <w:p>
-            <w:r>
-              <w:t>f_cl ≈ GBW / NG,  NG = 1 + R_f/Rᵢₙ</w:t>
-            </w:r>
-          </w:p>
-        </w:tc>
-      </w:tr>
-      <w:tr>
-        <w:tblPrEx>
-          <w:tblCellMar>
-            <w:top w:w="0" w:type="dxa"/>
-            <w:bottom w:w="0" w:type="dxa"/>
-          </w:tblCellMar>
-        </w:tblPrEx>
-        <w:tc>
-          <w:tcPr>
-            <w:tcW w:w="0" w:type="auto"/>
-          </w:tcPr>
-          <w:p>
-            <w:r>
-              <w:t>Full-power bandwidth</w:t>
-            </w:r>
-          </w:p>
-        </w:tc>
-        <w:tc>
-          <w:tcPr>
-            <w:tcW w:w="0" w:type="auto"/>
-          </w:tcPr>
-          <w:p>
-            <w:r>
-              <w:t>f_FP = SR / (2π V_p)</w:t>
-            </w:r>
-          </w:p>
-        </w:tc>
-      </w:tr>
-      <w:tr>
-        <w:tblPrEx>
-          <w:tblCellMar>
-            <w:top w:w="0" w:type="dxa"/>
-            <w:bottom w:w="0" w:type="dxa"/>
-          </w:tblCellMar>
-        </w:tblPrEx>
-        <w:tc>
-          <w:tcPr>
-            <w:tcW w:w="0" w:type="auto"/>
-          </w:tcPr>
-          <w:p>
-            <w:r>
-              <w:t>Johnson noise density</w:t>
-            </w:r>
-          </w:p>
-        </w:tc>
-        <w:tc>
-          <w:tcPr>
-            <w:tcW w:w="0" w:type="auto"/>
-          </w:tcPr>
-          <w:p>
-            <w:r>
-              <w:t>e_R = √(4kTR)</w:t>
-            </w:r>
-          </w:p>
-        </w:tc>
-      </w:tr>
-      <w:tr>
-        <w:tblPrEx>
-          <w:tblCellMar>
-            <w:top w:w="0" w:type="dxa"/>
-            <w:bottom w:w="0" w:type="dxa"/>
-          </w:tblCellMar>
-        </w:tblPrEx>
-        <w:tc>
-          <w:tcPr>
-            <w:tcW w:w="0" w:type="auto"/>
-          </w:tcPr>
-          <w:p>
-            <w:r>
-              <w:t>Noise sum (uncorrelated)</w:t>
-            </w:r>
-          </w:p>
-        </w:tc>
-        <w:tc>
-          <w:tcPr>
-            <w:tcW w:w="0" w:type="auto"/>
-          </w:tcPr>
-          <w:p>
-            <w:r>
-              <w:t>e_total = √(e₁² + e₂² + …)</w:t>
-            </w:r>
-          </w:p>
-        </w:tc>
-      </w:tr>
-      <w:tr>
-        <w:tblPrEx>
-          <w:tblCellMar>
-            <w:top w:w="0" w:type="dxa"/>
-            <w:bottom w:w="0" w:type="dxa"/>
-          </w:tblCellMar>
-        </w:tblPrEx>
-        <w:tc>
-          <w:tcPr>
-            <w:tcW w:w="0" w:type="auto"/>
-          </w:tcPr>
-          <w:p>
-            <w:r>
-              <w:t>Single-pole noise bandwidth</w:t>
-            </w:r>
-          </w:p>
-        </w:tc>
-        <w:tc>
-          <w:tcPr>
-            <w:tcW w:w="0" w:type="auto"/>
-          </w:tcPr>
-          <w:p>
-            <w:r>
-              <w:t>ENBW = (π/2) f₋₃dB</w:t>
-            </w:r>
-          </w:p>
-        </w:tc>
-      </w:tr>
-      <w:tr>
-        <w:tblPrEx>
-          <w:tblCellMar>
-            <w:top w:w="0" w:type="dxa"/>
-            <w:bottom w:w="0" w:type="dxa"/>
-          </w:tblCellMar>
-        </w:tblPrEx>
-        <w:tc>
-          <w:tcPr>
-            <w:tcW w:w="0" w:type="auto"/>
-          </w:tcPr>
-          <w:p>
-            <w:r>
-              <w:t>Offset at output</w:t>
-            </w:r>
-          </w:p>
-        </w:tc>
-        <w:tc>
-          <w:tcPr>
-            <w:tcW w:w="0" w:type="auto"/>
-          </w:tcPr>
-          <w:p>
-            <w:r>
-              <w:t>V_out = V_os (1 + R_f/Rᵢₙ)</w:t>
-            </w:r>
-          </w:p>
-        </w:tc>
-      </w:tr>
-      <w:tr>
-        <w:tblPrEx>
-          <w:tblCellMar>
-            <w:top w:w="0" w:type="dxa"/>
-            <w:bottom w:w="0" w:type="dxa"/>
-          </w:tblCellMar>
-        </w:tblPrEx>
-        <w:tc>
-          <w:tcPr>
-            <w:tcW w:w="0" w:type="auto"/>
-          </w:tcPr>
-          <w:p>
-            <w:r>
-              <w:t>Bias-current compensation</w:t>
-            </w:r>
-          </w:p>
-        </w:tc>
-        <w:tc>
-          <w:tcPr>
-            <w:tcW w:w="0" w:type="auto"/>
-          </w:tcPr>
-          <w:p>
-            <w:r>
-              <w:t>R_c = R_f ‖ Rᵢₙ; residual ≈ I_os R_f</w:t>
-            </w:r>
-          </w:p>
-        </w:tc>
-      </w:tr>
-      <w:tr>
-        <w:tblPrEx>
-          <w:tblCellMar>
-            <w:top w:w="0" w:type="dxa"/>
-            <w:bottom w:w="0" w:type="dxa"/>
-          </w:tblCellMar>
-        </w:tblPrEx>
-        <w:tc>
-          <w:tcPr>
-            <w:tcW w:w="0" w:type="auto"/>
-          </w:tcPr>
-          <w:p>
-            <w:r>
-              <w:t>Schmitt threshold</w:t>
-            </w:r>
-          </w:p>
-        </w:tc>
-        <w:tc>
-          <w:tcPr>
-            <w:tcW w:w="0" w:type="auto"/>
-          </w:tcPr>
-          <w:p>
-            <w:r>
-              <w:t>V_th = V_ref R₂/(R₁+R₂) + V_out R₁/(R₁+R₂)</w:t>
-            </w:r>
-          </w:p>
-        </w:tc>
-      </w:tr>
-      <w:tr>
-        <w:tblPrEx>
-          <w:tblCellMar>
-            <w:top w:w="0" w:type="dxa"/>
-            <w:bottom w:w="0" w:type="dxa"/>
-          </w:tblCellMar>
-        </w:tblPrEx>
-        <w:tc>
-          <w:tcPr>
-            <w:tcW w:w="0" w:type="auto"/>
-          </w:tcPr>
-          <w:p>
-            <w:r>
-              <w:t>Pull-up rise time (10–90%)</w:t>
-            </w:r>
-          </w:p>
-        </w:tc>
-        <w:tc>
-          <w:tcPr>
-            <w:tcW w:w="0" w:type="auto"/>
-          </w:tcPr>
-          <w:p>
-            <w:r>
-              <w:t>t_r = 2.2 R_pu C</w:t>
-            </w:r>
-          </w:p>
-        </w:tc>
-      </w:tr>
-      <w:tr>
-        <w:tblPrEx>
-          <w:tblCellMar>
-            <w:top w:w="0" w:type="dxa"/>
-            <w:bottom w:w="0" w:type="dxa"/>
-          </w:tblCellMar>
-        </w:tblPrEx>
-        <w:tc>
-          <w:tcPr>
-            <w:tcW w:w="0" w:type="auto"/>
-          </w:tcPr>
-          <w:p>
-            <w:r>
-              <w:t>Closed-loop tracking</w:t>
-            </w:r>
-          </w:p>
-        </w:tc>
-        <w:tc>
-          <w:tcPr>
-            <w:tcW w:w="0" w:type="auto"/>
-          </w:tcPr>
-          <w:p>
-            <w:r>
-              <w:t>Y/R = CP/(1 + CP)</w:t>
-            </w:r>
-          </w:p>
-        </w:tc>
-      </w:tr>
-      <w:tr>
-        <w:tblPrEx>
-          <w:tblCellMar>
-            <w:top w:w="0" w:type="dxa"/>
-            <w:bottom w:w="0" w:type="dxa"/>
-          </w:tblCellMar>
-        </w:tblPrEx>
-        <w:tc>
-          <w:tcPr>
-            <w:tcW w:w="0" w:type="auto"/>
-          </w:tcPr>
-          <w:p>
-            <w:r>
-              <w:t>First-order plant, P control</w:t>
-            </w:r>
-          </w:p>
-        </w:tc>
-        <w:tc>
-          <w:tcPr>
-            <w:tcW w:w="0" w:type="auto"/>
-          </w:tcPr>
-          <w:p>
-            <w:r>
-              <w:t>τ_cl = τ/(1 + K_p K); e_ss = 1/(1 + K_p K)</w:t>
-            </w:r>
-          </w:p>
-        </w:tc>
-      </w:tr>
-      <w:tr>
-        <w:tblPrEx>
-          <w:tblCellMar>
-            <w:top w:w="0" w:type="dxa"/>
-            <w:bottom w:w="0" w:type="dxa"/>
-          </w:tblCellMar>
-        </w:tblPrEx>
-        <w:tc>
-          <w:tcPr>
-            <w:tcW w:w="0" w:type="auto"/>
-          </w:tcPr>
-          <w:p>
-            <w:r>
-              <w:t>PID law</w:t>
-            </w:r>
-          </w:p>
-        </w:tc>
-        <w:tc>
-          <w:tcPr>
-            <w:tcW w:w="0" w:type="auto"/>
-          </w:tcPr>
-          <w:p>
-            <w:r>
-              <w:t>u = K_p e + K_i ∫e dt + K_d de/dt</w:t>
-            </w:r>
-          </w:p>
-        </w:tc>
-      </w:tr>
-      <w:tr>
-        <w:tblPrEx>
-          <w:tblCellMar>
-            <w:top w:w="0" w:type="dxa"/>
-            <w:bottom w:w="0" w:type="dxa"/>
-          </w:tblCellMar>
-        </w:tblPrEx>
-        <w:tc>
-          <w:tcPr>
-            <w:tcW w:w="0" w:type="auto"/>
-          </w:tcPr>
-          <w:p>
-            <w:r>
-              <w:t>Lead network maximum phase</w:t>
-            </w:r>
-          </w:p>
-        </w:tc>
-        <w:tc>
-          <w:tcPr>
-            <w:tcW w:w="0" w:type="auto"/>
-          </w:tcPr>
-          <w:p>
-            <w:r>
-              <w:t>φ_max = arcsin((α−1)/(α+1)) at √(ω_z ω_p)</w:t>
-            </w:r>
-          </w:p>
-        </w:tc>
-      </w:tr>
-      <w:tr>
-        <w:tblPrEx>
-          <w:tblCellMar>
-            <w:top w:w="0" w:type="dxa"/>
-            <w:bottom w:w="0" w:type="dxa"/>
-          </w:tblCellMar>
-        </w:tblPrEx>
-        <w:tc>
-          <w:tcPr>
-            <w:tcW w:w="0" w:type="auto"/>
-          </w:tcPr>
-          <w:p>
-            <w:r>
-              <w:t>Sampled-loop delay</w:t>
-            </w:r>
-          </w:p>
-        </w:tc>
-        <w:tc>
-          <w:tcPr>
-            <w:tcW w:w="0" w:type="auto"/>
-          </w:tcPr>
-          <w:p>
-            <w:r>
-              <w:t>t_d ≈ T/2 + T_compute;  φ = ω_c t_d</w:t>
-            </w:r>
-          </w:p>
-        </w:tc>
-      </w:tr>
-      <w:tr>
-        <w:tblPrEx>
-          <w:tblCellMar>
-            <w:top w:w="0" w:type="dxa"/>
-            <w:bottom w:w="0" w:type="dxa"/>
-          </w:tblCellMar>
-        </w:tblPrEx>
-        <w:tc>
-          <w:tcPr>
-            <w:tcW w:w="0" w:type="auto"/>
-          </w:tcPr>
-          <w:p>
-            <w:r>
-              <w:t>Discrete PI (backward Euler)</w:t>
-            </w:r>
-          </w:p>
-        </w:tc>
-        <w:tc>
-          <w:tcPr>
-            <w:tcW w:w="0" w:type="auto"/>
-          </w:tcPr>
-          <w:p>
-            <w:r>
-              <w:t>I[k] = I[k−1] + T e[k];  u[k] = K_p e[k] + K_i I[k]</w:t>
-            </w:r>
-          </w:p>
-        </w:tc>
-      </w:tr>
-      <w:tr>
-        <w:tblPrEx>
-          <w:tblCellMar>
-            <w:top w:w="0" w:type="dxa"/>
-            <w:bottom w:w="0" w:type="dxa"/>
-          </w:tblCellMar>
-        </w:tblPrEx>
-        <w:tc>
-          <w:tcPr>
-            <w:tcW w:w="0" w:type="auto"/>
-          </w:tcPr>
-          <w:p>
-            <w:r>
-              <w:t>Buck inductor ripple</w:t>
-            </w:r>
-          </w:p>
-        </w:tc>
-        <w:tc>
-          <w:tcPr>
-            <w:tcW w:w="0" w:type="auto"/>
-          </w:tcPr>
-          <w:p>
-            <w:r>
-              <w:t>ΔI = (V_in − V_out) D / (L f_sw)</w:t>
-            </w:r>
-          </w:p>
-        </w:tc>
-      </w:tr>
-      <w:tr>
-        <w:tblPrEx>
-          <w:tblCellMar>
-            <w:top w:w="0" w:type="dxa"/>
-            <w:bottom w:w="0" w:type="dxa"/>
-          </w:tblCellMar>
-        </w:tblPrEx>
-        <w:tc>
-          <w:tcPr>
-            <w:tcW w:w="0" w:type="auto"/>
-          </w:tcPr>
-          <w:p>
-            <w:r>
-              <w:t>Triangle-on-DC rms</w:t>
-            </w:r>
-          </w:p>
-        </w:tc>
-        <w:tc>
-          <w:tcPr>
-            <w:tcW w:w="0" w:type="auto"/>
-          </w:tcPr>
-          <w:p>
-            <w:r>
-              <w:t>I_rms = √(I_DC² + ΔI²/12)</w:t>
-            </w:r>
-          </w:p>
-        </w:tc>
-      </w:tr>
-      <w:tr>
-        <w:tblPrEx>
-          <w:tblCellMar>
-            <w:top w:w="0" w:type="dxa"/>
-            <w:bottom w:w="0" w:type="dxa"/>
-          </w:tblCellMar>
-        </w:tblPrEx>
-        <w:tc>
-          <w:tcPr>
-            <w:tcW w:w="0" w:type="auto"/>
-          </w:tcPr>
-          <w:p>
-            <w:r>
-              <w:t>Second-order low-pass</w:t>
-            </w:r>
-          </w:p>
-        </w:tc>
-        <w:tc>
-          <w:tcPr>
-            <w:tcW w:w="0" w:type="auto"/>
-          </w:tcPr>
-          <w:p>
-            <w:r>
-              <w:t>H(s) = H₀ω₀²/(s² + (ω₀/Q)s + ω₀²)</w:t>
-            </w:r>
-          </w:p>
-        </w:tc>
-      </w:tr>
-      <w:tr>
-        <w:tblPrEx>
-          <w:tblCellMar>
-            <w:top w:w="0" w:type="dxa"/>
-            <w:bottom w:w="0" w:type="dxa"/>
-          </w:tblCellMar>
-        </w:tblPrEx>
-        <w:tc>
-          <w:tcPr>
-            <w:tcW w:w="0" w:type="auto"/>
-          </w:tcPr>
-          <w:p>
-            <w:r>
-              <w:t>Unity-gain Sallen-Key, equal R</w:t>
-            </w:r>
-          </w:p>
-        </w:tc>
-        <w:tc>
-          <w:tcPr>
-            <w:tcW w:w="0" w:type="auto"/>
-          </w:tcPr>
-          <w:p>
-            <w:r>
-              <w:t>ω₀ = 1/(R√(C₁C₂)); Q = ½√(C₁/C₂)</w:t>
-            </w:r>
-          </w:p>
-        </w:tc>
-      </w:tr>
-      <w:tr>
-        <w:tblPrEx>
-          <w:tblCellMar>
-            <w:top w:w="0" w:type="dxa"/>
-            <w:bottom w:w="0" w:type="dxa"/>
-          </w:tblCellMar>
-        </w:tblPrEx>
-        <w:tc>
-          <w:tcPr>
-            <w:tcW w:w="0" w:type="auto"/>
-          </w:tcPr>
-          <w:p>
-            <w:r>
-              <w:t>MFB low-pass, equal R</w:t>
-            </w:r>
-          </w:p>
-        </w:tc>
-        <w:tc>
-          <w:tcPr>
-            <w:tcW w:w="0" w:type="auto"/>
-          </w:tcPr>
-          <w:p>
-            <w:r>
-              <w:t>H₀ = −1; ω₀ = 1/(R√(C₁C₂)); Q = ⅓√(C₁/C₂)</w:t>
-            </w:r>
-          </w:p>
-        </w:tc>
-      </w:tr>
-      <w:tr>
-        <w:tblPrEx>
-          <w:tblCellMar>
-            <w:top w:w="0" w:type="dxa"/>
-            <w:bottom w:w="0" w:type="dxa"/>
-          </w:tblCellMar>
-        </w:tblPrEx>
-        <w:tc>
-          <w:tcPr>
-            <w:tcW w:w="0" w:type="auto"/>
-          </w:tcPr>
-          <w:p>
-            <w:r>
-              <w:t>Linear power derating</w:t>
-            </w:r>
-          </w:p>
-        </w:tc>
-        <w:tc>
-          <w:tcPr>
-            <w:tcW w:w="0" w:type="auto"/>
-          </w:tcPr>
-          <w:p>
-            <w:r>
-              <w:t>P = P_rated (T_max − T_amb)/(T_max − T_knee)</w:t>
-            </w:r>
-          </w:p>
-        </w:tc>
-      </w:tr>
-      <w:tr>
-        <w:tblPrEx>
-          <w:tblCellMar>
-            <w:top w:w="0" w:type="dxa"/>
-            <w:bottom w:w="0" w:type="dxa"/>
-          </w:tblCellMar>
-        </w:tblPrEx>
-        <w:tc>
-          <w:tcPr>
-            <w:tcW w:w="0" w:type="auto"/>
-          </w:tcPr>
-          <w:p>
-            <w:r>
-              <w:t>Self-heating</w:t>
-            </w:r>
-          </w:p>
-        </w:tc>
-        <w:tc>
-          <w:tcPr>
-            <w:tcW w:w="0" w:type="auto"/>
-          </w:tcPr>
-          <w:p>
-            <w:r>
-              <w:t>ΔT = P θ;  ΔR/R = TCR × ΔT</w:t>
-            </w:r>
-          </w:p>
-        </w:tc>
-      </w:tr>
-      <w:tr>
-        <w:tblPrEx>
-          <w:tblCellMar>
-            <w:top w:w="0" w:type="dxa"/>
-            <w:bottom w:w="0" w:type="dxa"/>
-          </w:tblCellMar>
-        </w:tblPrEx>
-        <w:tc>
-          <w:tcPr>
-            <w:tcW w:w="0" w:type="auto"/>
-          </w:tcPr>
-          <w:p>
-            <w:r>
-              <w:t>Capacitor impedance</w:t>
-            </w:r>
-          </w:p>
-        </w:tc>
-        <w:tc>
-          <w:tcPr>
-            <w:tcW w:w="0" w:type="auto"/>
-          </w:tcPr>
-          <w:p>
-            <w:r>
-              <w:t>|Z| = √(ESR² + (ωL − 1/(ωC))²)</w:t>
-            </w:r>
-          </w:p>
-        </w:tc>
-      </w:tr>
-      <w:tr>
-        <w:tblPrEx>
-          <w:tblCellMar>
-            <w:top w:w="0" w:type="dxa"/>
-            <w:bottom w:w="0" w:type="dxa"/>
-          </w:tblCellMar>
-        </w:tblPrEx>
-        <w:tc>
-          <w:tcPr>
-            <w:tcW w:w="0" w:type="auto"/>
-          </w:tcPr>
-          <w:p>
-            <w:r>
-              <w:t>Target impedance</w:t>
-            </w:r>
-          </w:p>
-        </w:tc>
-        <w:tc>
-          <w:tcPr>
-            <w:tcW w:w="0" w:type="auto"/>
-          </w:tcPr>
-          <w:p>
-            <w:r>
-              <w:t>Z_target = ΔV / ΔI</w:t>
-            </w:r>
-          </w:p>
-        </w:tc>
-      </w:tr>
-      <w:tr>
-        <w:tblPrEx>
-          <w:tblCellMar>
-            <w:top w:w="0" w:type="dxa"/>
-            <w:bottom w:w="0" w:type="dxa"/>
-          </w:tblCellMar>
-        </w:tblPrEx>
-        <w:tc>
-          <w:tcPr>
-            <w:tcW w:w="0" w:type="auto"/>
-          </w:tcPr>
-          <w:p>
-            <w:r>
-              <w:t>Antiresonance (approx.)</w:t>
-            </w:r>
-          </w:p>
-        </w:tc>
-        <w:tc>
-          <w:tcPr>
-            <w:tcW w:w="0" w:type="auto"/>
-          </w:tcPr>
-          <w:p>
-            <w:r>
-              <w:t>f_ar ≈ 1/(2π√((L₁+L₂)C_small))</w:t>
-            </w:r>
-          </w:p>
-        </w:tc>
-      </w:tr>
-      <w:tr>
-        <w:tblPrEx>
-          <w:tblCellMar>
-            <w:top w:w="0" w:type="dxa"/>
-            <w:bottom w:w="0" w:type="dxa"/>
-          </w:tblCellMar>
-        </w:tblPrEx>
-        <w:tc>
-          <w:tcPr>
-            <w:tcW w:w="0" w:type="auto"/>
-          </w:tcPr>
-          <w:p>
-            <w:r>
-              <w:t>Bulk capacitance</w:t>
-            </w:r>
-          </w:p>
-        </w:tc>
-        <w:tc>
-          <w:tcPr>
-            <w:tcW w:w="0" w:type="auto"/>
-          </w:tcPr>
-          <w:p>
-            <w:r>
-              <w:t>C ≥ I Δt / ΔV</w:t>
-            </w:r>
-          </w:p>
-        </w:tc>
-      </w:tr>
-      <w:tr>
-        <w:tblPrEx>
-          <w:tblCellMar>
-            <w:top w:w="0" w:type="dxa"/>
-            <w:bottom w:w="0" w:type="dxa"/>
-          </w:tblCellMar>
-        </w:tblPrEx>
-        <w:tc>
-          <w:tcPr>
-            <w:tcW w:w="0" w:type="auto"/>
-          </w:tcPr>
-          <w:p>
-            <w:r>
-              <w:t>Differential and common mode</w:t>
-            </w:r>
-          </w:p>
-        </w:tc>
-        <w:tc>
-          <w:tcPr>
-            <w:tcW w:w="0" w:type="auto"/>
-          </w:tcPr>
-          <w:p>
-            <w:r>
-              <w:t>V_d = V₊ − V₋,  V_cm = (V₊ + V₋)/2</w:t>
-            </w:r>
-          </w:p>
-        </w:tc>
-      </w:tr>
-      <w:tr>
-        <w:tblPrEx>
-          <w:tblCellMar>
-            <w:top w:w="0" w:type="dxa"/>
-            <w:bottom w:w="0" w:type="dxa"/>
-          </w:tblCellMar>
-        </w:tblPrEx>
-        <w:tc>
-          <w:tcPr>
-            <w:tcW w:w="0" w:type="auto"/>
-          </w:tcPr>
-          <w:p>
-            <w:r>
-              <w:t>Difference-amplifier CMRR (worst case)</w:t>
-            </w:r>
-          </w:p>
-        </w:tc>
-        <w:tc>
-          <w:tcPr>
-            <w:tcW w:w="0" w:type="auto"/>
-          </w:tcPr>
-          <w:p>
-            <w:r>
-              <w:t>CMRR ≈ (1 + G)/(4t)</w:t>
-            </w:r>
-          </w:p>
-        </w:tc>
-      </w:tr>
-      <w:tr>
-        <w:tblPrEx>
-          <w:tblCellMar>
-            <w:top w:w="0" w:type="dxa"/>
-            <w:bottom w:w="0" w:type="dxa"/>
-          </w:tblCellMar>
-        </w:tblPrEx>
-        <w:tc>
-          <w:tcPr>
-            <w:tcW w:w="0" w:type="auto"/>
-          </w:tcPr>
-          <w:p>
-            <w:r>
-              <w:t>Three-op-amp INA gain</w:t>
-            </w:r>
-          </w:p>
-        </w:tc>
-        <w:tc>
-          <w:tcPr>
-            <w:tcW w:w="0" w:type="auto"/>
-          </w:tcPr>
-          <w:p>
-            <w:r>
-              <w:t>G = (1 + 2R/R_G)(R₂/R₁)</w:t>
-            </w:r>
-          </w:p>
-        </w:tc>
-      </w:tr>
-      <w:tr>
-        <w:tblPrEx>
-          <w:tblCellMar>
-            <w:top w:w="0" w:type="dxa"/>
-            <w:bottom w:w="0" w:type="dxa"/>
-          </w:tblCellMar>
-        </w:tblPrEx>
-        <w:tc>
-          <w:tcPr>
-            <w:tcW w:w="0" w:type="auto"/>
-          </w:tcPr>
-          <w:p>
-            <w:r>
-              <w:t>INA rejection</w:t>
-            </w:r>
-          </w:p>
-        </w:tc>
-        <w:tc>
-          <w:tcPr>
-            <w:tcW w:w="0" w:type="auto"/>
-          </w:tcPr>
-          <w:p>
-            <w:r>
-              <w:t>CMRR_total ≈ G₁ · CMRR_diff</w:t>
-            </w:r>
-          </w:p>
-        </w:tc>
-      </w:tr>
-      <w:tr>
-        <w:tblPrEx>
-          <w:tblCellMar>
-            <w:top w:w="0" w:type="dxa"/>
-            <w:bottom w:w="0" w:type="dxa"/>
-          </w:tblCellMar>
-        </w:tblPrEx>
-        <w:tc>
-          <w:tcPr>
-            <w:tcW w:w="0" w:type="auto"/>
-          </w:tcPr>
-          <w:p>
-            <w:r>
-              <w:t>State equation</w:t>
-            </w:r>
-          </w:p>
-        </w:tc>
-        <w:tc>
-          <w:tcPr>
-            <w:tcW w:w="0" w:type="auto"/>
-          </w:tcPr>
-          <w:p>
-            <w:r>
-              <w:t>ż = Az + Bu,  y = Cz</w:t>
-            </w:r>
-          </w:p>
-        </w:tc>
-      </w:tr>
-      <w:tr>
-        <w:tblPrEx>
-          <w:tblCellMar>
-            <w:top w:w="0" w:type="dxa"/>
-            <w:bottom w:w="0" w:type="dxa"/>
-          </w:tblCellMar>
-        </w:tblPrEx>
-        <w:tc>
-          <w:tcPr>
-            <w:tcW w:w="0" w:type="auto"/>
-          </w:tcPr>
-          <w:p>
-            <w:r>
-              <w:t>State-feedback gains for a mass</w:t>
-            </w:r>
-          </w:p>
-        </w:tc>
-        <w:tc>
-          <w:tcPr>
-            <w:tcW w:w="0" w:type="auto"/>
-          </w:tcPr>
-          <w:p>
-            <w:r>
-              <w:t>k₁ = mωₙ²,  k₂ = 2ζωₙm</w:t>
-            </w:r>
-          </w:p>
-        </w:tc>
-      </w:tr>
-      <w:tr>
-        <w:tblPrEx>
-          <w:tblCellMar>
-            <w:top w:w="0" w:type="dxa"/>
-            <w:bottom w:w="0" w:type="dxa"/>
-          </w:tblCellMar>
-        </w:tblPrEx>
-        <w:tc>
-          <w:tcPr>
-            <w:tcW w:w="0" w:type="auto"/>
-          </w:tcPr>
-          <w:p>
-            <w:r>
-              <w:t>Observer</w:t>
-            </w:r>
-          </w:p>
-        </w:tc>
-        <w:tc>
-          <w:tcPr>
-            <w:tcW w:w="0" w:type="auto"/>
-          </w:tcPr>
-          <w:p>
-            <w:r>
-              <w:t>dẑ/dt = Aẑ + Bu + L(y − Cẑ),  error poles: eig(A − LC)</w:t>
-            </w:r>
-          </w:p>
-        </w:tc>
-      </w:tr>
-      <w:tr>
-        <w:tblPrEx>
-          <w:tblCellMar>
-            <w:top w:w="0" w:type="dxa"/>
-            <w:bottom w:w="0" w:type="dxa"/>
-          </w:tblCellMar>
-        </w:tblPrEx>
-        <w:tc>
-          <w:tcPr>
-            <w:tcW w:w="0" w:type="auto"/>
-          </w:tcPr>
-          <w:p>
-            <w:r>
-              <w:t>Acquisition to ½ LSB</w:t>
-            </w:r>
-          </w:p>
-        </w:tc>
-        <w:tc>
-          <w:tcPr>
-            <w:tcW w:w="0" w:type="auto"/>
-          </w:tcPr>
-          <w:p>
-            <w:r>
-              <w:t>t_acq = RC (N + 1) ln 2</w:t>
-            </w:r>
-          </w:p>
-        </w:tc>
-      </w:tr>
-      <w:tr>
-        <w:tblPrEx>
-          <w:tblCellMar>
-            <w:top w:w="0" w:type="dxa"/>
-            <w:bottom w:w="0" w:type="dxa"/>
-          </w:tblCellMar>
-        </w:tblPrEx>
-        <w:tc>
-          <w:tcPr>
-            <w:tcW w:w="0" w:type="auto"/>
-          </w:tcPr>
-          <w:p>
-            <w:r>
-              <w:t>Sampled noise</w:t>
-            </w:r>
-          </w:p>
-        </w:tc>
-        <w:tc>
-          <w:tcPr>
-            <w:tcW w:w="0" w:type="auto"/>
-          </w:tcPr>
-          <w:p>
-            <w:r>
-              <w:t>v_n = √(kT/C)</w:t>
-            </w:r>
-          </w:p>
-        </w:tc>
-      </w:tr>
-      <w:tr>
-        <w:tblPrEx>
-          <w:tblCellMar>
-            <w:top w:w="0" w:type="dxa"/>
-            <w:bottom w:w="0" w:type="dxa"/>
-          </w:tblCellMar>
-        </w:tblPrEx>
-        <w:tc>
-          <w:tcPr>
-            <w:tcW w:w="0" w:type="auto"/>
-          </w:tcPr>
-          <w:p>
-            <w:r>
-              <w:t>Jitter-limited SNR</w:t>
-            </w:r>
-          </w:p>
-        </w:tc>
-        <w:tc>
-          <w:tcPr>
-            <w:tcW w:w="0" w:type="auto"/>
-          </w:tcPr>
-          <w:p>
-            <w:r>
-              <w:t>SNR = −20 log₁₀(2πfσ_t)</w:t>
-            </w:r>
-          </w:p>
-        </w:tc>
-      </w:tr>
-      <w:tr>
-        <w:tblPrEx>
-          <w:tblCellMar>
-            <w:top w:w="0" w:type="dxa"/>
-            <w:bottom w:w="0" w:type="dxa"/>
-          </w:tblCellMar>
-        </w:tblPrEx>
-        <w:tc>
-          <w:tcPr>
-            <w:tcW w:w="0" w:type="auto"/>
-          </w:tcPr>
-          <w:p>
-            <w:r>
-              <w:t>Pedestal and droop</w:t>
-            </w:r>
-          </w:p>
-        </w:tc>
-        <w:tc>
-          <w:tcPr>
-            <w:tcW w:w="0" w:type="auto"/>
-          </w:tcPr>
-          <w:p>
-            <w:r>
-              <w:t>ΔV = Q/C,   dV/dt = I_leak/C</w:t>
-            </w:r>
-          </w:p>
-        </w:tc>
-      </w:tr>
-      <w:tr>
-        <w:tblPrEx>
-          <w:tblCellMar>
-            <w:top w:w="0" w:type="dxa"/>
-            <w:bottom w:w="0" w:type="dxa"/>
-          </w:tblCellMar>
-        </w:tblPrEx>
-        <w:tc>
-          <w:tcPr>
-            <w:tcW w:w="0" w:type="auto"/>
-          </w:tcPr>
-          <w:p>
-            <w:r>
-              <w:t>PTAT voltage</w:t>
-            </w:r>
-          </w:p>
-        </w:tc>
-        <w:tc>
-          <w:tcPr>
-            <w:tcW w:w="0" w:type="auto"/>
-          </w:tcPr>
-          <w:p>
-            <w:r>
-              <w:t>ΔV_BE = (kT/q) ln N</w:t>
-            </w:r>
-          </w:p>
-        </w:tc>
-      </w:tr>
-      <w:tr>
-        <w:tblPrEx>
-          <w:tblCellMar>
-            <w:top w:w="0" w:type="dxa"/>
-            <w:bottom w:w="0" w:type="dxa"/>
-          </w:tblCellMar>
-        </w:tblPrEx>
-        <w:tc>
-          <w:tcPr>
-            <w:tcW w:w="0" w:type="auto"/>
-          </w:tcPr>
-          <w:p>
-            <w:r>
-              <w:t>Bandgap output</w:t>
-            </w:r>
-          </w:p>
-        </w:tc>
-        <w:tc>
-          <w:tcPr>
-            <w:tcW w:w="0" w:type="auto"/>
-          </w:tcPr>
-          <w:p>
-            <w:r>
-              <w:t>V_REF = V_BE + (R₂/R₁)ΔV_BE</w:t>
-            </w:r>
-          </w:p>
-        </w:tc>
-      </w:tr>
-      <w:tr>
-        <w:tblPrEx>
-          <w:tblCellMar>
-            <w:top w:w="0" w:type="dxa"/>
-            <w:bottom w:w="0" w:type="dxa"/>
-          </w:tblCellMar>
-        </w:tblPrEx>
-        <w:tc>
-          <w:tcPr>
-            <w:tcW w:w="0" w:type="auto"/>
-          </w:tcPr>
-          <w:p>
-            <w:r>
-              <w:t>Box-method TC</w:t>
-            </w:r>
-          </w:p>
-        </w:tc>
-        <w:tc>
-          <w:tcPr>
-            <w:tcW w:w="0" w:type="auto"/>
-          </w:tcPr>
-          <w:p>
-            <w:r>
-              <w:t>TC = ΔV/(V_nom ΔT) × 10⁶ ppm/°C</w:t>
-            </w:r>
-          </w:p>
-        </w:tc>
-      </w:tr>
-      <w:tr>
-        <w:tblPrEx>
-          <w:tblCellMar>
-            <w:top w:w="0" w:type="dxa"/>
-            <w:bottom w:w="0" w:type="dxa"/>
-          </w:tblCellMar>
-        </w:tblPrEx>
-        <w:tc>
-          <w:tcPr>
-            <w:tcW w:w="0" w:type="auto"/>
-          </w:tcPr>
-          <w:p>
-            <w:r>
-              <w:t>Shunt-reference resistor</w:t>
-            </w:r>
-          </w:p>
-        </w:tc>
-        <w:tc>
-          <w:tcPr>
-            <w:tcW w:w="0" w:type="auto"/>
-          </w:tcPr>
-          <w:p>
-            <w:r>
-              <w:t>R_s ≤ (V_s,min − V_REF)/(I_load,max + I_K,min)</w:t>
-            </w:r>
-          </w:p>
-        </w:tc>
-      </w:tr>
-      <w:tr>
-        <w:tblPrEx>
-          <w:tblCellMar>
-            <w:top w:w="0" w:type="dxa"/>
-            <w:bottom w:w="0" w:type="dxa"/>
-          </w:tblCellMar>
-        </w:tblPrEx>
-        <w:tc>
-          <w:tcPr>
-            <w:tcW w:w="0" w:type="auto"/>
-          </w:tcPr>
-          <w:p>
-            <w:r>
-              <w:t>Bridge average voltage</w:t>
-            </w:r>
-          </w:p>
-        </w:tc>
-        <w:tc>
-          <w:tcPr>
-            <w:tcW w:w="0" w:type="auto"/>
-          </w:tcPr>
-          <w:p>
-            <w:r>
-              <w:t>Bipolar (2D − 1)V_s;  sign-magnitude D·V_s</w:t>
-            </w:r>
-          </w:p>
-        </w:tc>
-      </w:tr>
-      <w:tr>
-        <w:tblPrEx>
-          <w:tblCellMar>
-            <w:top w:w="0" w:type="dxa"/>
-            <w:bottom w:w="0" w:type="dxa"/>
-          </w:tblCellMar>
-        </w:tblPrEx>
-        <w:tc>
-          <w:tcPr>
-            <w:tcW w:w="0" w:type="auto"/>
-          </w:tcPr>
-          <w:p>
-            <w:r>
-              <w:t>PWM current ripple</w:t>
-            </w:r>
-          </w:p>
-        </w:tc>
-        <w:tc>
-          <w:tcPr>
-            <w:tcW w:w="0" w:type="auto"/>
-          </w:tcPr>
-          <w:p>
-            <w:r>
-              <w:t>Bipolar 2V_sD(1 − D)/(Lf);  sign-magnitude V_sD(1 − D)/(Lf)</w:t>
-            </w:r>
-          </w:p>
-        </w:tc>
-      </w:tr>
-      <w:tr>
-        <w:tblPrEx>
-          <w:tblCellMar>
-            <w:top w:w="0" w:type="dxa"/>
-            <w:bottom w:w="0" w:type="dxa"/>
-          </w:tblCellMar>
-        </w:tblPrEx>
-        <w:tc>
-          <w:tcPr>
-            <w:tcW w:w="0" w:type="auto"/>
-          </w:tcPr>
-          <w:p>
-            <w:r>
-              <w:t>DC motor</w:t>
-            </w:r>
-          </w:p>
-        </w:tc>
-        <w:tc>
-          <w:tcPr>
-            <w:tcW w:w="0" w:type="auto"/>
-          </w:tcPr>
-          <w:p>
-            <w:r>
-              <w:t>V = Ri + L di/dt + K_eω;  J dω/dt = K_ti − bω − T_L</w:t>
-            </w:r>
-          </w:p>
-        </w:tc>
-      </w:tr>
-      <w:tr>
-        <w:tblPrEx>
-          <w:tblCellMar>
-            <w:top w:w="0" w:type="dxa"/>
-            <w:bottom w:w="0" w:type="dxa"/>
-          </w:tblCellMar>
-        </w:tblPrEx>
-        <w:tc>
-          <w:tcPr>
-            <w:tcW w:w="0" w:type="auto"/>
-          </w:tcPr>
-          <w:p>
-            <w:r>
-              <w:t>Motor time constants</w:t>
-            </w:r>
-          </w:p>
-        </w:tc>
-        <w:tc>
-          <w:tcPr>
-            <w:tcW w:w="0" w:type="auto"/>
-          </w:tcPr>
-          <w:p>
-            <w:r>
-              <w:t>τ_e = L/R,  τ_m = JR/(K_tK_e)</w:t>
-            </w:r>
-          </w:p>
-        </w:tc>
-      </w:tr>
-      <w:tr>
-        <w:tblPrEx>
-          <w:tblCellMar>
-            <w:top w:w="0" w:type="dxa"/>
-            <w:bottom w:w="0" w:type="dxa"/>
-          </w:tblCellMar>
-        </w:tblPrEx>
-        <w:tc>
-          <w:tcPr>
-            <w:tcW w:w="0" w:type="auto"/>
-          </w:tcPr>
-          <w:p>
-            <w:r>
-              <w:t>PI current loop</w:t>
-            </w:r>
-          </w:p>
-        </w:tc>
-        <w:tc>
-          <w:tcPr>
-            <w:tcW w:w="0" w:type="auto"/>
-          </w:tcPr>
-          <w:p>
-            <w:r>
-              <w:t>K_i/K_p = R/L,  ω_c = K_p/L</w:t>
-            </w:r>
-          </w:p>
-        </w:tc>
-      </w:tr>
-      <w:tr>
-        <w:tblPrEx>
-          <w:tblCellMar>
-            <w:top w:w="0" w:type="dxa"/>
-            <w:bottom w:w="0" w:type="dxa"/>
-          </w:tblCellMar>
-        </w:tblPrEx>
-        <w:tc>
-          <w:tcPr>
-            <w:tcW w:w="0" w:type="auto"/>
-          </w:tcPr>
-          <w:p>
-            <w:r>
-              <w:t>Root-locus asymptotes</w:t>
-            </w:r>
-          </w:p>
-        </w:tc>
-        <w:tc>
-          <w:tcPr>
-            <w:tcW w:w="0" w:type="auto"/>
-          </w:tcPr>
-          <w:p>
-            <w:r>
-              <w:t>angles (2k + 1)180°/(n − m);  centroid (Σp − Σz)/(n − m)</w:t>
-            </w:r>
-          </w:p>
-        </w:tc>
-      </w:tr>
-      <w:tr>
-        <w:tblPrEx>
-          <w:tblCellMar>
-            <w:top w:w="0" w:type="dxa"/>
-            <w:bottom w:w="0" w:type="dxa"/>
-          </w:tblCellMar>
-        </w:tblPrEx>
-        <w:tc>
-          <w:tcPr>
-            <w:tcW w:w="0" w:type="auto"/>
-          </w:tcPr>
-          <w:p>
-            <w:r>
-              <w:t>Locus gain</w:t>
-            </w:r>
-          </w:p>
-        </w:tc>
-        <w:tc>
-          <w:tcPr>
-            <w:tcW w:w="0" w:type="auto"/>
-          </w:tcPr>
-          <w:p>
-            <w:r>
-              <w:t>K = 1/|G(s)| at a point satisfying ∠G(s) = 180°</w:t>
-            </w:r>
-          </w:p>
-        </w:tc>
-      </w:tr>
-      <w:tr>
-        <w:tblPrEx>
-          <w:tblCellMar>
-            <w:top w:w="0" w:type="dxa"/>
-            <w:bottom w:w="0" w:type="dxa"/>
-          </w:tblCellMar>
-        </w:tblPrEx>
-        <w:tc>
-          <w:tcPr>
-            <w:tcW w:w="0" w:type="auto"/>
-          </w:tcPr>
-          <w:p>
-            <w:r>
-              <w:t>Second-order specs</w:t>
-            </w:r>
-          </w:p>
-        </w:tc>
-        <w:tc>
-          <w:tcPr>
-            <w:tcW w:w="0" w:type="auto"/>
-          </w:tcPr>
-          <w:p>
-            <w:r>
-              <w:t>overshoot exp(−πζ/√(1 − ζ²));  t_s(2%) ≈ 4/(ζω_n)</w:t>
-            </w:r>
-          </w:p>
-        </w:tc>
-      </w:tr>
-      <w:tr>
-        <w:tblPrEx>
-          <w:tblCellMar>
-            <w:top w:w="0" w:type="dxa"/>
-            <w:bottom w:w="0" w:type="dxa"/>
-          </w:tblCellMar>
-        </w:tblPrEx>
-        <w:tc>
-          <w:tcPr>
-            <w:tcW w:w="0" w:type="auto"/>
-          </w:tcPr>
-          <w:p>
-            <w:r>
-              <w:t>Nyquist criterion</w:t>
-            </w:r>
-          </w:p>
-        </w:tc>
-        <w:tc>
-          <w:tcPr>
-            <w:tcW w:w="0" w:type="auto"/>
-          </w:tcPr>
-          <w:p>
-            <w:r>
-              <w:t>Z = N + P</w:t>
-            </w:r>
-          </w:p>
-        </w:tc>
-      </w:tr>
-      <w:tr>
-        <w:tblPrEx>
-          <w:tblCellMar>
-            <w:top w:w="0" w:type="dxa"/>
-            <w:bottom w:w="0" w:type="dxa"/>
-          </w:tblCellMar>
-        </w:tblPrEx>
-        <w:tc>
-          <w:tcPr>
-            <w:tcW w:w="0" w:type="auto"/>
-          </w:tcPr>
-          <w:p>
-            <w:r>
-              <w:t>Margins</w:t>
-            </w:r>
-          </w:p>
-        </w:tc>
-        <w:tc>
-          <w:tcPr>
-            <w:tcW w:w="0" w:type="auto"/>
-          </w:tcPr>
-          <w:p>
-            <w:r>
-              <w:t>GM = 1/|L(jω₁₈₀)|;  PM = 180° + ∠L(jω_c);  τ_max = PM/ω_c</w:t>
-            </w:r>
-          </w:p>
-        </w:tc>
-      </w:tr>
-      <w:tr>
-        <w:tblPrEx>
-          <w:tblCellMar>
-            <w:top w:w="0" w:type="dxa"/>
-            <w:bottom w:w="0" w:type="dxa"/>
-          </w:tblCellMar>
-        </w:tblPrEx>
-        <w:tc>
-          <w:tcPr>
-            <w:tcW w:w="0" w:type="auto"/>
-          </w:tcPr>
-          <w:p>
-            <w:r>
-              <w:t>Sensitivity bounds</w:t>
-            </w:r>
-          </w:p>
-        </w:tc>
-        <w:tc>
-          <w:tcPr>
-            <w:tcW w:w="0" w:type="auto"/>
-          </w:tcPr>
-          <w:p>
-            <w:r>
-              <w:t>GM ≥ M_s/(M_s − 1);  PM ≥ 2 arcsin(1/(2M_s))</w:t>
-            </w:r>
-          </w:p>
-        </w:tc>
-      </w:tr>
-      <w:tr>
-        <w:tblPrEx>
-          <w:tblCellMar>
-            <w:top w:w="0" w:type="dxa"/>
-            <w:bottom w:w="0" w:type="dxa"/>
-          </w:tblCellMar>
-        </w:tblPrEx>
-        <w:tc>
-          <w:tcPr>
-            <w:tcW w:w="0" w:type="auto"/>
-          </w:tcPr>
-          <w:p>
-            <w:r>
-              <w:t>Wien bridge</w:t>
-            </w:r>
-          </w:p>
-        </w:tc>
-        <w:tc>
-          <w:tcPr>
-            <w:tcW w:w="0" w:type="auto"/>
-          </w:tcPr>
-          <w:p>
-            <w:r>
-              <w:t>f₀ = 1/(2πRC);  gain 3</w:t>
-            </w:r>
-          </w:p>
-        </w:tc>
-      </w:tr>
-      <w:tr>
-        <w:tblPrEx>
-          <w:tblCellMar>
-            <w:top w:w="0" w:type="dxa"/>
-            <w:bottom w:w="0" w:type="dxa"/>
-          </w:tblCellMar>
-        </w:tblPrEx>
-        <w:tc>
-          <w:tcPr>
-            <w:tcW w:w="0" w:type="auto"/>
-          </w:tcPr>
-          <w:p>
-            <w:r>
-              <w:t>Relaxation oscillator</w:t>
-            </w:r>
-          </w:p>
-        </w:tc>
-        <w:tc>
-          <w:tcPr>
-            <w:tcW w:w="0" w:type="auto"/>
-          </w:tcPr>
-          <w:p>
-            <w:r>
-              <w:t>T = 2RC ln((1 + β)/(1 − β))</w:t>
-            </w:r>
-          </w:p>
-        </w:tc>
-      </w:tr>
-      <w:tr>
-        <w:tblPrEx>
-          <w:tblCellMar>
-            <w:top w:w="0" w:type="dxa"/>
-            <w:bottom w:w="0" w:type="dxa"/>
-          </w:tblCellMar>
-        </w:tblPrEx>
-        <w:tc>
-          <w:tcPr>
-            <w:tcW w:w="0" w:type="auto"/>
-          </w:tcPr>
-          <w:p>
-            <w:r>
-              <w:t>555 astable</w:t>
-            </w:r>
-          </w:p>
-        </w:tc>
-        <w:tc>
-          <w:tcPr>
-            <w:tcW w:w="0" w:type="auto"/>
-          </w:tcPr>
-          <w:p>
-            <w:r>
-              <w:t>f = 1.44/((R₁ + 2R₂)C);  duty (R₁ + R₂)/(R₁ + 2R₂)</w:t>
-            </w:r>
-          </w:p>
-        </w:tc>
-      </w:tr>
-      <w:tr>
-        <w:tblPrEx>
-          <w:tblCellMar>
-            <w:top w:w="0" w:type="dxa"/>
-            <w:bottom w:w="0" w:type="dxa"/>
-          </w:tblCellMar>
-        </w:tblPrEx>
-        <w:tc>
-          <w:tcPr>
-            <w:tcW w:w="0" w:type="auto"/>
-          </w:tcPr>
-          <w:p>
-            <w:r>
-              <w:t>Setup and hold</w:t>
-            </w:r>
-          </w:p>
-        </w:tc>
-        <w:tc>
-          <w:tcPr>
-            <w:tcW w:w="0" w:type="auto"/>
-          </w:tcPr>
-          <w:p>
-            <w:r>
-              <w:t>T_clk ≥ t_cq + t_pd + t_su + t_skew;  t_cq + t_cd ≥ t_h + t_skew</w:t>
-            </w:r>
-          </w:p>
-        </w:tc>
-      </w:tr>
-      <w:tr>
-        <w:tblPrEx>
-          <w:tblCellMar>
-            <w:top w:w="0" w:type="dxa"/>
-            <w:bottom w:w="0" w:type="dxa"/>
-          </w:tblCellMar>
-        </w:tblPrEx>
-        <w:tc>
-          <w:tcPr>
-            <w:tcW w:w="0" w:type="auto"/>
-          </w:tcPr>
-          <w:p>
-            <w:r>
-              <w:t>Synchronizer MTBF</w:t>
-            </w:r>
-          </w:p>
-        </w:tc>
-        <w:tc>
-          <w:tcPr>
-            <w:tcW w:w="0" w:type="auto"/>
-          </w:tcPr>
-          <w:p>
-            <w:r>
-              <w:t>e^(t_r/τ)/(T_w f_clk f_data)</w:t>
-            </w:r>
-          </w:p>
-        </w:tc>
-      </w:tr>
-    </w:tbl>
+    <w:p>
+      <w:pPr>
+        <w:spacing w:before="0" w:after="100"/>
+      </w:pPr>
+      <w:r>
+        <w:rPr>
+          <w:b/>
+          <w:bCs/>
+        </w:rPr>
+        <w:t>Concept</w:t>
+      </w:r>
+      <w:r>
+        <w:rPr>
+          <w:b/>
+        </w:rPr>
+        <w:t xml:space="preserve"> — </w:t>
+      </w:r>
+      <w:r>
+        <w:rPr>
+          <w:b/>
+          <w:bCs/>
+        </w:rPr>
+        <w:t>Formula</w:t>
+      </w:r>
+    </w:p>
+    <w:p>
+      <w:pPr>
+        <w:spacing w:before="0" w:after="100"/>
+      </w:pPr>
+      <w:r>
+        <w:rPr>
+          <w:b/>
+        </w:rPr>
+        <w:t>Noise margins</w:t>
+      </w:r>
+      <w:r>
+        <w:rPr/>
+        <w:t xml:space="preserve"> — </w:t>
+      </w:r>
+      <w:r>
+        <w:rPr/>
+        <w:t>NMʜ = Vₒₕ(min) − Vᵢₕ(min)      NMʟ = Vᵢʟ(max) − Vₒʟ(max)</w:t>
+      </w:r>
+    </w:p>
+    <w:p>
+      <w:pPr>
+        <w:spacing w:before="0" w:after="100"/>
+      </w:pPr>
+      <w:r>
+        <w:rPr>
+          <w:b/>
+        </w:rPr>
+        <w:t>Inverting amplifier</w:t>
+      </w:r>
+      <w:r>
+        <w:rPr/>
+        <w:t xml:space="preserve"> — </w:t>
+      </w:r>
+      <w:r>
+        <w:rPr/>
+        <w:t>Vₒᵤₜ = −(R_f / Rᵢₙ) · Vᵢₙ</w:t>
+      </w:r>
+    </w:p>
+    <w:p>
+      <w:pPr>
+        <w:spacing w:before="0" w:after="100"/>
+      </w:pPr>
+      <w:r>
+        <w:rPr>
+          <w:b/>
+        </w:rPr>
+        <w:t>Non-inverting amplifier</w:t>
+      </w:r>
+      <w:r>
+        <w:rPr/>
+        <w:t xml:space="preserve"> — </w:t>
+      </w:r>
+      <w:r>
+        <w:rPr/>
+        <w:t>Vₒᵤₜ = (1 + R_f / Rᵢₙ) · Vᵢₙ</w:t>
+      </w:r>
+    </w:p>
+    <w:p>
+      <w:pPr>
+        <w:spacing w:before="0" w:after="100"/>
+      </w:pPr>
+      <w:r>
+        <w:rPr>
+          <w:b/>
+        </w:rPr>
+        <w:t>RC filter corner frequency</w:t>
+      </w:r>
+      <w:r>
+        <w:rPr/>
+        <w:t xml:space="preserve"> — </w:t>
+      </w:r>
+      <w:r>
+        <w:rPr/>
+        <w:t>fᴄ = 1 / (2πRC)</w:t>
+      </w:r>
+    </w:p>
+    <w:p>
+      <w:pPr>
+        <w:spacing w:before="0" w:after="100"/>
+      </w:pPr>
+      <w:r>
+        <w:rPr>
+          <w:b/>
+        </w:rPr>
+        <w:t>Capacitor self-resonant frequency</w:t>
+      </w:r>
+      <w:r>
+        <w:rPr/>
+        <w:t xml:space="preserve"> — </w:t>
+      </w:r>
+      <w:r>
+        <w:rPr/>
+        <w:t>SRF = 1 / (2π√(L_ESL · C))</w:t>
+      </w:r>
+    </w:p>
+    <w:p>
+      <w:pPr>
+        <w:spacing w:before="0" w:after="100"/>
+      </w:pPr>
+      <w:r>
+        <w:rPr>
+          <w:b/>
+        </w:rPr>
+        <w:t>Inductor quality factor</w:t>
+      </w:r>
+      <w:r>
+        <w:rPr/>
+        <w:t xml:space="preserve"> — </w:t>
+      </w:r>
+      <w:r>
+        <w:rPr/>
+        <w:t>Q = ωL / R</w:t>
+      </w:r>
+    </w:p>
+    <w:p>
+      <w:pPr>
+        <w:spacing w:before="0" w:after="100"/>
+      </w:pPr>
+      <w:r>
+        <w:rPr>
+          <w:b/>
+        </w:rPr>
+        <w:t>Inductor self-resonant frequency</w:t>
+      </w:r>
+      <w:r>
+        <w:rPr/>
+        <w:t xml:space="preserve"> — </w:t>
+      </w:r>
+      <w:r>
+        <w:rPr/>
+        <w:t>SRF = 1 / (2π√(L · C_wind))</w:t>
+      </w:r>
+    </w:p>
+    <w:p>
+      <w:pPr>
+        <w:spacing w:before="0" w:after="100"/>
+      </w:pPr>
+      <w:r>
+        <w:rPr>
+          <w:b/>
+        </w:rPr>
+        <w:t>Feedback closed-loop gain</w:t>
+      </w:r>
+      <w:r>
+        <w:rPr/>
+        <w:t xml:space="preserve"> — </w:t>
+      </w:r>
+      <w:r>
+        <w:rPr/>
+        <w:t>G = A / (1 + Aβ) ≈ 1/β</w:t>
+      </w:r>
+    </w:p>
+    <w:p>
+      <w:pPr>
+        <w:spacing w:before="0" w:after="100"/>
+      </w:pPr>
+      <w:r>
+        <w:rPr>
+          <w:b/>
+        </w:rPr>
+        <w:t>Gain sensitivity</w:t>
+      </w:r>
+      <w:r>
+        <w:rPr/>
+        <w:t xml:space="preserve"> — </w:t>
+      </w:r>
+      <w:r>
+        <w:rPr/>
+        <w:t>ΔG/G ≈ (ΔA/A) / (1 + T)</w:t>
+      </w:r>
+    </w:p>
+    <w:p>
+      <w:pPr>
+        <w:spacing w:before="0" w:after="100"/>
+      </w:pPr>
+      <w:r>
+        <w:rPr>
+          <w:b/>
+        </w:rPr>
+        <w:t>Capacitive-load pole</w:t>
+      </w:r>
+      <w:r>
+        <w:rPr/>
+        <w:t xml:space="preserve"> — </w:t>
+      </w:r>
+      <w:r>
+        <w:rPr/>
+        <w:t>f₂ = 1 / (2π r_o C_L)</w:t>
+      </w:r>
+    </w:p>
+    <w:p>
+      <w:pPr>
+        <w:spacing w:before="0" w:after="100"/>
+      </w:pPr>
+      <w:r>
+        <w:rPr>
+          <w:b/>
+        </w:rPr>
+        <w:t>Closed-loop bandwidth</w:t>
+      </w:r>
+      <w:r>
+        <w:rPr/>
+        <w:t xml:space="preserve"> — </w:t>
+      </w:r>
+      <w:r>
+        <w:rPr/>
+        <w:t>f_cl ≈ GBW / NG,  NG = 1 + R_f/Rᵢₙ</w:t>
+      </w:r>
+    </w:p>
+    <w:p>
+      <w:pPr>
+        <w:spacing w:before="0" w:after="100"/>
+      </w:pPr>
+      <w:r>
+        <w:rPr>
+          <w:b/>
+        </w:rPr>
+        <w:t>Full-power bandwidth</w:t>
+      </w:r>
+      <w:r>
+        <w:rPr/>
+        <w:t xml:space="preserve"> — </w:t>
+      </w:r>
+      <w:r>
+        <w:rPr/>
+        <w:t>f_FP = SR / (2π V_p)</w:t>
+      </w:r>
+    </w:p>
+    <w:p>
+      <w:pPr>
+        <w:spacing w:before="0" w:after="100"/>
+      </w:pPr>
+      <w:r>
+        <w:rPr>
+          <w:b/>
+        </w:rPr>
+        <w:t>Johnson noise density</w:t>
+      </w:r>
+      <w:r>
+        <w:rPr/>
+        <w:t xml:space="preserve"> — </w:t>
+      </w:r>
+      <w:r>
+        <w:rPr/>
+        <w:t>e_R = √(4kTR)</w:t>
+      </w:r>
+    </w:p>
+    <w:p>
+      <w:pPr>
+        <w:spacing w:before="0" w:after="100"/>
+      </w:pPr>
+      <w:r>
+        <w:rPr>
+          <w:b/>
+        </w:rPr>
+        <w:t>Noise sum (uncorrelated)</w:t>
+      </w:r>
+      <w:r>
+        <w:rPr/>
+        <w:t xml:space="preserve"> — </w:t>
+      </w:r>
+      <w:r>
+        <w:rPr/>
+        <w:t>e_total = √(e₁² + e₂² + …)</w:t>
+      </w:r>
+    </w:p>
+    <w:p>
+      <w:pPr>
+        <w:spacing w:before="0" w:after="100"/>
+      </w:pPr>
+      <w:r>
+        <w:rPr>
+          <w:b/>
+        </w:rPr>
+        <w:t>Single-pole noise bandwidth</w:t>
+      </w:r>
+      <w:r>
+        <w:rPr/>
+        <w:t xml:space="preserve"> — </w:t>
+      </w:r>
+      <w:r>
+        <w:rPr/>
+        <w:t>ENBW = (π/2) f₋₃dB</w:t>
+      </w:r>
+    </w:p>
+    <w:p>
+      <w:pPr>
+        <w:spacing w:before="0" w:after="100"/>
+      </w:pPr>
+      <w:r>
+        <w:rPr>
+          <w:b/>
+        </w:rPr>
+        <w:t>Offset at output</w:t>
+      </w:r>
+      <w:r>
+        <w:rPr/>
+        <w:t xml:space="preserve"> — </w:t>
+      </w:r>
+      <w:r>
+        <w:rPr/>
+        <w:t>V_out = V_os (1 + R_f/Rᵢₙ)</w:t>
+      </w:r>
+    </w:p>
+    <w:p>
+      <w:pPr>
+        <w:spacing w:before="0" w:after="100"/>
+      </w:pPr>
+      <w:r>
+        <w:rPr>
+          <w:b/>
+        </w:rPr>
+        <w:t>Bias-current compensation</w:t>
+      </w:r>
+      <w:r>
+        <w:rPr/>
+        <w:t xml:space="preserve"> — </w:t>
+      </w:r>
+      <w:r>
+        <w:rPr/>
+        <w:t>R_c = R_f ‖ Rᵢₙ; residual ≈ I_os R_f</w:t>
+      </w:r>
+    </w:p>
+    <w:p>
+      <w:pPr>
+        <w:spacing w:before="0" w:after="100"/>
+      </w:pPr>
+      <w:r>
+        <w:rPr>
+          <w:b/>
+        </w:rPr>
+        <w:t>Schmitt threshold</w:t>
+      </w:r>
+      <w:r>
+        <w:rPr/>
+        <w:t xml:space="preserve"> — </w:t>
+      </w:r>
+      <w:r>
+        <w:rPr/>
+        <w:t>V_th = V_ref R₂/(R₁+R₂) + V_out R₁/(R₁+R₂)</w:t>
+      </w:r>
+    </w:p>
+    <w:p>
+      <w:pPr>
+        <w:spacing w:before="0" w:after="100"/>
+      </w:pPr>
+      <w:r>
+        <w:rPr>
+          <w:b/>
+        </w:rPr>
+        <w:t>Pull-up rise time (10–90%)</w:t>
+      </w:r>
+      <w:r>
+        <w:rPr/>
+        <w:t xml:space="preserve"> — </w:t>
+      </w:r>
+      <w:r>
+        <w:rPr/>
+        <w:t>t_r = 2.2 R_pu C</w:t>
+      </w:r>
+    </w:p>
+    <w:p>
+      <w:pPr>
+        <w:spacing w:before="0" w:after="100"/>
+      </w:pPr>
+      <w:r>
+        <w:rPr>
+          <w:b/>
+        </w:rPr>
+        <w:t>Closed-loop tracking</w:t>
+      </w:r>
+      <w:r>
+        <w:rPr/>
+        <w:t xml:space="preserve"> — </w:t>
+      </w:r>
+      <w:r>
+        <w:rPr/>
+        <w:t>Y/R = CP/(1 + CP)</w:t>
+      </w:r>
+    </w:p>
+    <w:p>
+      <w:pPr>
+        <w:spacing w:before="0" w:after="100"/>
+      </w:pPr>
+      <w:r>
+        <w:rPr>
+          <w:b/>
+        </w:rPr>
+        <w:t>First-order plant, P control</w:t>
+      </w:r>
+      <w:r>
+        <w:rPr/>
+        <w:t xml:space="preserve"> — </w:t>
+      </w:r>
+      <w:r>
+        <w:rPr/>
+        <w:t>τ_cl = τ/(1 + K_p K); e_ss = 1/(1 + K_p K)</w:t>
+      </w:r>
+    </w:p>
+    <w:p>
+      <w:pPr>
+        <w:spacing w:before="0" w:after="100"/>
+      </w:pPr>
+      <w:r>
+        <w:rPr>
+          <w:b/>
+        </w:rPr>
+        <w:t>PID law</w:t>
+      </w:r>
+      <w:r>
+        <w:rPr/>
+        <w:t xml:space="preserve"> — </w:t>
+      </w:r>
+      <w:r>
+        <w:rPr/>
+        <w:t>u = K_p e + K_i ∫e dt + K_d de/dt</w:t>
+      </w:r>
+    </w:p>
+    <w:p>
+      <w:pPr>
+        <w:spacing w:before="0" w:after="100"/>
+      </w:pPr>
+      <w:r>
+        <w:rPr>
+          <w:b/>
+        </w:rPr>
+        <w:t>Lead network maximum phase</w:t>
+      </w:r>
+      <w:r>
+        <w:rPr/>
+        <w:t xml:space="preserve"> — </w:t>
+      </w:r>
+      <w:r>
+        <w:rPr/>
+        <w:t>φ_max = arcsin((α−1)/(α+1)) at √(ω_z ω_p)</w:t>
+      </w:r>
+    </w:p>
+    <w:p>
+      <w:pPr>
+        <w:spacing w:before="0" w:after="100"/>
+      </w:pPr>
+      <w:r>
+        <w:rPr>
+          <w:b/>
+        </w:rPr>
+        <w:t>Sampled-loop delay</w:t>
+      </w:r>
+      <w:r>
+        <w:rPr/>
+        <w:t xml:space="preserve"> — </w:t>
+      </w:r>
+      <w:r>
+        <w:rPr/>
+        <w:t>t_d ≈ T/2 + T_compute;  φ = ω_c t_d</w:t>
+      </w:r>
+    </w:p>
+    <w:p>
+      <w:pPr>
+        <w:spacing w:before="0" w:after="100"/>
+      </w:pPr>
+      <w:r>
+        <w:rPr>
+          <w:b/>
+        </w:rPr>
+        <w:t>Discrete PI (backward Euler)</w:t>
+      </w:r>
+      <w:r>
+        <w:rPr/>
+        <w:t xml:space="preserve"> — </w:t>
+      </w:r>
+      <w:r>
+        <w:rPr/>
+        <w:t>I[k] = I[k−1] + T e[k];  u[k] = K_p e[k] + K_i I[k]</w:t>
+      </w:r>
+    </w:p>
+    <w:p>
+      <w:pPr>
+        <w:spacing w:before="0" w:after="100"/>
+      </w:pPr>
+      <w:r>
+        <w:rPr>
+          <w:b/>
+        </w:rPr>
+        <w:t>Buck inductor ripple</w:t>
+      </w:r>
+      <w:r>
+        <w:rPr/>
+        <w:t xml:space="preserve"> — </w:t>
+      </w:r>
+      <w:r>
+        <w:rPr/>
+        <w:t>ΔI = (V_in − V_out) D / (L f_sw)</w:t>
+      </w:r>
+    </w:p>
+    <w:p>
+      <w:pPr>
+        <w:spacing w:before="0" w:after="100"/>
+      </w:pPr>
+      <w:r>
+        <w:rPr>
+          <w:b/>
+        </w:rPr>
+        <w:t>Triangle-on-DC rms</w:t>
+      </w:r>
+      <w:r>
+        <w:rPr/>
+        <w:t xml:space="preserve"> — </w:t>
+      </w:r>
+      <w:r>
+        <w:rPr/>
+        <w:t>I_rms = √(I_DC² + ΔI²/12)</w:t>
+      </w:r>
+    </w:p>
+    <w:p>
+      <w:pPr>
+        <w:spacing w:before="0" w:after="100"/>
+      </w:pPr>
+      <w:r>
+        <w:rPr>
+          <w:b/>
+        </w:rPr>
+        <w:t>Second-order low-pass</w:t>
+      </w:r>
+      <w:r>
+        <w:rPr/>
+        <w:t xml:space="preserve"> — </w:t>
+      </w:r>
+      <w:r>
+        <w:rPr/>
+        <w:t>H(s) = H₀ω₀²/(s² + (ω₀/Q)s + ω₀²)</w:t>
+      </w:r>
+    </w:p>
+    <w:p>
+      <w:pPr>
+        <w:spacing w:before="0" w:after="100"/>
+      </w:pPr>
+      <w:r>
+        <w:rPr>
+          <w:b/>
+        </w:rPr>
+        <w:t>Unity-gain Sallen-Key, equal R</w:t>
+      </w:r>
+      <w:r>
+        <w:rPr/>
+        <w:t xml:space="preserve"> — </w:t>
+      </w:r>
+      <w:r>
+        <w:rPr/>
+        <w:t>ω₀ = 1/(R√(C₁C₂)); Q = ½√(C₁/C₂)</w:t>
+      </w:r>
+    </w:p>
+    <w:p>
+      <w:pPr>
+        <w:spacing w:before="0" w:after="100"/>
+      </w:pPr>
+      <w:r>
+        <w:rPr>
+          <w:b/>
+        </w:rPr>
+        <w:t>MFB low-pass, equal R</w:t>
+      </w:r>
+      <w:r>
+        <w:rPr/>
+        <w:t xml:space="preserve"> — </w:t>
+      </w:r>
+      <w:r>
+        <w:rPr/>
+        <w:t>H₀ = −1; ω₀ = 1/(R√(C₁C₂)); Q = ⅓√(C₁/C₂)</w:t>
+      </w:r>
+    </w:p>
+    <w:p>
+      <w:pPr>
+        <w:spacing w:before="0" w:after="100"/>
+      </w:pPr>
+      <w:r>
+        <w:rPr>
+          <w:b/>
+        </w:rPr>
+        <w:t>Linear power derating</w:t>
+      </w:r>
+      <w:r>
+        <w:rPr/>
+        <w:t xml:space="preserve"> — </w:t>
+      </w:r>
+      <w:r>
+        <w:rPr/>
+        <w:t>P = P_rated (T_max − T_amb)/(T_max − T_knee)</w:t>
+      </w:r>
+    </w:p>
+    <w:p>
+      <w:pPr>
+        <w:spacing w:before="0" w:after="100"/>
+      </w:pPr>
+      <w:r>
+        <w:rPr>
+          <w:b/>
+        </w:rPr>
+        <w:t>Self-heating</w:t>
+      </w:r>
+      <w:r>
+        <w:rPr/>
+        <w:t xml:space="preserve"> — </w:t>
+      </w:r>
+      <w:r>
+        <w:rPr/>
+        <w:t>ΔT = P θ;  ΔR/R = TCR × ΔT</w:t>
+      </w:r>
+    </w:p>
+    <w:p>
+      <w:pPr>
+        <w:spacing w:before="0" w:after="100"/>
+      </w:pPr>
+      <w:r>
+        <w:rPr>
+          <w:b/>
+        </w:rPr>
+        <w:t>Capacitor impedance</w:t>
+      </w:r>
+      <w:r>
+        <w:rPr/>
+        <w:t xml:space="preserve"> — </w:t>
+      </w:r>
+      <w:r>
+        <w:rPr/>
+        <w:t>|Z| = √(ESR² + (ωL − 1/(ωC))²)</w:t>
+      </w:r>
+    </w:p>
+    <w:p>
+      <w:pPr>
+        <w:spacing w:before="0" w:after="100"/>
+      </w:pPr>
+      <w:r>
+        <w:rPr>
+          <w:b/>
+        </w:rPr>
+        <w:t>Target impedance</w:t>
+      </w:r>
+      <w:r>
+        <w:rPr/>
+        <w:t xml:space="preserve"> — </w:t>
+      </w:r>
+      <w:r>
+        <w:rPr/>
+        <w:t>Z_target = ΔV / ΔI</w:t>
+      </w:r>
+    </w:p>
+    <w:p>
+      <w:pPr>
+        <w:spacing w:before="0" w:after="100"/>
+      </w:pPr>
+      <w:r>
+        <w:rPr>
+          <w:b/>
+        </w:rPr>
+        <w:t>Antiresonance (approx.)</w:t>
+      </w:r>
+      <w:r>
+        <w:rPr/>
+        <w:t xml:space="preserve"> — </w:t>
+      </w:r>
+      <w:r>
+        <w:rPr/>
+        <w:t>f_ar ≈ 1/(2π√((L₁+L₂)C_small))</w:t>
+      </w:r>
+    </w:p>
+    <w:p>
+      <w:pPr>
+        <w:spacing w:before="0" w:after="100"/>
+      </w:pPr>
+      <w:r>
+        <w:rPr>
+          <w:b/>
+        </w:rPr>
+        <w:t>Bulk capacitance</w:t>
+      </w:r>
+      <w:r>
+        <w:rPr/>
+        <w:t xml:space="preserve"> — </w:t>
+      </w:r>
+      <w:r>
+        <w:rPr/>
+        <w:t>C ≥ I Δt / ΔV</w:t>
+      </w:r>
+    </w:p>
+    <w:p>
+      <w:pPr>
+        <w:spacing w:before="0" w:after="100"/>
+      </w:pPr>
+      <w:r>
+        <w:rPr>
+          <w:b/>
+        </w:rPr>
+        <w:t>Differential and common mode</w:t>
+      </w:r>
+      <w:r>
+        <w:rPr/>
+        <w:t xml:space="preserve"> — </w:t>
+      </w:r>
+      <w:r>
+        <w:rPr/>
+        <w:t>V_d = V₊ − V₋,  V_cm = (V₊ + V₋)/2</w:t>
+      </w:r>
+    </w:p>
+    <w:p>
+      <w:pPr>
+        <w:spacing w:before="0" w:after="100"/>
+      </w:pPr>
+      <w:r>
+        <w:rPr>
+          <w:b/>
+        </w:rPr>
+        <w:t>Difference-amplifier CMRR (worst case)</w:t>
+      </w:r>
+      <w:r>
+        <w:rPr/>
+        <w:t xml:space="preserve"> — </w:t>
+      </w:r>
+      <w:r>
+        <w:rPr/>
+        <w:t>CMRR ≈ (1 + G)/(4t)</w:t>
+      </w:r>
+    </w:p>
+    <w:p>
+      <w:pPr>
+        <w:spacing w:before="0" w:after="100"/>
+      </w:pPr>
+      <w:r>
+        <w:rPr>
+          <w:b/>
+        </w:rPr>
+        <w:t>Three-op-amp INA gain</w:t>
+      </w:r>
+      <w:r>
+        <w:rPr/>
+        <w:t xml:space="preserve"> — </w:t>
+      </w:r>
+      <w:r>
+        <w:rPr/>
+        <w:t>G = (1 + 2R/R_G)(R₂/R₁)</w:t>
+      </w:r>
+    </w:p>
+    <w:p>
+      <w:pPr>
+        <w:spacing w:before="0" w:after="100"/>
+      </w:pPr>
+      <w:r>
+        <w:rPr>
+          <w:b/>
+        </w:rPr>
+        <w:t>INA rejection</w:t>
+      </w:r>
+      <w:r>
+        <w:rPr/>
+        <w:t xml:space="preserve"> — </w:t>
+      </w:r>
+      <w:r>
+        <w:rPr/>
+        <w:t>CMRR_total ≈ G₁ · CMRR_diff</w:t>
+      </w:r>
+    </w:p>
+    <w:p>
+      <w:pPr>
+        <w:spacing w:before="0" w:after="100"/>
+      </w:pPr>
+      <w:r>
+        <w:rPr>
+          <w:b/>
+        </w:rPr>
+        <w:t>State equation</w:t>
+      </w:r>
+      <w:r>
+        <w:rPr/>
+        <w:t xml:space="preserve"> — </w:t>
+      </w:r>
+      <w:r>
+        <w:rPr/>
+        <w:t>ż = Az + Bu,  y = Cz</w:t>
+      </w:r>
+    </w:p>
+    <w:p>
+      <w:pPr>
+        <w:spacing w:before="0" w:after="100"/>
+      </w:pPr>
+      <w:r>
+        <w:rPr>
+          <w:b/>
+        </w:rPr>
+        <w:t>State-feedback gains for a mass</w:t>
+      </w:r>
+      <w:r>
+        <w:rPr/>
+        <w:t xml:space="preserve"> — </w:t>
+      </w:r>
+      <w:r>
+        <w:rPr/>
+        <w:t>k₁ = mωₙ²,  k₂ = 2ζωₙm</w:t>
+      </w:r>
+    </w:p>
+    <w:p>
+      <w:pPr>
+        <w:spacing w:before="0" w:after="100"/>
+      </w:pPr>
+      <w:r>
+        <w:rPr>
+          <w:b/>
+        </w:rPr>
+        <w:t>Observer</w:t>
+      </w:r>
+      <w:r>
+        <w:rPr/>
+        <w:t xml:space="preserve"> — </w:t>
+      </w:r>
+      <w:r>
+        <w:rPr/>
+        <w:t>dẑ/dt = Aẑ + Bu + L(y − Cẑ),  error poles: eig(A − LC)</w:t>
+      </w:r>
+    </w:p>
+    <w:p>
+      <w:pPr>
+        <w:spacing w:before="0" w:after="100"/>
+      </w:pPr>
+      <w:r>
+        <w:rPr>
+          <w:b/>
+        </w:rPr>
+        <w:t>Acquisition to ½ LSB</w:t>
+      </w:r>
+      <w:r>
+        <w:rPr/>
+        <w:t xml:space="preserve"> — </w:t>
+      </w:r>
+      <w:r>
+        <w:rPr/>
+        <w:t>t_acq = RC (N + 1) ln 2</w:t>
+      </w:r>
+    </w:p>
+    <w:p>
+      <w:pPr>
+        <w:spacing w:before="0" w:after="100"/>
+      </w:pPr>
+      <w:r>
+        <w:rPr>
+          <w:b/>
+        </w:rPr>
+        <w:t>Sampled noise</w:t>
+      </w:r>
+      <w:r>
+        <w:rPr/>
+        <w:t xml:space="preserve"> — </w:t>
+      </w:r>
+      <w:r>
+        <w:rPr/>
+        <w:t>v_n = √(kT/C)</w:t>
+      </w:r>
+    </w:p>
+    <w:p>
+      <w:pPr>
+        <w:spacing w:before="0" w:after="100"/>
+      </w:pPr>
+      <w:r>
+        <w:rPr>
+          <w:b/>
+        </w:rPr>
+        <w:t>Jitter-limited SNR</w:t>
+      </w:r>
+      <w:r>
+        <w:rPr/>
+        <w:t xml:space="preserve"> — </w:t>
+      </w:r>
+      <w:r>
+        <w:rPr/>
+        <w:t>SNR = −20 log₁₀(2πfσ_t)</w:t>
+      </w:r>
+    </w:p>
+    <w:p>
+      <w:pPr>
+        <w:spacing w:before="0" w:after="100"/>
+      </w:pPr>
+      <w:r>
+        <w:rPr>
+          <w:b/>
+        </w:rPr>
+        <w:t>Pedestal and droop</w:t>
+      </w:r>
+      <w:r>
+        <w:rPr/>
+        <w:t xml:space="preserve"> — </w:t>
+      </w:r>
+      <w:r>
+        <w:rPr/>
+        <w:t>ΔV = Q/C,   dV/dt = I_leak/C</w:t>
+      </w:r>
+    </w:p>
+    <w:p>
+      <w:pPr>
+        <w:spacing w:before="0" w:after="100"/>
+      </w:pPr>
+      <w:r>
+        <w:rPr>
+          <w:b/>
+        </w:rPr>
+        <w:t>PTAT voltage</w:t>
+      </w:r>
+      <w:r>
+        <w:rPr/>
+        <w:t xml:space="preserve"> — </w:t>
+      </w:r>
+      <w:r>
+        <w:rPr/>
+        <w:t>ΔV_BE = (kT/q) ln N</w:t>
+      </w:r>
+    </w:p>
+    <w:p>
+      <w:pPr>
+        <w:spacing w:before="0" w:after="100"/>
+      </w:pPr>
+      <w:r>
+        <w:rPr>
+          <w:b/>
+        </w:rPr>
+        <w:t>Bandgap output</w:t>
+      </w:r>
+      <w:r>
+        <w:rPr/>
+        <w:t xml:space="preserve"> — </w:t>
+      </w:r>
+      <w:r>
+        <w:rPr/>
+        <w:t>V_REF = V_BE + (R₂/R₁)ΔV_BE</w:t>
+      </w:r>
+    </w:p>
+    <w:p>
+      <w:pPr>
+        <w:spacing w:before="0" w:after="100"/>
+      </w:pPr>
+      <w:r>
+        <w:rPr>
+          <w:b/>
+        </w:rPr>
+        <w:t>Box-method TC</w:t>
+      </w:r>
+      <w:r>
+        <w:rPr/>
+        <w:t xml:space="preserve"> — </w:t>
+      </w:r>
+      <w:r>
+        <w:rPr/>
+        <w:t>TC = ΔV/(V_nom ΔT) × 10⁶ ppm/°C</w:t>
+      </w:r>
+    </w:p>
+    <w:p>
+      <w:pPr>
+        <w:spacing w:before="0" w:after="100"/>
+      </w:pPr>
+      <w:r>
+        <w:rPr>
+          <w:b/>
+        </w:rPr>
+        <w:t>Shunt-reference resistor</w:t>
+      </w:r>
+      <w:r>
+        <w:rPr/>
+        <w:t xml:space="preserve"> — </w:t>
+      </w:r>
+      <w:r>
+        <w:rPr/>
+        <w:t>R_s ≤ (V_s,min − V_REF)/(I_load,max + I_K,min)</w:t>
+      </w:r>
+    </w:p>
+    <w:p>
+      <w:pPr>
+        <w:spacing w:before="0" w:after="100"/>
+      </w:pPr>
+      <w:r>
+        <w:rPr>
+          <w:b/>
+        </w:rPr>
+        <w:t>Bridge average voltage</w:t>
+      </w:r>
+      <w:r>
+        <w:rPr/>
+        <w:t xml:space="preserve"> — </w:t>
+      </w:r>
+      <w:r>
+        <w:rPr/>
+        <w:t>Bipolar (2D − 1)V_s;  sign-magnitude D·V_s</w:t>
+      </w:r>
+    </w:p>
+    <w:p>
+      <w:pPr>
+        <w:spacing w:before="0" w:after="100"/>
+      </w:pPr>
+      <w:r>
+        <w:rPr>
+          <w:b/>
+        </w:rPr>
+        <w:t>PWM current ripple</w:t>
+      </w:r>
+      <w:r>
+        <w:rPr/>
+        <w:t xml:space="preserve"> — </w:t>
+      </w:r>
+      <w:r>
+        <w:rPr/>
+        <w:t>Bipolar 2V_sD(1 − D)/(Lf);  sign-magnitude V_sD(1 − D)/(Lf)</w:t>
+      </w:r>
+    </w:p>
+    <w:p>
+      <w:pPr>
+        <w:spacing w:before="0" w:after="100"/>
+      </w:pPr>
+      <w:r>
+        <w:rPr>
+          <w:b/>
+        </w:rPr>
+        <w:t>DC motor</w:t>
+      </w:r>
+      <w:r>
+        <w:rPr/>
+        <w:t xml:space="preserve"> — </w:t>
+      </w:r>
+      <w:r>
+        <w:rPr/>
+        <w:t>V = Ri + L di/dt + K_eω;  J dω/dt = K_ti − bω − T_L</w:t>
+      </w:r>
+    </w:p>
+    <w:p>
+      <w:pPr>
+        <w:spacing w:before="0" w:after="100"/>
+      </w:pPr>
+      <w:r>
+        <w:rPr>
+          <w:b/>
+        </w:rPr>
+        <w:t>Motor time constants</w:t>
+      </w:r>
+      <w:r>
+        <w:rPr/>
+        <w:t xml:space="preserve"> — </w:t>
+      </w:r>
+      <w:r>
+        <w:rPr/>
+        <w:t>τ_e = L/R,  τ_m = JR/(K_tK_e)</w:t>
+      </w:r>
+    </w:p>
+    <w:p>
+      <w:pPr>
+        <w:spacing w:before="0" w:after="100"/>
+      </w:pPr>
+      <w:r>
+        <w:rPr>
+          <w:b/>
+        </w:rPr>
+        <w:t>PI current loop</w:t>
+      </w:r>
+      <w:r>
+        <w:rPr/>
+        <w:t xml:space="preserve"> — </w:t>
+      </w:r>
+      <w:r>
+        <w:rPr/>
+        <w:t>K_i/K_p = R/L,  ω_c = K_p/L</w:t>
+      </w:r>
+    </w:p>
+    <w:p>
+      <w:pPr>
+        <w:spacing w:before="0" w:after="100"/>
+      </w:pPr>
+      <w:r>
+        <w:rPr>
+          <w:b/>
+        </w:rPr>
+        <w:t>Root-locus asymptotes</w:t>
+      </w:r>
+      <w:r>
+        <w:rPr/>
+        <w:t xml:space="preserve"> — </w:t>
+      </w:r>
+      <w:r>
+        <w:rPr/>
+        <w:t>angles (2k + 1)180°/(n − m);  centroid (Σp − Σz)/(n − m)</w:t>
+      </w:r>
+    </w:p>
+    <w:p>
+      <w:pPr>
+        <w:spacing w:before="0" w:after="100"/>
+      </w:pPr>
+      <w:r>
+        <w:rPr>
+          <w:b/>
+        </w:rPr>
+        <w:t>Locus gain</w:t>
+      </w:r>
+      <w:r>
+        <w:rPr/>
+        <w:t xml:space="preserve"> — </w:t>
+      </w:r>
+      <w:r>
+        <w:rPr/>
+        <w:t>K = 1/|G(s)| at a point satisfying ∠G(s) = 180°</w:t>
+      </w:r>
+    </w:p>
+    <w:p>
+      <w:pPr>
+        <w:spacing w:before="0" w:after="100"/>
+      </w:pPr>
+      <w:r>
+        <w:rPr>
+          <w:b/>
+        </w:rPr>
+        <w:t>Second-order specs</w:t>
+      </w:r>
+      <w:r>
+        <w:rPr/>
+        <w:t xml:space="preserve"> — </w:t>
+      </w:r>
+      <w:r>
+        <w:rPr/>
+        <w:t>overshoot exp(−πζ/√(1 − ζ²));  t_s(2%) ≈ 4/(ζω_n)</w:t>
+      </w:r>
+    </w:p>
+    <w:p>
+      <w:pPr>
+        <w:spacing w:before="0" w:after="100"/>
+      </w:pPr>
+      <w:r>
+        <w:rPr>
+          <w:b/>
+        </w:rPr>
+        <w:t>Nyquist criterion</w:t>
+      </w:r>
+      <w:r>
+        <w:rPr/>
+        <w:t xml:space="preserve"> — </w:t>
+      </w:r>
+      <w:r>
+        <w:rPr/>
+        <w:t>Z = N + P</w:t>
+      </w:r>
+    </w:p>
+    <w:p>
+      <w:pPr>
+        <w:spacing w:before="0" w:after="100"/>
+      </w:pPr>
+      <w:r>
+        <w:rPr>
+          <w:b/>
+        </w:rPr>
+        <w:t>Margins</w:t>
+      </w:r>
+      <w:r>
+        <w:rPr/>
+        <w:t xml:space="preserve"> — </w:t>
+      </w:r>
+      <w:r>
+        <w:rPr/>
+        <w:t>GM = 1/|L(jω₁₈₀)|;  PM = 180° + ∠L(jω_c);  τ_max = PM/ω_c</w:t>
+      </w:r>
+    </w:p>
+    <w:p>
+      <w:pPr>
+        <w:spacing w:before="0" w:after="100"/>
+      </w:pPr>
+      <w:r>
+        <w:rPr>
+          <w:b/>
+        </w:rPr>
+        <w:t>Sensitivity bounds</w:t>
+      </w:r>
+      <w:r>
+        <w:rPr/>
+        <w:t xml:space="preserve"> — </w:t>
+      </w:r>
+      <w:r>
+        <w:rPr/>
+        <w:t>GM ≥ M_s/(M_s − 1);  PM ≥ 2 arcsin(1/(2M_s))</w:t>
+      </w:r>
+    </w:p>
+    <w:p>
+      <w:pPr>
+        <w:spacing w:before="0" w:after="100"/>
+      </w:pPr>
+      <w:r>
+        <w:rPr>
+          <w:b/>
+        </w:rPr>
+        <w:t>Wien bridge</w:t>
+      </w:r>
+      <w:r>
+        <w:rPr/>
+        <w:t xml:space="preserve"> — </w:t>
+      </w:r>
+      <w:r>
+        <w:rPr/>
+        <w:t>f₀ = 1/(2πRC);  gain 3</w:t>
+      </w:r>
+    </w:p>
+    <w:p>
+      <w:pPr>
+        <w:spacing w:before="0" w:after="100"/>
+      </w:pPr>
+      <w:r>
+        <w:rPr>
+          <w:b/>
+        </w:rPr>
+        <w:t>Relaxation oscillator</w:t>
+      </w:r>
+      <w:r>
+        <w:rPr/>
+        <w:t xml:space="preserve"> — </w:t>
+      </w:r>
+      <w:r>
+        <w:rPr/>
+        <w:t>T = 2RC ln((1 + β)/(1 − β))</w:t>
+      </w:r>
+    </w:p>
+    <w:p>
+      <w:pPr>
+        <w:spacing w:before="0" w:after="100"/>
+      </w:pPr>
+      <w:r>
+        <w:rPr>
+          <w:b/>
+        </w:rPr>
+        <w:t>555 astable</w:t>
+      </w:r>
+      <w:r>
+        <w:rPr/>
+        <w:t xml:space="preserve"> — </w:t>
+      </w:r>
+      <w:r>
+        <w:rPr/>
+        <w:t>f = 1.44/((R₁ + 2R₂)C);  duty (R₁ + R₂)/(R₁ + 2R₂)</w:t>
+      </w:r>
+    </w:p>
+    <w:p>
+      <w:pPr>
+        <w:spacing w:before="0" w:after="100"/>
+      </w:pPr>
+      <w:r>
+        <w:rPr>
+          <w:b/>
+        </w:rPr>
+        <w:t>Setup and hold</w:t>
+      </w:r>
+      <w:r>
+        <w:rPr/>
+        <w:t xml:space="preserve"> — </w:t>
+      </w:r>
+      <w:r>
+        <w:rPr/>
+        <w:t>T_clk ≥ t_cq + t_pd + t_su + t_skew;  t_cq + t_cd ≥ t_h + t_skew</w:t>
+      </w:r>
+    </w:p>
+    <w:p>
+      <w:pPr>
+        <w:spacing w:before="0" w:after="100"/>
+      </w:pPr>
+      <w:r>
+        <w:rPr>
+          <w:b/>
+        </w:rPr>
+        <w:t>Synchronizer MTBF</w:t>
+      </w:r>
+      <w:r>
+        <w:rPr/>
+        <w:t xml:space="preserve"> — </w:t>
+      </w:r>
+      <w:r>
+        <w:rPr/>
+        <w:t>e^(t_r/τ)/(T_w f_clk f_data)</w:t>
+      </w:r>
+    </w:p>
     <w:p>
       <w:pPr>
         <w:pStyle w:val="Heading1"/>

</xml_diff>

<commit_message>
No Word tables, part 1: kindle_tables.py and postbuild hook; EE 1-2, Life, Schrodinger's Paperwork (per-path from book-2-lectures-after-qed)
</commit_message>
<xml_diff>
--- a/EE - SERIES/Circuits_Components_and_Control_Book2.docx
+++ b/EE - SERIES/Circuits_Components_and_Control_Book2.docx
@@ -159,254 +159,162 @@
         <w:t>This book is the second of seven, covering circuits, components, and the classical control loop that later sits under a robot model. Each book assumes only the books before it in the list below — never the ones after.</w:t>
       </w:r>
     </w:p>
-    <w:tbl>
-      <w:tblPr>
-        <w:tblW w:w="5000" w:type="pct"/>
-        <w:tblBorders>
-          <w:top w:val="single" w:sz="4" w:space="0" w:color="auto"/>
-          <w:left w:val="single" w:sz="4" w:space="0" w:color="auto"/>
-          <w:bottom w:val="single" w:sz="4" w:space="0" w:color="auto"/>
-          <w:right w:val="single" w:sz="4" w:space="0" w:color="auto"/>
-          <w:insideH w:val="single" w:sz="4" w:space="0" w:color="auto"/>
-          <w:insideV w:val="single" w:sz="4" w:space="0" w:color="auto"/>
-        </w:tblBorders>
-        <w:tblCellMar>
-          <w:left w:w="10" w:type="dxa"/>
-          <w:right w:w="10" w:type="dxa"/>
-        </w:tblCellMar>
-        <w:tblLook w:val="04A0" w:firstRow="1" w:lastRow="0" w:firstColumn="1" w:lastColumn="0" w:noHBand="0" w:noVBand="1"/>
-      </w:tblPr>
-      <w:tblGrid>
-        <w:gridCol w:w="3195"/>
-        <w:gridCol w:w="6155"/>
-      </w:tblGrid>
-      <w:tr>
-        <w:tblPrEx>
-          <w:tblCellMar>
-            <w:top w:w="0" w:type="dxa"/>
-            <w:bottom w:w="0" w:type="dxa"/>
-          </w:tblCellMar>
-        </w:tblPrEx>
-        <w:tc>
-          <w:tcPr>
-            <w:tcW w:w="0" w:type="auto"/>
-            <w:shd w:val="clear" w:color="auto" w:fill="DDE6F0"/>
-          </w:tcPr>
-          <w:p>
-            <w:r>
-              <w:t>Book</w:t>
-            </w:r>
-          </w:p>
-        </w:tc>
-        <w:tc>
-          <w:tcPr>
-            <w:tcW w:w="0" w:type="auto"/>
-            <w:shd w:val="clear" w:color="auto" w:fill="DDE6F0"/>
-          </w:tcPr>
-          <w:p>
-            <w:r>
-              <w:t>Covers</w:t>
-            </w:r>
-          </w:p>
-        </w:tc>
-      </w:tr>
-      <w:tr>
-        <w:tblPrEx>
-          <w:tblCellMar>
-            <w:top w:w="0" w:type="dxa"/>
-            <w:bottom w:w="0" w:type="dxa"/>
-          </w:tblCellMar>
-        </w:tblPrEx>
-        <w:tc>
-          <w:tcPr>
-            <w:tcW w:w="0" w:type="auto"/>
-          </w:tcPr>
-          <w:p>
-            <w:r>
-              <w:t>1. Foundations</w:t>
-            </w:r>
-          </w:p>
-        </w:tc>
-        <w:tc>
-          <w:tcPr>
-            <w:tcW w:w="0" w:type="auto"/>
-          </w:tcPr>
-          <w:p>
-            <w:r>
-              <w:t>Physics, mathematics, and circuit theory</w:t>
-            </w:r>
-          </w:p>
-        </w:tc>
-      </w:tr>
-      <w:tr>
-        <w:tblPrEx>
-          <w:tblCellMar>
-            <w:top w:w="0" w:type="dxa"/>
-            <w:bottom w:w="0" w:type="dxa"/>
-          </w:tblCellMar>
-        </w:tblPrEx>
-        <w:tc>
-          <w:tcPr>
-            <w:tcW w:w="0" w:type="auto"/>
-          </w:tcPr>
-          <w:p>
-            <w:r>
-              <w:t>2. Circuits, Components, and Control (this book)</w:t>
-            </w:r>
-          </w:p>
-        </w:tc>
-        <w:tc>
-          <w:tcPr>
-            <w:tcW w:w="0" w:type="auto"/>
-          </w:tcPr>
-          <w:p>
-            <w:r>
-              <w:t>Analog and digital, op-amps, passives, the classical loop</w:t>
-            </w:r>
-          </w:p>
-        </w:tc>
-      </w:tr>
-      <w:tr>
-        <w:tblPrEx>
-          <w:tblCellMar>
-            <w:top w:w="0" w:type="dxa"/>
-            <w:bottom w:w="0" w:type="dxa"/>
-          </w:tblCellMar>
-        </w:tblPrEx>
-        <w:tc>
-          <w:tcPr>
-            <w:tcW w:w="0" w:type="auto"/>
-          </w:tcPr>
-          <w:p>
-            <w:r>
-              <w:t>3. Semiconductor Physics and Devices</w:t>
-            </w:r>
-          </w:p>
-        </w:tc>
-        <w:tc>
-          <w:tcPr>
-            <w:tcW w:w="0" w:type="auto"/>
-          </w:tcPr>
-          <w:p>
-            <w:r>
-              <w:t>Diodes, BJTs, MOSFETs, FinFET, compound semiconductors</w:t>
-            </w:r>
-          </w:p>
-        </w:tc>
-      </w:tr>
-      <w:tr>
-        <w:tblPrEx>
-          <w:tblCellMar>
-            <w:top w:w="0" w:type="dxa"/>
-            <w:bottom w:w="0" w:type="dxa"/>
-          </w:tblCellMar>
-        </w:tblPrEx>
-        <w:tc>
-          <w:tcPr>
-            <w:tcW w:w="0" w:type="auto"/>
-          </w:tcPr>
-          <w:p>
-            <w:r>
-              <w:t>4. RF, Microwave, and Transceivers</w:t>
-            </w:r>
-          </w:p>
-        </w:tc>
-        <w:tc>
-          <w:tcPr>
-            <w:tcW w:w="0" w:type="auto"/>
-          </w:tcPr>
-          <w:p>
-            <w:r>
-              <w:t>Lines, matching, antennas, PAs, receivers, PLLs, radar</w:t>
-            </w:r>
-          </w:p>
-        </w:tc>
-      </w:tr>
-      <w:tr>
-        <w:tblPrEx>
-          <w:tblCellMar>
-            <w:top w:w="0" w:type="dxa"/>
-            <w:bottom w:w="0" w:type="dxa"/>
-          </w:tblCellMar>
-        </w:tblPrEx>
-        <w:tc>
-          <w:tcPr>
-            <w:tcW w:w="0" w:type="auto"/>
-          </w:tcPr>
-          <w:p>
-            <w:r>
-              <w:t>5. Communications, Wireless, and SDR</w:t>
-            </w:r>
-          </w:p>
-        </w:tc>
-        <w:tc>
-          <w:tcPr>
-            <w:tcW w:w="0" w:type="auto"/>
-          </w:tcPr>
-          <w:p>
-            <w:r>
-              <w:t>Modulation, band plans, DSP and software radio</w:t>
-            </w:r>
-          </w:p>
-        </w:tc>
-      </w:tr>
-      <w:tr>
-        <w:tblPrEx>
-          <w:tblCellMar>
-            <w:top w:w="0" w:type="dxa"/>
-            <w:bottom w:w="0" w:type="dxa"/>
-          </w:tblCellMar>
-        </w:tblPrEx>
-        <w:tc>
-          <w:tcPr>
-            <w:tcW w:w="0" w:type="auto"/>
-          </w:tcPr>
-          <w:p>
-            <w:r>
-              <w:t>6. Power and Energy</w:t>
-            </w:r>
-          </w:p>
-        </w:tc>
-        <w:tc>
-          <w:tcPr>
-            <w:tcW w:w="0" w:type="auto"/>
-          </w:tcPr>
-          <w:p>
-            <w:r>
-              <w:t>Regulators, magnetics, the grid, the rack</w:t>
-            </w:r>
-          </w:p>
-        </w:tc>
-      </w:tr>
-      <w:tr>
-        <w:tblPrEx>
-          <w:tblCellMar>
-            <w:top w:w="0" w:type="dxa"/>
-            <w:bottom w:w="0" w:type="dxa"/>
-          </w:tblCellMar>
-        </w:tblPrEx>
-        <w:tc>
-          <w:tcPr>
-            <w:tcW w:w="0" w:type="auto"/>
-          </w:tcPr>
-          <w:p>
-            <w:r>
-              <w:t>7. Packaging, Layout, EMC, and Test</w:t>
-            </w:r>
-          </w:p>
-        </w:tc>
-        <w:tc>
-          <w:tcPr>
-            <w:tcW w:w="0" w:type="auto"/>
-          </w:tcPr>
-          <w:p>
-            <w:r>
-              <w:t>Boards, packages, cooling, emissions, the accredited lab, robots</w:t>
-            </w:r>
-          </w:p>
-        </w:tc>
-      </w:tr>
-    </w:tbl>
+    <w:p>
+      <w:pPr>
+        <w:spacing w:before="0" w:after="100"/>
+      </w:pPr>
+      <w:r>
+        <w:rPr>
+          <w:b/>
+        </w:rPr>
+        <w:t>Book</w:t>
+      </w:r>
+      <w:r>
+        <w:rPr>
+          <w:b/>
+        </w:rPr>
+        <w:t xml:space="preserve"> — </w:t>
+      </w:r>
+      <w:r>
+        <w:rPr>
+          <w:b/>
+        </w:rPr>
+        <w:t>Covers</w:t>
+      </w:r>
+    </w:p>
+    <w:p>
+      <w:pPr>
+        <w:spacing w:before="0" w:after="100"/>
+      </w:pPr>
+      <w:r>
+        <w:rPr>
+          <w:b/>
+        </w:rPr>
+        <w:t>1. Foundations</w:t>
+      </w:r>
+      <w:r>
+        <w:rPr/>
+        <w:t xml:space="preserve"> — </w:t>
+      </w:r>
+      <w:r>
+        <w:rPr/>
+        <w:t>Physics, mathematics, and circuit theory</w:t>
+      </w:r>
+    </w:p>
+    <w:p>
+      <w:pPr>
+        <w:spacing w:before="0" w:after="100"/>
+      </w:pPr>
+      <w:r>
+        <w:rPr>
+          <w:b/>
+        </w:rPr>
+        <w:t>2. Circuits, Components, and Control (this book)</w:t>
+      </w:r>
+      <w:r>
+        <w:rPr/>
+        <w:t xml:space="preserve"> — </w:t>
+      </w:r>
+      <w:r>
+        <w:rPr/>
+        <w:t>Analog and digital, op-amps, passives, the classical loop</w:t>
+      </w:r>
+    </w:p>
+    <w:p>
+      <w:pPr>
+        <w:spacing w:before="0" w:after="100"/>
+      </w:pPr>
+      <w:r>
+        <w:rPr>
+          <w:b/>
+        </w:rPr>
+        <w:t>3. Semiconductor Physics and Devices</w:t>
+      </w:r>
+      <w:r>
+        <w:rPr/>
+        <w:t xml:space="preserve"> — </w:t>
+      </w:r>
+      <w:r>
+        <w:rPr/>
+        <w:t>Diodes, BJTs, MOSFETs, FinFET, compound semiconductors</w:t>
+      </w:r>
+    </w:p>
+    <w:p>
+      <w:pPr>
+        <w:spacing w:before="0" w:after="100"/>
+      </w:pPr>
+      <w:r>
+        <w:rPr>
+          <w:b/>
+        </w:rPr>
+        <w:t>4. RF, Microwave, and Transceivers</w:t>
+      </w:r>
+      <w:r>
+        <w:rPr/>
+        <w:t xml:space="preserve"> — </w:t>
+      </w:r>
+      <w:r>
+        <w:rPr/>
+        <w:t>Lines, matching, antennas, PAs, receivers, PLLs, radar</w:t>
+      </w:r>
+    </w:p>
+    <w:p>
+      <w:pPr>
+        <w:spacing w:before="0" w:after="100"/>
+      </w:pPr>
+      <w:r>
+        <w:rPr>
+          <w:b/>
+        </w:rPr>
+        <w:t>5. Communications, Wireless, and SDR</w:t>
+      </w:r>
+      <w:r>
+        <w:rPr/>
+        <w:t xml:space="preserve"> — </w:t>
+      </w:r>
+      <w:r>
+        <w:rPr/>
+        <w:t>Modulation, band plans, DSP and software radio</w:t>
+      </w:r>
+    </w:p>
+    <w:p>
+      <w:pPr>
+        <w:spacing w:before="0" w:after="100"/>
+      </w:pPr>
+      <w:r>
+        <w:rPr>
+          <w:b/>
+        </w:rPr>
+        <w:t>6. Power and Energy</w:t>
+      </w:r>
+      <w:r>
+        <w:rPr/>
+        <w:t xml:space="preserve"> — </w:t>
+      </w:r>
+      <w:r>
+        <w:rPr/>
+        <w:t>Regulators, magnetics, the grid, the rack</w:t>
+      </w:r>
+    </w:p>
+    <w:p>
+      <w:pPr>
+        <w:spacing w:before="0" w:after="100"/>
+      </w:pPr>
+      <w:r>
+        <w:rPr>
+          <w:b/>
+        </w:rPr>
+        <w:t>7. Packaging, Layout, EMC, and Test</w:t>
+      </w:r>
+      <w:r>
+        <w:rPr/>
+        <w:t xml:space="preserve"> — </w:t>
+      </w:r>
+      <w:r>
+        <w:rPr/>
+        <w:t>Boards, packages, cooling, emissions, the accredited lab, robots</w:t>
+      </w:r>
+    </w:p>
     <w:p>
       <w:pPr>
         <w:shd w:val="clear" w:color="auto" w:fill="EFEFEF"/>
@@ -15953,1942 +15861,1304 @@
         <w:t>Appendix A — Formula Reference</w:t>
       </w:r>
     </w:p>
-    <w:tbl>
-      <w:tblPr>
-        <w:tblW w:w="5000" w:type="pct"/>
-        <w:tblBorders>
-          <w:top w:val="single" w:sz="4" w:space="0" w:color="auto"/>
-          <w:left w:val="single" w:sz="4" w:space="0" w:color="auto"/>
-          <w:bottom w:val="single" w:sz="4" w:space="0" w:color="auto"/>
-          <w:right w:val="single" w:sz="4" w:space="0" w:color="auto"/>
-          <w:insideH w:val="single" w:sz="4" w:space="0" w:color="auto"/>
-          <w:insideV w:val="single" w:sz="4" w:space="0" w:color="auto"/>
-        </w:tblBorders>
-        <w:tblCellMar>
-          <w:left w:w="10" w:type="dxa"/>
-          <w:right w:w="10" w:type="dxa"/>
-        </w:tblCellMar>
-        <w:tblLook w:val="04A0" w:firstRow="1" w:lastRow="0" w:firstColumn="1" w:lastColumn="0" w:noHBand="0" w:noVBand="1"/>
-      </w:tblPr>
-      <w:tblGrid>
-        <w:gridCol w:w="3344"/>
-        <w:gridCol w:w="6006"/>
-      </w:tblGrid>
-      <w:tr>
-        <w:tblPrEx>
-          <w:tblCellMar>
-            <w:top w:w="0" w:type="dxa"/>
-            <w:bottom w:w="0" w:type="dxa"/>
-          </w:tblCellMar>
-        </w:tblPrEx>
-        <w:tc>
-          <w:tcPr>
-            <w:tcW w:w="0" w:type="auto"/>
-            <w:shd w:val="clear" w:color="auto" w:fill="DDE6F0"/>
-          </w:tcPr>
-          <w:p>
-            <w:r>
-              <w:rPr>
-                <w:b/>
-                <w:bCs/>
-              </w:rPr>
-              <w:t>Concept</w:t>
-            </w:r>
-          </w:p>
-        </w:tc>
-        <w:tc>
-          <w:tcPr>
-            <w:tcW w:w="0" w:type="auto"/>
-            <w:shd w:val="clear" w:color="auto" w:fill="DDE6F0"/>
-          </w:tcPr>
-          <w:p>
-            <w:r>
-              <w:rPr>
-                <w:b/>
-                <w:bCs/>
-              </w:rPr>
-              <w:t>Formula</w:t>
-            </w:r>
-          </w:p>
-        </w:tc>
-      </w:tr>
-      <w:tr>
-        <w:tblPrEx>
-          <w:tblCellMar>
-            <w:top w:w="0" w:type="dxa"/>
-            <w:bottom w:w="0" w:type="dxa"/>
-          </w:tblCellMar>
-        </w:tblPrEx>
-        <w:tc>
-          <w:tcPr>
-            <w:tcW w:w="0" w:type="auto"/>
-          </w:tcPr>
-          <w:p>
-            <w:r>
-              <w:t>Noise margins</w:t>
-            </w:r>
-          </w:p>
-        </w:tc>
-        <w:tc>
-          <w:tcPr>
-            <w:tcW w:w="0" w:type="auto"/>
-          </w:tcPr>
-          <w:p>
-            <w:r>
-              <w:t>NMʜ = Vₒₕ(min) − Vᵢₕ(min)      NMʟ = Vᵢʟ(max) − Vₒʟ(max)</w:t>
-            </w:r>
-          </w:p>
-        </w:tc>
-      </w:tr>
-      <w:tr>
-        <w:tblPrEx>
-          <w:tblCellMar>
-            <w:top w:w="0" w:type="dxa"/>
-            <w:bottom w:w="0" w:type="dxa"/>
-          </w:tblCellMar>
-        </w:tblPrEx>
-        <w:tc>
-          <w:tcPr>
-            <w:tcW w:w="0" w:type="auto"/>
-          </w:tcPr>
-          <w:p>
-            <w:r>
-              <w:t>Inverting amplifier</w:t>
-            </w:r>
-          </w:p>
-        </w:tc>
-        <w:tc>
-          <w:tcPr>
-            <w:tcW w:w="0" w:type="auto"/>
-          </w:tcPr>
-          <w:p>
-            <w:r>
-              <w:t>Vₒᵤₜ = −(R_f / Rᵢₙ) · Vᵢₙ</w:t>
-            </w:r>
-          </w:p>
-        </w:tc>
-      </w:tr>
-      <w:tr>
-        <w:tblPrEx>
-          <w:tblCellMar>
-            <w:top w:w="0" w:type="dxa"/>
-            <w:bottom w:w="0" w:type="dxa"/>
-          </w:tblCellMar>
-        </w:tblPrEx>
-        <w:tc>
-          <w:tcPr>
-            <w:tcW w:w="0" w:type="auto"/>
-          </w:tcPr>
-          <w:p>
-            <w:r>
-              <w:t>Non-inverting amplifier</w:t>
-            </w:r>
-          </w:p>
-        </w:tc>
-        <w:tc>
-          <w:tcPr>
-            <w:tcW w:w="0" w:type="auto"/>
-          </w:tcPr>
-          <w:p>
-            <w:r>
-              <w:t>Vₒᵤₜ = (1 + R_f / Rᵢₙ) · Vᵢₙ</w:t>
-            </w:r>
-          </w:p>
-        </w:tc>
-      </w:tr>
-      <w:tr>
-        <w:tblPrEx>
-          <w:tblCellMar>
-            <w:top w:w="0" w:type="dxa"/>
-            <w:bottom w:w="0" w:type="dxa"/>
-          </w:tblCellMar>
-        </w:tblPrEx>
-        <w:tc>
-          <w:tcPr>
-            <w:tcW w:w="0" w:type="auto"/>
-          </w:tcPr>
-          <w:p>
-            <w:r>
-              <w:t>RC filter corner frequency</w:t>
-            </w:r>
-          </w:p>
-        </w:tc>
-        <w:tc>
-          <w:tcPr>
-            <w:tcW w:w="0" w:type="auto"/>
-          </w:tcPr>
-          <w:p>
-            <w:r>
-              <w:t>fᴄ = 1 / (2πRC)</w:t>
-            </w:r>
-          </w:p>
-        </w:tc>
-      </w:tr>
-      <w:tr>
-        <w:tblPrEx>
-          <w:tblCellMar>
-            <w:top w:w="0" w:type="dxa"/>
-            <w:bottom w:w="0" w:type="dxa"/>
-          </w:tblCellMar>
-        </w:tblPrEx>
-        <w:tc>
-          <w:tcPr>
-            <w:tcW w:w="0" w:type="auto"/>
-          </w:tcPr>
-          <w:p>
-            <w:r>
-              <w:t>Capacitor self-resonant frequency</w:t>
-            </w:r>
-          </w:p>
-        </w:tc>
-        <w:tc>
-          <w:tcPr>
-            <w:tcW w:w="0" w:type="auto"/>
-          </w:tcPr>
-          <w:p>
-            <w:r>
-              <w:t>SRF = 1 / (2π√(L_ESL · C))</w:t>
-            </w:r>
-          </w:p>
-        </w:tc>
-      </w:tr>
-      <w:tr>
-        <w:tblPrEx>
-          <w:tblCellMar>
-            <w:top w:w="0" w:type="dxa"/>
-            <w:bottom w:w="0" w:type="dxa"/>
-          </w:tblCellMar>
-        </w:tblPrEx>
-        <w:tc>
-          <w:tcPr>
-            <w:tcW w:w="0" w:type="auto"/>
-          </w:tcPr>
-          <w:p>
-            <w:r>
-              <w:t>Inductor quality factor</w:t>
-            </w:r>
-          </w:p>
-        </w:tc>
-        <w:tc>
-          <w:tcPr>
-            <w:tcW w:w="0" w:type="auto"/>
-          </w:tcPr>
-          <w:p>
-            <w:r>
-              <w:t>Q = ωL / R</w:t>
-            </w:r>
-          </w:p>
-        </w:tc>
-      </w:tr>
-      <w:tr>
-        <w:tblPrEx>
-          <w:tblCellMar>
-            <w:top w:w="0" w:type="dxa"/>
-            <w:bottom w:w="0" w:type="dxa"/>
-          </w:tblCellMar>
-        </w:tblPrEx>
-        <w:tc>
-          <w:tcPr>
-            <w:tcW w:w="0" w:type="auto"/>
-          </w:tcPr>
-          <w:p>
-            <w:r>
-              <w:t>Inductor self-resonant frequency</w:t>
-            </w:r>
-          </w:p>
-        </w:tc>
-        <w:tc>
-          <w:tcPr>
-            <w:tcW w:w="0" w:type="auto"/>
-          </w:tcPr>
-          <w:p>
-            <w:r>
-              <w:t>SRF = 1 / (2π√(L · C_wind))</w:t>
-            </w:r>
-          </w:p>
-        </w:tc>
-      </w:tr>
-      <w:tr>
-        <w:tblPrEx>
-          <w:tblCellMar>
-            <w:top w:w="0" w:type="dxa"/>
-            <w:bottom w:w="0" w:type="dxa"/>
-          </w:tblCellMar>
-        </w:tblPrEx>
-        <w:tc>
-          <w:tcPr>
-            <w:tcW w:w="0" w:type="auto"/>
-          </w:tcPr>
-          <w:p>
-            <w:r>
-              <w:t>Feedback closed-loop gain</w:t>
-            </w:r>
-          </w:p>
-        </w:tc>
-        <w:tc>
-          <w:tcPr>
-            <w:tcW w:w="0" w:type="auto"/>
-          </w:tcPr>
-          <w:p>
-            <w:r>
-              <w:t>G = A / (1 + Aβ) ≈ 1/β</w:t>
-            </w:r>
-          </w:p>
-        </w:tc>
-      </w:tr>
-      <w:tr>
-        <w:tblPrEx>
-          <w:tblCellMar>
-            <w:top w:w="0" w:type="dxa"/>
-            <w:bottom w:w="0" w:type="dxa"/>
-          </w:tblCellMar>
-        </w:tblPrEx>
-        <w:tc>
-          <w:tcPr>
-            <w:tcW w:w="0" w:type="auto"/>
-          </w:tcPr>
-          <w:p>
-            <w:r>
-              <w:t>Gain sensitivity</w:t>
-            </w:r>
-          </w:p>
-        </w:tc>
-        <w:tc>
-          <w:tcPr>
-            <w:tcW w:w="0" w:type="auto"/>
-          </w:tcPr>
-          <w:p>
-            <w:r>
-              <w:t>ΔG/G ≈ (ΔA/A) / (1 + T)</w:t>
-            </w:r>
-          </w:p>
-        </w:tc>
-      </w:tr>
-      <w:tr>
-        <w:tblPrEx>
-          <w:tblCellMar>
-            <w:top w:w="0" w:type="dxa"/>
-            <w:bottom w:w="0" w:type="dxa"/>
-          </w:tblCellMar>
-        </w:tblPrEx>
-        <w:tc>
-          <w:tcPr>
-            <w:tcW w:w="0" w:type="auto"/>
-          </w:tcPr>
-          <w:p>
-            <w:r>
-              <w:t>Capacitive-load pole</w:t>
-            </w:r>
-          </w:p>
-        </w:tc>
-        <w:tc>
-          <w:tcPr>
-            <w:tcW w:w="0" w:type="auto"/>
-          </w:tcPr>
-          <w:p>
-            <w:r>
-              <w:t>f₂ = 1 / (2π r_o C_L)</w:t>
-            </w:r>
-          </w:p>
-        </w:tc>
-      </w:tr>
-      <w:tr>
-        <w:tblPrEx>
-          <w:tblCellMar>
-            <w:top w:w="0" w:type="dxa"/>
-            <w:bottom w:w="0" w:type="dxa"/>
-          </w:tblCellMar>
-        </w:tblPrEx>
-        <w:tc>
-          <w:tcPr>
-            <w:tcW w:w="0" w:type="auto"/>
-          </w:tcPr>
-          <w:p>
-            <w:r>
-              <w:t>Closed-loop bandwidth</w:t>
-            </w:r>
-          </w:p>
-        </w:tc>
-        <w:tc>
-          <w:tcPr>
-            <w:tcW w:w="0" w:type="auto"/>
-          </w:tcPr>
-          <w:p>
-            <w:r>
-              <w:t>f_cl ≈ GBW / NG,  NG = 1 + R_f/Rᵢₙ</w:t>
-            </w:r>
-          </w:p>
-        </w:tc>
-      </w:tr>
-      <w:tr>
-        <w:tblPrEx>
-          <w:tblCellMar>
-            <w:top w:w="0" w:type="dxa"/>
-            <w:bottom w:w="0" w:type="dxa"/>
-          </w:tblCellMar>
-        </w:tblPrEx>
-        <w:tc>
-          <w:tcPr>
-            <w:tcW w:w="0" w:type="auto"/>
-          </w:tcPr>
-          <w:p>
-            <w:r>
-              <w:t>Full-power bandwidth</w:t>
-            </w:r>
-          </w:p>
-        </w:tc>
-        <w:tc>
-          <w:tcPr>
-            <w:tcW w:w="0" w:type="auto"/>
-          </w:tcPr>
-          <w:p>
-            <w:r>
-              <w:t>f_FP = SR / (2π V_p)</w:t>
-            </w:r>
-          </w:p>
-        </w:tc>
-      </w:tr>
-      <w:tr>
-        <w:tblPrEx>
-          <w:tblCellMar>
-            <w:top w:w="0" w:type="dxa"/>
-            <w:bottom w:w="0" w:type="dxa"/>
-          </w:tblCellMar>
-        </w:tblPrEx>
-        <w:tc>
-          <w:tcPr>
-            <w:tcW w:w="0" w:type="auto"/>
-          </w:tcPr>
-          <w:p>
-            <w:r>
-              <w:t>Johnson noise density</w:t>
-            </w:r>
-          </w:p>
-        </w:tc>
-        <w:tc>
-          <w:tcPr>
-            <w:tcW w:w="0" w:type="auto"/>
-          </w:tcPr>
-          <w:p>
-            <w:r>
-              <w:t>e_R = √(4kTR)</w:t>
-            </w:r>
-          </w:p>
-        </w:tc>
-      </w:tr>
-      <w:tr>
-        <w:tblPrEx>
-          <w:tblCellMar>
-            <w:top w:w="0" w:type="dxa"/>
-            <w:bottom w:w="0" w:type="dxa"/>
-          </w:tblCellMar>
-        </w:tblPrEx>
-        <w:tc>
-          <w:tcPr>
-            <w:tcW w:w="0" w:type="auto"/>
-          </w:tcPr>
-          <w:p>
-            <w:r>
-              <w:t>Noise sum (uncorrelated)</w:t>
-            </w:r>
-          </w:p>
-        </w:tc>
-        <w:tc>
-          <w:tcPr>
-            <w:tcW w:w="0" w:type="auto"/>
-          </w:tcPr>
-          <w:p>
-            <w:r>
-              <w:t>e_total = √(e₁² + e₂² + …)</w:t>
-            </w:r>
-          </w:p>
-        </w:tc>
-      </w:tr>
-      <w:tr>
-        <w:tblPrEx>
-          <w:tblCellMar>
-            <w:top w:w="0" w:type="dxa"/>
-            <w:bottom w:w="0" w:type="dxa"/>
-          </w:tblCellMar>
-        </w:tblPrEx>
-        <w:tc>
-          <w:tcPr>
-            <w:tcW w:w="0" w:type="auto"/>
-          </w:tcPr>
-          <w:p>
-            <w:r>
-              <w:t>Single-pole noise bandwidth</w:t>
-            </w:r>
-          </w:p>
-        </w:tc>
-        <w:tc>
-          <w:tcPr>
-            <w:tcW w:w="0" w:type="auto"/>
-          </w:tcPr>
-          <w:p>
-            <w:r>
-              <w:t>ENBW = (π/2) f₋₃dB</w:t>
-            </w:r>
-          </w:p>
-        </w:tc>
-      </w:tr>
-      <w:tr>
-        <w:tblPrEx>
-          <w:tblCellMar>
-            <w:top w:w="0" w:type="dxa"/>
-            <w:bottom w:w="0" w:type="dxa"/>
-          </w:tblCellMar>
-        </w:tblPrEx>
-        <w:tc>
-          <w:tcPr>
-            <w:tcW w:w="0" w:type="auto"/>
-          </w:tcPr>
-          <w:p>
-            <w:r>
-              <w:t>Offset at output</w:t>
-            </w:r>
-          </w:p>
-        </w:tc>
-        <w:tc>
-          <w:tcPr>
-            <w:tcW w:w="0" w:type="auto"/>
-          </w:tcPr>
-          <w:p>
-            <w:r>
-              <w:t>V_out = V_os (1 + R_f/Rᵢₙ)</w:t>
-            </w:r>
-          </w:p>
-        </w:tc>
-      </w:tr>
-      <w:tr>
-        <w:tblPrEx>
-          <w:tblCellMar>
-            <w:top w:w="0" w:type="dxa"/>
-            <w:bottom w:w="0" w:type="dxa"/>
-          </w:tblCellMar>
-        </w:tblPrEx>
-        <w:tc>
-          <w:tcPr>
-            <w:tcW w:w="0" w:type="auto"/>
-          </w:tcPr>
-          <w:p>
-            <w:r>
-              <w:t>Bias-current compensation</w:t>
-            </w:r>
-          </w:p>
-        </w:tc>
-        <w:tc>
-          <w:tcPr>
-            <w:tcW w:w="0" w:type="auto"/>
-          </w:tcPr>
-          <w:p>
-            <w:r>
-              <w:t>R_c = R_f ‖ Rᵢₙ; residual ≈ I_os R_f</w:t>
-            </w:r>
-          </w:p>
-        </w:tc>
-      </w:tr>
-      <w:tr>
-        <w:tblPrEx>
-          <w:tblCellMar>
-            <w:top w:w="0" w:type="dxa"/>
-            <w:bottom w:w="0" w:type="dxa"/>
-          </w:tblCellMar>
-        </w:tblPrEx>
-        <w:tc>
-          <w:tcPr>
-            <w:tcW w:w="0" w:type="auto"/>
-          </w:tcPr>
-          <w:p>
-            <w:r>
-              <w:t>Schmitt threshold</w:t>
-            </w:r>
-          </w:p>
-        </w:tc>
-        <w:tc>
-          <w:tcPr>
-            <w:tcW w:w="0" w:type="auto"/>
-          </w:tcPr>
-          <w:p>
-            <w:r>
-              <w:t>V_th = V_ref R₂/(R₁+R₂) + V_out R₁/(R₁+R₂)</w:t>
-            </w:r>
-          </w:p>
-        </w:tc>
-      </w:tr>
-      <w:tr>
-        <w:tblPrEx>
-          <w:tblCellMar>
-            <w:top w:w="0" w:type="dxa"/>
-            <w:bottom w:w="0" w:type="dxa"/>
-          </w:tblCellMar>
-        </w:tblPrEx>
-        <w:tc>
-          <w:tcPr>
-            <w:tcW w:w="0" w:type="auto"/>
-          </w:tcPr>
-          <w:p>
-            <w:r>
-              <w:t>Pull-up rise time (10–90%)</w:t>
-            </w:r>
-          </w:p>
-        </w:tc>
-        <w:tc>
-          <w:tcPr>
-            <w:tcW w:w="0" w:type="auto"/>
-          </w:tcPr>
-          <w:p>
-            <w:r>
-              <w:t>t_r = 2.2 R_pu C</w:t>
-            </w:r>
-          </w:p>
-        </w:tc>
-      </w:tr>
-      <w:tr>
-        <w:tblPrEx>
-          <w:tblCellMar>
-            <w:top w:w="0" w:type="dxa"/>
-            <w:bottom w:w="0" w:type="dxa"/>
-          </w:tblCellMar>
-        </w:tblPrEx>
-        <w:tc>
-          <w:tcPr>
-            <w:tcW w:w="0" w:type="auto"/>
-          </w:tcPr>
-          <w:p>
-            <w:r>
-              <w:t>Closed-loop tracking</w:t>
-            </w:r>
-          </w:p>
-        </w:tc>
-        <w:tc>
-          <w:tcPr>
-            <w:tcW w:w="0" w:type="auto"/>
-          </w:tcPr>
-          <w:p>
-            <w:r>
-              <w:t>Y/R = CP/(1 + CP)</w:t>
-            </w:r>
-          </w:p>
-        </w:tc>
-      </w:tr>
-      <w:tr>
-        <w:tblPrEx>
-          <w:tblCellMar>
-            <w:top w:w="0" w:type="dxa"/>
-            <w:bottom w:w="0" w:type="dxa"/>
-          </w:tblCellMar>
-        </w:tblPrEx>
-        <w:tc>
-          <w:tcPr>
-            <w:tcW w:w="0" w:type="auto"/>
-          </w:tcPr>
-          <w:p>
-            <w:r>
-              <w:t>First-order plant, P control</w:t>
-            </w:r>
-          </w:p>
-        </w:tc>
-        <w:tc>
-          <w:tcPr>
-            <w:tcW w:w="0" w:type="auto"/>
-          </w:tcPr>
-          <w:p>
-            <w:r>
-              <w:t>τ_cl = τ/(1 + K_p K); e_ss = 1/(1 + K_p K)</w:t>
-            </w:r>
-          </w:p>
-        </w:tc>
-      </w:tr>
-      <w:tr>
-        <w:tblPrEx>
-          <w:tblCellMar>
-            <w:top w:w="0" w:type="dxa"/>
-            <w:bottom w:w="0" w:type="dxa"/>
-          </w:tblCellMar>
-        </w:tblPrEx>
-        <w:tc>
-          <w:tcPr>
-            <w:tcW w:w="0" w:type="auto"/>
-          </w:tcPr>
-          <w:p>
-            <w:r>
-              <w:t>PID law</w:t>
-            </w:r>
-          </w:p>
-        </w:tc>
-        <w:tc>
-          <w:tcPr>
-            <w:tcW w:w="0" w:type="auto"/>
-          </w:tcPr>
-          <w:p>
-            <w:r>
-              <w:t>u = K_p e + K_i ∫e dt + K_d de/dt</w:t>
-            </w:r>
-          </w:p>
-        </w:tc>
-      </w:tr>
-      <w:tr>
-        <w:tblPrEx>
-          <w:tblCellMar>
-            <w:top w:w="0" w:type="dxa"/>
-            <w:bottom w:w="0" w:type="dxa"/>
-          </w:tblCellMar>
-        </w:tblPrEx>
-        <w:tc>
-          <w:tcPr>
-            <w:tcW w:w="0" w:type="auto"/>
-          </w:tcPr>
-          <w:p>
-            <w:r>
-              <w:t>Lead network maximum phase</w:t>
-            </w:r>
-          </w:p>
-        </w:tc>
-        <w:tc>
-          <w:tcPr>
-            <w:tcW w:w="0" w:type="auto"/>
-          </w:tcPr>
-          <w:p>
-            <w:r>
-              <w:t>φ_max = arcsin((α−1)/(α+1)) at √(ω_z ω_p)</w:t>
-            </w:r>
-          </w:p>
-        </w:tc>
-      </w:tr>
-      <w:tr>
-        <w:tblPrEx>
-          <w:tblCellMar>
-            <w:top w:w="0" w:type="dxa"/>
-            <w:bottom w:w="0" w:type="dxa"/>
-          </w:tblCellMar>
-        </w:tblPrEx>
-        <w:tc>
-          <w:tcPr>
-            <w:tcW w:w="0" w:type="auto"/>
-          </w:tcPr>
-          <w:p>
-            <w:r>
-              <w:t>Sampled-loop delay</w:t>
-            </w:r>
-          </w:p>
-        </w:tc>
-        <w:tc>
-          <w:tcPr>
-            <w:tcW w:w="0" w:type="auto"/>
-          </w:tcPr>
-          <w:p>
-            <w:r>
-              <w:t>t_d ≈ T/2 + T_compute;  φ = ω_c t_d</w:t>
-            </w:r>
-          </w:p>
-        </w:tc>
-      </w:tr>
-      <w:tr>
-        <w:tblPrEx>
-          <w:tblCellMar>
-            <w:top w:w="0" w:type="dxa"/>
-            <w:bottom w:w="0" w:type="dxa"/>
-          </w:tblCellMar>
-        </w:tblPrEx>
-        <w:tc>
-          <w:tcPr>
-            <w:tcW w:w="0" w:type="auto"/>
-          </w:tcPr>
-          <w:p>
-            <w:r>
-              <w:t>Discrete PI (backward Euler)</w:t>
-            </w:r>
-          </w:p>
-        </w:tc>
-        <w:tc>
-          <w:tcPr>
-            <w:tcW w:w="0" w:type="auto"/>
-          </w:tcPr>
-          <w:p>
-            <w:r>
-              <w:t>I[k] = I[k−1] + T e[k];  u[k] = K_p e[k] + K_i I[k]</w:t>
-            </w:r>
-          </w:p>
-        </w:tc>
-      </w:tr>
-      <w:tr>
-        <w:tblPrEx>
-          <w:tblCellMar>
-            <w:top w:w="0" w:type="dxa"/>
-            <w:bottom w:w="0" w:type="dxa"/>
-          </w:tblCellMar>
-        </w:tblPrEx>
-        <w:tc>
-          <w:tcPr>
-            <w:tcW w:w="0" w:type="auto"/>
-          </w:tcPr>
-          <w:p>
-            <w:r>
-              <w:t>Buck inductor ripple</w:t>
-            </w:r>
-          </w:p>
-        </w:tc>
-        <w:tc>
-          <w:tcPr>
-            <w:tcW w:w="0" w:type="auto"/>
-          </w:tcPr>
-          <w:p>
-            <w:r>
-              <w:t>ΔI = (V_in − V_out) D / (L f_sw)</w:t>
-            </w:r>
-          </w:p>
-        </w:tc>
-      </w:tr>
-      <w:tr>
-        <w:tblPrEx>
-          <w:tblCellMar>
-            <w:top w:w="0" w:type="dxa"/>
-            <w:bottom w:w="0" w:type="dxa"/>
-          </w:tblCellMar>
-        </w:tblPrEx>
-        <w:tc>
-          <w:tcPr>
-            <w:tcW w:w="0" w:type="auto"/>
-          </w:tcPr>
-          <w:p>
-            <w:r>
-              <w:t>Triangle-on-DC rms</w:t>
-            </w:r>
-          </w:p>
-        </w:tc>
-        <w:tc>
-          <w:tcPr>
-            <w:tcW w:w="0" w:type="auto"/>
-          </w:tcPr>
-          <w:p>
-            <w:r>
-              <w:t>I_rms = √(I_DC² + ΔI²/12)</w:t>
-            </w:r>
-          </w:p>
-        </w:tc>
-      </w:tr>
-      <w:tr>
-        <w:tblPrEx>
-          <w:tblCellMar>
-            <w:top w:w="0" w:type="dxa"/>
-            <w:bottom w:w="0" w:type="dxa"/>
-          </w:tblCellMar>
-        </w:tblPrEx>
-        <w:tc>
-          <w:tcPr>
-            <w:tcW w:w="0" w:type="auto"/>
-          </w:tcPr>
-          <w:p>
-            <w:r>
-              <w:t>Second-order low-pass</w:t>
-            </w:r>
-          </w:p>
-        </w:tc>
-        <w:tc>
-          <w:tcPr>
-            <w:tcW w:w="0" w:type="auto"/>
-          </w:tcPr>
-          <w:p>
-            <w:r>
-              <w:t>H(s) = H₀ω₀²/(s² + (ω₀/Q)s + ω₀²)</w:t>
-            </w:r>
-          </w:p>
-        </w:tc>
-      </w:tr>
-      <w:tr>
-        <w:tblPrEx>
-          <w:tblCellMar>
-            <w:top w:w="0" w:type="dxa"/>
-            <w:bottom w:w="0" w:type="dxa"/>
-          </w:tblCellMar>
-        </w:tblPrEx>
-        <w:tc>
-          <w:tcPr>
-            <w:tcW w:w="0" w:type="auto"/>
-          </w:tcPr>
-          <w:p>
-            <w:r>
-              <w:t>Unity-gain Sallen-Key, equal R</w:t>
-            </w:r>
-          </w:p>
-        </w:tc>
-        <w:tc>
-          <w:tcPr>
-            <w:tcW w:w="0" w:type="auto"/>
-          </w:tcPr>
-          <w:p>
-            <w:r>
-              <w:t>ω₀ = 1/(R√(C₁C₂)); Q = ½√(C₁/C₂)</w:t>
-            </w:r>
-          </w:p>
-        </w:tc>
-      </w:tr>
-      <w:tr>
-        <w:tblPrEx>
-          <w:tblCellMar>
-            <w:top w:w="0" w:type="dxa"/>
-            <w:bottom w:w="0" w:type="dxa"/>
-          </w:tblCellMar>
-        </w:tblPrEx>
-        <w:tc>
-          <w:tcPr>
-            <w:tcW w:w="0" w:type="auto"/>
-          </w:tcPr>
-          <w:p>
-            <w:r>
-              <w:t>MFB low-pass, equal R</w:t>
-            </w:r>
-          </w:p>
-        </w:tc>
-        <w:tc>
-          <w:tcPr>
-            <w:tcW w:w="0" w:type="auto"/>
-          </w:tcPr>
-          <w:p>
-            <w:r>
-              <w:t>H₀ = −1; ω₀ = 1/(R√(C₁C₂)); Q = ⅓√(C₁/C₂)</w:t>
-            </w:r>
-          </w:p>
-        </w:tc>
-      </w:tr>
-      <w:tr>
-        <w:tblPrEx>
-          <w:tblCellMar>
-            <w:top w:w="0" w:type="dxa"/>
-            <w:bottom w:w="0" w:type="dxa"/>
-          </w:tblCellMar>
-        </w:tblPrEx>
-        <w:tc>
-          <w:tcPr>
-            <w:tcW w:w="0" w:type="auto"/>
-          </w:tcPr>
-          <w:p>
-            <w:r>
-              <w:t>Linear power derating</w:t>
-            </w:r>
-          </w:p>
-        </w:tc>
-        <w:tc>
-          <w:tcPr>
-            <w:tcW w:w="0" w:type="auto"/>
-          </w:tcPr>
-          <w:p>
-            <w:r>
-              <w:t>P = P_rated (T_max − T_amb)/(T_max − T_knee)</w:t>
-            </w:r>
-          </w:p>
-        </w:tc>
-      </w:tr>
-      <w:tr>
-        <w:tblPrEx>
-          <w:tblCellMar>
-            <w:top w:w="0" w:type="dxa"/>
-            <w:bottom w:w="0" w:type="dxa"/>
-          </w:tblCellMar>
-        </w:tblPrEx>
-        <w:tc>
-          <w:tcPr>
-            <w:tcW w:w="0" w:type="auto"/>
-          </w:tcPr>
-          <w:p>
-            <w:r>
-              <w:t>Self-heating</w:t>
-            </w:r>
-          </w:p>
-        </w:tc>
-        <w:tc>
-          <w:tcPr>
-            <w:tcW w:w="0" w:type="auto"/>
-          </w:tcPr>
-          <w:p>
-            <w:r>
-              <w:t>ΔT = P θ;  ΔR/R = TCR × ΔT</w:t>
-            </w:r>
-          </w:p>
-        </w:tc>
-      </w:tr>
-      <w:tr>
-        <w:tblPrEx>
-          <w:tblCellMar>
-            <w:top w:w="0" w:type="dxa"/>
-            <w:bottom w:w="0" w:type="dxa"/>
-          </w:tblCellMar>
-        </w:tblPrEx>
-        <w:tc>
-          <w:tcPr>
-            <w:tcW w:w="0" w:type="auto"/>
-          </w:tcPr>
-          <w:p>
-            <w:r>
-              <w:t>Capacitor impedance</w:t>
-            </w:r>
-          </w:p>
-        </w:tc>
-        <w:tc>
-          <w:tcPr>
-            <w:tcW w:w="0" w:type="auto"/>
-          </w:tcPr>
-          <w:p>
-            <w:r>
-              <w:t>|Z| = √(ESR² + (ωL − 1/(ωC))²)</w:t>
-            </w:r>
-          </w:p>
-        </w:tc>
-      </w:tr>
-      <w:tr>
-        <w:tblPrEx>
-          <w:tblCellMar>
-            <w:top w:w="0" w:type="dxa"/>
-            <w:bottom w:w="0" w:type="dxa"/>
-          </w:tblCellMar>
-        </w:tblPrEx>
-        <w:tc>
-          <w:tcPr>
-            <w:tcW w:w="0" w:type="auto"/>
-          </w:tcPr>
-          <w:p>
-            <w:r>
-              <w:t>Target impedance</w:t>
-            </w:r>
-          </w:p>
-        </w:tc>
-        <w:tc>
-          <w:tcPr>
-            <w:tcW w:w="0" w:type="auto"/>
-          </w:tcPr>
-          <w:p>
-            <w:r>
-              <w:t>Z_target = ΔV / ΔI</w:t>
-            </w:r>
-          </w:p>
-        </w:tc>
-      </w:tr>
-      <w:tr>
-        <w:tblPrEx>
-          <w:tblCellMar>
-            <w:top w:w="0" w:type="dxa"/>
-            <w:bottom w:w="0" w:type="dxa"/>
-          </w:tblCellMar>
-        </w:tblPrEx>
-        <w:tc>
-          <w:tcPr>
-            <w:tcW w:w="0" w:type="auto"/>
-          </w:tcPr>
-          <w:p>
-            <w:r>
-              <w:t>Antiresonance (approx.)</w:t>
-            </w:r>
-          </w:p>
-        </w:tc>
-        <w:tc>
-          <w:tcPr>
-            <w:tcW w:w="0" w:type="auto"/>
-          </w:tcPr>
-          <w:p>
-            <w:r>
-              <w:t>f_ar ≈ 1/(2π√((L₁+L₂)C_small))</w:t>
-            </w:r>
-          </w:p>
-        </w:tc>
-      </w:tr>
-      <w:tr>
-        <w:tblPrEx>
-          <w:tblCellMar>
-            <w:top w:w="0" w:type="dxa"/>
-            <w:bottom w:w="0" w:type="dxa"/>
-          </w:tblCellMar>
-        </w:tblPrEx>
-        <w:tc>
-          <w:tcPr>
-            <w:tcW w:w="0" w:type="auto"/>
-          </w:tcPr>
-          <w:p>
-            <w:r>
-              <w:t>Bulk capacitance</w:t>
-            </w:r>
-          </w:p>
-        </w:tc>
-        <w:tc>
-          <w:tcPr>
-            <w:tcW w:w="0" w:type="auto"/>
-          </w:tcPr>
-          <w:p>
-            <w:r>
-              <w:t>C ≥ I Δt / ΔV</w:t>
-            </w:r>
-          </w:p>
-        </w:tc>
-      </w:tr>
-      <w:tr>
-        <w:tblPrEx>
-          <w:tblCellMar>
-            <w:top w:w="0" w:type="dxa"/>
-            <w:bottom w:w="0" w:type="dxa"/>
-          </w:tblCellMar>
-        </w:tblPrEx>
-        <w:tc>
-          <w:tcPr>
-            <w:tcW w:w="0" w:type="auto"/>
-          </w:tcPr>
-          <w:p>
-            <w:r>
-              <w:t>Differential and common mode</w:t>
-            </w:r>
-          </w:p>
-        </w:tc>
-        <w:tc>
-          <w:tcPr>
-            <w:tcW w:w="0" w:type="auto"/>
-          </w:tcPr>
-          <w:p>
-            <w:r>
-              <w:t>V_d = V₊ − V₋,  V_cm = (V₊ + V₋)/2</w:t>
-            </w:r>
-          </w:p>
-        </w:tc>
-      </w:tr>
-      <w:tr>
-        <w:tblPrEx>
-          <w:tblCellMar>
-            <w:top w:w="0" w:type="dxa"/>
-            <w:bottom w:w="0" w:type="dxa"/>
-          </w:tblCellMar>
-        </w:tblPrEx>
-        <w:tc>
-          <w:tcPr>
-            <w:tcW w:w="0" w:type="auto"/>
-          </w:tcPr>
-          <w:p>
-            <w:r>
-              <w:t>Difference-amplifier CMRR (worst case)</w:t>
-            </w:r>
-          </w:p>
-        </w:tc>
-        <w:tc>
-          <w:tcPr>
-            <w:tcW w:w="0" w:type="auto"/>
-          </w:tcPr>
-          <w:p>
-            <w:r>
-              <w:t>CMRR ≈ (1 + G)/(4t)</w:t>
-            </w:r>
-          </w:p>
-        </w:tc>
-      </w:tr>
-      <w:tr>
-        <w:tblPrEx>
-          <w:tblCellMar>
-            <w:top w:w="0" w:type="dxa"/>
-            <w:bottom w:w="0" w:type="dxa"/>
-          </w:tblCellMar>
-        </w:tblPrEx>
-        <w:tc>
-          <w:tcPr>
-            <w:tcW w:w="0" w:type="auto"/>
-          </w:tcPr>
-          <w:p>
-            <w:r>
-              <w:t>Three-op-amp INA gain</w:t>
-            </w:r>
-          </w:p>
-        </w:tc>
-        <w:tc>
-          <w:tcPr>
-            <w:tcW w:w="0" w:type="auto"/>
-          </w:tcPr>
-          <w:p>
-            <w:r>
-              <w:t>G = (1 + 2R/R_G)(R₂/R₁)</w:t>
-            </w:r>
-          </w:p>
-        </w:tc>
-      </w:tr>
-      <w:tr>
-        <w:tblPrEx>
-          <w:tblCellMar>
-            <w:top w:w="0" w:type="dxa"/>
-            <w:bottom w:w="0" w:type="dxa"/>
-          </w:tblCellMar>
-        </w:tblPrEx>
-        <w:tc>
-          <w:tcPr>
-            <w:tcW w:w="0" w:type="auto"/>
-          </w:tcPr>
-          <w:p>
-            <w:r>
-              <w:t>INA rejection</w:t>
-            </w:r>
-          </w:p>
-        </w:tc>
-        <w:tc>
-          <w:tcPr>
-            <w:tcW w:w="0" w:type="auto"/>
-          </w:tcPr>
-          <w:p>
-            <w:r>
-              <w:t>CMRR_total ≈ G₁ · CMRR_diff</w:t>
-            </w:r>
-          </w:p>
-        </w:tc>
-      </w:tr>
-      <w:tr>
-        <w:tblPrEx>
-          <w:tblCellMar>
-            <w:top w:w="0" w:type="dxa"/>
-            <w:bottom w:w="0" w:type="dxa"/>
-          </w:tblCellMar>
-        </w:tblPrEx>
-        <w:tc>
-          <w:tcPr>
-            <w:tcW w:w="0" w:type="auto"/>
-          </w:tcPr>
-          <w:p>
-            <w:r>
-              <w:t>State equation</w:t>
-            </w:r>
-          </w:p>
-        </w:tc>
-        <w:tc>
-          <w:tcPr>
-            <w:tcW w:w="0" w:type="auto"/>
-          </w:tcPr>
-          <w:p>
-            <w:r>
-              <w:t>ż = Az + Bu,  y = Cz</w:t>
-            </w:r>
-          </w:p>
-        </w:tc>
-      </w:tr>
-      <w:tr>
-        <w:tblPrEx>
-          <w:tblCellMar>
-            <w:top w:w="0" w:type="dxa"/>
-            <w:bottom w:w="0" w:type="dxa"/>
-          </w:tblCellMar>
-        </w:tblPrEx>
-        <w:tc>
-          <w:tcPr>
-            <w:tcW w:w="0" w:type="auto"/>
-          </w:tcPr>
-          <w:p>
-            <w:r>
-              <w:t>State-feedback gains for a mass</w:t>
-            </w:r>
-          </w:p>
-        </w:tc>
-        <w:tc>
-          <w:tcPr>
-            <w:tcW w:w="0" w:type="auto"/>
-          </w:tcPr>
-          <w:p>
-            <w:r>
-              <w:t>k₁ = mωₙ²,  k₂ = 2ζωₙm</w:t>
-            </w:r>
-          </w:p>
-        </w:tc>
-      </w:tr>
-      <w:tr>
-        <w:tblPrEx>
-          <w:tblCellMar>
-            <w:top w:w="0" w:type="dxa"/>
-            <w:bottom w:w="0" w:type="dxa"/>
-          </w:tblCellMar>
-        </w:tblPrEx>
-        <w:tc>
-          <w:tcPr>
-            <w:tcW w:w="0" w:type="auto"/>
-          </w:tcPr>
-          <w:p>
-            <w:r>
-              <w:t>Observer</w:t>
-            </w:r>
-          </w:p>
-        </w:tc>
-        <w:tc>
-          <w:tcPr>
-            <w:tcW w:w="0" w:type="auto"/>
-          </w:tcPr>
-          <w:p>
-            <w:r>
-              <w:t>dẑ/dt = Aẑ + Bu + L(y − Cẑ),  error poles: eig(A − LC)</w:t>
-            </w:r>
-          </w:p>
-        </w:tc>
-      </w:tr>
-      <w:tr>
-        <w:tblPrEx>
-          <w:tblCellMar>
-            <w:top w:w="0" w:type="dxa"/>
-            <w:bottom w:w="0" w:type="dxa"/>
-          </w:tblCellMar>
-        </w:tblPrEx>
-        <w:tc>
-          <w:tcPr>
-            <w:tcW w:w="0" w:type="auto"/>
-          </w:tcPr>
-          <w:p>
-            <w:r>
-              <w:t>Acquisition to ½ LSB</w:t>
-            </w:r>
-          </w:p>
-        </w:tc>
-        <w:tc>
-          <w:tcPr>
-            <w:tcW w:w="0" w:type="auto"/>
-          </w:tcPr>
-          <w:p>
-            <w:r>
-              <w:t>t_acq = RC (N + 1) ln 2</w:t>
-            </w:r>
-          </w:p>
-        </w:tc>
-      </w:tr>
-      <w:tr>
-        <w:tblPrEx>
-          <w:tblCellMar>
-            <w:top w:w="0" w:type="dxa"/>
-            <w:bottom w:w="0" w:type="dxa"/>
-          </w:tblCellMar>
-        </w:tblPrEx>
-        <w:tc>
-          <w:tcPr>
-            <w:tcW w:w="0" w:type="auto"/>
-          </w:tcPr>
-          <w:p>
-            <w:r>
-              <w:t>Sampled noise</w:t>
-            </w:r>
-          </w:p>
-        </w:tc>
-        <w:tc>
-          <w:tcPr>
-            <w:tcW w:w="0" w:type="auto"/>
-          </w:tcPr>
-          <w:p>
-            <w:r>
-              <w:t>v_n = √(kT/C)</w:t>
-            </w:r>
-          </w:p>
-        </w:tc>
-      </w:tr>
-      <w:tr>
-        <w:tblPrEx>
-          <w:tblCellMar>
-            <w:top w:w="0" w:type="dxa"/>
-            <w:bottom w:w="0" w:type="dxa"/>
-          </w:tblCellMar>
-        </w:tblPrEx>
-        <w:tc>
-          <w:tcPr>
-            <w:tcW w:w="0" w:type="auto"/>
-          </w:tcPr>
-          <w:p>
-            <w:r>
-              <w:t>Jitter-limited SNR</w:t>
-            </w:r>
-          </w:p>
-        </w:tc>
-        <w:tc>
-          <w:tcPr>
-            <w:tcW w:w="0" w:type="auto"/>
-          </w:tcPr>
-          <w:p>
-            <w:r>
-              <w:t>SNR = −20 log₁₀(2πfσ_t)</w:t>
-            </w:r>
-          </w:p>
-        </w:tc>
-      </w:tr>
-      <w:tr>
-        <w:tblPrEx>
-          <w:tblCellMar>
-            <w:top w:w="0" w:type="dxa"/>
-            <w:bottom w:w="0" w:type="dxa"/>
-          </w:tblCellMar>
-        </w:tblPrEx>
-        <w:tc>
-          <w:tcPr>
-            <w:tcW w:w="0" w:type="auto"/>
-          </w:tcPr>
-          <w:p>
-            <w:r>
-              <w:t>Pedestal and droop</w:t>
-            </w:r>
-          </w:p>
-        </w:tc>
-        <w:tc>
-          <w:tcPr>
-            <w:tcW w:w="0" w:type="auto"/>
-          </w:tcPr>
-          <w:p>
-            <w:r>
-              <w:t>ΔV = Q/C,   dV/dt = I_leak/C</w:t>
-            </w:r>
-          </w:p>
-        </w:tc>
-      </w:tr>
-      <w:tr>
-        <w:tblPrEx>
-          <w:tblCellMar>
-            <w:top w:w="0" w:type="dxa"/>
-            <w:bottom w:w="0" w:type="dxa"/>
-          </w:tblCellMar>
-        </w:tblPrEx>
-        <w:tc>
-          <w:tcPr>
-            <w:tcW w:w="0" w:type="auto"/>
-          </w:tcPr>
-          <w:p>
-            <w:r>
-              <w:t>PTAT voltage</w:t>
-            </w:r>
-          </w:p>
-        </w:tc>
-        <w:tc>
-          <w:tcPr>
-            <w:tcW w:w="0" w:type="auto"/>
-          </w:tcPr>
-          <w:p>
-            <w:r>
-              <w:t>ΔV_BE = (kT/q) ln N</w:t>
-            </w:r>
-          </w:p>
-        </w:tc>
-      </w:tr>
-      <w:tr>
-        <w:tblPrEx>
-          <w:tblCellMar>
-            <w:top w:w="0" w:type="dxa"/>
-            <w:bottom w:w="0" w:type="dxa"/>
-          </w:tblCellMar>
-        </w:tblPrEx>
-        <w:tc>
-          <w:tcPr>
-            <w:tcW w:w="0" w:type="auto"/>
-          </w:tcPr>
-          <w:p>
-            <w:r>
-              <w:t>Bandgap output</w:t>
-            </w:r>
-          </w:p>
-        </w:tc>
-        <w:tc>
-          <w:tcPr>
-            <w:tcW w:w="0" w:type="auto"/>
-          </w:tcPr>
-          <w:p>
-            <w:r>
-              <w:t>V_REF = V_BE + (R₂/R₁)ΔV_BE</w:t>
-            </w:r>
-          </w:p>
-        </w:tc>
-      </w:tr>
-      <w:tr>
-        <w:tblPrEx>
-          <w:tblCellMar>
-            <w:top w:w="0" w:type="dxa"/>
-            <w:bottom w:w="0" w:type="dxa"/>
-          </w:tblCellMar>
-        </w:tblPrEx>
-        <w:tc>
-          <w:tcPr>
-            <w:tcW w:w="0" w:type="auto"/>
-          </w:tcPr>
-          <w:p>
-            <w:r>
-              <w:t>Box-method TC</w:t>
-            </w:r>
-          </w:p>
-        </w:tc>
-        <w:tc>
-          <w:tcPr>
-            <w:tcW w:w="0" w:type="auto"/>
-          </w:tcPr>
-          <w:p>
-            <w:r>
-              <w:t>TC = ΔV/(V_nom ΔT) × 10⁶ ppm/°C</w:t>
-            </w:r>
-          </w:p>
-        </w:tc>
-      </w:tr>
-      <w:tr>
-        <w:tblPrEx>
-          <w:tblCellMar>
-            <w:top w:w="0" w:type="dxa"/>
-            <w:bottom w:w="0" w:type="dxa"/>
-          </w:tblCellMar>
-        </w:tblPrEx>
-        <w:tc>
-          <w:tcPr>
-            <w:tcW w:w="0" w:type="auto"/>
-          </w:tcPr>
-          <w:p>
-            <w:r>
-              <w:t>Shunt-reference resistor</w:t>
-            </w:r>
-          </w:p>
-        </w:tc>
-        <w:tc>
-          <w:tcPr>
-            <w:tcW w:w="0" w:type="auto"/>
-          </w:tcPr>
-          <w:p>
-            <w:r>
-              <w:t>R_s ≤ (V_s,min − V_REF)/(I_load,max + I_K,min)</w:t>
-            </w:r>
-          </w:p>
-        </w:tc>
-      </w:tr>
-      <w:tr>
-        <w:tblPrEx>
-          <w:tblCellMar>
-            <w:top w:w="0" w:type="dxa"/>
-            <w:bottom w:w="0" w:type="dxa"/>
-          </w:tblCellMar>
-        </w:tblPrEx>
-        <w:tc>
-          <w:tcPr>
-            <w:tcW w:w="0" w:type="auto"/>
-          </w:tcPr>
-          <w:p>
-            <w:r>
-              <w:t>Bridge average voltage</w:t>
-            </w:r>
-          </w:p>
-        </w:tc>
-        <w:tc>
-          <w:tcPr>
-            <w:tcW w:w="0" w:type="auto"/>
-          </w:tcPr>
-          <w:p>
-            <w:r>
-              <w:t>Bipolar (2D − 1)V_s;  sign-magnitude D·V_s</w:t>
-            </w:r>
-          </w:p>
-        </w:tc>
-      </w:tr>
-      <w:tr>
-        <w:tblPrEx>
-          <w:tblCellMar>
-            <w:top w:w="0" w:type="dxa"/>
-            <w:bottom w:w="0" w:type="dxa"/>
-          </w:tblCellMar>
-        </w:tblPrEx>
-        <w:tc>
-          <w:tcPr>
-            <w:tcW w:w="0" w:type="auto"/>
-          </w:tcPr>
-          <w:p>
-            <w:r>
-              <w:t>PWM current ripple</w:t>
-            </w:r>
-          </w:p>
-        </w:tc>
-        <w:tc>
-          <w:tcPr>
-            <w:tcW w:w="0" w:type="auto"/>
-          </w:tcPr>
-          <w:p>
-            <w:r>
-              <w:t>Bipolar 2V_sD(1 − D)/(Lf);  sign-magnitude V_sD(1 − D)/(Lf)</w:t>
-            </w:r>
-          </w:p>
-        </w:tc>
-      </w:tr>
-      <w:tr>
-        <w:tblPrEx>
-          <w:tblCellMar>
-            <w:top w:w="0" w:type="dxa"/>
-            <w:bottom w:w="0" w:type="dxa"/>
-          </w:tblCellMar>
-        </w:tblPrEx>
-        <w:tc>
-          <w:tcPr>
-            <w:tcW w:w="0" w:type="auto"/>
-          </w:tcPr>
-          <w:p>
-            <w:r>
-              <w:t>DC motor</w:t>
-            </w:r>
-          </w:p>
-        </w:tc>
-        <w:tc>
-          <w:tcPr>
-            <w:tcW w:w="0" w:type="auto"/>
-          </w:tcPr>
-          <w:p>
-            <w:r>
-              <w:t>V = Ri + L di/dt + K_eω;  J dω/dt = K_ti − bω − T_L</w:t>
-            </w:r>
-          </w:p>
-        </w:tc>
-      </w:tr>
-      <w:tr>
-        <w:tblPrEx>
-          <w:tblCellMar>
-            <w:top w:w="0" w:type="dxa"/>
-            <w:bottom w:w="0" w:type="dxa"/>
-          </w:tblCellMar>
-        </w:tblPrEx>
-        <w:tc>
-          <w:tcPr>
-            <w:tcW w:w="0" w:type="auto"/>
-          </w:tcPr>
-          <w:p>
-            <w:r>
-              <w:t>Motor time constants</w:t>
-            </w:r>
-          </w:p>
-        </w:tc>
-        <w:tc>
-          <w:tcPr>
-            <w:tcW w:w="0" w:type="auto"/>
-          </w:tcPr>
-          <w:p>
-            <w:r>
-              <w:t>τ_e = L/R,  τ_m = JR/(K_tK_e)</w:t>
-            </w:r>
-          </w:p>
-        </w:tc>
-      </w:tr>
-      <w:tr>
-        <w:tblPrEx>
-          <w:tblCellMar>
-            <w:top w:w="0" w:type="dxa"/>
-            <w:bottom w:w="0" w:type="dxa"/>
-          </w:tblCellMar>
-        </w:tblPrEx>
-        <w:tc>
-          <w:tcPr>
-            <w:tcW w:w="0" w:type="auto"/>
-          </w:tcPr>
-          <w:p>
-            <w:r>
-              <w:t>PI current loop</w:t>
-            </w:r>
-          </w:p>
-        </w:tc>
-        <w:tc>
-          <w:tcPr>
-            <w:tcW w:w="0" w:type="auto"/>
-          </w:tcPr>
-          <w:p>
-            <w:r>
-              <w:t>K_i/K_p = R/L,  ω_c = K_p/L</w:t>
-            </w:r>
-          </w:p>
-        </w:tc>
-      </w:tr>
-      <w:tr>
-        <w:tblPrEx>
-          <w:tblCellMar>
-            <w:top w:w="0" w:type="dxa"/>
-            <w:bottom w:w="0" w:type="dxa"/>
-          </w:tblCellMar>
-        </w:tblPrEx>
-        <w:tc>
-          <w:tcPr>
-            <w:tcW w:w="0" w:type="auto"/>
-          </w:tcPr>
-          <w:p>
-            <w:r>
-              <w:t>Root-locus asymptotes</w:t>
-            </w:r>
-          </w:p>
-        </w:tc>
-        <w:tc>
-          <w:tcPr>
-            <w:tcW w:w="0" w:type="auto"/>
-          </w:tcPr>
-          <w:p>
-            <w:r>
-              <w:t>angles (2k + 1)180°/(n − m);  centroid (Σp − Σz)/(n − m)</w:t>
-            </w:r>
-          </w:p>
-        </w:tc>
-      </w:tr>
-      <w:tr>
-        <w:tblPrEx>
-          <w:tblCellMar>
-            <w:top w:w="0" w:type="dxa"/>
-            <w:bottom w:w="0" w:type="dxa"/>
-          </w:tblCellMar>
-        </w:tblPrEx>
-        <w:tc>
-          <w:tcPr>
-            <w:tcW w:w="0" w:type="auto"/>
-          </w:tcPr>
-          <w:p>
-            <w:r>
-              <w:t>Locus gain</w:t>
-            </w:r>
-          </w:p>
-        </w:tc>
-        <w:tc>
-          <w:tcPr>
-            <w:tcW w:w="0" w:type="auto"/>
-          </w:tcPr>
-          <w:p>
-            <w:r>
-              <w:t>K = 1/|G(s)| at a point satisfying ∠G(s) = 180°</w:t>
-            </w:r>
-          </w:p>
-        </w:tc>
-      </w:tr>
-      <w:tr>
-        <w:tblPrEx>
-          <w:tblCellMar>
-            <w:top w:w="0" w:type="dxa"/>
-            <w:bottom w:w="0" w:type="dxa"/>
-          </w:tblCellMar>
-        </w:tblPrEx>
-        <w:tc>
-          <w:tcPr>
-            <w:tcW w:w="0" w:type="auto"/>
-          </w:tcPr>
-          <w:p>
-            <w:r>
-              <w:t>Second-order specs</w:t>
-            </w:r>
-          </w:p>
-        </w:tc>
-        <w:tc>
-          <w:tcPr>
-            <w:tcW w:w="0" w:type="auto"/>
-          </w:tcPr>
-          <w:p>
-            <w:r>
-              <w:t>overshoot exp(−πζ/√(1 − ζ²));  t_s(2%) ≈ 4/(ζω_n)</w:t>
-            </w:r>
-          </w:p>
-        </w:tc>
-      </w:tr>
-      <w:tr>
-        <w:tblPrEx>
-          <w:tblCellMar>
-            <w:top w:w="0" w:type="dxa"/>
-            <w:bottom w:w="0" w:type="dxa"/>
-          </w:tblCellMar>
-        </w:tblPrEx>
-        <w:tc>
-          <w:tcPr>
-            <w:tcW w:w="0" w:type="auto"/>
-          </w:tcPr>
-          <w:p>
-            <w:r>
-              <w:t>Nyquist criterion</w:t>
-            </w:r>
-          </w:p>
-        </w:tc>
-        <w:tc>
-          <w:tcPr>
-            <w:tcW w:w="0" w:type="auto"/>
-          </w:tcPr>
-          <w:p>
-            <w:r>
-              <w:t>Z = N + P</w:t>
-            </w:r>
-          </w:p>
-        </w:tc>
-      </w:tr>
-      <w:tr>
-        <w:tblPrEx>
-          <w:tblCellMar>
-            <w:top w:w="0" w:type="dxa"/>
-            <w:bottom w:w="0" w:type="dxa"/>
-          </w:tblCellMar>
-        </w:tblPrEx>
-        <w:tc>
-          <w:tcPr>
-            <w:tcW w:w="0" w:type="auto"/>
-          </w:tcPr>
-          <w:p>
-            <w:r>
-              <w:t>Margins</w:t>
-            </w:r>
-          </w:p>
-        </w:tc>
-        <w:tc>
-          <w:tcPr>
-            <w:tcW w:w="0" w:type="auto"/>
-          </w:tcPr>
-          <w:p>
-            <w:r>
-              <w:t>GM = 1/|L(jω₁₈₀)|;  PM = 180° + ∠L(jω_c);  τ_max = PM/ω_c</w:t>
-            </w:r>
-          </w:p>
-        </w:tc>
-      </w:tr>
-      <w:tr>
-        <w:tblPrEx>
-          <w:tblCellMar>
-            <w:top w:w="0" w:type="dxa"/>
-            <w:bottom w:w="0" w:type="dxa"/>
-          </w:tblCellMar>
-        </w:tblPrEx>
-        <w:tc>
-          <w:tcPr>
-            <w:tcW w:w="0" w:type="auto"/>
-          </w:tcPr>
-          <w:p>
-            <w:r>
-              <w:t>Sensitivity bounds</w:t>
-            </w:r>
-          </w:p>
-        </w:tc>
-        <w:tc>
-          <w:tcPr>
-            <w:tcW w:w="0" w:type="auto"/>
-          </w:tcPr>
-          <w:p>
-            <w:r>
-              <w:t>GM ≥ M_s/(M_s − 1);  PM ≥ 2 arcsin(1/(2M_s))</w:t>
-            </w:r>
-          </w:p>
-        </w:tc>
-      </w:tr>
-      <w:tr>
-        <w:tblPrEx>
-          <w:tblCellMar>
-            <w:top w:w="0" w:type="dxa"/>
-            <w:bottom w:w="0" w:type="dxa"/>
-          </w:tblCellMar>
-        </w:tblPrEx>
-        <w:tc>
-          <w:tcPr>
-            <w:tcW w:w="0" w:type="auto"/>
-          </w:tcPr>
-          <w:p>
-            <w:r>
-              <w:t>Wien bridge</w:t>
-            </w:r>
-          </w:p>
-        </w:tc>
-        <w:tc>
-          <w:tcPr>
-            <w:tcW w:w="0" w:type="auto"/>
-          </w:tcPr>
-          <w:p>
-            <w:r>
-              <w:t>f₀ = 1/(2πRC);  gain 3</w:t>
-            </w:r>
-          </w:p>
-        </w:tc>
-      </w:tr>
-      <w:tr>
-        <w:tblPrEx>
-          <w:tblCellMar>
-            <w:top w:w="0" w:type="dxa"/>
-            <w:bottom w:w="0" w:type="dxa"/>
-          </w:tblCellMar>
-        </w:tblPrEx>
-        <w:tc>
-          <w:tcPr>
-            <w:tcW w:w="0" w:type="auto"/>
-          </w:tcPr>
-          <w:p>
-            <w:r>
-              <w:t>Relaxation oscillator</w:t>
-            </w:r>
-          </w:p>
-        </w:tc>
-        <w:tc>
-          <w:tcPr>
-            <w:tcW w:w="0" w:type="auto"/>
-          </w:tcPr>
-          <w:p>
-            <w:r>
-              <w:t>T = 2RC ln((1 + β)/(1 − β))</w:t>
-            </w:r>
-          </w:p>
-        </w:tc>
-      </w:tr>
-      <w:tr>
-        <w:tblPrEx>
-          <w:tblCellMar>
-            <w:top w:w="0" w:type="dxa"/>
-            <w:bottom w:w="0" w:type="dxa"/>
-          </w:tblCellMar>
-        </w:tblPrEx>
-        <w:tc>
-          <w:tcPr>
-            <w:tcW w:w="0" w:type="auto"/>
-          </w:tcPr>
-          <w:p>
-            <w:r>
-              <w:t>555 astable</w:t>
-            </w:r>
-          </w:p>
-        </w:tc>
-        <w:tc>
-          <w:tcPr>
-            <w:tcW w:w="0" w:type="auto"/>
-          </w:tcPr>
-          <w:p>
-            <w:r>
-              <w:t>f = 1.44/((R₁ + 2R₂)C);  duty (R₁ + R₂)/(R₁ + 2R₂)</w:t>
-            </w:r>
-          </w:p>
-        </w:tc>
-      </w:tr>
-      <w:tr>
-        <w:tblPrEx>
-          <w:tblCellMar>
-            <w:top w:w="0" w:type="dxa"/>
-            <w:bottom w:w="0" w:type="dxa"/>
-          </w:tblCellMar>
-        </w:tblPrEx>
-        <w:tc>
-          <w:tcPr>
-            <w:tcW w:w="0" w:type="auto"/>
-          </w:tcPr>
-          <w:p>
-            <w:r>
-              <w:t>Setup and hold</w:t>
-            </w:r>
-          </w:p>
-        </w:tc>
-        <w:tc>
-          <w:tcPr>
-            <w:tcW w:w="0" w:type="auto"/>
-          </w:tcPr>
-          <w:p>
-            <w:r>
-              <w:t>T_clk ≥ t_cq + t_pd + t_su + t_skew;  t_cq + t_cd ≥ t_h + t_skew</w:t>
-            </w:r>
-          </w:p>
-        </w:tc>
-      </w:tr>
-      <w:tr>
-        <w:tblPrEx>
-          <w:tblCellMar>
-            <w:top w:w="0" w:type="dxa"/>
-            <w:bottom w:w="0" w:type="dxa"/>
-          </w:tblCellMar>
-        </w:tblPrEx>
-        <w:tc>
-          <w:tcPr>
-            <w:tcW w:w="0" w:type="auto"/>
-          </w:tcPr>
-          <w:p>
-            <w:r>
-              <w:t>Synchronizer MTBF</w:t>
-            </w:r>
-          </w:p>
-        </w:tc>
-        <w:tc>
-          <w:tcPr>
-            <w:tcW w:w="0" w:type="auto"/>
-          </w:tcPr>
-          <w:p>
-            <w:r>
-              <w:t>e^(t_r/τ)/(T_w f_clk f_data)</w:t>
-            </w:r>
-          </w:p>
-        </w:tc>
-      </w:tr>
-    </w:tbl>
+    <w:p>
+      <w:pPr>
+        <w:spacing w:before="0" w:after="100"/>
+      </w:pPr>
+      <w:r>
+        <w:rPr>
+          <w:b/>
+          <w:bCs/>
+        </w:rPr>
+        <w:t>Concept</w:t>
+      </w:r>
+      <w:r>
+        <w:rPr>
+          <w:b/>
+        </w:rPr>
+        <w:t xml:space="preserve"> — </w:t>
+      </w:r>
+      <w:r>
+        <w:rPr>
+          <w:b/>
+          <w:bCs/>
+        </w:rPr>
+        <w:t>Formula</w:t>
+      </w:r>
+    </w:p>
+    <w:p>
+      <w:pPr>
+        <w:spacing w:before="0" w:after="100"/>
+      </w:pPr>
+      <w:r>
+        <w:rPr>
+          <w:b/>
+        </w:rPr>
+        <w:t>Noise margins</w:t>
+      </w:r>
+      <w:r>
+        <w:rPr/>
+        <w:t xml:space="preserve"> — </w:t>
+      </w:r>
+      <w:r>
+        <w:rPr/>
+        <w:t>NMʜ = Vₒₕ(min) − Vᵢₕ(min)      NMʟ = Vᵢʟ(max) − Vₒʟ(max)</w:t>
+      </w:r>
+    </w:p>
+    <w:p>
+      <w:pPr>
+        <w:spacing w:before="0" w:after="100"/>
+      </w:pPr>
+      <w:r>
+        <w:rPr>
+          <w:b/>
+        </w:rPr>
+        <w:t>Inverting amplifier</w:t>
+      </w:r>
+      <w:r>
+        <w:rPr/>
+        <w:t xml:space="preserve"> — </w:t>
+      </w:r>
+      <w:r>
+        <w:rPr/>
+        <w:t>Vₒᵤₜ = −(R_f / Rᵢₙ) · Vᵢₙ</w:t>
+      </w:r>
+    </w:p>
+    <w:p>
+      <w:pPr>
+        <w:spacing w:before="0" w:after="100"/>
+      </w:pPr>
+      <w:r>
+        <w:rPr>
+          <w:b/>
+        </w:rPr>
+        <w:t>Non-inverting amplifier</w:t>
+      </w:r>
+      <w:r>
+        <w:rPr/>
+        <w:t xml:space="preserve"> — </w:t>
+      </w:r>
+      <w:r>
+        <w:rPr/>
+        <w:t>Vₒᵤₜ = (1 + R_f / Rᵢₙ) · Vᵢₙ</w:t>
+      </w:r>
+    </w:p>
+    <w:p>
+      <w:pPr>
+        <w:spacing w:before="0" w:after="100"/>
+      </w:pPr>
+      <w:r>
+        <w:rPr>
+          <w:b/>
+        </w:rPr>
+        <w:t>RC filter corner frequency</w:t>
+      </w:r>
+      <w:r>
+        <w:rPr/>
+        <w:t xml:space="preserve"> — </w:t>
+      </w:r>
+      <w:r>
+        <w:rPr/>
+        <w:t>fᴄ = 1 / (2πRC)</w:t>
+      </w:r>
+    </w:p>
+    <w:p>
+      <w:pPr>
+        <w:spacing w:before="0" w:after="100"/>
+      </w:pPr>
+      <w:r>
+        <w:rPr>
+          <w:b/>
+        </w:rPr>
+        <w:t>Capacitor self-resonant frequency</w:t>
+      </w:r>
+      <w:r>
+        <w:rPr/>
+        <w:t xml:space="preserve"> — </w:t>
+      </w:r>
+      <w:r>
+        <w:rPr/>
+        <w:t>SRF = 1 / (2π√(L_ESL · C))</w:t>
+      </w:r>
+    </w:p>
+    <w:p>
+      <w:pPr>
+        <w:spacing w:before="0" w:after="100"/>
+      </w:pPr>
+      <w:r>
+        <w:rPr>
+          <w:b/>
+        </w:rPr>
+        <w:t>Inductor quality factor</w:t>
+      </w:r>
+      <w:r>
+        <w:rPr/>
+        <w:t xml:space="preserve"> — </w:t>
+      </w:r>
+      <w:r>
+        <w:rPr/>
+        <w:t>Q = ωL / R</w:t>
+      </w:r>
+    </w:p>
+    <w:p>
+      <w:pPr>
+        <w:spacing w:before="0" w:after="100"/>
+      </w:pPr>
+      <w:r>
+        <w:rPr>
+          <w:b/>
+        </w:rPr>
+        <w:t>Inductor self-resonant frequency</w:t>
+      </w:r>
+      <w:r>
+        <w:rPr/>
+        <w:t xml:space="preserve"> — </w:t>
+      </w:r>
+      <w:r>
+        <w:rPr/>
+        <w:t>SRF = 1 / (2π√(L · C_wind))</w:t>
+      </w:r>
+    </w:p>
+    <w:p>
+      <w:pPr>
+        <w:spacing w:before="0" w:after="100"/>
+      </w:pPr>
+      <w:r>
+        <w:rPr>
+          <w:b/>
+        </w:rPr>
+        <w:t>Feedback closed-loop gain</w:t>
+      </w:r>
+      <w:r>
+        <w:rPr/>
+        <w:t xml:space="preserve"> — </w:t>
+      </w:r>
+      <w:r>
+        <w:rPr/>
+        <w:t>G = A / (1 + Aβ) ≈ 1/β</w:t>
+      </w:r>
+    </w:p>
+    <w:p>
+      <w:pPr>
+        <w:spacing w:before="0" w:after="100"/>
+      </w:pPr>
+      <w:r>
+        <w:rPr>
+          <w:b/>
+        </w:rPr>
+        <w:t>Gain sensitivity</w:t>
+      </w:r>
+      <w:r>
+        <w:rPr/>
+        <w:t xml:space="preserve"> — </w:t>
+      </w:r>
+      <w:r>
+        <w:rPr/>
+        <w:t>ΔG/G ≈ (ΔA/A) / (1 + T)</w:t>
+      </w:r>
+    </w:p>
+    <w:p>
+      <w:pPr>
+        <w:spacing w:before="0" w:after="100"/>
+      </w:pPr>
+      <w:r>
+        <w:rPr>
+          <w:b/>
+        </w:rPr>
+        <w:t>Capacitive-load pole</w:t>
+      </w:r>
+      <w:r>
+        <w:rPr/>
+        <w:t xml:space="preserve"> — </w:t>
+      </w:r>
+      <w:r>
+        <w:rPr/>
+        <w:t>f₂ = 1 / (2π r_o C_L)</w:t>
+      </w:r>
+    </w:p>
+    <w:p>
+      <w:pPr>
+        <w:spacing w:before="0" w:after="100"/>
+      </w:pPr>
+      <w:r>
+        <w:rPr>
+          <w:b/>
+        </w:rPr>
+        <w:t>Closed-loop bandwidth</w:t>
+      </w:r>
+      <w:r>
+        <w:rPr/>
+        <w:t xml:space="preserve"> — </w:t>
+      </w:r>
+      <w:r>
+        <w:rPr/>
+        <w:t>f_cl ≈ GBW / NG,  NG = 1 + R_f/Rᵢₙ</w:t>
+      </w:r>
+    </w:p>
+    <w:p>
+      <w:pPr>
+        <w:spacing w:before="0" w:after="100"/>
+      </w:pPr>
+      <w:r>
+        <w:rPr>
+          <w:b/>
+        </w:rPr>
+        <w:t>Full-power bandwidth</w:t>
+      </w:r>
+      <w:r>
+        <w:rPr/>
+        <w:t xml:space="preserve"> — </w:t>
+      </w:r>
+      <w:r>
+        <w:rPr/>
+        <w:t>f_FP = SR / (2π V_p)</w:t>
+      </w:r>
+    </w:p>
+    <w:p>
+      <w:pPr>
+        <w:spacing w:before="0" w:after="100"/>
+      </w:pPr>
+      <w:r>
+        <w:rPr>
+          <w:b/>
+        </w:rPr>
+        <w:t>Johnson noise density</w:t>
+      </w:r>
+      <w:r>
+        <w:rPr/>
+        <w:t xml:space="preserve"> — </w:t>
+      </w:r>
+      <w:r>
+        <w:rPr/>
+        <w:t>e_R = √(4kTR)</w:t>
+      </w:r>
+    </w:p>
+    <w:p>
+      <w:pPr>
+        <w:spacing w:before="0" w:after="100"/>
+      </w:pPr>
+      <w:r>
+        <w:rPr>
+          <w:b/>
+        </w:rPr>
+        <w:t>Noise sum (uncorrelated)</w:t>
+      </w:r>
+      <w:r>
+        <w:rPr/>
+        <w:t xml:space="preserve"> — </w:t>
+      </w:r>
+      <w:r>
+        <w:rPr/>
+        <w:t>e_total = √(e₁² + e₂² + …)</w:t>
+      </w:r>
+    </w:p>
+    <w:p>
+      <w:pPr>
+        <w:spacing w:before="0" w:after="100"/>
+      </w:pPr>
+      <w:r>
+        <w:rPr>
+          <w:b/>
+        </w:rPr>
+        <w:t>Single-pole noise bandwidth</w:t>
+      </w:r>
+      <w:r>
+        <w:rPr/>
+        <w:t xml:space="preserve"> — </w:t>
+      </w:r>
+      <w:r>
+        <w:rPr/>
+        <w:t>ENBW = (π/2) f₋₃dB</w:t>
+      </w:r>
+    </w:p>
+    <w:p>
+      <w:pPr>
+        <w:spacing w:before="0" w:after="100"/>
+      </w:pPr>
+      <w:r>
+        <w:rPr>
+          <w:b/>
+        </w:rPr>
+        <w:t>Offset at output</w:t>
+      </w:r>
+      <w:r>
+        <w:rPr/>
+        <w:t xml:space="preserve"> — </w:t>
+      </w:r>
+      <w:r>
+        <w:rPr/>
+        <w:t>V_out = V_os (1 + R_f/Rᵢₙ)</w:t>
+      </w:r>
+    </w:p>
+    <w:p>
+      <w:pPr>
+        <w:spacing w:before="0" w:after="100"/>
+      </w:pPr>
+      <w:r>
+        <w:rPr>
+          <w:b/>
+        </w:rPr>
+        <w:t>Bias-current compensation</w:t>
+      </w:r>
+      <w:r>
+        <w:rPr/>
+        <w:t xml:space="preserve"> — </w:t>
+      </w:r>
+      <w:r>
+        <w:rPr/>
+        <w:t>R_c = R_f ‖ Rᵢₙ; residual ≈ I_os R_f</w:t>
+      </w:r>
+    </w:p>
+    <w:p>
+      <w:pPr>
+        <w:spacing w:before="0" w:after="100"/>
+      </w:pPr>
+      <w:r>
+        <w:rPr>
+          <w:b/>
+        </w:rPr>
+        <w:t>Schmitt threshold</w:t>
+      </w:r>
+      <w:r>
+        <w:rPr/>
+        <w:t xml:space="preserve"> — </w:t>
+      </w:r>
+      <w:r>
+        <w:rPr/>
+        <w:t>V_th = V_ref R₂/(R₁+R₂) + V_out R₁/(R₁+R₂)</w:t>
+      </w:r>
+    </w:p>
+    <w:p>
+      <w:pPr>
+        <w:spacing w:before="0" w:after="100"/>
+      </w:pPr>
+      <w:r>
+        <w:rPr>
+          <w:b/>
+        </w:rPr>
+        <w:t>Pull-up rise time (10–90%)</w:t>
+      </w:r>
+      <w:r>
+        <w:rPr/>
+        <w:t xml:space="preserve"> — </w:t>
+      </w:r>
+      <w:r>
+        <w:rPr/>
+        <w:t>t_r = 2.2 R_pu C</w:t>
+      </w:r>
+    </w:p>
+    <w:p>
+      <w:pPr>
+        <w:spacing w:before="0" w:after="100"/>
+      </w:pPr>
+      <w:r>
+        <w:rPr>
+          <w:b/>
+        </w:rPr>
+        <w:t>Closed-loop tracking</w:t>
+      </w:r>
+      <w:r>
+        <w:rPr/>
+        <w:t xml:space="preserve"> — </w:t>
+      </w:r>
+      <w:r>
+        <w:rPr/>
+        <w:t>Y/R = CP/(1 + CP)</w:t>
+      </w:r>
+    </w:p>
+    <w:p>
+      <w:pPr>
+        <w:spacing w:before="0" w:after="100"/>
+      </w:pPr>
+      <w:r>
+        <w:rPr>
+          <w:b/>
+        </w:rPr>
+        <w:t>First-order plant, P control</w:t>
+      </w:r>
+      <w:r>
+        <w:rPr/>
+        <w:t xml:space="preserve"> — </w:t>
+      </w:r>
+      <w:r>
+        <w:rPr/>
+        <w:t>τ_cl = τ/(1 + K_p K); e_ss = 1/(1 + K_p K)</w:t>
+      </w:r>
+    </w:p>
+    <w:p>
+      <w:pPr>
+        <w:spacing w:before="0" w:after="100"/>
+      </w:pPr>
+      <w:r>
+        <w:rPr>
+          <w:b/>
+        </w:rPr>
+        <w:t>PID law</w:t>
+      </w:r>
+      <w:r>
+        <w:rPr/>
+        <w:t xml:space="preserve"> — </w:t>
+      </w:r>
+      <w:r>
+        <w:rPr/>
+        <w:t>u = K_p e + K_i ∫e dt + K_d de/dt</w:t>
+      </w:r>
+    </w:p>
+    <w:p>
+      <w:pPr>
+        <w:spacing w:before="0" w:after="100"/>
+      </w:pPr>
+      <w:r>
+        <w:rPr>
+          <w:b/>
+        </w:rPr>
+        <w:t>Lead network maximum phase</w:t>
+      </w:r>
+      <w:r>
+        <w:rPr/>
+        <w:t xml:space="preserve"> — </w:t>
+      </w:r>
+      <w:r>
+        <w:rPr/>
+        <w:t>φ_max = arcsin((α−1)/(α+1)) at √(ω_z ω_p)</w:t>
+      </w:r>
+    </w:p>
+    <w:p>
+      <w:pPr>
+        <w:spacing w:before="0" w:after="100"/>
+      </w:pPr>
+      <w:r>
+        <w:rPr>
+          <w:b/>
+        </w:rPr>
+        <w:t>Sampled-loop delay</w:t>
+      </w:r>
+      <w:r>
+        <w:rPr/>
+        <w:t xml:space="preserve"> — </w:t>
+      </w:r>
+      <w:r>
+        <w:rPr/>
+        <w:t>t_d ≈ T/2 + T_compute;  φ = ω_c t_d</w:t>
+      </w:r>
+    </w:p>
+    <w:p>
+      <w:pPr>
+        <w:spacing w:before="0" w:after="100"/>
+      </w:pPr>
+      <w:r>
+        <w:rPr>
+          <w:b/>
+        </w:rPr>
+        <w:t>Discrete PI (backward Euler)</w:t>
+      </w:r>
+      <w:r>
+        <w:rPr/>
+        <w:t xml:space="preserve"> — </w:t>
+      </w:r>
+      <w:r>
+        <w:rPr/>
+        <w:t>I[k] = I[k−1] + T e[k];  u[k] = K_p e[k] + K_i I[k]</w:t>
+      </w:r>
+    </w:p>
+    <w:p>
+      <w:pPr>
+        <w:spacing w:before="0" w:after="100"/>
+      </w:pPr>
+      <w:r>
+        <w:rPr>
+          <w:b/>
+        </w:rPr>
+        <w:t>Buck inductor ripple</w:t>
+      </w:r>
+      <w:r>
+        <w:rPr/>
+        <w:t xml:space="preserve"> — </w:t>
+      </w:r>
+      <w:r>
+        <w:rPr/>
+        <w:t>ΔI = (V_in − V_out) D / (L f_sw)</w:t>
+      </w:r>
+    </w:p>
+    <w:p>
+      <w:pPr>
+        <w:spacing w:before="0" w:after="100"/>
+      </w:pPr>
+      <w:r>
+        <w:rPr>
+          <w:b/>
+        </w:rPr>
+        <w:t>Triangle-on-DC rms</w:t>
+      </w:r>
+      <w:r>
+        <w:rPr/>
+        <w:t xml:space="preserve"> — </w:t>
+      </w:r>
+      <w:r>
+        <w:rPr/>
+        <w:t>I_rms = √(I_DC² + ΔI²/12)</w:t>
+      </w:r>
+    </w:p>
+    <w:p>
+      <w:pPr>
+        <w:spacing w:before="0" w:after="100"/>
+      </w:pPr>
+      <w:r>
+        <w:rPr>
+          <w:b/>
+        </w:rPr>
+        <w:t>Second-order low-pass</w:t>
+      </w:r>
+      <w:r>
+        <w:rPr/>
+        <w:t xml:space="preserve"> — </w:t>
+      </w:r>
+      <w:r>
+        <w:rPr/>
+        <w:t>H(s) = H₀ω₀²/(s² + (ω₀/Q)s + ω₀²)</w:t>
+      </w:r>
+    </w:p>
+    <w:p>
+      <w:pPr>
+        <w:spacing w:before="0" w:after="100"/>
+      </w:pPr>
+      <w:r>
+        <w:rPr>
+          <w:b/>
+        </w:rPr>
+        <w:t>Unity-gain Sallen-Key, equal R</w:t>
+      </w:r>
+      <w:r>
+        <w:rPr/>
+        <w:t xml:space="preserve"> — </w:t>
+      </w:r>
+      <w:r>
+        <w:rPr/>
+        <w:t>ω₀ = 1/(R√(C₁C₂)); Q = ½√(C₁/C₂)</w:t>
+      </w:r>
+    </w:p>
+    <w:p>
+      <w:pPr>
+        <w:spacing w:before="0" w:after="100"/>
+      </w:pPr>
+      <w:r>
+        <w:rPr>
+          <w:b/>
+        </w:rPr>
+        <w:t>MFB low-pass, equal R</w:t>
+      </w:r>
+      <w:r>
+        <w:rPr/>
+        <w:t xml:space="preserve"> — </w:t>
+      </w:r>
+      <w:r>
+        <w:rPr/>
+        <w:t>H₀ = −1; ω₀ = 1/(R√(C₁C₂)); Q = ⅓√(C₁/C₂)</w:t>
+      </w:r>
+    </w:p>
+    <w:p>
+      <w:pPr>
+        <w:spacing w:before="0" w:after="100"/>
+      </w:pPr>
+      <w:r>
+        <w:rPr>
+          <w:b/>
+        </w:rPr>
+        <w:t>Linear power derating</w:t>
+      </w:r>
+      <w:r>
+        <w:rPr/>
+        <w:t xml:space="preserve"> — </w:t>
+      </w:r>
+      <w:r>
+        <w:rPr/>
+        <w:t>P = P_rated (T_max − T_amb)/(T_max − T_knee)</w:t>
+      </w:r>
+    </w:p>
+    <w:p>
+      <w:pPr>
+        <w:spacing w:before="0" w:after="100"/>
+      </w:pPr>
+      <w:r>
+        <w:rPr>
+          <w:b/>
+        </w:rPr>
+        <w:t>Self-heating</w:t>
+      </w:r>
+      <w:r>
+        <w:rPr/>
+        <w:t xml:space="preserve"> — </w:t>
+      </w:r>
+      <w:r>
+        <w:rPr/>
+        <w:t>ΔT = P θ;  ΔR/R = TCR × ΔT</w:t>
+      </w:r>
+    </w:p>
+    <w:p>
+      <w:pPr>
+        <w:spacing w:before="0" w:after="100"/>
+      </w:pPr>
+      <w:r>
+        <w:rPr>
+          <w:b/>
+        </w:rPr>
+        <w:t>Capacitor impedance</w:t>
+      </w:r>
+      <w:r>
+        <w:rPr/>
+        <w:t xml:space="preserve"> — </w:t>
+      </w:r>
+      <w:r>
+        <w:rPr/>
+        <w:t>|Z| = √(ESR² + (ωL − 1/(ωC))²)</w:t>
+      </w:r>
+    </w:p>
+    <w:p>
+      <w:pPr>
+        <w:spacing w:before="0" w:after="100"/>
+      </w:pPr>
+      <w:r>
+        <w:rPr>
+          <w:b/>
+        </w:rPr>
+        <w:t>Target impedance</w:t>
+      </w:r>
+      <w:r>
+        <w:rPr/>
+        <w:t xml:space="preserve"> — </w:t>
+      </w:r>
+      <w:r>
+        <w:rPr/>
+        <w:t>Z_target = ΔV / ΔI</w:t>
+      </w:r>
+    </w:p>
+    <w:p>
+      <w:pPr>
+        <w:spacing w:before="0" w:after="100"/>
+      </w:pPr>
+      <w:r>
+        <w:rPr>
+          <w:b/>
+        </w:rPr>
+        <w:t>Antiresonance (approx.)</w:t>
+      </w:r>
+      <w:r>
+        <w:rPr/>
+        <w:t xml:space="preserve"> — </w:t>
+      </w:r>
+      <w:r>
+        <w:rPr/>
+        <w:t>f_ar ≈ 1/(2π√((L₁+L₂)C_small))</w:t>
+      </w:r>
+    </w:p>
+    <w:p>
+      <w:pPr>
+        <w:spacing w:before="0" w:after="100"/>
+      </w:pPr>
+      <w:r>
+        <w:rPr>
+          <w:b/>
+        </w:rPr>
+        <w:t>Bulk capacitance</w:t>
+      </w:r>
+      <w:r>
+        <w:rPr/>
+        <w:t xml:space="preserve"> — </w:t>
+      </w:r>
+      <w:r>
+        <w:rPr/>
+        <w:t>C ≥ I Δt / ΔV</w:t>
+      </w:r>
+    </w:p>
+    <w:p>
+      <w:pPr>
+        <w:spacing w:before="0" w:after="100"/>
+      </w:pPr>
+      <w:r>
+        <w:rPr>
+          <w:b/>
+        </w:rPr>
+        <w:t>Differential and common mode</w:t>
+      </w:r>
+      <w:r>
+        <w:rPr/>
+        <w:t xml:space="preserve"> — </w:t>
+      </w:r>
+      <w:r>
+        <w:rPr/>
+        <w:t>V_d = V₊ − V₋,  V_cm = (V₊ + V₋)/2</w:t>
+      </w:r>
+    </w:p>
+    <w:p>
+      <w:pPr>
+        <w:spacing w:before="0" w:after="100"/>
+      </w:pPr>
+      <w:r>
+        <w:rPr>
+          <w:b/>
+        </w:rPr>
+        <w:t>Difference-amplifier CMRR (worst case)</w:t>
+      </w:r>
+      <w:r>
+        <w:rPr/>
+        <w:t xml:space="preserve"> — </w:t>
+      </w:r>
+      <w:r>
+        <w:rPr/>
+        <w:t>CMRR ≈ (1 + G)/(4t)</w:t>
+      </w:r>
+    </w:p>
+    <w:p>
+      <w:pPr>
+        <w:spacing w:before="0" w:after="100"/>
+      </w:pPr>
+      <w:r>
+        <w:rPr>
+          <w:b/>
+        </w:rPr>
+        <w:t>Three-op-amp INA gain</w:t>
+      </w:r>
+      <w:r>
+        <w:rPr/>
+        <w:t xml:space="preserve"> — </w:t>
+      </w:r>
+      <w:r>
+        <w:rPr/>
+        <w:t>G = (1 + 2R/R_G)(R₂/R₁)</w:t>
+      </w:r>
+    </w:p>
+    <w:p>
+      <w:pPr>
+        <w:spacing w:before="0" w:after="100"/>
+      </w:pPr>
+      <w:r>
+        <w:rPr>
+          <w:b/>
+        </w:rPr>
+        <w:t>INA rejection</w:t>
+      </w:r>
+      <w:r>
+        <w:rPr/>
+        <w:t xml:space="preserve"> — </w:t>
+      </w:r>
+      <w:r>
+        <w:rPr/>
+        <w:t>CMRR_total ≈ G₁ · CMRR_diff</w:t>
+      </w:r>
+    </w:p>
+    <w:p>
+      <w:pPr>
+        <w:spacing w:before="0" w:after="100"/>
+      </w:pPr>
+      <w:r>
+        <w:rPr>
+          <w:b/>
+        </w:rPr>
+        <w:t>State equation</w:t>
+      </w:r>
+      <w:r>
+        <w:rPr/>
+        <w:t xml:space="preserve"> — </w:t>
+      </w:r>
+      <w:r>
+        <w:rPr/>
+        <w:t>ż = Az + Bu,  y = Cz</w:t>
+      </w:r>
+    </w:p>
+    <w:p>
+      <w:pPr>
+        <w:spacing w:before="0" w:after="100"/>
+      </w:pPr>
+      <w:r>
+        <w:rPr>
+          <w:b/>
+        </w:rPr>
+        <w:t>State-feedback gains for a mass</w:t>
+      </w:r>
+      <w:r>
+        <w:rPr/>
+        <w:t xml:space="preserve"> — </w:t>
+      </w:r>
+      <w:r>
+        <w:rPr/>
+        <w:t>k₁ = mωₙ²,  k₂ = 2ζωₙm</w:t>
+      </w:r>
+    </w:p>
+    <w:p>
+      <w:pPr>
+        <w:spacing w:before="0" w:after="100"/>
+      </w:pPr>
+      <w:r>
+        <w:rPr>
+          <w:b/>
+        </w:rPr>
+        <w:t>Observer</w:t>
+      </w:r>
+      <w:r>
+        <w:rPr/>
+        <w:t xml:space="preserve"> — </w:t>
+      </w:r>
+      <w:r>
+        <w:rPr/>
+        <w:t>dẑ/dt = Aẑ + Bu + L(y − Cẑ),  error poles: eig(A − LC)</w:t>
+      </w:r>
+    </w:p>
+    <w:p>
+      <w:pPr>
+        <w:spacing w:before="0" w:after="100"/>
+      </w:pPr>
+      <w:r>
+        <w:rPr>
+          <w:b/>
+        </w:rPr>
+        <w:t>Acquisition to ½ LSB</w:t>
+      </w:r>
+      <w:r>
+        <w:rPr/>
+        <w:t xml:space="preserve"> — </w:t>
+      </w:r>
+      <w:r>
+        <w:rPr/>
+        <w:t>t_acq = RC (N + 1) ln 2</w:t>
+      </w:r>
+    </w:p>
+    <w:p>
+      <w:pPr>
+        <w:spacing w:before="0" w:after="100"/>
+      </w:pPr>
+      <w:r>
+        <w:rPr>
+          <w:b/>
+        </w:rPr>
+        <w:t>Sampled noise</w:t>
+      </w:r>
+      <w:r>
+        <w:rPr/>
+        <w:t xml:space="preserve"> — </w:t>
+      </w:r>
+      <w:r>
+        <w:rPr/>
+        <w:t>v_n = √(kT/C)</w:t>
+      </w:r>
+    </w:p>
+    <w:p>
+      <w:pPr>
+        <w:spacing w:before="0" w:after="100"/>
+      </w:pPr>
+      <w:r>
+        <w:rPr>
+          <w:b/>
+        </w:rPr>
+        <w:t>Jitter-limited SNR</w:t>
+      </w:r>
+      <w:r>
+        <w:rPr/>
+        <w:t xml:space="preserve"> — </w:t>
+      </w:r>
+      <w:r>
+        <w:rPr/>
+        <w:t>SNR = −20 log₁₀(2πfσ_t)</w:t>
+      </w:r>
+    </w:p>
+    <w:p>
+      <w:pPr>
+        <w:spacing w:before="0" w:after="100"/>
+      </w:pPr>
+      <w:r>
+        <w:rPr>
+          <w:b/>
+        </w:rPr>
+        <w:t>Pedestal and droop</w:t>
+      </w:r>
+      <w:r>
+        <w:rPr/>
+        <w:t xml:space="preserve"> — </w:t>
+      </w:r>
+      <w:r>
+        <w:rPr/>
+        <w:t>ΔV = Q/C,   dV/dt = I_leak/C</w:t>
+      </w:r>
+    </w:p>
+    <w:p>
+      <w:pPr>
+        <w:spacing w:before="0" w:after="100"/>
+      </w:pPr>
+      <w:r>
+        <w:rPr>
+          <w:b/>
+        </w:rPr>
+        <w:t>PTAT voltage</w:t>
+      </w:r>
+      <w:r>
+        <w:rPr/>
+        <w:t xml:space="preserve"> — </w:t>
+      </w:r>
+      <w:r>
+        <w:rPr/>
+        <w:t>ΔV_BE = (kT/q) ln N</w:t>
+      </w:r>
+    </w:p>
+    <w:p>
+      <w:pPr>
+        <w:spacing w:before="0" w:after="100"/>
+      </w:pPr>
+      <w:r>
+        <w:rPr>
+          <w:b/>
+        </w:rPr>
+        <w:t>Bandgap output</w:t>
+      </w:r>
+      <w:r>
+        <w:rPr/>
+        <w:t xml:space="preserve"> — </w:t>
+      </w:r>
+      <w:r>
+        <w:rPr/>
+        <w:t>V_REF = V_BE + (R₂/R₁)ΔV_BE</w:t>
+      </w:r>
+    </w:p>
+    <w:p>
+      <w:pPr>
+        <w:spacing w:before="0" w:after="100"/>
+      </w:pPr>
+      <w:r>
+        <w:rPr>
+          <w:b/>
+        </w:rPr>
+        <w:t>Box-method TC</w:t>
+      </w:r>
+      <w:r>
+        <w:rPr/>
+        <w:t xml:space="preserve"> — </w:t>
+      </w:r>
+      <w:r>
+        <w:rPr/>
+        <w:t>TC = ΔV/(V_nom ΔT) × 10⁶ ppm/°C</w:t>
+      </w:r>
+    </w:p>
+    <w:p>
+      <w:pPr>
+        <w:spacing w:before="0" w:after="100"/>
+      </w:pPr>
+      <w:r>
+        <w:rPr>
+          <w:b/>
+        </w:rPr>
+        <w:t>Shunt-reference resistor</w:t>
+      </w:r>
+      <w:r>
+        <w:rPr/>
+        <w:t xml:space="preserve"> — </w:t>
+      </w:r>
+      <w:r>
+        <w:rPr/>
+        <w:t>R_s ≤ (V_s,min − V_REF)/(I_load,max + I_K,min)</w:t>
+      </w:r>
+    </w:p>
+    <w:p>
+      <w:pPr>
+        <w:spacing w:before="0" w:after="100"/>
+      </w:pPr>
+      <w:r>
+        <w:rPr>
+          <w:b/>
+        </w:rPr>
+        <w:t>Bridge average voltage</w:t>
+      </w:r>
+      <w:r>
+        <w:rPr/>
+        <w:t xml:space="preserve"> — </w:t>
+      </w:r>
+      <w:r>
+        <w:rPr/>
+        <w:t>Bipolar (2D − 1)V_s;  sign-magnitude D·V_s</w:t>
+      </w:r>
+    </w:p>
+    <w:p>
+      <w:pPr>
+        <w:spacing w:before="0" w:after="100"/>
+      </w:pPr>
+      <w:r>
+        <w:rPr>
+          <w:b/>
+        </w:rPr>
+        <w:t>PWM current ripple</w:t>
+      </w:r>
+      <w:r>
+        <w:rPr/>
+        <w:t xml:space="preserve"> — </w:t>
+      </w:r>
+      <w:r>
+        <w:rPr/>
+        <w:t>Bipolar 2V_sD(1 − D)/(Lf);  sign-magnitude V_sD(1 − D)/(Lf)</w:t>
+      </w:r>
+    </w:p>
+    <w:p>
+      <w:pPr>
+        <w:spacing w:before="0" w:after="100"/>
+      </w:pPr>
+      <w:r>
+        <w:rPr>
+          <w:b/>
+        </w:rPr>
+        <w:t>DC motor</w:t>
+      </w:r>
+      <w:r>
+        <w:rPr/>
+        <w:t xml:space="preserve"> — </w:t>
+      </w:r>
+      <w:r>
+        <w:rPr/>
+        <w:t>V = Ri + L di/dt + K_eω;  J dω/dt = K_ti − bω − T_L</w:t>
+      </w:r>
+    </w:p>
+    <w:p>
+      <w:pPr>
+        <w:spacing w:before="0" w:after="100"/>
+      </w:pPr>
+      <w:r>
+        <w:rPr>
+          <w:b/>
+        </w:rPr>
+        <w:t>Motor time constants</w:t>
+      </w:r>
+      <w:r>
+        <w:rPr/>
+        <w:t xml:space="preserve"> — </w:t>
+      </w:r>
+      <w:r>
+        <w:rPr/>
+        <w:t>τ_e = L/R,  τ_m = JR/(K_tK_e)</w:t>
+      </w:r>
+    </w:p>
+    <w:p>
+      <w:pPr>
+        <w:spacing w:before="0" w:after="100"/>
+      </w:pPr>
+      <w:r>
+        <w:rPr>
+          <w:b/>
+        </w:rPr>
+        <w:t>PI current loop</w:t>
+      </w:r>
+      <w:r>
+        <w:rPr/>
+        <w:t xml:space="preserve"> — </w:t>
+      </w:r>
+      <w:r>
+        <w:rPr/>
+        <w:t>K_i/K_p = R/L,  ω_c = K_p/L</w:t>
+      </w:r>
+    </w:p>
+    <w:p>
+      <w:pPr>
+        <w:spacing w:before="0" w:after="100"/>
+      </w:pPr>
+      <w:r>
+        <w:rPr>
+          <w:b/>
+        </w:rPr>
+        <w:t>Root-locus asymptotes</w:t>
+      </w:r>
+      <w:r>
+        <w:rPr/>
+        <w:t xml:space="preserve"> — </w:t>
+      </w:r>
+      <w:r>
+        <w:rPr/>
+        <w:t>angles (2k + 1)180°/(n − m);  centroid (Σp − Σz)/(n − m)</w:t>
+      </w:r>
+    </w:p>
+    <w:p>
+      <w:pPr>
+        <w:spacing w:before="0" w:after="100"/>
+      </w:pPr>
+      <w:r>
+        <w:rPr>
+          <w:b/>
+        </w:rPr>
+        <w:t>Locus gain</w:t>
+      </w:r>
+      <w:r>
+        <w:rPr/>
+        <w:t xml:space="preserve"> — </w:t>
+      </w:r>
+      <w:r>
+        <w:rPr/>
+        <w:t>K = 1/|G(s)| at a point satisfying ∠G(s) = 180°</w:t>
+      </w:r>
+    </w:p>
+    <w:p>
+      <w:pPr>
+        <w:spacing w:before="0" w:after="100"/>
+      </w:pPr>
+      <w:r>
+        <w:rPr>
+          <w:b/>
+        </w:rPr>
+        <w:t>Second-order specs</w:t>
+      </w:r>
+      <w:r>
+        <w:rPr/>
+        <w:t xml:space="preserve"> — </w:t>
+      </w:r>
+      <w:r>
+        <w:rPr/>
+        <w:t>overshoot exp(−πζ/√(1 − ζ²));  t_s(2%) ≈ 4/(ζω_n)</w:t>
+      </w:r>
+    </w:p>
+    <w:p>
+      <w:pPr>
+        <w:spacing w:before="0" w:after="100"/>
+      </w:pPr>
+      <w:r>
+        <w:rPr>
+          <w:b/>
+        </w:rPr>
+        <w:t>Nyquist criterion</w:t>
+      </w:r>
+      <w:r>
+        <w:rPr/>
+        <w:t xml:space="preserve"> — </w:t>
+      </w:r>
+      <w:r>
+        <w:rPr/>
+        <w:t>Z = N + P</w:t>
+      </w:r>
+    </w:p>
+    <w:p>
+      <w:pPr>
+        <w:spacing w:before="0" w:after="100"/>
+      </w:pPr>
+      <w:r>
+        <w:rPr>
+          <w:b/>
+        </w:rPr>
+        <w:t>Margins</w:t>
+      </w:r>
+      <w:r>
+        <w:rPr/>
+        <w:t xml:space="preserve"> — </w:t>
+      </w:r>
+      <w:r>
+        <w:rPr/>
+        <w:t>GM = 1/|L(jω₁₈₀)|;  PM = 180° + ∠L(jω_c);  τ_max = PM/ω_c</w:t>
+      </w:r>
+    </w:p>
+    <w:p>
+      <w:pPr>
+        <w:spacing w:before="0" w:after="100"/>
+      </w:pPr>
+      <w:r>
+        <w:rPr>
+          <w:b/>
+        </w:rPr>
+        <w:t>Sensitivity bounds</w:t>
+      </w:r>
+      <w:r>
+        <w:rPr/>
+        <w:t xml:space="preserve"> — </w:t>
+      </w:r>
+      <w:r>
+        <w:rPr/>
+        <w:t>GM ≥ M_s/(M_s − 1);  PM ≥ 2 arcsin(1/(2M_s))</w:t>
+      </w:r>
+    </w:p>
+    <w:p>
+      <w:pPr>
+        <w:spacing w:before="0" w:after="100"/>
+      </w:pPr>
+      <w:r>
+        <w:rPr>
+          <w:b/>
+        </w:rPr>
+        <w:t>Wien bridge</w:t>
+      </w:r>
+      <w:r>
+        <w:rPr/>
+        <w:t xml:space="preserve"> — </w:t>
+      </w:r>
+      <w:r>
+        <w:rPr/>
+        <w:t>f₀ = 1/(2πRC);  gain 3</w:t>
+      </w:r>
+    </w:p>
+    <w:p>
+      <w:pPr>
+        <w:spacing w:before="0" w:after="100"/>
+      </w:pPr>
+      <w:r>
+        <w:rPr>
+          <w:b/>
+        </w:rPr>
+        <w:t>Relaxation oscillator</w:t>
+      </w:r>
+      <w:r>
+        <w:rPr/>
+        <w:t xml:space="preserve"> — </w:t>
+      </w:r>
+      <w:r>
+        <w:rPr/>
+        <w:t>T = 2RC ln((1 + β)/(1 − β))</w:t>
+      </w:r>
+    </w:p>
+    <w:p>
+      <w:pPr>
+        <w:spacing w:before="0" w:after="100"/>
+      </w:pPr>
+      <w:r>
+        <w:rPr>
+          <w:b/>
+        </w:rPr>
+        <w:t>555 astable</w:t>
+      </w:r>
+      <w:r>
+        <w:rPr/>
+        <w:t xml:space="preserve"> — </w:t>
+      </w:r>
+      <w:r>
+        <w:rPr/>
+        <w:t>f = 1.44/((R₁ + 2R₂)C);  duty (R₁ + R₂)/(R₁ + 2R₂)</w:t>
+      </w:r>
+    </w:p>
+    <w:p>
+      <w:pPr>
+        <w:spacing w:before="0" w:after="100"/>
+      </w:pPr>
+      <w:r>
+        <w:rPr>
+          <w:b/>
+        </w:rPr>
+        <w:t>Setup and hold</w:t>
+      </w:r>
+      <w:r>
+        <w:rPr/>
+        <w:t xml:space="preserve"> — </w:t>
+      </w:r>
+      <w:r>
+        <w:rPr/>
+        <w:t>T_clk ≥ t_cq + t_pd + t_su + t_skew;  t_cq + t_cd ≥ t_h + t_skew</w:t>
+      </w:r>
+    </w:p>
+    <w:p>
+      <w:pPr>
+        <w:spacing w:before="0" w:after="100"/>
+      </w:pPr>
+      <w:r>
+        <w:rPr>
+          <w:b/>
+        </w:rPr>
+        <w:t>Synchronizer MTBF</w:t>
+      </w:r>
+      <w:r>
+        <w:rPr/>
+        <w:t xml:space="preserve"> — </w:t>
+      </w:r>
+      <w:r>
+        <w:rPr/>
+        <w:t>e^(t_r/τ)/(T_w f_clk f_data)</w:t>
+      </w:r>
+    </w:p>
     <w:p>
       <w:pPr>
         <w:pStyle w:val="Heading1"/>

</xml_diff>

<commit_message>
EE series: add Book 9 series pointers
</commit_message>
<xml_diff>
--- a/EE - SERIES/Circuits_Components_and_Control_Book2.docx
+++ b/EE - SERIES/Circuits_Components_and_Control_Book2.docx
@@ -22353,6 +22353,26 @@
       </w:pPr>
       <w:r>
         <w:t xml:space="preserve">Packaging, Layout, EMC, and Test (Book 7)</w:t>
+      </w:r>
+    </w:p>
+    <w:p>
+      <w:pPr>
+        <w:spacing w:after="20" w:line="276" w:lineRule="auto" w:before="0"/>
+        <w:ind w:left="360" w:firstLine="0" w:right="0"/>
+        <w:jc w:val="left"/>
+      </w:pPr>
+      <w:r>
+        <w:t xml:space="preserve">Firmware and Software for Electronics (Book 8)</w:t>
+      </w:r>
+    </w:p>
+    <w:p>
+      <w:pPr>
+        <w:spacing w:after="20" w:line="276" w:lineRule="auto" w:before="0"/>
+        <w:ind w:left="360" w:firstLine="0" w:right="0"/>
+        <w:jc w:val="left"/>
+      </w:pPr>
+      <w:r>
+        <w:t xml:space="preserve">Test and Measurement Instruments (Book 9)</w:t>
       </w:r>
     </w:p>
     <w:p>

</xml_diff>

<commit_message>
WIP: epitaxy pre-switch from book-2-lectures-after-qed
</commit_message>
<xml_diff>
--- a/EE - SERIES/Circuits_Components_and_Control_Book2.docx
+++ b/EE - SERIES/Circuits_Components_and_Control_Book2.docx
@@ -128,6 +128,12 @@
       </w:r>
     </w:p>
     <w:p>
+      <w:pPr/>
+      <w:r>
+        <w:t>Advanced control path: Chapters 21 and 25-26 extend the classical loop with state-space feedback and frequency-domain stability. Before these chapters, review matrix multiplication and simultaneous equations from Book 1, plus transfer functions, poles, and Bode plots from Chapters 17-19. Chapter 21 introduces state-space notation but expects you to follow matrix calculations.</w:t>
+      </w:r>
+    </w:p>
+    <w:p>
       <w:pPr>
         <w:shd w:val="clear" w:color="auto" w:fill="EFEFEF"/>
         <w:spacing w:before="120" w:after="80"/>
@@ -172,7 +178,7 @@
         <w:spacing w:after="200" w:line="276" w:lineRule="auto"/>
       </w:pPr>
       <w:r>
-        <w:t>This book is the second of seven, covering circuits, components, and the classical control loop that later sits under a robot model. Each book assumes only the books before it in the list below — never the ones after.</w:t>
+        <w:t>This book is the second of nine. It covers circuits, components, and the classical control loop that later sits under a robot model. Each volume assumes only the books before it in the list below, never the ones after.</w:t>
       </w:r>
     </w:p>
     <w:p>
@@ -180,155 +186,61 @@
         <w:spacing w:before="0" w:after="100"/>
       </w:pPr>
       <w:r>
-        <w:rPr>
-          <w:b/>
-        </w:rPr>
-        <w:t>Book</w:t>
-      </w:r>
-      <w:r>
-        <w:rPr>
-          <w:b/>
-        </w:rPr>
-        <w:t xml:space="preserve"> — </w:t>
-      </w:r>
-      <w:r>
-        <w:rPr>
-          <w:b/>
-        </w:rPr>
-        <w:t>Covers</w:t>
-      </w:r>
-    </w:p>
-    <w:p>
-      <w:pPr>
-        <w:spacing w:before="0" w:after="100"/>
-      </w:pPr>
-      <w:r>
-        <w:rPr>
-          <w:b/>
-        </w:rPr>
-        <w:t>1. Foundations</w:t>
-      </w:r>
-      <w:r>
-        <w:rPr/>
-        <w:t xml:space="preserve"> — </w:t>
-      </w:r>
-      <w:r>
-        <w:rPr/>
-        <w:t>Physics, mathematics, and circuit theory</w:t>
-      </w:r>
-    </w:p>
-    <w:p>
-      <w:pPr>
-        <w:spacing w:before="0" w:after="100"/>
-      </w:pPr>
-      <w:r>
-        <w:rPr>
-          <w:b/>
-        </w:rPr>
-        <w:t>2. Circuits, Components, and Control (this book)</w:t>
-      </w:r>
-      <w:r>
-        <w:rPr/>
-        <w:t xml:space="preserve"> — </w:t>
-      </w:r>
-      <w:r>
-        <w:rPr/>
-        <w:t>Analog and digital, op-amps, passives, the classical loop</w:t>
-      </w:r>
-    </w:p>
-    <w:p>
-      <w:pPr>
-        <w:spacing w:before="0" w:after="100"/>
-      </w:pPr>
-      <w:r>
-        <w:rPr>
-          <w:b/>
-        </w:rPr>
-        <w:t>3. Semiconductor Physics and Devices</w:t>
-      </w:r>
-      <w:r>
-        <w:rPr/>
-        <w:t xml:space="preserve"> — </w:t>
-      </w:r>
-      <w:r>
-        <w:rPr/>
-        <w:t>Diodes, BJTs, MOSFETs, FinFET, compound semiconductors</w:t>
-      </w:r>
-    </w:p>
-    <w:p>
-      <w:pPr>
-        <w:spacing w:before="0" w:after="100"/>
-      </w:pPr>
-      <w:r>
-        <w:rPr>
-          <w:b/>
-        </w:rPr>
-        <w:t>4. RF, Microwave, and Transceivers</w:t>
-      </w:r>
-      <w:r>
-        <w:rPr/>
-        <w:t xml:space="preserve"> — </w:t>
-      </w:r>
-      <w:r>
-        <w:rPr/>
-        <w:t>Lines, matching, antennas, PAs, receivers, PLLs, radar</w:t>
-      </w:r>
-    </w:p>
-    <w:p>
-      <w:pPr>
-        <w:spacing w:before="0" w:after="100"/>
-      </w:pPr>
-      <w:r>
-        <w:rPr>
-          <w:b/>
-        </w:rPr>
-        <w:t>5. Communications, Wireless, and SDR</w:t>
-      </w:r>
-      <w:r>
-        <w:rPr/>
-        <w:t xml:space="preserve"> — </w:t>
-      </w:r>
-      <w:r>
-        <w:rPr/>
-        <w:t>Modulation, band plans, DSP and software radio</w:t>
-      </w:r>
-    </w:p>
-    <w:p>
-      <w:pPr>
-        <w:spacing w:before="0" w:after="100"/>
-      </w:pPr>
-      <w:r>
-        <w:rPr>
-          <w:b/>
-        </w:rPr>
-        <w:t>6. Power and Energy</w:t>
-      </w:r>
-      <w:r>
-        <w:rPr/>
-        <w:t xml:space="preserve"> — </w:t>
-      </w:r>
-      <w:r>
-        <w:rPr/>
-        <w:t>Regulators, magnetics, the grid, the rack</w:t>
-      </w:r>
-    </w:p>
-    <w:p>
-      <w:pPr>
-        <w:spacing w:before="0" w:after="100"/>
-      </w:pPr>
-      <w:r>
-        <w:rPr>
-          <w:b/>
-        </w:rPr>
-        <w:t>7. Packaging, Layout, EMC, and Test</w:t>
-      </w:r>
-      <w:r>
-        <w:rPr/>
-        <w:t xml:space="preserve"> — </w:t>
-      </w:r>
-      <w:r>
-        <w:rPr/>
-        <w:t>Boards, packages, cooling, emissions, the accredited lab, robots</w:t>
+        <w:t>Book - Covers</w:t>
+      </w:r>
+    </w:p>
+    <w:p>
+      <w:pPr/>
+      <w:r>
+        <w:t>1. Foundations - Physics, mathematics, and circuit theory</w:t>
+      </w:r>
+    </w:p>
+    <w:p>
+      <w:pPr/>
+      <w:r>
+        <w:t>2. Circuits, Components, and Control (this book) - Analog and digital, op-amps, passives, the classical loop</w:t>
+      </w:r>
+    </w:p>
+    <w:p>
+      <w:pPr/>
+      <w:r>
+        <w:t>3. Semiconductor Physics and Devices - Diodes, BJTs, MOSFETs, FinFET, compound semiconductors</w:t>
+      </w:r>
+    </w:p>
+    <w:p>
+      <w:pPr/>
+      <w:r>
+        <w:t>4. RF, Microwave, and Transceivers - Lines, matching, antennas, PAs, receivers, PLLs, radar</w:t>
+      </w:r>
+    </w:p>
+    <w:p>
+      <w:pPr/>
+      <w:r>
+        <w:t>5. Communications, Wireless, and SDR - Modulation, band plans, DSP and software radio</w:t>
+      </w:r>
+    </w:p>
+    <w:p>
+      <w:pPr/>
+      <w:r>
+        <w:t>6. Power and Energy - Regulators, magnetics, the grid, the rack</w:t>
+      </w:r>
+    </w:p>
+    <w:p>
+      <w:pPr/>
+      <w:r>
+        <w:t>7. Packaging, Layout, EMC, and Test - Boards, packages, cooling, emissions, the accredited lab, robots</w:t>
+      </w:r>
+    </w:p>
+    <w:p>
+      <w:pPr/>
+      <w:r>
+        <w:t>8. Firmware and Software for Electronics - Embedded firmware, software tools, and code-driven electronics</w:t>
+      </w:r>
+    </w:p>
+    <w:p>
+      <w:pPr/>
+      <w:r>
+        <w:t>9. Test and Measurement Instruments - Oscilloscopes, analyzers, calibration, and device characterization</w:t>
       </w:r>
     </w:p>
     <w:p>
@@ -350,13 +262,8 @@
         <w:spacing w:after="120"/>
       </w:pPr>
       <w:r>
-        <w:rPr>
-          <w:b/>
-          <w:bCs/>
-        </w:rPr>
-        <w:t>You do not need the other six books to use this one. This book is written to stand on Book 1's foundation alone — treat the table as a map of where you have been and where a later interest can take you, not a syllabus you must complete in order.</w:t>
-      </w:r>
-      <w:r/>
+        <w:t>You do not need the other eight books to use this one. This book is written to stand on Book 1's foundation alone; treat the table as a map of where you have been and where a later interest can take you, not as a syllabus you must complete in order.</w:t>
+      </w:r>
     </w:p>
     <w:p>
       <w:pPr>
@@ -5432,7 +5339,7 @@
         <w:spacing w:after="200" w:line="276" w:lineRule="auto"/>
       </w:pPr>
       <w:r>
-        <w:t>A resistor dissipates power according to the same P = I²R = V²/R relations from Book 1, and every real resistor carries a maximum power rating — commonly 1/8 W, 1/4 W, or 1/2 W for small through-hole and surface-mount parts — set by how much heat its package can shed before overheating. Good design practice leaves real margin below that rating, since the rating itself typically assumes a specific ambient temperature and derates further as ambient temperature rises.</w:t>
+        <w:t>A resistor dissipates power according to P = I^2 R = V^2/R, and every real resistor has a maximum rating set by its package and specified mounting conditions. Common ratings include 1/8 W, 1/4 W, and 1/2 W. Calculate expected dissipation and leave margin; at higher ambient temperatures, apply the part's derating curve as shown in Section 7.6.</w:t>
       </w:r>
     </w:p>
     <w:p>
@@ -5628,7 +5535,7 @@
         <w:spacing w:after="200" w:line="276" w:lineRule="auto"/>
       </w:pPr>
       <w:r>
-        <w:t xml:space="preserve">A resistor's power rating is really a statement about temperature: it is the power that raises the resistive element to its maximum allowed temperature when the surroundings sit at a stated ambient, commonly 70 °C for chip resistors. Above that ambient, the allowed power falls, usually linearly, to zero at the element's maximum temperature, often 155 °C. The datasheet shows this as a derating curve.</w:t>
+        <w:t>A resistor's power limit is thermal and depends on the specified board, footprint, and ambient conditions. Many chip-resistor series hold the full rating to a knee near 70 degrees C, then reduce it toward zero at the maximum element temperature; the actual curve varies by series and mounting. In the example below, T_knee is 70 degrees C and T_max is 155 degrees C. Use the exact part's datasheet for a design.</w:t>
       </w:r>
     </w:p>
     <w:p>
@@ -6749,7 +6656,7 @@
         <w:spacing w:after="200" w:line="276" w:lineRule="auto"/>
       </w:pPr>
       <w:r>
-        <w:t xml:space="preserve">Section 8.3 showed that a real capacitor has an equivalent series resistance and inductance, and that above its self-resonant frequency it behaves like an inductor. The rest of this chapter puts that model to work on the job capacitors are asked to do more than any other: holding a supply rail steady while the circuit on it draws sudden, fast-changing current. It ends with the quieter imperfections, dielectric absorption, leakage, ripple heating, and aging, that decide whether a capacitor is right for timing, sampling, or long life.</w:t>
+        <w:t>This section applies the series model from Section 8.3 to supply decoupling, then considers dielectric absorption, leakage, ripple heating, and aging that determine whether a capacitor is suitable for timing, sampling, or long life.</w:t>
       </w:r>
     </w:p>
     <w:p>
@@ -33465,6 +33372,26 @@
       </w:hyperlink>
       <w:r>
         <w:t xml:space="preserve"> (Book 7)</w:t>
+      </w:r>
+    </w:p>
+    <w:p>
+      <w:pPr>
+        <w:spacing w:after="20" w:line="276" w:lineRule="auto" w:before="0"/>
+        <w:ind w:left="360" w:firstLine="0" w:right="0"/>
+        <w:jc w:val="left"/>
+      </w:pPr>
+      <w:r>
+        <w:t xml:space="preserve">Firmware and Software for Electronics (Book 8)</w:t>
+      </w:r>
+    </w:p>
+    <w:p>
+      <w:pPr>
+        <w:spacing w:after="20" w:line="276" w:lineRule="auto" w:before="0"/>
+        <w:ind w:left="360" w:firstLine="0" w:right="0"/>
+        <w:jc w:val="left"/>
+      </w:pPr>
+      <w:r>
+        <w:t xml:space="preserve">Test and Measurement Instruments (Book 9)</w:t>
       </w:r>
     </w:p>
     <w:p>

</xml_diff>

<commit_message>
EE series: review literature style; fix Book 2 copy error
</commit_message>
<xml_diff>
--- a/EE - SERIES/Circuits_Components_and_Control_Book2.docx
+++ b/EE - SERIES/Circuits_Components_and_Control_Book2.docx
@@ -27429,10 +27429,10 @@
           <w:b/>
           <w:bCs/>
         </w:rPr>
-        <w:t xml:space="preserve">12. </w:t>
-      </w:r>
-      <w:r>
-        <w:t>Below its resistive region a ferrite bead is mostly an inductor, and with the decoupling capacitor after it it forms a series LC resonance. At that frequency the network can amplify noise instead of attenuating it, unless the bead's resistance or an added damping resistor lowers the Q.</w:t>
+        <w:t xml:space="preserve">12. Below its resistive region, a ferrite bead is mostly an inductor. Together with the decoupling capacitor after it, the bead forms a series LC resonance. Near resonance, the network can amplify noise instead of attenuating it unless the bead's resistance or an added damping resistor lowers the Q.</w:t>
+      </w:r>
+      <w:r>
+        <w:t xml:space="preserve"/>
       </w:r>
     </w:p>
     <w:p>

</xml_diff>

<commit_message>
Book 2: improve sentence rhythm in digital explanations
</commit_message>
<xml_diff>
--- a/EE - SERIES/Circuits_Components_and_Control_Book2.docx
+++ b/EE - SERIES/Circuits_Components_and_Control_Book2.docx
@@ -906,10 +906,10 @@
           <w:b/>
           <w:bCs/>
         </w:rPr>
-        <w:t xml:space="preserve">Headroom is the available signal range before a circuit hits a limiting mechanism such as clipping; </w:t>
-      </w:r>
-      <w:r>
-        <w:t>push any real circuit far enough and it becomes nonlinear on its own, sometimes well before it reaches a rail — headroom and the small-signal linear approximation are related but not identical, and a circuit can leave the linear region without yet running out of headroom.</w:t>
+        <w:t xml:space="preserve">Headroom is the signal range available before a circuit reaches a limit such as clipping. </w:t>
+      </w:r>
+      <w:r>
+        <w:t>A real circuit can become nonlinear before its output reaches either supply rail. Headroom and the small-signal linear approximation are related, but they are not the same: a circuit may leave its linear region while voltage headroom remains.</w:t>
       </w:r>
     </w:p>
     <w:p>
@@ -1935,10 +1935,10 @@
           <w:b/>
           <w:bCs/>
         </w:rPr>
-        <w:t xml:space="preserve">De Morgan's laws are the reason NAND and NOR gates are each, individually, universal: </w:t>
-      </w:r>
-      <w:r>
-        <w:t>since AND, OR, and NOT can all be rebuilt from either one alone, an entire digital system can be constructed from a single type of gate — a principle some minimalist or historical designs take literally, even though modern chips mix many gate types chosen for power, area, and timing.</w:t>
+        <w:t xml:space="preserve">De Morgan's laws make NAND and NOR gates individually universal. </w:t>
+      </w:r>
+      <w:r>
+        <w:t>Either gate type can be combined to build AND, OR, and NOT, so an entire digital system can use only NANDs or only NORs. Some minimalist and historical designs do exactly that. Modern chips usually mix gate types to meet power, area, and timing goals.</w:t>
       </w:r>
     </w:p>
     <w:p>
@@ -2545,7 +2545,7 @@
         <w:spacing w:after="200" w:line="276" w:lineRule="auto"/>
       </w:pPr>
       <w:r>
-        <w:t>This chapter, and the two before it, cover the digital vocabulary this series needs going forward, but they are not a complete treatment of digital design. Propagation delay (how long a gate takes to respond to an input change), clock skew (different flip-flops receiving the same clock edge at very slightly different times), metastability (what happens when a flip-flop's setup or hold time is violated), fan-out (how many gate inputs one output can safely drive), and the practical differences between logic families (TTL, CMOS, LVDS, and others) all matter enormously in a real digital system — and Chapter 28 returns to propagation delay, skew, setup and hold, and metastability with real numbers, while Section 4.5 meets the 4000 and 7400 families on the bench.</w:t>
+        <w:t>These three chapters introduce the digital vocabulary used later in the series; they are not a complete digital-design course. Real systems also depend on propagation delay (how long a gate takes to respond), clock skew (differences in clock arrival at flip-flops), metastability (an unsettled state after a setup or hold violation), fan-out (how many gate inputs an output can safely drive), and differences among logic families such as TTL, CMOS, and LVDS. Chapter 28 applies delay, skew, setup and hold, and metastability with real numbers. Section 4.5 takes the 4000 and 7400 logic families to the bench.</w:t>
       </w:r>
     </w:p>
     <w:p>
@@ -31681,7 +31681,7 @@
         <w:spacing w:after="200" w:line="276" w:lineRule="auto"/>
       </w:pPr>
       <w:r>
-        <w:t>A circuit is biased to a fixed operating point before a smaller signal rides on top of it; the distance from that point to the nearer output rail is its headroom, and headroom sets the largest undistorted signal the stage can pass; gain and headroom trade against each other for a fixed pair of supply rails, and exceeding that limit produces distortion, most visibly as clipping.</w:t>
+        <w:t>A circuit is biased at an operating point, around which a smaller signal varies. Headroom is the distance from that point to the nearer output rail; it limits the largest undistorted signal. For fixed supply rails, gain and headroom trade off. A signal distorts when it exceeds the stage's linear range; clipping at a rail is one common cause.</w:t>
       </w:r>
     </w:p>
     <w:p>

</xml_diff>

<commit_message>
Book 2: clarify digital and analog teaching prose
</commit_message>
<xml_diff>
--- a/EE - SERIES/Circuits_Components_and_Control_Book2.docx
+++ b/EE - SERIES/Circuits_Components_and_Control_Book2.docx
@@ -1244,7 +1244,7 @@
         <w:spacing w:after="200" w:line="276" w:lineRule="auto"/>
       </w:pPr>
       <w:r>
-        <w:t>Any noise, ringing, or voltage drop smaller than the relevant noise margin can be added to a signal anywhere along its path without ever risking a misread bit. This is the source of digital electronics' most valuable property: a signal can pass through dozens of gates, each one imperfect and each one adding a little noise, and come out the other end exactly as clean as it went in — because each gate does not pass along the noisy analog voltage it received, it reads a bit and regenerates a fresh, full-strength output level.</w:t>
+        <w:t>Digital regeneration is the key advantage. A signal can pass through dozens of imperfect gates, each adding some noise, and still arrive as a clean logic level. Each gate reads the logic state and produces a fresh, full-strength output instead of passing along the noisy analog voltage.</w:t>
       </w:r>
     </w:p>
     <w:p>
@@ -1955,7 +1955,7 @@
         <w:spacing w:after="200" w:line="276" w:lineRule="auto"/>
       </w:pPr>
       <w:r>
-        <w:t>For expressions with more than two or three variables, spotting the right sequence of algebraic simplifications by inspection becomes difficult. A Karnaugh map arranges a truth table's outputs into a grid where every adjacent cell differs in exactly one input bit, so that groups of adjacent 1s can be circled and read off directly as a simplified term — a visual shortcut to the same simplifications the algebra provides, and the standard tool for anything up to about four or five variables.</w:t>
+        <w:t>For expressions with several variables, algebraic simplification becomes hard to do by inspection. A Karnaugh map arranges the truth table in a grid where adjacent cells differ by one input bit. Group neighboring 1s and read each group as a simplified term. This visual method reaches the same result as Boolean algebra and works well for about four or five variables.</w:t>
       </w:r>
     </w:p>
     <w:p>
@@ -2374,7 +2374,13 @@
         <w:spacing w:after="200" w:line="276" w:lineRule="auto"/>
       </w:pPr>
       <w:r>
-        <w:t>The simplest bistable element, the SR latch, can be built two ways, and the two are not interchangeable in their details. A NOR-gate version uses active-high inputs: setting S = 1 forces the stored output Q to 1, setting R = 1 forces it to 0, and with both inputs at 0 the latch holds whatever value it last stored — but setting both S and R to 1 simultaneously is forbidden, since both cross-coupled gates are then driven to the same output state, and which stable state the latch settles into once both inputs release is not defined by the circuit. A NAND-gate version instead uses active-low inputs, conventionally written S̄ and R̄: a 0 is what sets or resets the latch, and holding both inputs high is what makes it hold its value. There, the forbidden combination is S̄ = R̄ = 0 — the same underlying problem, with the roles of 0 and 1 inverted.</w:t>
+        <w:t>The simplest bistable element, the SR latch, has NOR- and NAND-gate versions with different input conventions. A NOR-gate version uses active-high inputs. Setting S = 1 forces Q = 1; setting R = 1 forces Q = 0. With both inputs at 0, the latch holds its last value. Do not set both inputs to 1: both cross-coupled gates are driven to the same output state, so the state after both inputs return to 0 is undefined.</w:t>
+      </w:r>
+    </w:p>
+    <w:p>
+      <w:pPr/>
+      <w:r>
+        <w:t>A NAND-gate version instead uses active-low inputs, conventionally written S-bar and R-bar. A 0 sets or resets the latch; holding both inputs high makes it hold its value. The forbidden combination is S-bar = R-bar = 0, the same underlying problem with 0 and 1 reversed.</w:t>
       </w:r>
     </w:p>
     <w:p>
@@ -4271,7 +4277,7 @@
         <w:spacing w:after="200" w:line="276" w:lineRule="auto"/>
       </w:pPr>
       <w:r>
-        <w:t>Every passive filter discussed so far has one practical drawback: its actual frequency response depends on whatever load impedance is connected to its output, since that load forms part of the circuit the filter's transfer function was derived from. An active filter places an op-amp between the filtering network and the output, using the op-amp's near-zero (though not literally zero) output impedance to strongly isolate the filter's response from the load, and its gain to make up for any signal loss the filtering network introduces — something no arrangement of passive components alone can do, since a real resistor, capacitor, and inductor can only remove energy from a signal, never add it.</w:t>
+        <w:t>Every passive filter has a practical limitation: its response changes with the impedance connected to its output, because that load becomes part of the filter circuit. An active filter places an op-amp between the passive network and its load. The op-amp's low, though nonzero, output impedance reduces load interaction, and its gain can restore loss in the network. Passive resistors, capacitors, and inductors can only store or dissipate energy; they cannot provide signal gain.</w:t>
       </w:r>
     </w:p>
     <w:p>
@@ -6312,7 +6318,13 @@
         <w:spacing w:after="200" w:line="276" w:lineRule="auto"/>
       </w:pPr>
       <w:r>
-        <w:t>Ceramic capacitors split into two practically different families sharing one name: Class 1 types (commonly labeled C0G or NP0) hold their rated capacitance almost exactly regardless of applied voltage or temperature, while Class 2 types (X7R, Y5V, and similar) pack far more capacitance into the same size at the cost of a capacitance that measurably decreases as DC voltage across it increases — a real, specified effect called DC bias derating, not a manufacturing defect. Electrolytic capacitors (aluminum and tantalum) reach far higher capacitance values than any ceramic in a comparable size, but are polarized — connecting one backwards is not merely ineffective but can destroy the part, sometimes violently — a failure mode both aluminum and tantalum electrolytics are known for. Film capacitors sit between the two extremes: unpolarized, stable, and typically used where ceramics' voltage sensitivity or electrolytics' polarity requirement is undesirable.</w:t>
+        <w:t>Ceramic capacitors fall into two useful families. Class 1 parts, commonly marked C0G or NP0, keep their capacitance nearly constant across voltage and temperature. Class 2 parts, such as X7R and Y5V, pack much more capacitance into the same size, but lose capacitance as DC bias rises. This DC-bias derating is specified behavior, not a manufacturing defect.</w:t>
+      </w:r>
+    </w:p>
+    <w:p>
+      <w:pPr/>
+      <w:r>
+        <w:t>Electrolytic capacitors (aluminum and tantalum) provide far more capacitance than ceramic parts of similar size, but they are polarized. Connecting one backward can destroy it, sometimes violently. Film capacitors are unpolarized and stable; use them when ceramic voltage sensitivity or electrolytic polarity is undesirable.</w:t>
       </w:r>
     </w:p>
     <w:p>

</xml_diff>

<commit_message>
Book 2: correct logic family ranges and roadmap
</commit_message>
<xml_diff>
--- a/EE - SERIES/Circuits_Components_and_Control_Book2.docx
+++ b/EE - SERIES/Circuits_Components_and_Control_Book2.docx
@@ -116,18 +116,51 @@
         <w:spacing w:after="200" w:line="276" w:lineRule="auto"/>
       </w:pPr>
       <w:r>
-        <w:t>Chapters 1–2 build the vocabulary shared by every later chapter: bias points, headroom, and small-signal behavior for analog circuits, and logic levels and noise margins for digital ones. Chapters 3–4 develop digital design specifically, from Boolean algebra through sequential circuits with memory. Chapter 5 introduces the operational amplifier as an ideal building block, in the same spirit Book 1 used for the resistor, capacitor, and inductor. Chapter 6 generalizes Book 1's filter and resonance results into a full filter-design vocabulary, passive and active, and carries it through to Sallen-Key and multiple-feedback designs built from standard parts. Chapters 7–9 return to the resistor, capacitor, and inductor themselves as real, physical parts: first their types, tolerances, ratings, and parasitics, then the practical side, from heat, drift, and pulse ratings to decoupling, real impedance, and reading an inductor datasheet.</w:t>
-      </w:r>
-    </w:p>
-    <w:p>
-      <w:pPr>
-        <w:spacing w:after="200" w:line="276" w:lineRule="auto"/>
-      </w:pPr>
-      <w:r>
-        <w:t>Chapter 10 introduces the control loop itself, through the smart thermostat of Book 1 and a robot joint. Chapters 11–16 return to the op-amp with real numbers: feedback as a quantitative tool, followers and capacitive loads, bandwidth and slew rate, noise, DC errors, and comparators. Chapters 17–19 build classical control on that foundation, from plant and controller through PID and lead-lag compensation to the digital loop and its sampling delay. Chapters 20–24 add five building blocks that join the book's two halves: the instrumentation amplifier, state feedback with observers, the sample-and-hold circuit, the voltage reference, and the H-bridge motor drive written as a plant for the loops of Chapters 17–19. Chapters 25–28 complete both halves: the root locus and the stability margins and sensitivity peak on the control side, and oscillators and digital timing with metastability on the circuit side. Along the way, bench sections put the theory to work: logic you can build and the FPGA (Chapter 4), LED and optocoupler drivers (Chapter 12), the photodiode amplifier (Chapter 13), switch debouncing (Chapter 16), PID on a Pico or a Teensy (Chapter 19), piezo and mains-current front ends (Chapter 20), relays, servos, and steppers (Chapter 24), and projects that need no controller at all (Chapter 27). Chapter 24.8 also introduces audio output-stage classes and a load-power example.</w:t>
-      </w:r>
-    </w:p>
-    <w:p>
+        <w:t>Chapters 1-4 build the vocabulary used throughout the book: bias points, headroom, small-signal behavior, logic levels, noise margins, Boolean algebra, and sequential circuits with memory.</w:t>
+      </w:r>
+    </w:p>
+    <w:p>
+      <w:pPr/>
+      <w:r>
+        <w:t>Chapters 5-6 introduce the operational amplifier as an ideal building block, then extend Book 1's filter and resonance work into passive and active designs, including Sallen-Key and multiple-feedback filters made with standard parts.</w:t>
+      </w:r>
+    </w:p>
+    <w:p>
+      <w:pPr/>
+      <w:r>
+        <w:t>Chapters 7-9 return to resistors, capacitors, and inductors as physical parts. They cover types, tolerances, ratings, parasitics, heat, drift, pulse limits, decoupling, real impedance, and datasheet reading.</w:t>
+      </w:r>
+    </w:p>
+    <w:p>
+      <w:pPr>
+        <w:spacing w:after="200" w:line="276" w:lineRule="auto"/>
+      </w:pPr>
+      <w:r>
+        <w:t>Chapter 10 introduces the control loop through Book 1's smart thermostat and a robot joint. Chapters 11-16 return to op-amps with feedback, loading, bandwidth, noise, DC errors, and comparators. Chapters 17-19 build the classical loop from plant and controller through PID, lead-lag compensation, and digital sampling delay.</w:t>
+      </w:r>
+    </w:p>
+    <w:p>
+      <w:pPr/>
+      <w:r>
+        <w:t>Chapters 20-24 add five blocks that connect circuit design and control: the instrumentation amplifier, state feedback and observers, sample-and-hold, voltage reference, and an H-bridge motor drive treated as a plant.</w:t>
+      </w:r>
+    </w:p>
+    <w:p>
+      <w:pPr/>
+      <w:r>
+        <w:t>Chapters 25-28 finish the two strands with root locus and stability margins, oscillators, and digital timing with metastability. The advanced control path is flagged separately below for readers who want to prepare its matrix and frequency-domain prerequisites.</w:t>
+      </w:r>
+    </w:p>
+    <w:p>
+      <w:pPr/>
+      <w:r>
+        <w:t>Bench sections apply the ideas: logic and FPGA work (Chapter 4), LED and optocoupler drivers (12), a photodiode amplifier (13), debouncing (16), PID on a Pico or Teensy (19), piezo and mains-current front ends (20), relays, servos, and steppers (24), and controller-free projects (27). Section 24.8 adds audio-output classes and a load-power example.</w:t>
+      </w:r>
+    </w:p>
+    <w:p>
+      <w:pPr>
+        <w:keepLines/>
+      </w:pPr>
       <w:r>
         <w:t>Advanced control path: Chapters 21 and 25-26 extend the classical loop with state-space feedback and frequency-domain stability. Before these chapters, review matrix multiplication and simultaneous equations from Book 1, plus transfer functions, poles, and Bode plots from Chapters 17-19. Chapter 21 introduces state-space notation but expects you to follow matrix calculations.</w:t>
       </w:r>
@@ -2568,10 +2601,13 @@
         <w:spacing w:after="200" w:line="276" w:lineRule="auto"/>
       </w:pPr>
       <w:r>
-        <w:t xml:space="preserve">Everything in Chapters 3 and 4 can be built on a breadboard from chips that have been in catalogs for more than fifty years. The 7400 family began as bipolar TTL; its modern 74HC and 74HCT members are CMOS parts that run from 2 V to 6 V in the same pin-outs. The 4000 family (CD4xxx) is older and slower but runs from 3 V to 15 V and draws almost nothing when idle, which makes it a favorite for battery projects. A 555 timer (Chapter 27) supplies the clock. With those three, a counter, a divider, a debouncer, </w:t>
-      </w:r>
-      <w:r>
-        <w:t>or an electronic die can be built without a line of code, which is the analog-first rule of Book 1's reader lab applied to logic.</w:t>
+        <w:t>Everything in Chapters 3 and 4 can be built on a breadboard from logic families with roots going back more than fifty years. The original 7400 family used bipolar TTL; 74HC and 74HCT are later CMOS families. For example, a 74HC14 commonly operates from 2 V to 6 V, while a 74HCT14 operates from 4.5 V to 5.5 V and has TTL-compatible input thresholds. Corresponding HC, HCT, and older 74-series parts often share a function and pinout, but check the specific datasheet before substituting one.</w:t>
+      </w:r>
+    </w:p>
+    <w:p>
+      <w:pPr/>
+      <w:r>
+        <w:t>The 4000 family (CD4xxx) is older and slower but commonly operates from 3 V to 15 V and draws very little when idle, which can suit battery projects; check the chosen device's limits. A 555 timer (Chapter 27) supplies the clock. With those parts, a counter, divider, debouncer, or electronic die can be built without a line of code, applying Book 1's analog-first rule to logic.</w:t>
       </w:r>
     </w:p>
     <w:p>
@@ -2839,18 +2875,15 @@
         <w:spacing w:after="200" w:line="276" w:lineRule="auto"/>
       </w:pPr>
       <w:r>
-        <w:t>Nobody draws an FPGA design gate by gate. It is described in a hardware description language such as Verilog or VHDL, and a synthesis tool maps the description onto LUTs and flip-flops. Book 8's chapter HDL: Software That Becomes Hardware (Chapter 26) covers that language side; this book supplies the gates, flip-flops, and timing (Chapter 28) underneath it. Small boards built around Lattice iCE40 FPGAs are inexpensive and can be programmed with a free, open-source toolchain, which makes them a good first FP</w:t>
-      </w:r>
-      <w:r>
-        <w:t>GA.</w:t>
-      </w:r>
-    </w:p>
-    <w:p>
-      <w:pPr>
-        <w:spacing w:after="200" w:line="276" w:lineRule="auto"/>
-      </w:pPr>
-      <w:r>
-        <w:t>The ASIC is no longer out of reach for a student either. Tiny Tapeout, a community project, collects many small designs onto one shared chip made in a commercial foundry from an open-source process design kit, so that a hobbyist or a class can have a small tile of logic built into real silicon for the cost of a hobby project rather than a mask set. The design flow is the FPGA flow with one difference that changes everything: there is no reprogramming after the chips come back.</w:t>
+        <w:t>Nobody draws an FPGA design gate by gate. It is described in a hardware description language such as Verilog or VHDL, and a synthesis tool maps the description onto LUTs and flip-flops. Book 8's chapter HDL: Software That Becomes Hardware (Chapter 26) covers that language side; this book supplies the gates, flip-flops, and timing (Chapter 28) underneath it. Some Lattice iCE40 devices are supported by the open-source Yosys, nextpnr, and Project IceStorm toolchain. Device support, board constraints, and programming hardware vary, so check the current tool and board documentation before choosing a first FPGA.</w:t>
+      </w:r>
+    </w:p>
+    <w:p>
+      <w:pPr>
+        <w:spacing w:after="200" w:line="276" w:lineRule="auto"/>
+      </w:pPr>
+      <w:r>
+        <w:t>The ASIC is no longer out of reach for a student either. Tiny Tapeout, a community project, aggregates small designs into shared fabrication shuttles that use open process-design kits. It lets a hobbyist or class send a small tile of logic to a commercial foundry without funding a private mask set. Tile pricing, process options, board and shipping charges, shuttle availability, and delivery estimates vary; check the current project pages before planning a build. An FPGA can be reprogrammed; a fabricated chip cannot.</w:t>
       </w:r>
     </w:p>
     <w:p>
@@ -32752,6 +32785,24 @@
       </w:r>
       <w:r>
         <w:t>the hand-drawn classic for the 555, 4000-series, and 7400-series builds of Section 4.5 and the projects without a controller of Section 27.6.</w:t>
+      </w:r>
+    </w:p>
+    <w:p>
+      <w:pPr/>
+      <w:r>
+        <w:t>Nexperia, 74HC14 and 74HCT14 Hex Inverting Schmitt Trigger data sheet (2024), for representative operating ranges and input thresholds: https://assets.nexperia.com/documents/data-sheet/74HC_HCT14.pdf.</w:t>
+      </w:r>
+    </w:p>
+    <w:p>
+      <w:pPr/>
+      <w:r>
+        <w:t>YosysHQ, nextpnr documentation and Project IceStorm, for current iCE40 device and open-source tool support: https://github.com/YosysHQ/nextpnr.</w:t>
+      </w:r>
+    </w:p>
+    <w:p>
+      <w:pPr/>
+      <w:r>
+        <w:t>Tiny Tapeout, current shuttle, process, and pricing pages, for time-sensitive tile, board, shipping, and delivery details: https://www.tinytapeout.com/.</w:t>
       </w:r>
     </w:p>
     <w:p>

</xml_diff>